<commit_message>
Console Rework & Cache Module Rework.
</commit_message>
<xml_diff>
--- a/Support Manual.docx
+++ b/Support Manual.docx
@@ -321,7 +321,25 @@
           <w:b/>
           <w:sz w:val="48"/>
         </w:rPr>
-        <w:t>Game assets structure (by entries)</w:t>
+        <w:t xml:space="preserve">Game </w:t>
+      </w:r>
+      <w:proofErr w:type="gramStart"/>
+      <w:r>
+        <w:rPr>
+          <w:rFonts w:ascii="Verdana" w:hAnsi="Verdana"/>
+          <w:b/>
+          <w:sz w:val="48"/>
+        </w:rPr>
+        <w:t>assets</w:t>
+      </w:r>
+      <w:proofErr w:type="gramEnd"/>
+      <w:r>
+        <w:rPr>
+          <w:rFonts w:ascii="Verdana" w:hAnsi="Verdana"/>
+          <w:b/>
+          <w:sz w:val="48"/>
+        </w:rPr>
+        <w:t xml:space="preserve"> structure (by entries)</w:t>
       </w:r>
       <w:r>
         <w:rPr>
@@ -1128,7 +1146,25 @@
           <w:sz w:val="32"/>
           <w:szCs w:val="32"/>
         </w:rPr>
-        <w:t xml:space="preserve"> &lt;num&gt;, sound &lt;num&gt; : sets respectively music and </w:t>
+        <w:t xml:space="preserve"> &lt;num&gt;, sound &lt;num</w:t>
+      </w:r>
+      <w:proofErr w:type="gramStart"/>
+      <w:r>
+        <w:rPr>
+          <w:rFonts w:ascii="Verdana" w:hAnsi="Verdana"/>
+          <w:sz w:val="32"/>
+          <w:szCs w:val="32"/>
+        </w:rPr>
+        <w:t>&gt; :</w:t>
+      </w:r>
+      <w:proofErr w:type="gramEnd"/>
+      <w:r>
+        <w:rPr>
+          <w:rFonts w:ascii="Verdana" w:hAnsi="Verdana"/>
+          <w:sz w:val="32"/>
+          <w:szCs w:val="32"/>
+        </w:rPr>
+        <w:t xml:space="preserve"> sets respectively music and </w:t>
       </w:r>
       <w:r>
         <w:rPr>
@@ -1370,1073 +1406,33 @@
           <w:sz w:val="32"/>
           <w:szCs w:val="32"/>
         </w:rPr>
-        <w:t>quit, exit</w:t>
-      </w:r>
-      <w:r>
-        <w:rPr>
-          <w:rFonts w:ascii="Verdana" w:hAnsi="Verdana"/>
-          <w:sz w:val="32"/>
-          <w:szCs w:val="32"/>
-        </w:rPr>
-        <w:t xml:space="preserve"> : leaves the game.</w:t>
-      </w:r>
-    </w:p>
-    <w:p>
-      <w:pPr>
-        <w:pStyle w:val="NoSpacing"/>
-        <w:rPr>
-          <w:rFonts w:ascii="Verdana" w:hAnsi="Verdana"/>
-          <w:b/>
-          <w:sz w:val="32"/>
-          <w:szCs w:val="32"/>
-        </w:rPr>
-      </w:pPr>
-    </w:p>
-    <w:p>
-      <w:pPr>
-        <w:pStyle w:val="NoSpacing"/>
-        <w:pBdr>
-          <w:top w:val="single" w:sz="4" w:space="1" w:color="auto"/>
-          <w:left w:val="single" w:sz="4" w:space="4" w:color="auto"/>
-          <w:bottom w:val="single" w:sz="4" w:space="1" w:color="auto"/>
-          <w:right w:val="single" w:sz="4" w:space="4" w:color="auto"/>
-        </w:pBdr>
-        <w:rPr>
-          <w:rFonts w:ascii="Verdana" w:hAnsi="Verdana"/>
-          <w:b/>
-          <w:sz w:val="32"/>
-          <w:szCs w:val="32"/>
-        </w:rPr>
-      </w:pPr>
-      <w:r>
-        <w:rPr>
-          <w:rFonts w:ascii="Verdana" w:hAnsi="Verdana"/>
-          <w:b/>
-          <w:sz w:val="32"/>
-          <w:szCs w:val="32"/>
-        </w:rPr>
-        <w:t xml:space="preserve">HELP </w:t>
-      </w:r>
-    </w:p>
-    <w:p>
-      <w:pPr>
-        <w:pStyle w:val="NoSpacing"/>
-        <w:pBdr>
-          <w:top w:val="single" w:sz="4" w:space="1" w:color="auto"/>
-          <w:left w:val="single" w:sz="4" w:space="4" w:color="auto"/>
-          <w:bottom w:val="single" w:sz="4" w:space="1" w:color="auto"/>
-          <w:right w:val="single" w:sz="4" w:space="4" w:color="auto"/>
-        </w:pBdr>
-        <w:rPr>
-          <w:rFonts w:ascii="Verdana" w:hAnsi="Verdana"/>
-          <w:b/>
-          <w:sz w:val="32"/>
-          <w:szCs w:val="32"/>
-        </w:rPr>
-      </w:pPr>
-    </w:p>
-    <w:p>
-      <w:pPr>
-        <w:pStyle w:val="NoSpacing"/>
-        <w:pBdr>
-          <w:top w:val="single" w:sz="4" w:space="1" w:color="auto"/>
-          <w:left w:val="single" w:sz="4" w:space="4" w:color="auto"/>
-          <w:bottom w:val="single" w:sz="4" w:space="1" w:color="auto"/>
-          <w:right w:val="single" w:sz="4" w:space="4" w:color="auto"/>
-        </w:pBdr>
-        <w:rPr>
-          <w:rFonts w:ascii="Verdana" w:hAnsi="Verdana"/>
-          <w:b/>
-          <w:sz w:val="32"/>
-          <w:szCs w:val="32"/>
-        </w:rPr>
-      </w:pPr>
-      <w:r>
-        <w:rPr>
-          <w:rFonts w:ascii="Verdana" w:hAnsi="Verdana"/>
-          <w:b/>
-          <w:sz w:val="32"/>
-          <w:szCs w:val="32"/>
-        </w:rPr>
-        <w:t>Camera movements:</w:t>
-      </w:r>
-    </w:p>
-    <w:p>
-      <w:pPr>
-        <w:pStyle w:val="NoSpacing"/>
-        <w:pBdr>
-          <w:top w:val="single" w:sz="4" w:space="1" w:color="auto"/>
-          <w:left w:val="single" w:sz="4" w:space="4" w:color="auto"/>
-          <w:bottom w:val="single" w:sz="4" w:space="1" w:color="auto"/>
-          <w:right w:val="single" w:sz="4" w:space="4" w:color="auto"/>
-        </w:pBdr>
-        <w:rPr>
-          <w:rFonts w:ascii="Verdana" w:hAnsi="Verdana"/>
-          <w:sz w:val="32"/>
-          <w:szCs w:val="32"/>
-        </w:rPr>
-      </w:pPr>
-      <w:r>
-        <w:rPr>
-          <w:rFonts w:ascii="Verdana" w:hAnsi="Verdana"/>
-          <w:sz w:val="32"/>
-          <w:szCs w:val="32"/>
-        </w:rPr>
-        <w:t xml:space="preserve">W, </w:t>
-      </w:r>
-      <w:proofErr w:type="spellStart"/>
-      <w:r>
-        <w:rPr>
-          <w:rFonts w:ascii="Verdana" w:hAnsi="Verdana"/>
-          <w:sz w:val="32"/>
-          <w:szCs w:val="32"/>
-        </w:rPr>
-        <w:t>UpArrow</w:t>
-      </w:r>
-      <w:proofErr w:type="spellEnd"/>
-      <w:r>
-        <w:rPr>
-          <w:rFonts w:ascii="Verdana" w:hAnsi="Verdana"/>
-          <w:sz w:val="32"/>
-          <w:szCs w:val="32"/>
-        </w:rPr>
-        <w:t xml:space="preserve"> = Forward</w:t>
-      </w:r>
-    </w:p>
-    <w:p>
-      <w:pPr>
-        <w:pStyle w:val="NoSpacing"/>
-        <w:pBdr>
-          <w:top w:val="single" w:sz="4" w:space="1" w:color="auto"/>
-          <w:left w:val="single" w:sz="4" w:space="4" w:color="auto"/>
-          <w:bottom w:val="single" w:sz="4" w:space="1" w:color="auto"/>
-          <w:right w:val="single" w:sz="4" w:space="4" w:color="auto"/>
-        </w:pBdr>
-        <w:rPr>
-          <w:rFonts w:ascii="Verdana" w:hAnsi="Verdana"/>
-          <w:sz w:val="32"/>
-          <w:szCs w:val="32"/>
-        </w:rPr>
-      </w:pPr>
-      <w:r>
-        <w:rPr>
-          <w:rFonts w:ascii="Verdana" w:hAnsi="Verdana"/>
-          <w:sz w:val="32"/>
-          <w:szCs w:val="32"/>
-        </w:rPr>
-        <w:t xml:space="preserve">A, </w:t>
-      </w:r>
-      <w:proofErr w:type="spellStart"/>
-      <w:r>
-        <w:rPr>
-          <w:rFonts w:ascii="Verdana" w:hAnsi="Verdana"/>
-          <w:sz w:val="32"/>
-          <w:szCs w:val="32"/>
-        </w:rPr>
-        <w:t>DownArrow</w:t>
-      </w:r>
-      <w:proofErr w:type="spellEnd"/>
-      <w:r>
-        <w:rPr>
-          <w:rFonts w:ascii="Verdana" w:hAnsi="Verdana"/>
-          <w:sz w:val="32"/>
-          <w:szCs w:val="32"/>
-        </w:rPr>
-        <w:t xml:space="preserve"> = Backward</w:t>
-      </w:r>
-    </w:p>
-    <w:p>
-      <w:pPr>
-        <w:pStyle w:val="NoSpacing"/>
-        <w:pBdr>
-          <w:top w:val="single" w:sz="4" w:space="1" w:color="auto"/>
-          <w:left w:val="single" w:sz="4" w:space="4" w:color="auto"/>
-          <w:bottom w:val="single" w:sz="4" w:space="1" w:color="auto"/>
-          <w:right w:val="single" w:sz="4" w:space="4" w:color="auto"/>
-        </w:pBdr>
-        <w:rPr>
-          <w:rFonts w:ascii="Verdana" w:hAnsi="Verdana"/>
-          <w:sz w:val="32"/>
-          <w:szCs w:val="32"/>
-        </w:rPr>
-      </w:pPr>
-      <w:r>
-        <w:rPr>
-          <w:rFonts w:ascii="Verdana" w:hAnsi="Verdana"/>
-          <w:sz w:val="32"/>
-          <w:szCs w:val="32"/>
-        </w:rPr>
-        <w:t>S = Strafe Left</w:t>
-      </w:r>
-    </w:p>
-    <w:p>
-      <w:pPr>
-        <w:pStyle w:val="NoSpacing"/>
-        <w:pBdr>
-          <w:top w:val="single" w:sz="4" w:space="1" w:color="auto"/>
-          <w:left w:val="single" w:sz="4" w:space="4" w:color="auto"/>
-          <w:bottom w:val="single" w:sz="4" w:space="1" w:color="auto"/>
-          <w:right w:val="single" w:sz="4" w:space="4" w:color="auto"/>
-        </w:pBdr>
-        <w:rPr>
-          <w:rFonts w:ascii="Verdana" w:hAnsi="Verdana"/>
-          <w:sz w:val="32"/>
-          <w:szCs w:val="32"/>
-        </w:rPr>
-      </w:pPr>
-      <w:r>
-        <w:rPr>
-          <w:rFonts w:ascii="Verdana" w:hAnsi="Verdana"/>
-          <w:sz w:val="32"/>
-          <w:szCs w:val="32"/>
-        </w:rPr>
-        <w:lastRenderedPageBreak/>
-        <w:t>D = Strafe Right</w:t>
-      </w:r>
-    </w:p>
-    <w:p>
-      <w:pPr>
-        <w:pStyle w:val="NoSpacing"/>
-        <w:pBdr>
-          <w:top w:val="single" w:sz="4" w:space="1" w:color="auto"/>
-          <w:left w:val="single" w:sz="4" w:space="4" w:color="auto"/>
-          <w:bottom w:val="single" w:sz="4" w:space="1" w:color="auto"/>
-          <w:right w:val="single" w:sz="4" w:space="4" w:color="auto"/>
-        </w:pBdr>
-        <w:rPr>
-          <w:rFonts w:ascii="Verdana" w:hAnsi="Verdana"/>
-          <w:sz w:val="32"/>
-          <w:szCs w:val="32"/>
-        </w:rPr>
-      </w:pPr>
-      <w:proofErr w:type="spellStart"/>
-      <w:r>
-        <w:rPr>
-          <w:rFonts w:ascii="Verdana" w:hAnsi="Verdana"/>
-          <w:sz w:val="32"/>
-          <w:szCs w:val="32"/>
-        </w:rPr>
-        <w:t>LeftArrow</w:t>
-      </w:r>
-      <w:proofErr w:type="spellEnd"/>
-      <w:r>
-        <w:rPr>
-          <w:rFonts w:ascii="Verdana" w:hAnsi="Verdana"/>
-          <w:sz w:val="32"/>
-          <w:szCs w:val="32"/>
-        </w:rPr>
-        <w:t xml:space="preserve"> = Turn Left</w:t>
-      </w:r>
-    </w:p>
-    <w:p>
-      <w:pPr>
-        <w:pStyle w:val="NoSpacing"/>
-        <w:pBdr>
-          <w:top w:val="single" w:sz="4" w:space="1" w:color="auto"/>
-          <w:left w:val="single" w:sz="4" w:space="4" w:color="auto"/>
-          <w:bottom w:val="single" w:sz="4" w:space="1" w:color="auto"/>
-          <w:right w:val="single" w:sz="4" w:space="4" w:color="auto"/>
-        </w:pBdr>
-        <w:rPr>
-          <w:rFonts w:ascii="Verdana" w:hAnsi="Verdana"/>
-          <w:sz w:val="32"/>
-          <w:szCs w:val="32"/>
-        </w:rPr>
-      </w:pPr>
-      <w:proofErr w:type="spellStart"/>
-      <w:r>
-        <w:rPr>
-          <w:rFonts w:ascii="Verdana" w:hAnsi="Verdana"/>
-          <w:sz w:val="32"/>
-          <w:szCs w:val="32"/>
-        </w:rPr>
-        <w:t>RightArrow</w:t>
-      </w:r>
-      <w:proofErr w:type="spellEnd"/>
-      <w:r>
-        <w:rPr>
-          <w:rFonts w:ascii="Verdana" w:hAnsi="Verdana"/>
-          <w:sz w:val="32"/>
-          <w:szCs w:val="32"/>
-        </w:rPr>
-        <w:t xml:space="preserve"> = Turn Right</w:t>
-      </w:r>
-    </w:p>
-    <w:p>
-      <w:pPr>
-        <w:pStyle w:val="NoSpacing"/>
-        <w:pBdr>
-          <w:top w:val="single" w:sz="4" w:space="1" w:color="auto"/>
-          <w:left w:val="single" w:sz="4" w:space="4" w:color="auto"/>
-          <w:bottom w:val="single" w:sz="4" w:space="1" w:color="auto"/>
-          <w:right w:val="single" w:sz="4" w:space="4" w:color="auto"/>
-        </w:pBdr>
-        <w:rPr>
-          <w:rFonts w:ascii="Verdana" w:hAnsi="Verdana"/>
-          <w:b/>
-          <w:sz w:val="32"/>
-          <w:szCs w:val="32"/>
-        </w:rPr>
-      </w:pPr>
-    </w:p>
-    <w:p>
-      <w:pPr>
-        <w:pStyle w:val="NoSpacing"/>
-        <w:pBdr>
-          <w:top w:val="single" w:sz="4" w:space="1" w:color="auto"/>
-          <w:left w:val="single" w:sz="4" w:space="4" w:color="auto"/>
-          <w:bottom w:val="single" w:sz="4" w:space="1" w:color="auto"/>
-          <w:right w:val="single" w:sz="4" w:space="4" w:color="auto"/>
-        </w:pBdr>
-        <w:rPr>
-          <w:rFonts w:ascii="Verdana" w:hAnsi="Verdana"/>
-          <w:b/>
-          <w:sz w:val="32"/>
-          <w:szCs w:val="32"/>
-        </w:rPr>
-      </w:pPr>
-      <w:r>
-        <w:rPr>
-          <w:rFonts w:ascii="Verdana" w:hAnsi="Verdana"/>
-          <w:b/>
-          <w:sz w:val="32"/>
-          <w:szCs w:val="32"/>
-        </w:rPr>
-        <w:t>Player functions:</w:t>
-      </w:r>
-    </w:p>
-    <w:p>
-      <w:pPr>
-        <w:pStyle w:val="NoSpacing"/>
-        <w:pBdr>
-          <w:top w:val="single" w:sz="4" w:space="1" w:color="auto"/>
-          <w:left w:val="single" w:sz="4" w:space="4" w:color="auto"/>
-          <w:bottom w:val="single" w:sz="4" w:space="1" w:color="auto"/>
-          <w:right w:val="single" w:sz="4" w:space="4" w:color="auto"/>
-        </w:pBdr>
-        <w:rPr>
-          <w:rFonts w:ascii="Verdana" w:hAnsi="Verdana"/>
-          <w:sz w:val="32"/>
-          <w:szCs w:val="32"/>
-        </w:rPr>
-      </w:pPr>
-      <w:r>
-        <w:rPr>
-          <w:rFonts w:ascii="Verdana" w:hAnsi="Verdana"/>
-          <w:sz w:val="32"/>
-          <w:szCs w:val="32"/>
-        </w:rPr>
-        <w:t>1 = Pistol</w:t>
-      </w:r>
-    </w:p>
-    <w:p>
-      <w:pPr>
-        <w:pStyle w:val="NoSpacing"/>
-        <w:pBdr>
-          <w:top w:val="single" w:sz="4" w:space="1" w:color="auto"/>
-          <w:left w:val="single" w:sz="4" w:space="4" w:color="auto"/>
-          <w:bottom w:val="single" w:sz="4" w:space="1" w:color="auto"/>
-          <w:right w:val="single" w:sz="4" w:space="4" w:color="auto"/>
-        </w:pBdr>
-        <w:rPr>
-          <w:rFonts w:ascii="Verdana" w:hAnsi="Verdana"/>
-          <w:sz w:val="32"/>
-          <w:szCs w:val="32"/>
-        </w:rPr>
-      </w:pPr>
-      <w:r>
-        <w:rPr>
-          <w:rFonts w:ascii="Verdana" w:hAnsi="Verdana"/>
-          <w:sz w:val="32"/>
-          <w:szCs w:val="32"/>
-        </w:rPr>
-        <w:t>2 = Sub Machine Gun</w:t>
-      </w:r>
-    </w:p>
-    <w:p>
-      <w:pPr>
-        <w:pStyle w:val="NoSpacing"/>
-        <w:pBdr>
-          <w:top w:val="single" w:sz="4" w:space="1" w:color="auto"/>
-          <w:left w:val="single" w:sz="4" w:space="4" w:color="auto"/>
-          <w:bottom w:val="single" w:sz="4" w:space="1" w:color="auto"/>
-          <w:right w:val="single" w:sz="4" w:space="4" w:color="auto"/>
-        </w:pBdr>
-        <w:rPr>
-          <w:rFonts w:ascii="Verdana" w:hAnsi="Verdana"/>
-          <w:sz w:val="32"/>
-          <w:szCs w:val="32"/>
-        </w:rPr>
-      </w:pPr>
-      <w:r>
-        <w:rPr>
-          <w:rFonts w:ascii="Verdana" w:hAnsi="Verdana"/>
-          <w:sz w:val="32"/>
-          <w:szCs w:val="32"/>
-        </w:rPr>
-        <w:t>3 = Shotgun</w:t>
-      </w:r>
-    </w:p>
-    <w:p>
-      <w:pPr>
-        <w:pStyle w:val="NoSpacing"/>
-        <w:pBdr>
-          <w:top w:val="single" w:sz="4" w:space="1" w:color="auto"/>
-          <w:left w:val="single" w:sz="4" w:space="4" w:color="auto"/>
-          <w:bottom w:val="single" w:sz="4" w:space="1" w:color="auto"/>
-          <w:right w:val="single" w:sz="4" w:space="4" w:color="auto"/>
-        </w:pBdr>
-        <w:rPr>
-          <w:rFonts w:ascii="Verdana" w:hAnsi="Verdana"/>
-          <w:sz w:val="32"/>
-          <w:szCs w:val="32"/>
-        </w:rPr>
-      </w:pPr>
-      <w:r>
-        <w:rPr>
-          <w:rFonts w:ascii="Verdana" w:hAnsi="Verdana"/>
-          <w:sz w:val="32"/>
-          <w:szCs w:val="32"/>
-        </w:rPr>
-        <w:t>4 = Assault Rifle</w:t>
-      </w:r>
-    </w:p>
-    <w:p>
-      <w:pPr>
-        <w:pStyle w:val="NoSpacing"/>
-        <w:pBdr>
-          <w:top w:val="single" w:sz="4" w:space="1" w:color="auto"/>
-          <w:left w:val="single" w:sz="4" w:space="4" w:color="auto"/>
-          <w:bottom w:val="single" w:sz="4" w:space="1" w:color="auto"/>
-          <w:right w:val="single" w:sz="4" w:space="4" w:color="auto"/>
-        </w:pBdr>
-        <w:rPr>
-          <w:rFonts w:ascii="Verdana" w:hAnsi="Verdana"/>
-          <w:sz w:val="32"/>
-          <w:szCs w:val="32"/>
-        </w:rPr>
-      </w:pPr>
-      <w:r>
-        <w:rPr>
-          <w:rFonts w:ascii="Verdana" w:hAnsi="Verdana"/>
-          <w:sz w:val="32"/>
-          <w:szCs w:val="32"/>
-        </w:rPr>
-        <w:t>5 = Machine Gun</w:t>
-      </w:r>
-    </w:p>
-    <w:p>
-      <w:pPr>
-        <w:pStyle w:val="NoSpacing"/>
-        <w:pBdr>
-          <w:top w:val="single" w:sz="4" w:space="1" w:color="auto"/>
-          <w:left w:val="single" w:sz="4" w:space="4" w:color="auto"/>
-          <w:bottom w:val="single" w:sz="4" w:space="1" w:color="auto"/>
-          <w:right w:val="single" w:sz="4" w:space="4" w:color="auto"/>
-        </w:pBdr>
-        <w:rPr>
-          <w:rFonts w:ascii="Verdana" w:hAnsi="Verdana"/>
-          <w:sz w:val="32"/>
-          <w:szCs w:val="32"/>
-        </w:rPr>
-      </w:pPr>
-      <w:r>
-        <w:rPr>
-          <w:rFonts w:ascii="Verdana" w:hAnsi="Verdana"/>
-          <w:sz w:val="32"/>
-          <w:szCs w:val="32"/>
-        </w:rPr>
-        <w:t>6 = Sniper Rifle</w:t>
-      </w:r>
-    </w:p>
-    <w:p>
-      <w:pPr>
-        <w:pStyle w:val="NoSpacing"/>
-        <w:pBdr>
-          <w:top w:val="single" w:sz="4" w:space="1" w:color="auto"/>
-          <w:left w:val="single" w:sz="4" w:space="4" w:color="auto"/>
-          <w:bottom w:val="single" w:sz="4" w:space="1" w:color="auto"/>
-          <w:right w:val="single" w:sz="4" w:space="4" w:color="auto"/>
-        </w:pBdr>
-        <w:rPr>
-          <w:rFonts w:ascii="Verdana" w:hAnsi="Verdana"/>
-          <w:sz w:val="32"/>
-          <w:szCs w:val="32"/>
-        </w:rPr>
-      </w:pPr>
-      <w:r>
-        <w:rPr>
-          <w:rFonts w:ascii="Verdana" w:hAnsi="Verdana"/>
-          <w:sz w:val="32"/>
-          <w:szCs w:val="32"/>
-        </w:rPr>
-        <w:t>Mouse1 = Fire [Not implemented]</w:t>
-      </w:r>
-    </w:p>
-    <w:p>
-      <w:pPr>
-        <w:pStyle w:val="NoSpacing"/>
-        <w:pBdr>
-          <w:top w:val="single" w:sz="4" w:space="1" w:color="auto"/>
-          <w:left w:val="single" w:sz="4" w:space="4" w:color="auto"/>
-          <w:bottom w:val="single" w:sz="4" w:space="1" w:color="auto"/>
-          <w:right w:val="single" w:sz="4" w:space="4" w:color="auto"/>
-        </w:pBdr>
-        <w:rPr>
-          <w:rFonts w:ascii="Verdana" w:hAnsi="Verdana"/>
-          <w:b/>
-          <w:sz w:val="32"/>
-          <w:szCs w:val="32"/>
-        </w:rPr>
-      </w:pPr>
-      <w:r>
-        <w:rPr>
-          <w:rFonts w:ascii="Verdana" w:hAnsi="Verdana"/>
-          <w:sz w:val="32"/>
-          <w:szCs w:val="32"/>
-        </w:rPr>
-        <w:t>Mouse2 = Alt-Fire [Not implemented]</w:t>
-      </w:r>
-    </w:p>
-    <w:p>
-      <w:pPr>
-        <w:pStyle w:val="NoSpacing"/>
-        <w:pBdr>
-          <w:top w:val="single" w:sz="4" w:space="1" w:color="auto"/>
-          <w:left w:val="single" w:sz="4" w:space="4" w:color="auto"/>
-          <w:bottom w:val="single" w:sz="4" w:space="1" w:color="auto"/>
-          <w:right w:val="single" w:sz="4" w:space="4" w:color="auto"/>
-        </w:pBdr>
-        <w:rPr>
-          <w:rFonts w:ascii="Verdana" w:hAnsi="Verdana"/>
-          <w:b/>
-          <w:sz w:val="32"/>
-          <w:szCs w:val="32"/>
-        </w:rPr>
-      </w:pPr>
-    </w:p>
-    <w:p>
-      <w:pPr>
-        <w:pStyle w:val="NoSpacing"/>
-        <w:pBdr>
-          <w:top w:val="single" w:sz="4" w:space="1" w:color="auto"/>
-          <w:left w:val="single" w:sz="4" w:space="4" w:color="auto"/>
-          <w:bottom w:val="single" w:sz="4" w:space="1" w:color="auto"/>
-          <w:right w:val="single" w:sz="4" w:space="4" w:color="auto"/>
-        </w:pBdr>
-        <w:rPr>
-          <w:rFonts w:ascii="Verdana" w:hAnsi="Verdana"/>
-          <w:b/>
-          <w:sz w:val="32"/>
-          <w:szCs w:val="32"/>
-        </w:rPr>
-      </w:pPr>
-      <w:r>
-        <w:rPr>
-          <w:rFonts w:ascii="Verdana" w:hAnsi="Verdana"/>
-          <w:b/>
-          <w:sz w:val="32"/>
-          <w:szCs w:val="32"/>
-        </w:rPr>
-        <w:t>Editor functions:</w:t>
-      </w:r>
-    </w:p>
-    <w:p>
-      <w:pPr>
-        <w:pStyle w:val="NoSpacing"/>
-        <w:pBdr>
-          <w:top w:val="single" w:sz="4" w:space="1" w:color="auto"/>
-          <w:left w:val="single" w:sz="4" w:space="4" w:color="auto"/>
-          <w:bottom w:val="single" w:sz="4" w:space="1" w:color="auto"/>
-          <w:right w:val="single" w:sz="4" w:space="4" w:color="auto"/>
-        </w:pBdr>
-        <w:rPr>
-          <w:rFonts w:ascii="Verdana" w:hAnsi="Verdana"/>
-          <w:sz w:val="32"/>
-          <w:szCs w:val="32"/>
-        </w:rPr>
-      </w:pPr>
-      <w:r>
-        <w:rPr>
-          <w:rFonts w:ascii="Verdana" w:hAnsi="Verdana"/>
-          <w:sz w:val="32"/>
-          <w:szCs w:val="32"/>
-        </w:rPr>
-        <w:t>N = Create New Block</w:t>
-      </w:r>
-    </w:p>
-    <w:p>
-      <w:pPr>
-        <w:pStyle w:val="NoSpacing"/>
-        <w:pBdr>
-          <w:top w:val="single" w:sz="4" w:space="1" w:color="auto"/>
-          <w:left w:val="single" w:sz="4" w:space="4" w:color="auto"/>
-          <w:bottom w:val="single" w:sz="4" w:space="1" w:color="auto"/>
-          <w:right w:val="single" w:sz="4" w:space="4" w:color="auto"/>
-        </w:pBdr>
-        <w:rPr>
-          <w:rFonts w:ascii="Verdana" w:hAnsi="Verdana"/>
-          <w:sz w:val="32"/>
-          <w:szCs w:val="32"/>
-        </w:rPr>
-      </w:pPr>
-      <w:r>
-        <w:rPr>
-          <w:rFonts w:ascii="Verdana" w:hAnsi="Verdana"/>
-          <w:sz w:val="32"/>
-          <w:szCs w:val="32"/>
-        </w:rPr>
-        <w:t>M = Change Block Color</w:t>
-      </w:r>
-    </w:p>
-    <w:p>
-      <w:pPr>
-        <w:pStyle w:val="NoSpacing"/>
-        <w:pBdr>
-          <w:top w:val="single" w:sz="4" w:space="1" w:color="auto"/>
-          <w:left w:val="single" w:sz="4" w:space="4" w:color="auto"/>
-          <w:bottom w:val="single" w:sz="4" w:space="1" w:color="auto"/>
-          <w:right w:val="single" w:sz="4" w:space="4" w:color="auto"/>
-        </w:pBdr>
-        <w:rPr>
-          <w:rFonts w:ascii="Verdana" w:hAnsi="Verdana"/>
-          <w:sz w:val="32"/>
-          <w:szCs w:val="32"/>
-        </w:rPr>
-      </w:pPr>
-      <w:r>
-        <w:rPr>
-          <w:rFonts w:ascii="Verdana" w:hAnsi="Verdana"/>
-          <w:sz w:val="32"/>
-          <w:szCs w:val="32"/>
-        </w:rPr>
-        <w:t>Mouse1 = Select Solid Block</w:t>
-      </w:r>
-    </w:p>
-    <w:p>
-      <w:pPr>
-        <w:pStyle w:val="NoSpacing"/>
-        <w:pBdr>
-          <w:top w:val="single" w:sz="4" w:space="1" w:color="auto"/>
-          <w:left w:val="single" w:sz="4" w:space="4" w:color="auto"/>
-          <w:bottom w:val="single" w:sz="4" w:space="1" w:color="auto"/>
-          <w:right w:val="single" w:sz="4" w:space="4" w:color="auto"/>
-        </w:pBdr>
-        <w:rPr>
-          <w:rFonts w:ascii="Verdana" w:hAnsi="Verdana"/>
-          <w:sz w:val="32"/>
-          <w:szCs w:val="32"/>
-        </w:rPr>
-      </w:pPr>
-      <w:r>
-        <w:rPr>
-          <w:rFonts w:ascii="Verdana" w:hAnsi="Verdana"/>
-          <w:sz w:val="32"/>
-          <w:szCs w:val="32"/>
-        </w:rPr>
-        <w:t>Mouse1 + SHIFT = Select Fluid Block</w:t>
-      </w:r>
-    </w:p>
-    <w:p>
-      <w:pPr>
-        <w:pStyle w:val="NoSpacing"/>
-        <w:pBdr>
-          <w:top w:val="single" w:sz="4" w:space="1" w:color="auto"/>
-          <w:left w:val="single" w:sz="4" w:space="4" w:color="auto"/>
-          <w:bottom w:val="single" w:sz="4" w:space="1" w:color="auto"/>
-          <w:right w:val="single" w:sz="4" w:space="4" w:color="auto"/>
-        </w:pBdr>
-        <w:rPr>
-          <w:rFonts w:ascii="Verdana" w:hAnsi="Verdana"/>
-          <w:sz w:val="32"/>
-          <w:szCs w:val="32"/>
-        </w:rPr>
-      </w:pPr>
-      <w:r>
-        <w:rPr>
-          <w:rFonts w:ascii="Verdana" w:hAnsi="Verdana"/>
-          <w:sz w:val="32"/>
-          <w:szCs w:val="32"/>
-        </w:rPr>
-        <w:t>Mouse2 = Place New Block</w:t>
-      </w:r>
-    </w:p>
-    <w:p>
-      <w:pPr>
-        <w:pStyle w:val="NoSpacing"/>
-        <w:pBdr>
-          <w:top w:val="single" w:sz="4" w:space="1" w:color="auto"/>
-          <w:left w:val="single" w:sz="4" w:space="4" w:color="auto"/>
-          <w:bottom w:val="single" w:sz="4" w:space="1" w:color="auto"/>
-          <w:right w:val="single" w:sz="4" w:space="4" w:color="auto"/>
-        </w:pBdr>
-        <w:rPr>
-          <w:rFonts w:ascii="Verdana" w:hAnsi="Verdana"/>
-          <w:sz w:val="32"/>
-          <w:szCs w:val="32"/>
-        </w:rPr>
-      </w:pPr>
-      <w:r>
-        <w:rPr>
-          <w:rFonts w:ascii="Verdana" w:hAnsi="Verdana"/>
-          <w:sz w:val="32"/>
-          <w:szCs w:val="32"/>
-        </w:rPr>
-        <w:t>1-6 = Select Adjacent Solid Block</w:t>
-      </w:r>
-    </w:p>
-    <w:p>
-      <w:pPr>
-        <w:pStyle w:val="NoSpacing"/>
-        <w:pBdr>
-          <w:top w:val="single" w:sz="4" w:space="1" w:color="auto"/>
-          <w:left w:val="single" w:sz="4" w:space="4" w:color="auto"/>
-          <w:bottom w:val="single" w:sz="4" w:space="1" w:color="auto"/>
-          <w:right w:val="single" w:sz="4" w:space="4" w:color="auto"/>
-        </w:pBdr>
-        <w:rPr>
-          <w:rFonts w:ascii="Verdana" w:hAnsi="Verdana"/>
-          <w:sz w:val="32"/>
-          <w:szCs w:val="32"/>
-        </w:rPr>
-      </w:pPr>
-      <w:r>
-        <w:rPr>
-          <w:rFonts w:ascii="Verdana" w:hAnsi="Verdana"/>
-          <w:sz w:val="32"/>
-          <w:szCs w:val="32"/>
-        </w:rPr>
-        <w:t>1-6 + SHIFT = Select Adjacent Fluid Block</w:t>
-      </w:r>
-    </w:p>
-    <w:p>
-      <w:pPr>
-        <w:pStyle w:val="NoSpacing"/>
-        <w:pBdr>
-          <w:top w:val="single" w:sz="4" w:space="1" w:color="auto"/>
-          <w:left w:val="single" w:sz="4" w:space="4" w:color="auto"/>
-          <w:bottom w:val="single" w:sz="4" w:space="1" w:color="auto"/>
-          <w:right w:val="single" w:sz="4" w:space="4" w:color="auto"/>
-        </w:pBdr>
-        <w:rPr>
-          <w:rFonts w:ascii="Verdana" w:hAnsi="Verdana"/>
-          <w:sz w:val="32"/>
-          <w:szCs w:val="32"/>
-        </w:rPr>
-      </w:pPr>
-      <w:r>
-        <w:rPr>
-          <w:rFonts w:ascii="Verdana" w:hAnsi="Verdana"/>
-          <w:sz w:val="32"/>
-          <w:szCs w:val="32"/>
-        </w:rPr>
-        <w:t>F, 0 = Deselect</w:t>
-      </w:r>
-    </w:p>
-    <w:p>
-      <w:pPr>
-        <w:pStyle w:val="NoSpacing"/>
-        <w:pBdr>
-          <w:top w:val="single" w:sz="4" w:space="1" w:color="auto"/>
-          <w:left w:val="single" w:sz="4" w:space="4" w:color="auto"/>
-          <w:bottom w:val="single" w:sz="4" w:space="1" w:color="auto"/>
-          <w:right w:val="single" w:sz="4" w:space="4" w:color="auto"/>
-        </w:pBdr>
-        <w:rPr>
-          <w:rFonts w:ascii="Verdana" w:hAnsi="Verdana"/>
-          <w:sz w:val="32"/>
-          <w:szCs w:val="32"/>
-        </w:rPr>
-      </w:pPr>
-      <w:r>
-        <w:rPr>
-          <w:rFonts w:ascii="Verdana" w:hAnsi="Verdana"/>
-          <w:sz w:val="32"/>
-          <w:szCs w:val="32"/>
-        </w:rPr>
-        <w:t>R = Remove Selected Block</w:t>
-      </w:r>
-    </w:p>
-    <w:p>
-      <w:pPr>
-        <w:pStyle w:val="NoSpacing"/>
-        <w:pBdr>
-          <w:top w:val="single" w:sz="4" w:space="1" w:color="auto"/>
-          <w:left w:val="single" w:sz="4" w:space="4" w:color="auto"/>
-          <w:bottom w:val="single" w:sz="4" w:space="1" w:color="auto"/>
-          <w:right w:val="single" w:sz="4" w:space="4" w:color="auto"/>
-        </w:pBdr>
-        <w:rPr>
-          <w:rFonts w:ascii="Verdana" w:hAnsi="Verdana"/>
-          <w:sz w:val="32"/>
-          <w:szCs w:val="32"/>
-        </w:rPr>
-      </w:pPr>
-      <w:r>
-        <w:rPr>
-          <w:rFonts w:ascii="Verdana" w:hAnsi="Verdana"/>
-          <w:sz w:val="32"/>
-          <w:szCs w:val="32"/>
-        </w:rPr>
-        <w:t>[, ] = Change Texture For New Block</w:t>
-      </w:r>
-    </w:p>
-    <w:p>
-      <w:pPr>
-        <w:pStyle w:val="NoSpacing"/>
-        <w:pBdr>
-          <w:top w:val="single" w:sz="4" w:space="1" w:color="auto"/>
-          <w:left w:val="single" w:sz="4" w:space="4" w:color="auto"/>
-          <w:bottom w:val="single" w:sz="4" w:space="1" w:color="auto"/>
-          <w:right w:val="single" w:sz="4" w:space="4" w:color="auto"/>
-        </w:pBdr>
-        <w:rPr>
-          <w:rFonts w:ascii="Verdana" w:hAnsi="Verdana"/>
-          <w:b/>
-          <w:sz w:val="32"/>
-          <w:szCs w:val="32"/>
-        </w:rPr>
-      </w:pPr>
-    </w:p>
-    <w:p>
-      <w:pPr>
-        <w:pStyle w:val="NoSpacing"/>
-        <w:pBdr>
-          <w:top w:val="single" w:sz="4" w:space="1" w:color="auto"/>
-          <w:left w:val="single" w:sz="4" w:space="4" w:color="auto"/>
-          <w:bottom w:val="single" w:sz="4" w:space="1" w:color="auto"/>
-          <w:right w:val="single" w:sz="4" w:space="4" w:color="auto"/>
-        </w:pBdr>
-        <w:rPr>
-          <w:rFonts w:ascii="Verdana" w:hAnsi="Verdana"/>
-          <w:b/>
-          <w:sz w:val="32"/>
-          <w:szCs w:val="32"/>
-        </w:rPr>
-      </w:pPr>
-      <w:r>
-        <w:rPr>
-          <w:rFonts w:ascii="Verdana" w:hAnsi="Verdana"/>
-          <w:b/>
-          <w:sz w:val="32"/>
-          <w:szCs w:val="32"/>
-        </w:rPr>
-        <w:t>Other functions:</w:t>
-      </w:r>
-    </w:p>
-    <w:p>
-      <w:pPr>
-        <w:pStyle w:val="NoSpacing"/>
-        <w:pBdr>
-          <w:top w:val="single" w:sz="4" w:space="1" w:color="auto"/>
-          <w:left w:val="single" w:sz="4" w:space="4" w:color="auto"/>
-          <w:bottom w:val="single" w:sz="4" w:space="1" w:color="auto"/>
-          <w:right w:val="single" w:sz="4" w:space="4" w:color="auto"/>
-        </w:pBdr>
-        <w:rPr>
-          <w:rFonts w:ascii="Verdana" w:hAnsi="Verdana"/>
-          <w:sz w:val="32"/>
-          <w:szCs w:val="32"/>
-        </w:rPr>
-      </w:pPr>
-      <w:r>
-        <w:rPr>
-          <w:rFonts w:ascii="Verdana" w:hAnsi="Verdana"/>
-          <w:sz w:val="32"/>
-          <w:szCs w:val="32"/>
-        </w:rPr>
-        <w:t>` = Enter Command</w:t>
-      </w:r>
-    </w:p>
-    <w:p>
-      <w:pPr>
-        <w:pStyle w:val="NoSpacing"/>
-        <w:pBdr>
-          <w:top w:val="single" w:sz="4" w:space="1" w:color="auto"/>
-          <w:left w:val="single" w:sz="4" w:space="4" w:color="auto"/>
-          <w:bottom w:val="single" w:sz="4" w:space="1" w:color="auto"/>
-          <w:right w:val="single" w:sz="4" w:space="4" w:color="auto"/>
-        </w:pBdr>
-        <w:rPr>
-          <w:rFonts w:ascii="Verdana" w:hAnsi="Verdana"/>
-          <w:sz w:val="32"/>
-          <w:szCs w:val="32"/>
-        </w:rPr>
-      </w:pPr>
-      <w:r>
-        <w:rPr>
-          <w:rFonts w:ascii="Verdana" w:hAnsi="Verdana"/>
-          <w:sz w:val="32"/>
-          <w:szCs w:val="32"/>
-        </w:rPr>
-        <w:t>ESC = Main Menu</w:t>
-      </w:r>
-    </w:p>
-    <w:p>
-      <w:pPr>
-        <w:pStyle w:val="NoSpacing"/>
-        <w:pBdr>
-          <w:top w:val="single" w:sz="4" w:space="1" w:color="auto"/>
-          <w:left w:val="single" w:sz="4" w:space="4" w:color="auto"/>
-          <w:bottom w:val="single" w:sz="4" w:space="1" w:color="auto"/>
-          <w:right w:val="single" w:sz="4" w:space="4" w:color="auto"/>
-        </w:pBdr>
-        <w:rPr>
-          <w:rFonts w:ascii="Verdana" w:hAnsi="Verdana"/>
-          <w:sz w:val="32"/>
-          <w:szCs w:val="32"/>
-        </w:rPr>
-      </w:pPr>
-      <w:r>
-        <w:rPr>
-          <w:rFonts w:ascii="Verdana" w:hAnsi="Verdana"/>
-          <w:sz w:val="32"/>
-          <w:szCs w:val="32"/>
-        </w:rPr>
-        <w:t>F1 = Help</w:t>
-      </w:r>
-    </w:p>
-    <w:p>
-      <w:pPr>
-        <w:pStyle w:val="NoSpacing"/>
-        <w:pBdr>
-          <w:top w:val="single" w:sz="4" w:space="1" w:color="auto"/>
-          <w:left w:val="single" w:sz="4" w:space="4" w:color="auto"/>
-          <w:bottom w:val="single" w:sz="4" w:space="1" w:color="auto"/>
-          <w:right w:val="single" w:sz="4" w:space="4" w:color="auto"/>
-        </w:pBdr>
-        <w:rPr>
-          <w:rFonts w:ascii="Verdana" w:hAnsi="Verdana"/>
-          <w:sz w:val="32"/>
-          <w:szCs w:val="32"/>
-        </w:rPr>
-      </w:pPr>
-      <w:r>
-        <w:rPr>
-          <w:rFonts w:ascii="Verdana" w:hAnsi="Verdana"/>
-          <w:sz w:val="32"/>
-          <w:szCs w:val="32"/>
-        </w:rPr>
-        <w:t>F2 = Save Level</w:t>
-      </w:r>
-    </w:p>
-    <w:p>
-      <w:pPr>
-        <w:pStyle w:val="NoSpacing"/>
-        <w:pBdr>
-          <w:top w:val="single" w:sz="4" w:space="1" w:color="auto"/>
-          <w:left w:val="single" w:sz="4" w:space="4" w:color="auto"/>
-          <w:bottom w:val="single" w:sz="4" w:space="1" w:color="auto"/>
-          <w:right w:val="single" w:sz="4" w:space="4" w:color="auto"/>
-        </w:pBdr>
-        <w:rPr>
-          <w:rFonts w:ascii="Verdana" w:hAnsi="Verdana"/>
-          <w:sz w:val="32"/>
-          <w:szCs w:val="32"/>
-        </w:rPr>
-      </w:pPr>
-      <w:r>
-        <w:rPr>
-          <w:rFonts w:ascii="Verdana" w:hAnsi="Verdana"/>
-          <w:sz w:val="32"/>
-          <w:szCs w:val="32"/>
-        </w:rPr>
-        <w:t>F3 = Load Level</w:t>
-      </w:r>
-    </w:p>
-    <w:p>
-      <w:pPr>
-        <w:pStyle w:val="NoSpacing"/>
-        <w:pBdr>
-          <w:top w:val="single" w:sz="4" w:space="1" w:color="auto"/>
-          <w:left w:val="single" w:sz="4" w:space="4" w:color="auto"/>
-          <w:bottom w:val="single" w:sz="4" w:space="1" w:color="auto"/>
-          <w:right w:val="single" w:sz="4" w:space="4" w:color="auto"/>
-        </w:pBdr>
-        <w:rPr>
-          <w:rFonts w:ascii="Verdana" w:hAnsi="Verdana"/>
-          <w:sz w:val="32"/>
-          <w:szCs w:val="32"/>
-        </w:rPr>
-      </w:pPr>
-      <w:r>
-        <w:rPr>
-          <w:rFonts w:ascii="Verdana" w:hAnsi="Verdana"/>
-          <w:sz w:val="32"/>
-          <w:szCs w:val="32"/>
-        </w:rPr>
-        <w:t>F12 = Take Screenshot</w:t>
-      </w:r>
-    </w:p>
-    <w:p>
-      <w:pPr>
-        <w:pStyle w:val="NoSpacing"/>
-        <w:pBdr>
-          <w:top w:val="single" w:sz="4" w:space="1" w:color="auto"/>
-          <w:left w:val="single" w:sz="4" w:space="4" w:color="auto"/>
-          <w:bottom w:val="single" w:sz="4" w:space="1" w:color="auto"/>
-          <w:right w:val="single" w:sz="4" w:space="4" w:color="auto"/>
-        </w:pBdr>
-        <w:rPr>
-          <w:rFonts w:ascii="Verdana" w:hAnsi="Verdana"/>
-          <w:sz w:val="32"/>
-          <w:szCs w:val="32"/>
-        </w:rPr>
-      </w:pPr>
-      <w:r>
-        <w:rPr>
-          <w:rFonts w:ascii="Verdana" w:hAnsi="Verdana"/>
-          <w:sz w:val="32"/>
-          <w:szCs w:val="32"/>
-        </w:rPr>
-        <w:t>P = Change Crosshair Color</w:t>
-      </w:r>
-    </w:p>
-    <w:p>
-      <w:pPr>
-        <w:pStyle w:val="NoSpacing"/>
-        <w:rPr>
-          <w:rFonts w:ascii="Verdana" w:hAnsi="Verdana"/>
-          <w:b/>
-          <w:sz w:val="32"/>
-          <w:szCs w:val="32"/>
-        </w:rPr>
-      </w:pPr>
-    </w:p>
-    <w:p>
-      <w:pPr>
-        <w:pStyle w:val="NoSpacing"/>
-        <w:pBdr>
-          <w:top w:val="single" w:sz="4" w:space="1" w:color="auto"/>
-          <w:left w:val="single" w:sz="4" w:space="4" w:color="auto"/>
-          <w:bottom w:val="single" w:sz="4" w:space="1" w:color="auto"/>
-          <w:right w:val="single" w:sz="4" w:space="4" w:color="auto"/>
-        </w:pBdr>
-        <w:rPr>
-          <w:rFonts w:ascii="Verdana" w:hAnsi="Verdana"/>
-          <w:b/>
-          <w:sz w:val="48"/>
-          <w:szCs w:val="32"/>
-        </w:rPr>
-      </w:pPr>
-      <w:r>
-        <w:rPr>
-          <w:rFonts w:ascii="Verdana" w:hAnsi="Verdana"/>
-          <w:b/>
-          <w:sz w:val="48"/>
-          <w:szCs w:val="32"/>
-        </w:rPr>
-        <w:lastRenderedPageBreak/>
-        <w:t>N</w:t>
-      </w:r>
-      <w:r>
-        <w:rPr>
-          <w:rFonts w:ascii="Verdana" w:hAnsi="Verdana"/>
-          <w:b/>
-          <w:sz w:val="48"/>
-          <w:szCs w:val="32"/>
-        </w:rPr>
-        <w:t>otes:</w:t>
+        <w:t xml:space="preserve">quit, </w:t>
+      </w:r>
+      <w:proofErr w:type="gramStart"/>
+      <w:r>
+        <w:rPr>
+          <w:rFonts w:ascii="Verdana" w:hAnsi="Verdana"/>
+          <w:sz w:val="32"/>
+          <w:szCs w:val="32"/>
+        </w:rPr>
+        <w:t>exit</w:t>
+      </w:r>
+      <w:r>
+        <w:rPr>
+          <w:rFonts w:ascii="Verdana" w:hAnsi="Verdana"/>
+          <w:sz w:val="32"/>
+          <w:szCs w:val="32"/>
+        </w:rPr>
+        <w:t xml:space="preserve"> :</w:t>
+      </w:r>
+      <w:proofErr w:type="gramEnd"/>
+      <w:r>
+        <w:rPr>
+          <w:rFonts w:ascii="Verdana" w:hAnsi="Verdana"/>
+          <w:sz w:val="32"/>
+          <w:szCs w:val="32"/>
+        </w:rPr>
+        <w:t xml:space="preserve"> leaves the game.</w:t>
       </w:r>
     </w:p>
     <w:p>
@@ -2461,10 +1457,28 @@
       <w:r>
         <w:rPr>
           <w:rFonts w:ascii="Verdana" w:hAnsi="Verdana"/>
-          <w:sz w:val="32"/>
-          <w:szCs w:val="32"/>
-        </w:rPr>
-        <w:t>Game uses LWJGL 3.2.3 since v 02 (BELARUS).</w:t>
+          <w:b/>
+          <w:bCs/>
+          <w:sz w:val="32"/>
+          <w:szCs w:val="32"/>
+        </w:rPr>
+        <w:t>cache</w:t>
+      </w:r>
+      <w:r>
+        <w:rPr>
+          <w:rFonts w:ascii="Verdana" w:hAnsi="Verdana"/>
+          <w:sz w:val="32"/>
+          <w:szCs w:val="32"/>
+        </w:rPr>
+        <w:t>:</w:t>
+      </w:r>
+      <w:r>
+        <w:rPr>
+          <w:rFonts w:ascii="Verdana" w:hAnsi="Verdana"/>
+          <w:sz w:val="32"/>
+          <w:szCs w:val="32"/>
+        </w:rPr>
+        <w:t xml:space="preserve"> displays info about cached chunks: &lt;id&gt;&lt;size&gt;&lt;filename&gt;</w:t>
       </w:r>
     </w:p>
     <w:p>
@@ -2489,38 +1503,26 @@
       <w:r>
         <w:rPr>
           <w:rFonts w:ascii="Verdana" w:hAnsi="Verdana"/>
-          <w:sz w:val="32"/>
-          <w:szCs w:val="32"/>
-        </w:rPr>
-        <w:t xml:space="preserve">Game requires Quad Core processor with support for at least 4 threads. </w:t>
-      </w:r>
-      <w:r>
-        <w:rPr>
-          <w:rFonts w:ascii="Verdana" w:hAnsi="Verdana"/>
-          <w:sz w:val="32"/>
-          <w:szCs w:val="32"/>
-        </w:rPr>
-        <w:t>Game implementation is multithreaded (</w:t>
-      </w:r>
-      <w:r>
-        <w:rPr>
-          <w:rFonts w:ascii="Verdana" w:hAnsi="Verdana"/>
-          <w:sz w:val="32"/>
-          <w:szCs w:val="32"/>
-        </w:rPr>
-        <w:t xml:space="preserve">at most time </w:t>
-      </w:r>
-      <w:r>
-        <w:rPr>
-          <w:rFonts w:ascii="Verdana" w:hAnsi="Verdana"/>
-          <w:sz w:val="32"/>
-          <w:szCs w:val="32"/>
-        </w:rPr>
-        <w:t>3</w:t>
-      </w:r>
-      <w:r>
-        <w:rPr>
-          <w:rFonts w:ascii="Verdana" w:hAnsi="Verdana"/>
+          <w:b/>
+          <w:bCs/>
+          <w:sz w:val="32"/>
+          <w:szCs w:val="32"/>
+        </w:rPr>
+        <w:t>clear</w:t>
+      </w:r>
+      <w:r>
+        <w:rPr>
+          <w:rFonts w:ascii="Verdana" w:hAnsi="Verdana"/>
+          <w:sz w:val="32"/>
+          <w:szCs w:val="32"/>
+        </w:rPr>
+        <w:t>:</w:t>
+      </w:r>
+      <w:r>
+        <w:rPr>
+          <w:rFonts w:ascii="Verdana" w:hAnsi="Verdana"/>
+          <w:b/>
+          <w:bCs/>
           <w:sz w:val="32"/>
           <w:szCs w:val="32"/>
         </w:rPr>
@@ -2532,31 +1534,1083 @@
           <w:sz w:val="32"/>
           <w:szCs w:val="32"/>
         </w:rPr>
-        <w:t>threads will</w:t>
-      </w:r>
-      <w:r>
-        <w:rPr>
-          <w:rFonts w:ascii="Verdana" w:hAnsi="Verdana"/>
-          <w:sz w:val="32"/>
-          <w:szCs w:val="32"/>
-        </w:rPr>
-        <w:t xml:space="preserve"> be active</w:t>
-      </w:r>
-      <w:r>
-        <w:rPr>
-          <w:rFonts w:ascii="Verdana" w:hAnsi="Verdana"/>
-          <w:sz w:val="32"/>
-          <w:szCs w:val="32"/>
-        </w:rPr>
-        <w:t xml:space="preserve"> + 1 additional thread if random level generator is being used or when loading or saving level is in progress</w:t>
-      </w:r>
-      <w:r>
-        <w:rPr>
-          <w:rFonts w:ascii="Verdana" w:hAnsi="Verdana"/>
-          <w:sz w:val="32"/>
-          <w:szCs w:val="32"/>
-        </w:rPr>
-        <w:t>).</w:t>
+        <w:t>clears the console history.</w:t>
+      </w:r>
+    </w:p>
+    <w:p>
+      <w:pPr>
+        <w:pStyle w:val="NoSpacing"/>
+        <w:rPr>
+          <w:rFonts w:ascii="Verdana" w:hAnsi="Verdana"/>
+          <w:b/>
+          <w:sz w:val="32"/>
+          <w:szCs w:val="32"/>
+        </w:rPr>
+      </w:pPr>
+    </w:p>
+    <w:p>
+      <w:pPr>
+        <w:pStyle w:val="NoSpacing"/>
+        <w:pBdr>
+          <w:top w:val="single" w:sz="4" w:space="1" w:color="auto"/>
+          <w:left w:val="single" w:sz="4" w:space="4" w:color="auto"/>
+          <w:bottom w:val="single" w:sz="4" w:space="1" w:color="auto"/>
+          <w:right w:val="single" w:sz="4" w:space="4" w:color="auto"/>
+        </w:pBdr>
+        <w:rPr>
+          <w:rFonts w:ascii="Verdana" w:hAnsi="Verdana"/>
+          <w:b/>
+          <w:sz w:val="32"/>
+          <w:szCs w:val="32"/>
+        </w:rPr>
+      </w:pPr>
+      <w:r>
+        <w:rPr>
+          <w:rFonts w:ascii="Verdana" w:hAnsi="Verdana"/>
+          <w:b/>
+          <w:sz w:val="32"/>
+          <w:szCs w:val="32"/>
+        </w:rPr>
+        <w:t xml:space="preserve">HELP </w:t>
+      </w:r>
+    </w:p>
+    <w:p>
+      <w:pPr>
+        <w:pStyle w:val="NoSpacing"/>
+        <w:pBdr>
+          <w:top w:val="single" w:sz="4" w:space="1" w:color="auto"/>
+          <w:left w:val="single" w:sz="4" w:space="4" w:color="auto"/>
+          <w:bottom w:val="single" w:sz="4" w:space="1" w:color="auto"/>
+          <w:right w:val="single" w:sz="4" w:space="4" w:color="auto"/>
+        </w:pBdr>
+        <w:rPr>
+          <w:rFonts w:ascii="Verdana" w:hAnsi="Verdana"/>
+          <w:b/>
+          <w:sz w:val="32"/>
+          <w:szCs w:val="32"/>
+        </w:rPr>
+      </w:pPr>
+    </w:p>
+    <w:p>
+      <w:pPr>
+        <w:pStyle w:val="NoSpacing"/>
+        <w:pBdr>
+          <w:top w:val="single" w:sz="4" w:space="1" w:color="auto"/>
+          <w:left w:val="single" w:sz="4" w:space="4" w:color="auto"/>
+          <w:bottom w:val="single" w:sz="4" w:space="1" w:color="auto"/>
+          <w:right w:val="single" w:sz="4" w:space="4" w:color="auto"/>
+        </w:pBdr>
+        <w:rPr>
+          <w:rFonts w:ascii="Verdana" w:hAnsi="Verdana"/>
+          <w:b/>
+          <w:sz w:val="32"/>
+          <w:szCs w:val="32"/>
+        </w:rPr>
+      </w:pPr>
+      <w:r>
+        <w:rPr>
+          <w:rFonts w:ascii="Verdana" w:hAnsi="Verdana"/>
+          <w:b/>
+          <w:sz w:val="32"/>
+          <w:szCs w:val="32"/>
+        </w:rPr>
+        <w:t>Camera movements:</w:t>
+      </w:r>
+    </w:p>
+    <w:p>
+      <w:pPr>
+        <w:pStyle w:val="NoSpacing"/>
+        <w:pBdr>
+          <w:top w:val="single" w:sz="4" w:space="1" w:color="auto"/>
+          <w:left w:val="single" w:sz="4" w:space="4" w:color="auto"/>
+          <w:bottom w:val="single" w:sz="4" w:space="1" w:color="auto"/>
+          <w:right w:val="single" w:sz="4" w:space="4" w:color="auto"/>
+        </w:pBdr>
+        <w:rPr>
+          <w:rFonts w:ascii="Verdana" w:hAnsi="Verdana"/>
+          <w:sz w:val="32"/>
+          <w:szCs w:val="32"/>
+        </w:rPr>
+      </w:pPr>
+      <w:r>
+        <w:rPr>
+          <w:rFonts w:ascii="Verdana" w:hAnsi="Verdana"/>
+          <w:sz w:val="32"/>
+          <w:szCs w:val="32"/>
+        </w:rPr>
+        <w:lastRenderedPageBreak/>
+        <w:t xml:space="preserve">W, </w:t>
+      </w:r>
+      <w:proofErr w:type="spellStart"/>
+      <w:r>
+        <w:rPr>
+          <w:rFonts w:ascii="Verdana" w:hAnsi="Verdana"/>
+          <w:sz w:val="32"/>
+          <w:szCs w:val="32"/>
+        </w:rPr>
+        <w:t>UpArrow</w:t>
+      </w:r>
+      <w:proofErr w:type="spellEnd"/>
+      <w:r>
+        <w:rPr>
+          <w:rFonts w:ascii="Verdana" w:hAnsi="Verdana"/>
+          <w:sz w:val="32"/>
+          <w:szCs w:val="32"/>
+        </w:rPr>
+        <w:t xml:space="preserve"> = Forward</w:t>
+      </w:r>
+    </w:p>
+    <w:p>
+      <w:pPr>
+        <w:pStyle w:val="NoSpacing"/>
+        <w:pBdr>
+          <w:top w:val="single" w:sz="4" w:space="1" w:color="auto"/>
+          <w:left w:val="single" w:sz="4" w:space="4" w:color="auto"/>
+          <w:bottom w:val="single" w:sz="4" w:space="1" w:color="auto"/>
+          <w:right w:val="single" w:sz="4" w:space="4" w:color="auto"/>
+        </w:pBdr>
+        <w:rPr>
+          <w:rFonts w:ascii="Verdana" w:hAnsi="Verdana"/>
+          <w:sz w:val="32"/>
+          <w:szCs w:val="32"/>
+        </w:rPr>
+      </w:pPr>
+      <w:r>
+        <w:rPr>
+          <w:rFonts w:ascii="Verdana" w:hAnsi="Verdana"/>
+          <w:sz w:val="32"/>
+          <w:szCs w:val="32"/>
+        </w:rPr>
+        <w:t xml:space="preserve">A, </w:t>
+      </w:r>
+      <w:proofErr w:type="spellStart"/>
+      <w:r>
+        <w:rPr>
+          <w:rFonts w:ascii="Verdana" w:hAnsi="Verdana"/>
+          <w:sz w:val="32"/>
+          <w:szCs w:val="32"/>
+        </w:rPr>
+        <w:t>DownArrow</w:t>
+      </w:r>
+      <w:proofErr w:type="spellEnd"/>
+      <w:r>
+        <w:rPr>
+          <w:rFonts w:ascii="Verdana" w:hAnsi="Verdana"/>
+          <w:sz w:val="32"/>
+          <w:szCs w:val="32"/>
+        </w:rPr>
+        <w:t xml:space="preserve"> = Backward</w:t>
+      </w:r>
+    </w:p>
+    <w:p>
+      <w:pPr>
+        <w:pStyle w:val="NoSpacing"/>
+        <w:pBdr>
+          <w:top w:val="single" w:sz="4" w:space="1" w:color="auto"/>
+          <w:left w:val="single" w:sz="4" w:space="4" w:color="auto"/>
+          <w:bottom w:val="single" w:sz="4" w:space="1" w:color="auto"/>
+          <w:right w:val="single" w:sz="4" w:space="4" w:color="auto"/>
+        </w:pBdr>
+        <w:rPr>
+          <w:rFonts w:ascii="Verdana" w:hAnsi="Verdana"/>
+          <w:sz w:val="32"/>
+          <w:szCs w:val="32"/>
+        </w:rPr>
+      </w:pPr>
+      <w:r>
+        <w:rPr>
+          <w:rFonts w:ascii="Verdana" w:hAnsi="Verdana"/>
+          <w:sz w:val="32"/>
+          <w:szCs w:val="32"/>
+        </w:rPr>
+        <w:t>S = Strafe Left</w:t>
+      </w:r>
+    </w:p>
+    <w:p>
+      <w:pPr>
+        <w:pStyle w:val="NoSpacing"/>
+        <w:pBdr>
+          <w:top w:val="single" w:sz="4" w:space="1" w:color="auto"/>
+          <w:left w:val="single" w:sz="4" w:space="4" w:color="auto"/>
+          <w:bottom w:val="single" w:sz="4" w:space="1" w:color="auto"/>
+          <w:right w:val="single" w:sz="4" w:space="4" w:color="auto"/>
+        </w:pBdr>
+        <w:rPr>
+          <w:rFonts w:ascii="Verdana" w:hAnsi="Verdana"/>
+          <w:sz w:val="32"/>
+          <w:szCs w:val="32"/>
+        </w:rPr>
+      </w:pPr>
+      <w:r>
+        <w:rPr>
+          <w:rFonts w:ascii="Verdana" w:hAnsi="Verdana"/>
+          <w:sz w:val="32"/>
+          <w:szCs w:val="32"/>
+        </w:rPr>
+        <w:t>D = Strafe Right</w:t>
+      </w:r>
+    </w:p>
+    <w:p>
+      <w:pPr>
+        <w:pStyle w:val="NoSpacing"/>
+        <w:pBdr>
+          <w:top w:val="single" w:sz="4" w:space="1" w:color="auto"/>
+          <w:left w:val="single" w:sz="4" w:space="4" w:color="auto"/>
+          <w:bottom w:val="single" w:sz="4" w:space="1" w:color="auto"/>
+          <w:right w:val="single" w:sz="4" w:space="4" w:color="auto"/>
+        </w:pBdr>
+        <w:rPr>
+          <w:rFonts w:ascii="Verdana" w:hAnsi="Verdana"/>
+          <w:sz w:val="32"/>
+          <w:szCs w:val="32"/>
+        </w:rPr>
+      </w:pPr>
+      <w:proofErr w:type="spellStart"/>
+      <w:r>
+        <w:rPr>
+          <w:rFonts w:ascii="Verdana" w:hAnsi="Verdana"/>
+          <w:sz w:val="32"/>
+          <w:szCs w:val="32"/>
+        </w:rPr>
+        <w:t>LeftArrow</w:t>
+      </w:r>
+      <w:proofErr w:type="spellEnd"/>
+      <w:r>
+        <w:rPr>
+          <w:rFonts w:ascii="Verdana" w:hAnsi="Verdana"/>
+          <w:sz w:val="32"/>
+          <w:szCs w:val="32"/>
+        </w:rPr>
+        <w:t xml:space="preserve"> = Turn Left</w:t>
+      </w:r>
+    </w:p>
+    <w:p>
+      <w:pPr>
+        <w:pStyle w:val="NoSpacing"/>
+        <w:pBdr>
+          <w:top w:val="single" w:sz="4" w:space="1" w:color="auto"/>
+          <w:left w:val="single" w:sz="4" w:space="4" w:color="auto"/>
+          <w:bottom w:val="single" w:sz="4" w:space="1" w:color="auto"/>
+          <w:right w:val="single" w:sz="4" w:space="4" w:color="auto"/>
+        </w:pBdr>
+        <w:rPr>
+          <w:rFonts w:ascii="Verdana" w:hAnsi="Verdana"/>
+          <w:sz w:val="32"/>
+          <w:szCs w:val="32"/>
+        </w:rPr>
+      </w:pPr>
+      <w:proofErr w:type="spellStart"/>
+      <w:r>
+        <w:rPr>
+          <w:rFonts w:ascii="Verdana" w:hAnsi="Verdana"/>
+          <w:sz w:val="32"/>
+          <w:szCs w:val="32"/>
+        </w:rPr>
+        <w:t>RightArrow</w:t>
+      </w:r>
+      <w:proofErr w:type="spellEnd"/>
+      <w:r>
+        <w:rPr>
+          <w:rFonts w:ascii="Verdana" w:hAnsi="Verdana"/>
+          <w:sz w:val="32"/>
+          <w:szCs w:val="32"/>
+        </w:rPr>
+        <w:t xml:space="preserve"> = Turn Right</w:t>
+      </w:r>
+    </w:p>
+    <w:p>
+      <w:pPr>
+        <w:pStyle w:val="NoSpacing"/>
+        <w:pBdr>
+          <w:top w:val="single" w:sz="4" w:space="1" w:color="auto"/>
+          <w:left w:val="single" w:sz="4" w:space="4" w:color="auto"/>
+          <w:bottom w:val="single" w:sz="4" w:space="1" w:color="auto"/>
+          <w:right w:val="single" w:sz="4" w:space="4" w:color="auto"/>
+        </w:pBdr>
+        <w:rPr>
+          <w:rFonts w:ascii="Verdana" w:hAnsi="Verdana"/>
+          <w:b/>
+          <w:sz w:val="32"/>
+          <w:szCs w:val="32"/>
+        </w:rPr>
+      </w:pPr>
+    </w:p>
+    <w:p>
+      <w:pPr>
+        <w:pStyle w:val="NoSpacing"/>
+        <w:pBdr>
+          <w:top w:val="single" w:sz="4" w:space="1" w:color="auto"/>
+          <w:left w:val="single" w:sz="4" w:space="4" w:color="auto"/>
+          <w:bottom w:val="single" w:sz="4" w:space="1" w:color="auto"/>
+          <w:right w:val="single" w:sz="4" w:space="4" w:color="auto"/>
+        </w:pBdr>
+        <w:rPr>
+          <w:rFonts w:ascii="Verdana" w:hAnsi="Verdana"/>
+          <w:b/>
+          <w:sz w:val="32"/>
+          <w:szCs w:val="32"/>
+        </w:rPr>
+      </w:pPr>
+      <w:r>
+        <w:rPr>
+          <w:rFonts w:ascii="Verdana" w:hAnsi="Verdana"/>
+          <w:b/>
+          <w:sz w:val="32"/>
+          <w:szCs w:val="32"/>
+        </w:rPr>
+        <w:t>Player functions:</w:t>
+      </w:r>
+    </w:p>
+    <w:p>
+      <w:pPr>
+        <w:pStyle w:val="NoSpacing"/>
+        <w:pBdr>
+          <w:top w:val="single" w:sz="4" w:space="1" w:color="auto"/>
+          <w:left w:val="single" w:sz="4" w:space="4" w:color="auto"/>
+          <w:bottom w:val="single" w:sz="4" w:space="1" w:color="auto"/>
+          <w:right w:val="single" w:sz="4" w:space="4" w:color="auto"/>
+        </w:pBdr>
+        <w:rPr>
+          <w:rFonts w:ascii="Verdana" w:hAnsi="Verdana"/>
+          <w:sz w:val="32"/>
+          <w:szCs w:val="32"/>
+        </w:rPr>
+      </w:pPr>
+      <w:r>
+        <w:rPr>
+          <w:rFonts w:ascii="Verdana" w:hAnsi="Verdana"/>
+          <w:sz w:val="32"/>
+          <w:szCs w:val="32"/>
+        </w:rPr>
+        <w:t>1 = Pistol</w:t>
+      </w:r>
+    </w:p>
+    <w:p>
+      <w:pPr>
+        <w:pStyle w:val="NoSpacing"/>
+        <w:pBdr>
+          <w:top w:val="single" w:sz="4" w:space="1" w:color="auto"/>
+          <w:left w:val="single" w:sz="4" w:space="4" w:color="auto"/>
+          <w:bottom w:val="single" w:sz="4" w:space="1" w:color="auto"/>
+          <w:right w:val="single" w:sz="4" w:space="4" w:color="auto"/>
+        </w:pBdr>
+        <w:rPr>
+          <w:rFonts w:ascii="Verdana" w:hAnsi="Verdana"/>
+          <w:sz w:val="32"/>
+          <w:szCs w:val="32"/>
+        </w:rPr>
+      </w:pPr>
+      <w:r>
+        <w:rPr>
+          <w:rFonts w:ascii="Verdana" w:hAnsi="Verdana"/>
+          <w:sz w:val="32"/>
+          <w:szCs w:val="32"/>
+        </w:rPr>
+        <w:t>2 = Sub Machine Gun</w:t>
+      </w:r>
+    </w:p>
+    <w:p>
+      <w:pPr>
+        <w:pStyle w:val="NoSpacing"/>
+        <w:pBdr>
+          <w:top w:val="single" w:sz="4" w:space="1" w:color="auto"/>
+          <w:left w:val="single" w:sz="4" w:space="4" w:color="auto"/>
+          <w:bottom w:val="single" w:sz="4" w:space="1" w:color="auto"/>
+          <w:right w:val="single" w:sz="4" w:space="4" w:color="auto"/>
+        </w:pBdr>
+        <w:rPr>
+          <w:rFonts w:ascii="Verdana" w:hAnsi="Verdana"/>
+          <w:sz w:val="32"/>
+          <w:szCs w:val="32"/>
+        </w:rPr>
+      </w:pPr>
+      <w:r>
+        <w:rPr>
+          <w:rFonts w:ascii="Verdana" w:hAnsi="Verdana"/>
+          <w:sz w:val="32"/>
+          <w:szCs w:val="32"/>
+        </w:rPr>
+        <w:t>3 = Shotgun</w:t>
+      </w:r>
+    </w:p>
+    <w:p>
+      <w:pPr>
+        <w:pStyle w:val="NoSpacing"/>
+        <w:pBdr>
+          <w:top w:val="single" w:sz="4" w:space="1" w:color="auto"/>
+          <w:left w:val="single" w:sz="4" w:space="4" w:color="auto"/>
+          <w:bottom w:val="single" w:sz="4" w:space="1" w:color="auto"/>
+          <w:right w:val="single" w:sz="4" w:space="4" w:color="auto"/>
+        </w:pBdr>
+        <w:rPr>
+          <w:rFonts w:ascii="Verdana" w:hAnsi="Verdana"/>
+          <w:sz w:val="32"/>
+          <w:szCs w:val="32"/>
+        </w:rPr>
+      </w:pPr>
+      <w:r>
+        <w:rPr>
+          <w:rFonts w:ascii="Verdana" w:hAnsi="Verdana"/>
+          <w:sz w:val="32"/>
+          <w:szCs w:val="32"/>
+        </w:rPr>
+        <w:t>4 = Assault Rifle</w:t>
+      </w:r>
+    </w:p>
+    <w:p>
+      <w:pPr>
+        <w:pStyle w:val="NoSpacing"/>
+        <w:pBdr>
+          <w:top w:val="single" w:sz="4" w:space="1" w:color="auto"/>
+          <w:left w:val="single" w:sz="4" w:space="4" w:color="auto"/>
+          <w:bottom w:val="single" w:sz="4" w:space="1" w:color="auto"/>
+          <w:right w:val="single" w:sz="4" w:space="4" w:color="auto"/>
+        </w:pBdr>
+        <w:rPr>
+          <w:rFonts w:ascii="Verdana" w:hAnsi="Verdana"/>
+          <w:sz w:val="32"/>
+          <w:szCs w:val="32"/>
+        </w:rPr>
+      </w:pPr>
+      <w:r>
+        <w:rPr>
+          <w:rFonts w:ascii="Verdana" w:hAnsi="Verdana"/>
+          <w:sz w:val="32"/>
+          <w:szCs w:val="32"/>
+        </w:rPr>
+        <w:t>5 = Machine Gun</w:t>
+      </w:r>
+    </w:p>
+    <w:p>
+      <w:pPr>
+        <w:pStyle w:val="NoSpacing"/>
+        <w:pBdr>
+          <w:top w:val="single" w:sz="4" w:space="1" w:color="auto"/>
+          <w:left w:val="single" w:sz="4" w:space="4" w:color="auto"/>
+          <w:bottom w:val="single" w:sz="4" w:space="1" w:color="auto"/>
+          <w:right w:val="single" w:sz="4" w:space="4" w:color="auto"/>
+        </w:pBdr>
+        <w:rPr>
+          <w:rFonts w:ascii="Verdana" w:hAnsi="Verdana"/>
+          <w:sz w:val="32"/>
+          <w:szCs w:val="32"/>
+        </w:rPr>
+      </w:pPr>
+      <w:r>
+        <w:rPr>
+          <w:rFonts w:ascii="Verdana" w:hAnsi="Verdana"/>
+          <w:sz w:val="32"/>
+          <w:szCs w:val="32"/>
+        </w:rPr>
+        <w:t>6 = Sniper Rifle</w:t>
+      </w:r>
+    </w:p>
+    <w:p>
+      <w:pPr>
+        <w:pStyle w:val="NoSpacing"/>
+        <w:pBdr>
+          <w:top w:val="single" w:sz="4" w:space="1" w:color="auto"/>
+          <w:left w:val="single" w:sz="4" w:space="4" w:color="auto"/>
+          <w:bottom w:val="single" w:sz="4" w:space="1" w:color="auto"/>
+          <w:right w:val="single" w:sz="4" w:space="4" w:color="auto"/>
+        </w:pBdr>
+        <w:rPr>
+          <w:rFonts w:ascii="Verdana" w:hAnsi="Verdana"/>
+          <w:sz w:val="32"/>
+          <w:szCs w:val="32"/>
+        </w:rPr>
+      </w:pPr>
+      <w:r>
+        <w:rPr>
+          <w:rFonts w:ascii="Verdana" w:hAnsi="Verdana"/>
+          <w:sz w:val="32"/>
+          <w:szCs w:val="32"/>
+        </w:rPr>
+        <w:t>Mouse1 = Fire [Not implemented]</w:t>
+      </w:r>
+    </w:p>
+    <w:p>
+      <w:pPr>
+        <w:pStyle w:val="NoSpacing"/>
+        <w:pBdr>
+          <w:top w:val="single" w:sz="4" w:space="1" w:color="auto"/>
+          <w:left w:val="single" w:sz="4" w:space="4" w:color="auto"/>
+          <w:bottom w:val="single" w:sz="4" w:space="1" w:color="auto"/>
+          <w:right w:val="single" w:sz="4" w:space="4" w:color="auto"/>
+        </w:pBdr>
+        <w:rPr>
+          <w:rFonts w:ascii="Verdana" w:hAnsi="Verdana"/>
+          <w:b/>
+          <w:sz w:val="32"/>
+          <w:szCs w:val="32"/>
+        </w:rPr>
+      </w:pPr>
+      <w:r>
+        <w:rPr>
+          <w:rFonts w:ascii="Verdana" w:hAnsi="Verdana"/>
+          <w:sz w:val="32"/>
+          <w:szCs w:val="32"/>
+        </w:rPr>
+        <w:t>Mouse2 = Alt-Fire [Not implemented]</w:t>
+      </w:r>
+    </w:p>
+    <w:p>
+      <w:pPr>
+        <w:pStyle w:val="NoSpacing"/>
+        <w:pBdr>
+          <w:top w:val="single" w:sz="4" w:space="1" w:color="auto"/>
+          <w:left w:val="single" w:sz="4" w:space="4" w:color="auto"/>
+          <w:bottom w:val="single" w:sz="4" w:space="1" w:color="auto"/>
+          <w:right w:val="single" w:sz="4" w:space="4" w:color="auto"/>
+        </w:pBdr>
+        <w:rPr>
+          <w:rFonts w:ascii="Verdana" w:hAnsi="Verdana"/>
+          <w:b/>
+          <w:sz w:val="32"/>
+          <w:szCs w:val="32"/>
+        </w:rPr>
+      </w:pPr>
+    </w:p>
+    <w:p>
+      <w:pPr>
+        <w:pStyle w:val="NoSpacing"/>
+        <w:pBdr>
+          <w:top w:val="single" w:sz="4" w:space="1" w:color="auto"/>
+          <w:left w:val="single" w:sz="4" w:space="4" w:color="auto"/>
+          <w:bottom w:val="single" w:sz="4" w:space="1" w:color="auto"/>
+          <w:right w:val="single" w:sz="4" w:space="4" w:color="auto"/>
+        </w:pBdr>
+        <w:rPr>
+          <w:rFonts w:ascii="Verdana" w:hAnsi="Verdana"/>
+          <w:b/>
+          <w:sz w:val="32"/>
+          <w:szCs w:val="32"/>
+        </w:rPr>
+      </w:pPr>
+      <w:r>
+        <w:rPr>
+          <w:rFonts w:ascii="Verdana" w:hAnsi="Verdana"/>
+          <w:b/>
+          <w:sz w:val="32"/>
+          <w:szCs w:val="32"/>
+        </w:rPr>
+        <w:t>Editor functions:</w:t>
+      </w:r>
+    </w:p>
+    <w:p>
+      <w:pPr>
+        <w:pStyle w:val="NoSpacing"/>
+        <w:pBdr>
+          <w:top w:val="single" w:sz="4" w:space="1" w:color="auto"/>
+          <w:left w:val="single" w:sz="4" w:space="4" w:color="auto"/>
+          <w:bottom w:val="single" w:sz="4" w:space="1" w:color="auto"/>
+          <w:right w:val="single" w:sz="4" w:space="4" w:color="auto"/>
+        </w:pBdr>
+        <w:rPr>
+          <w:rFonts w:ascii="Verdana" w:hAnsi="Verdana"/>
+          <w:sz w:val="32"/>
+          <w:szCs w:val="32"/>
+        </w:rPr>
+      </w:pPr>
+      <w:r>
+        <w:rPr>
+          <w:rFonts w:ascii="Verdana" w:hAnsi="Verdana"/>
+          <w:sz w:val="32"/>
+          <w:szCs w:val="32"/>
+        </w:rPr>
+        <w:t>N = Create New Block</w:t>
+      </w:r>
+    </w:p>
+    <w:p>
+      <w:pPr>
+        <w:pStyle w:val="NoSpacing"/>
+        <w:pBdr>
+          <w:top w:val="single" w:sz="4" w:space="1" w:color="auto"/>
+          <w:left w:val="single" w:sz="4" w:space="4" w:color="auto"/>
+          <w:bottom w:val="single" w:sz="4" w:space="1" w:color="auto"/>
+          <w:right w:val="single" w:sz="4" w:space="4" w:color="auto"/>
+        </w:pBdr>
+        <w:rPr>
+          <w:rFonts w:ascii="Verdana" w:hAnsi="Verdana"/>
+          <w:sz w:val="32"/>
+          <w:szCs w:val="32"/>
+        </w:rPr>
+      </w:pPr>
+      <w:r>
+        <w:rPr>
+          <w:rFonts w:ascii="Verdana" w:hAnsi="Verdana"/>
+          <w:sz w:val="32"/>
+          <w:szCs w:val="32"/>
+        </w:rPr>
+        <w:t>M = Change Block Color</w:t>
+      </w:r>
+    </w:p>
+    <w:p>
+      <w:pPr>
+        <w:pStyle w:val="NoSpacing"/>
+        <w:pBdr>
+          <w:top w:val="single" w:sz="4" w:space="1" w:color="auto"/>
+          <w:left w:val="single" w:sz="4" w:space="4" w:color="auto"/>
+          <w:bottom w:val="single" w:sz="4" w:space="1" w:color="auto"/>
+          <w:right w:val="single" w:sz="4" w:space="4" w:color="auto"/>
+        </w:pBdr>
+        <w:rPr>
+          <w:rFonts w:ascii="Verdana" w:hAnsi="Verdana"/>
+          <w:sz w:val="32"/>
+          <w:szCs w:val="32"/>
+        </w:rPr>
+      </w:pPr>
+      <w:r>
+        <w:rPr>
+          <w:rFonts w:ascii="Verdana" w:hAnsi="Verdana"/>
+          <w:sz w:val="32"/>
+          <w:szCs w:val="32"/>
+        </w:rPr>
+        <w:t>Mouse1 = Select Solid Block</w:t>
+      </w:r>
+    </w:p>
+    <w:p>
+      <w:pPr>
+        <w:pStyle w:val="NoSpacing"/>
+        <w:pBdr>
+          <w:top w:val="single" w:sz="4" w:space="1" w:color="auto"/>
+          <w:left w:val="single" w:sz="4" w:space="4" w:color="auto"/>
+          <w:bottom w:val="single" w:sz="4" w:space="1" w:color="auto"/>
+          <w:right w:val="single" w:sz="4" w:space="4" w:color="auto"/>
+        </w:pBdr>
+        <w:rPr>
+          <w:rFonts w:ascii="Verdana" w:hAnsi="Verdana"/>
+          <w:sz w:val="32"/>
+          <w:szCs w:val="32"/>
+        </w:rPr>
+      </w:pPr>
+      <w:r>
+        <w:rPr>
+          <w:rFonts w:ascii="Verdana" w:hAnsi="Verdana"/>
+          <w:sz w:val="32"/>
+          <w:szCs w:val="32"/>
+        </w:rPr>
+        <w:t>Mouse1 + SHIFT = Select Fluid Block</w:t>
+      </w:r>
+    </w:p>
+    <w:p>
+      <w:pPr>
+        <w:pStyle w:val="NoSpacing"/>
+        <w:pBdr>
+          <w:top w:val="single" w:sz="4" w:space="1" w:color="auto"/>
+          <w:left w:val="single" w:sz="4" w:space="4" w:color="auto"/>
+          <w:bottom w:val="single" w:sz="4" w:space="1" w:color="auto"/>
+          <w:right w:val="single" w:sz="4" w:space="4" w:color="auto"/>
+        </w:pBdr>
+        <w:rPr>
+          <w:rFonts w:ascii="Verdana" w:hAnsi="Verdana"/>
+          <w:sz w:val="32"/>
+          <w:szCs w:val="32"/>
+        </w:rPr>
+      </w:pPr>
+      <w:r>
+        <w:rPr>
+          <w:rFonts w:ascii="Verdana" w:hAnsi="Verdana"/>
+          <w:sz w:val="32"/>
+          <w:szCs w:val="32"/>
+        </w:rPr>
+        <w:t>Mouse2 = Place New Block</w:t>
+      </w:r>
+    </w:p>
+    <w:p>
+      <w:pPr>
+        <w:pStyle w:val="NoSpacing"/>
+        <w:pBdr>
+          <w:top w:val="single" w:sz="4" w:space="1" w:color="auto"/>
+          <w:left w:val="single" w:sz="4" w:space="4" w:color="auto"/>
+          <w:bottom w:val="single" w:sz="4" w:space="1" w:color="auto"/>
+          <w:right w:val="single" w:sz="4" w:space="4" w:color="auto"/>
+        </w:pBdr>
+        <w:rPr>
+          <w:rFonts w:ascii="Verdana" w:hAnsi="Verdana"/>
+          <w:sz w:val="32"/>
+          <w:szCs w:val="32"/>
+        </w:rPr>
+      </w:pPr>
+      <w:r>
+        <w:rPr>
+          <w:rFonts w:ascii="Verdana" w:hAnsi="Verdana"/>
+          <w:sz w:val="32"/>
+          <w:szCs w:val="32"/>
+        </w:rPr>
+        <w:t>1-6 = Select Adjacent Solid Block</w:t>
+      </w:r>
+    </w:p>
+    <w:p>
+      <w:pPr>
+        <w:pStyle w:val="NoSpacing"/>
+        <w:pBdr>
+          <w:top w:val="single" w:sz="4" w:space="1" w:color="auto"/>
+          <w:left w:val="single" w:sz="4" w:space="4" w:color="auto"/>
+          <w:bottom w:val="single" w:sz="4" w:space="1" w:color="auto"/>
+          <w:right w:val="single" w:sz="4" w:space="4" w:color="auto"/>
+        </w:pBdr>
+        <w:rPr>
+          <w:rFonts w:ascii="Verdana" w:hAnsi="Verdana"/>
+          <w:sz w:val="32"/>
+          <w:szCs w:val="32"/>
+        </w:rPr>
+      </w:pPr>
+      <w:r>
+        <w:rPr>
+          <w:rFonts w:ascii="Verdana" w:hAnsi="Verdana"/>
+          <w:sz w:val="32"/>
+          <w:szCs w:val="32"/>
+        </w:rPr>
+        <w:t>1-6 + SHIFT = Select Adjacent Fluid Block</w:t>
+      </w:r>
+    </w:p>
+    <w:p>
+      <w:pPr>
+        <w:pStyle w:val="NoSpacing"/>
+        <w:pBdr>
+          <w:top w:val="single" w:sz="4" w:space="1" w:color="auto"/>
+          <w:left w:val="single" w:sz="4" w:space="4" w:color="auto"/>
+          <w:bottom w:val="single" w:sz="4" w:space="1" w:color="auto"/>
+          <w:right w:val="single" w:sz="4" w:space="4" w:color="auto"/>
+        </w:pBdr>
+        <w:rPr>
+          <w:rFonts w:ascii="Verdana" w:hAnsi="Verdana"/>
+          <w:sz w:val="32"/>
+          <w:szCs w:val="32"/>
+        </w:rPr>
+      </w:pPr>
+      <w:r>
+        <w:rPr>
+          <w:rFonts w:ascii="Verdana" w:hAnsi="Verdana"/>
+          <w:sz w:val="32"/>
+          <w:szCs w:val="32"/>
+        </w:rPr>
+        <w:t>F, 0 = Deselect</w:t>
+      </w:r>
+    </w:p>
+    <w:p>
+      <w:pPr>
+        <w:pStyle w:val="NoSpacing"/>
+        <w:pBdr>
+          <w:top w:val="single" w:sz="4" w:space="1" w:color="auto"/>
+          <w:left w:val="single" w:sz="4" w:space="4" w:color="auto"/>
+          <w:bottom w:val="single" w:sz="4" w:space="1" w:color="auto"/>
+          <w:right w:val="single" w:sz="4" w:space="4" w:color="auto"/>
+        </w:pBdr>
+        <w:rPr>
+          <w:rFonts w:ascii="Verdana" w:hAnsi="Verdana"/>
+          <w:sz w:val="32"/>
+          <w:szCs w:val="32"/>
+        </w:rPr>
+      </w:pPr>
+      <w:r>
+        <w:rPr>
+          <w:rFonts w:ascii="Verdana" w:hAnsi="Verdana"/>
+          <w:sz w:val="32"/>
+          <w:szCs w:val="32"/>
+        </w:rPr>
+        <w:t>R = Remove Selected Block</w:t>
+      </w:r>
+    </w:p>
+    <w:p>
+      <w:pPr>
+        <w:pStyle w:val="NoSpacing"/>
+        <w:pBdr>
+          <w:top w:val="single" w:sz="4" w:space="1" w:color="auto"/>
+          <w:left w:val="single" w:sz="4" w:space="4" w:color="auto"/>
+          <w:bottom w:val="single" w:sz="4" w:space="1" w:color="auto"/>
+          <w:right w:val="single" w:sz="4" w:space="4" w:color="auto"/>
+        </w:pBdr>
+        <w:rPr>
+          <w:rFonts w:ascii="Verdana" w:hAnsi="Verdana"/>
+          <w:sz w:val="32"/>
+          <w:szCs w:val="32"/>
+        </w:rPr>
+      </w:pPr>
+      <w:r>
+        <w:rPr>
+          <w:rFonts w:ascii="Verdana" w:hAnsi="Verdana"/>
+          <w:sz w:val="32"/>
+          <w:szCs w:val="32"/>
+        </w:rPr>
+        <w:t>[</w:t>
+      </w:r>
+      <w:proofErr w:type="gramStart"/>
+      <w:r>
+        <w:rPr>
+          <w:rFonts w:ascii="Verdana" w:hAnsi="Verdana"/>
+          <w:sz w:val="32"/>
+          <w:szCs w:val="32"/>
+        </w:rPr>
+        <w:t>, ]</w:t>
+      </w:r>
+      <w:proofErr w:type="gramEnd"/>
+      <w:r>
+        <w:rPr>
+          <w:rFonts w:ascii="Verdana" w:hAnsi="Verdana"/>
+          <w:sz w:val="32"/>
+          <w:szCs w:val="32"/>
+        </w:rPr>
+        <w:t xml:space="preserve"> = Change Texture For New Block</w:t>
+      </w:r>
+    </w:p>
+    <w:p>
+      <w:pPr>
+        <w:pStyle w:val="NoSpacing"/>
+        <w:pBdr>
+          <w:top w:val="single" w:sz="4" w:space="1" w:color="auto"/>
+          <w:left w:val="single" w:sz="4" w:space="4" w:color="auto"/>
+          <w:bottom w:val="single" w:sz="4" w:space="1" w:color="auto"/>
+          <w:right w:val="single" w:sz="4" w:space="4" w:color="auto"/>
+        </w:pBdr>
+        <w:rPr>
+          <w:rFonts w:ascii="Verdana" w:hAnsi="Verdana"/>
+          <w:b/>
+          <w:sz w:val="32"/>
+          <w:szCs w:val="32"/>
+        </w:rPr>
+      </w:pPr>
+    </w:p>
+    <w:p>
+      <w:pPr>
+        <w:pStyle w:val="NoSpacing"/>
+        <w:pBdr>
+          <w:top w:val="single" w:sz="4" w:space="1" w:color="auto"/>
+          <w:left w:val="single" w:sz="4" w:space="4" w:color="auto"/>
+          <w:bottom w:val="single" w:sz="4" w:space="1" w:color="auto"/>
+          <w:right w:val="single" w:sz="4" w:space="4" w:color="auto"/>
+        </w:pBdr>
+        <w:rPr>
+          <w:rFonts w:ascii="Verdana" w:hAnsi="Verdana"/>
+          <w:b/>
+          <w:sz w:val="32"/>
+          <w:szCs w:val="32"/>
+        </w:rPr>
+      </w:pPr>
+      <w:r>
+        <w:rPr>
+          <w:rFonts w:ascii="Verdana" w:hAnsi="Verdana"/>
+          <w:b/>
+          <w:sz w:val="32"/>
+          <w:szCs w:val="32"/>
+        </w:rPr>
+        <w:t>Other functions:</w:t>
+      </w:r>
+    </w:p>
+    <w:p>
+      <w:pPr>
+        <w:pStyle w:val="NoSpacing"/>
+        <w:pBdr>
+          <w:top w:val="single" w:sz="4" w:space="1" w:color="auto"/>
+          <w:left w:val="single" w:sz="4" w:space="4" w:color="auto"/>
+          <w:bottom w:val="single" w:sz="4" w:space="1" w:color="auto"/>
+          <w:right w:val="single" w:sz="4" w:space="4" w:color="auto"/>
+        </w:pBdr>
+        <w:rPr>
+          <w:rFonts w:ascii="Verdana" w:hAnsi="Verdana"/>
+          <w:sz w:val="32"/>
+          <w:szCs w:val="32"/>
+        </w:rPr>
+      </w:pPr>
+      <w:r>
+        <w:rPr>
+          <w:rFonts w:ascii="Verdana" w:hAnsi="Verdana"/>
+          <w:sz w:val="32"/>
+          <w:szCs w:val="32"/>
+        </w:rPr>
+        <w:t>` = Enter Command</w:t>
+      </w:r>
+    </w:p>
+    <w:p>
+      <w:pPr>
+        <w:pStyle w:val="NoSpacing"/>
+        <w:pBdr>
+          <w:top w:val="single" w:sz="4" w:space="1" w:color="auto"/>
+          <w:left w:val="single" w:sz="4" w:space="4" w:color="auto"/>
+          <w:bottom w:val="single" w:sz="4" w:space="1" w:color="auto"/>
+          <w:right w:val="single" w:sz="4" w:space="4" w:color="auto"/>
+        </w:pBdr>
+        <w:rPr>
+          <w:rFonts w:ascii="Verdana" w:hAnsi="Verdana"/>
+          <w:sz w:val="32"/>
+          <w:szCs w:val="32"/>
+        </w:rPr>
+      </w:pPr>
+      <w:r>
+        <w:rPr>
+          <w:rFonts w:ascii="Verdana" w:hAnsi="Verdana"/>
+          <w:sz w:val="32"/>
+          <w:szCs w:val="32"/>
+        </w:rPr>
+        <w:t>ESC = Main Menu</w:t>
+      </w:r>
+    </w:p>
+    <w:p>
+      <w:pPr>
+        <w:pStyle w:val="NoSpacing"/>
+        <w:pBdr>
+          <w:top w:val="single" w:sz="4" w:space="1" w:color="auto"/>
+          <w:left w:val="single" w:sz="4" w:space="4" w:color="auto"/>
+          <w:bottom w:val="single" w:sz="4" w:space="1" w:color="auto"/>
+          <w:right w:val="single" w:sz="4" w:space="4" w:color="auto"/>
+        </w:pBdr>
+        <w:rPr>
+          <w:rFonts w:ascii="Verdana" w:hAnsi="Verdana"/>
+          <w:sz w:val="32"/>
+          <w:szCs w:val="32"/>
+        </w:rPr>
+      </w:pPr>
+      <w:r>
+        <w:rPr>
+          <w:rFonts w:ascii="Verdana" w:hAnsi="Verdana"/>
+          <w:sz w:val="32"/>
+          <w:szCs w:val="32"/>
+        </w:rPr>
+        <w:t>F1 = Help</w:t>
+      </w:r>
+    </w:p>
+    <w:p>
+      <w:pPr>
+        <w:pStyle w:val="NoSpacing"/>
+        <w:pBdr>
+          <w:top w:val="single" w:sz="4" w:space="1" w:color="auto"/>
+          <w:left w:val="single" w:sz="4" w:space="4" w:color="auto"/>
+          <w:bottom w:val="single" w:sz="4" w:space="1" w:color="auto"/>
+          <w:right w:val="single" w:sz="4" w:space="4" w:color="auto"/>
+        </w:pBdr>
+        <w:rPr>
+          <w:rFonts w:ascii="Verdana" w:hAnsi="Verdana"/>
+          <w:sz w:val="32"/>
+          <w:szCs w:val="32"/>
+        </w:rPr>
+      </w:pPr>
+      <w:r>
+        <w:rPr>
+          <w:rFonts w:ascii="Verdana" w:hAnsi="Verdana"/>
+          <w:sz w:val="32"/>
+          <w:szCs w:val="32"/>
+        </w:rPr>
+        <w:t>F2 = Save Level</w:t>
+      </w:r>
+    </w:p>
+    <w:p>
+      <w:pPr>
+        <w:pStyle w:val="NoSpacing"/>
+        <w:pBdr>
+          <w:top w:val="single" w:sz="4" w:space="1" w:color="auto"/>
+          <w:left w:val="single" w:sz="4" w:space="4" w:color="auto"/>
+          <w:bottom w:val="single" w:sz="4" w:space="1" w:color="auto"/>
+          <w:right w:val="single" w:sz="4" w:space="4" w:color="auto"/>
+        </w:pBdr>
+        <w:rPr>
+          <w:rFonts w:ascii="Verdana" w:hAnsi="Verdana"/>
+          <w:sz w:val="32"/>
+          <w:szCs w:val="32"/>
+        </w:rPr>
+      </w:pPr>
+      <w:r>
+        <w:rPr>
+          <w:rFonts w:ascii="Verdana" w:hAnsi="Verdana"/>
+          <w:sz w:val="32"/>
+          <w:szCs w:val="32"/>
+        </w:rPr>
+        <w:t>F3 = Load Level</w:t>
+      </w:r>
+    </w:p>
+    <w:p>
+      <w:pPr>
+        <w:pStyle w:val="NoSpacing"/>
+        <w:pBdr>
+          <w:top w:val="single" w:sz="4" w:space="1" w:color="auto"/>
+          <w:left w:val="single" w:sz="4" w:space="4" w:color="auto"/>
+          <w:bottom w:val="single" w:sz="4" w:space="1" w:color="auto"/>
+          <w:right w:val="single" w:sz="4" w:space="4" w:color="auto"/>
+        </w:pBdr>
+        <w:rPr>
+          <w:rFonts w:ascii="Verdana" w:hAnsi="Verdana"/>
+          <w:sz w:val="32"/>
+          <w:szCs w:val="32"/>
+        </w:rPr>
+      </w:pPr>
+      <w:r>
+        <w:rPr>
+          <w:rFonts w:ascii="Verdana" w:hAnsi="Verdana"/>
+          <w:sz w:val="32"/>
+          <w:szCs w:val="32"/>
+        </w:rPr>
+        <w:t>F12 = Take Screenshot</w:t>
+      </w:r>
+    </w:p>
+    <w:p>
+      <w:pPr>
+        <w:pStyle w:val="NoSpacing"/>
+        <w:pBdr>
+          <w:top w:val="single" w:sz="4" w:space="1" w:color="auto"/>
+          <w:left w:val="single" w:sz="4" w:space="4" w:color="auto"/>
+          <w:bottom w:val="single" w:sz="4" w:space="1" w:color="auto"/>
+          <w:right w:val="single" w:sz="4" w:space="4" w:color="auto"/>
+        </w:pBdr>
+        <w:rPr>
+          <w:rFonts w:ascii="Verdana" w:hAnsi="Verdana"/>
+          <w:sz w:val="32"/>
+          <w:szCs w:val="32"/>
+        </w:rPr>
+      </w:pPr>
+      <w:r>
+        <w:rPr>
+          <w:rFonts w:ascii="Verdana" w:hAnsi="Verdana"/>
+          <w:sz w:val="32"/>
+          <w:szCs w:val="32"/>
+        </w:rPr>
+        <w:lastRenderedPageBreak/>
+        <w:t>P = Change Crosshair Color</w:t>
+      </w:r>
+    </w:p>
+    <w:p>
+      <w:pPr>
+        <w:pStyle w:val="NoSpacing"/>
+        <w:rPr>
+          <w:rFonts w:ascii="Verdana" w:hAnsi="Verdana"/>
+          <w:b/>
+          <w:sz w:val="32"/>
+          <w:szCs w:val="32"/>
+        </w:rPr>
+      </w:pPr>
+    </w:p>
+    <w:p>
+      <w:pPr>
+        <w:pStyle w:val="NoSpacing"/>
+        <w:pBdr>
+          <w:top w:val="single" w:sz="4" w:space="1" w:color="auto"/>
+          <w:left w:val="single" w:sz="4" w:space="4" w:color="auto"/>
+          <w:bottom w:val="single" w:sz="4" w:space="1" w:color="auto"/>
+          <w:right w:val="single" w:sz="4" w:space="4" w:color="auto"/>
+        </w:pBdr>
+        <w:rPr>
+          <w:rFonts w:ascii="Verdana" w:hAnsi="Verdana"/>
+          <w:b/>
+          <w:sz w:val="48"/>
+          <w:szCs w:val="32"/>
+        </w:rPr>
+      </w:pPr>
+      <w:r>
+        <w:rPr>
+          <w:rFonts w:ascii="Verdana" w:hAnsi="Verdana"/>
+          <w:b/>
+          <w:sz w:val="48"/>
+          <w:szCs w:val="32"/>
+        </w:rPr>
+        <w:t>N</w:t>
+      </w:r>
+      <w:r>
+        <w:rPr>
+          <w:rFonts w:ascii="Verdana" w:hAnsi="Verdana"/>
+          <w:b/>
+          <w:sz w:val="48"/>
+          <w:szCs w:val="32"/>
+        </w:rPr>
+        <w:t>otes:</w:t>
       </w:r>
     </w:p>
     <w:p>
@@ -2584,7 +2638,7 @@
           <w:sz w:val="32"/>
           <w:szCs w:val="32"/>
         </w:rPr>
-        <w:t>Running the game requires OpenGL 3.3 (on graphic cards since March 2010) or later.</w:t>
+        <w:t>Game uses LWJGL 3.2.3 since v 02 (BELARUS).</w:t>
       </w:r>
     </w:p>
     <w:p>
@@ -2612,7 +2666,145 @@
           <w:sz w:val="32"/>
           <w:szCs w:val="32"/>
         </w:rPr>
-        <w:t>Game is implemented using Java version 1.8. (requires 1.8 or higher).</w:t>
+        <w:t xml:space="preserve">Game requires Quad Core processor with support for at least 4 threads. </w:t>
+      </w:r>
+      <w:r>
+        <w:rPr>
+          <w:rFonts w:ascii="Verdana" w:hAnsi="Verdana"/>
+          <w:sz w:val="32"/>
+          <w:szCs w:val="32"/>
+        </w:rPr>
+        <w:t>Game implementation is multithreaded (</w:t>
+      </w:r>
+      <w:r>
+        <w:rPr>
+          <w:rFonts w:ascii="Verdana" w:hAnsi="Verdana"/>
+          <w:sz w:val="32"/>
+          <w:szCs w:val="32"/>
+        </w:rPr>
+        <w:t xml:space="preserve">at most time </w:t>
+      </w:r>
+      <w:r>
+        <w:rPr>
+          <w:rFonts w:ascii="Verdana" w:hAnsi="Verdana"/>
+          <w:sz w:val="32"/>
+          <w:szCs w:val="32"/>
+        </w:rPr>
+        <w:t>3</w:t>
+      </w:r>
+      <w:r>
+        <w:rPr>
+          <w:rFonts w:ascii="Verdana" w:hAnsi="Verdana"/>
+          <w:sz w:val="32"/>
+          <w:szCs w:val="32"/>
+        </w:rPr>
+        <w:t xml:space="preserve"> </w:t>
+      </w:r>
+      <w:r>
+        <w:rPr>
+          <w:rFonts w:ascii="Verdana" w:hAnsi="Verdana"/>
+          <w:sz w:val="32"/>
+          <w:szCs w:val="32"/>
+        </w:rPr>
+        <w:t>threads will</w:t>
+      </w:r>
+      <w:r>
+        <w:rPr>
+          <w:rFonts w:ascii="Verdana" w:hAnsi="Verdana"/>
+          <w:sz w:val="32"/>
+          <w:szCs w:val="32"/>
+        </w:rPr>
+        <w:t xml:space="preserve"> be active</w:t>
+      </w:r>
+      <w:r>
+        <w:rPr>
+          <w:rFonts w:ascii="Verdana" w:hAnsi="Verdana"/>
+          <w:sz w:val="32"/>
+          <w:szCs w:val="32"/>
+        </w:rPr>
+        <w:t xml:space="preserve"> + 1 additional thread if random level generator is being used or when loading or saving level is in progress</w:t>
+      </w:r>
+      <w:r>
+        <w:rPr>
+          <w:rFonts w:ascii="Verdana" w:hAnsi="Verdana"/>
+          <w:sz w:val="32"/>
+          <w:szCs w:val="32"/>
+        </w:rPr>
+        <w:t>).</w:t>
+      </w:r>
+    </w:p>
+    <w:p>
+      <w:pPr>
+        <w:pStyle w:val="NoSpacing"/>
+        <w:numPr>
+          <w:ilvl w:val="0"/>
+          <w:numId w:val="1"/>
+        </w:numPr>
+        <w:pBdr>
+          <w:top w:val="single" w:sz="4" w:space="1" w:color="auto"/>
+          <w:left w:val="single" w:sz="4" w:space="4" w:color="auto"/>
+          <w:bottom w:val="single" w:sz="4" w:space="1" w:color="auto"/>
+          <w:right w:val="single" w:sz="4" w:space="4" w:color="auto"/>
+        </w:pBdr>
+        <w:rPr>
+          <w:rFonts w:ascii="Verdana" w:hAnsi="Verdana"/>
+          <w:sz w:val="32"/>
+          <w:szCs w:val="32"/>
+        </w:rPr>
+      </w:pPr>
+      <w:r>
+        <w:rPr>
+          <w:rFonts w:ascii="Verdana" w:hAnsi="Verdana"/>
+          <w:sz w:val="32"/>
+          <w:szCs w:val="32"/>
+        </w:rPr>
+        <w:t>Running the game requires OpenGL 3.3 (on graphic cards since March 2010) or later.</w:t>
+      </w:r>
+    </w:p>
+    <w:p>
+      <w:pPr>
+        <w:pStyle w:val="NoSpacing"/>
+        <w:numPr>
+          <w:ilvl w:val="0"/>
+          <w:numId w:val="1"/>
+        </w:numPr>
+        <w:pBdr>
+          <w:top w:val="single" w:sz="4" w:space="1" w:color="auto"/>
+          <w:left w:val="single" w:sz="4" w:space="4" w:color="auto"/>
+          <w:bottom w:val="single" w:sz="4" w:space="1" w:color="auto"/>
+          <w:right w:val="single" w:sz="4" w:space="4" w:color="auto"/>
+        </w:pBdr>
+        <w:rPr>
+          <w:rFonts w:ascii="Verdana" w:hAnsi="Verdana"/>
+          <w:sz w:val="32"/>
+          <w:szCs w:val="32"/>
+        </w:rPr>
+      </w:pPr>
+      <w:r>
+        <w:rPr>
+          <w:rFonts w:ascii="Verdana" w:hAnsi="Verdana"/>
+          <w:sz w:val="32"/>
+          <w:szCs w:val="32"/>
+        </w:rPr>
+        <w:t>Game is implemented using Java version 1.8. (</w:t>
+      </w:r>
+      <w:proofErr w:type="gramStart"/>
+      <w:r>
+        <w:rPr>
+          <w:rFonts w:ascii="Verdana" w:hAnsi="Verdana"/>
+          <w:sz w:val="32"/>
+          <w:szCs w:val="32"/>
+        </w:rPr>
+        <w:t>requires</w:t>
+      </w:r>
+      <w:proofErr w:type="gramEnd"/>
+      <w:r>
+        <w:rPr>
+          <w:rFonts w:ascii="Verdana" w:hAnsi="Verdana"/>
+          <w:sz w:val="32"/>
+          <w:szCs w:val="32"/>
+        </w:rPr>
+        <w:t xml:space="preserve"> 1.8 or higher).</w:t>
       </w:r>
     </w:p>
     <w:p>
@@ -3961,6 +4153,7 @@
     <w:rsid w:val="00913FCE"/>
     <w:rsid w:val="00947FFB"/>
     <w:rsid w:val="00A47230"/>
+    <w:rsid w:val="00BE1171"/>
     <w:rsid w:val="00CC63E5"/>
     <w:rsid w:val="00D0732D"/>
   </w:rsids>

</xml_diff>

<commit_message>
Build V37. Delete changelogs. Skybox Shader. Horizont impl. Screenshots.
</commit_message>
<xml_diff>
--- a/Support Manual.docx
+++ b/Support Manual.docx
@@ -321,25 +321,7 @@
           <w:b/>
           <w:sz w:val="48"/>
         </w:rPr>
-        <w:t xml:space="preserve">Game </w:t>
-      </w:r>
-      <w:proofErr w:type="gramStart"/>
-      <w:r>
-        <w:rPr>
-          <w:rFonts w:ascii="Verdana" w:hAnsi="Verdana"/>
-          <w:b/>
-          <w:sz w:val="48"/>
-        </w:rPr>
-        <w:t>assets</w:t>
-      </w:r>
-      <w:proofErr w:type="gramEnd"/>
-      <w:r>
-        <w:rPr>
-          <w:rFonts w:ascii="Verdana" w:hAnsi="Verdana"/>
-          <w:b/>
-          <w:sz w:val="48"/>
-        </w:rPr>
-        <w:t xml:space="preserve"> structure (by entries)</w:t>
+        <w:t>Game assets structure (by entries)</w:t>
       </w:r>
       <w:r>
         <w:rPr>
@@ -851,6 +833,24 @@
       <w:r>
         <w:rPr>
           <w:rFonts w:ascii="Verdana" w:hAnsi="Verdana"/>
+          <w:b/>
+          <w:bCs/>
+          <w:sz w:val="32"/>
+          <w:szCs w:val="32"/>
+        </w:rPr>
+        <w:t xml:space="preserve"> </w:t>
+      </w:r>
+      <w:r>
+        <w:rPr>
+          <w:rFonts w:ascii="Verdana" w:hAnsi="Verdana"/>
+          <w:sz w:val="32"/>
+          <w:szCs w:val="32"/>
+        </w:rPr>
+        <w:t>&lt;bool&gt;</w:t>
+      </w:r>
+      <w:r>
+        <w:rPr>
+          <w:rFonts w:ascii="Verdana" w:hAnsi="Verdana"/>
           <w:sz w:val="32"/>
           <w:szCs w:val="32"/>
         </w:rPr>
@@ -874,6 +874,14 @@
         <w:t>fullscreen</w:t>
       </w:r>
       <w:proofErr w:type="spellEnd"/>
+      <w:r>
+        <w:rPr>
+          <w:rFonts w:ascii="Verdana" w:hAnsi="Verdana"/>
+          <w:sz w:val="32"/>
+          <w:szCs w:val="32"/>
+        </w:rPr>
+        <w:t>/windowed</w:t>
+      </w:r>
       <w:r>
         <w:rPr>
           <w:rFonts w:ascii="Verdana" w:hAnsi="Verdana"/>
@@ -902,21 +910,79 @@
           <w:szCs w:val="32"/>
         </w:rPr>
       </w:pPr>
-      <w:r>
-        <w:rPr>
-          <w:rFonts w:ascii="Verdana" w:hAnsi="Verdana"/>
-          <w:sz w:val="32"/>
-          <w:szCs w:val="32"/>
-        </w:rPr>
-        <w:t xml:space="preserve">windowed: makes your game run </w:t>
-      </w:r>
-      <w:r>
-        <w:rPr>
-          <w:rFonts w:ascii="Verdana" w:hAnsi="Verdana"/>
-          <w:sz w:val="32"/>
-          <w:szCs w:val="32"/>
-        </w:rPr>
-        <w:t>windowed mode.</w:t>
+      <w:proofErr w:type="spellStart"/>
+      <w:r>
+        <w:rPr>
+          <w:rFonts w:ascii="Verdana" w:hAnsi="Verdana"/>
+          <w:b/>
+          <w:bCs/>
+          <w:sz w:val="32"/>
+          <w:szCs w:val="32"/>
+        </w:rPr>
+        <w:t>v_sync</w:t>
+      </w:r>
+      <w:proofErr w:type="spellEnd"/>
+      <w:r>
+        <w:rPr>
+          <w:rFonts w:ascii="Verdana" w:hAnsi="Verdana"/>
+          <w:sz w:val="32"/>
+          <w:szCs w:val="32"/>
+        </w:rPr>
+        <w:t xml:space="preserve"> &lt;bool&gt;, </w:t>
+      </w:r>
+      <w:proofErr w:type="spellStart"/>
+      <w:r>
+        <w:rPr>
+          <w:rFonts w:ascii="Verdana" w:hAnsi="Verdana"/>
+          <w:sz w:val="32"/>
+          <w:szCs w:val="32"/>
+        </w:rPr>
+        <w:t>vsync</w:t>
+      </w:r>
+      <w:proofErr w:type="spellEnd"/>
+      <w:r>
+        <w:rPr>
+          <w:rFonts w:ascii="Verdana" w:hAnsi="Verdana"/>
+          <w:sz w:val="32"/>
+          <w:szCs w:val="32"/>
+        </w:rPr>
+        <w:t xml:space="preserve">&lt;bool&gt;: whether or not you </w:t>
+      </w:r>
+      <w:proofErr w:type="spellStart"/>
+      <w:r>
+        <w:rPr>
+          <w:rFonts w:ascii="Verdana" w:hAnsi="Verdana"/>
+          <w:sz w:val="32"/>
+          <w:szCs w:val="32"/>
+        </w:rPr>
+        <w:t>wanna</w:t>
+      </w:r>
+      <w:proofErr w:type="spellEnd"/>
+      <w:r>
+        <w:rPr>
+          <w:rFonts w:ascii="Verdana" w:hAnsi="Verdana"/>
+          <w:sz w:val="32"/>
+          <w:szCs w:val="32"/>
+        </w:rPr>
+        <w:t xml:space="preserve"> </w:t>
+      </w:r>
+      <w:proofErr w:type="spellStart"/>
+      <w:r>
+        <w:rPr>
+          <w:rFonts w:ascii="Verdana" w:hAnsi="Verdana"/>
+          <w:sz w:val="32"/>
+          <w:szCs w:val="32"/>
+        </w:rPr>
+        <w:t>vsync</w:t>
+      </w:r>
+      <w:proofErr w:type="spellEnd"/>
+      <w:r>
+        <w:rPr>
+          <w:rFonts w:ascii="Verdana" w:hAnsi="Verdana"/>
+          <w:sz w:val="32"/>
+          <w:szCs w:val="32"/>
+        </w:rPr>
+        <w:t xml:space="preserve"> on or off. If it’s on (you’ve set it to true) your fps is capped to your monitor refresh rate.</w:t>
       </w:r>
     </w:p>
     <w:p>
@@ -947,7 +1013,7 @@
           <w:sz w:val="32"/>
           <w:szCs w:val="32"/>
         </w:rPr>
-        <w:t>v_sync</w:t>
+        <w:t>water_efects</w:t>
       </w:r>
       <w:proofErr w:type="spellEnd"/>
       <w:r>
@@ -956,61 +1022,7 @@
           <w:sz w:val="32"/>
           <w:szCs w:val="32"/>
         </w:rPr>
-        <w:t xml:space="preserve"> &lt;bool&gt;, </w:t>
-      </w:r>
-      <w:proofErr w:type="spellStart"/>
-      <w:r>
-        <w:rPr>
-          <w:rFonts w:ascii="Verdana" w:hAnsi="Verdana"/>
-          <w:sz w:val="32"/>
-          <w:szCs w:val="32"/>
-        </w:rPr>
-        <w:t>vsync</w:t>
-      </w:r>
-      <w:proofErr w:type="spellEnd"/>
-      <w:r>
-        <w:rPr>
-          <w:rFonts w:ascii="Verdana" w:hAnsi="Verdana"/>
-          <w:sz w:val="32"/>
-          <w:szCs w:val="32"/>
-        </w:rPr>
-        <w:t xml:space="preserve">&lt;bool&gt;: whether or not you </w:t>
-      </w:r>
-      <w:proofErr w:type="spellStart"/>
-      <w:r>
-        <w:rPr>
-          <w:rFonts w:ascii="Verdana" w:hAnsi="Verdana"/>
-          <w:sz w:val="32"/>
-          <w:szCs w:val="32"/>
-        </w:rPr>
-        <w:t>wanna</w:t>
-      </w:r>
-      <w:proofErr w:type="spellEnd"/>
-      <w:r>
-        <w:rPr>
-          <w:rFonts w:ascii="Verdana" w:hAnsi="Verdana"/>
-          <w:sz w:val="32"/>
-          <w:szCs w:val="32"/>
-        </w:rPr>
-        <w:t xml:space="preserve"> </w:t>
-      </w:r>
-      <w:proofErr w:type="spellStart"/>
-      <w:r>
-        <w:rPr>
-          <w:rFonts w:ascii="Verdana" w:hAnsi="Verdana"/>
-          <w:sz w:val="32"/>
-          <w:szCs w:val="32"/>
-        </w:rPr>
-        <w:t>vsync</w:t>
-      </w:r>
-      <w:proofErr w:type="spellEnd"/>
-      <w:r>
-        <w:rPr>
-          <w:rFonts w:ascii="Verdana" w:hAnsi="Verdana"/>
-          <w:sz w:val="32"/>
-          <w:szCs w:val="32"/>
-        </w:rPr>
-        <w:t xml:space="preserve"> on or off. If it’s on (you’ve set it to true) your fps is capped to your monitor refresh rate.</w:t>
+        <w:t xml:space="preserve"> &lt;bool&gt;: enables (true) or disables (false) water effects (such as reflection).</w:t>
       </w:r>
     </w:p>
     <w:p>
@@ -1041,7 +1053,7 @@
           <w:sz w:val="32"/>
           <w:szCs w:val="32"/>
         </w:rPr>
-        <w:t>water_efects</w:t>
+        <w:t>mouse_sensitivity</w:t>
       </w:r>
       <w:proofErr w:type="spellEnd"/>
       <w:r>
@@ -1050,7 +1062,25 @@
           <w:sz w:val="32"/>
           <w:szCs w:val="32"/>
         </w:rPr>
-        <w:t xml:space="preserve"> &lt;bool&gt;: enables (true) or disables (false) water effects (such as reflection).</w:t>
+        <w:t xml:space="preserve">&lt;num&gt;, </w:t>
+      </w:r>
+      <w:proofErr w:type="spellStart"/>
+      <w:r>
+        <w:rPr>
+          <w:rFonts w:ascii="Verdana" w:hAnsi="Verdana"/>
+          <w:sz w:val="32"/>
+          <w:szCs w:val="32"/>
+        </w:rPr>
+        <w:t>msens</w:t>
+      </w:r>
+      <w:proofErr w:type="spellEnd"/>
+      <w:r>
+        <w:rPr>
+          <w:rFonts w:ascii="Verdana" w:hAnsi="Verdana"/>
+          <w:sz w:val="32"/>
+          <w:szCs w:val="32"/>
+        </w:rPr>
+        <w:t xml:space="preserve"> &lt;num&gt;: sets mouse sensitivity to this value.</w:t>
       </w:r>
     </w:p>
     <w:p>
@@ -1072,7 +1102,6 @@
           <w:szCs w:val="32"/>
         </w:rPr>
       </w:pPr>
-      <w:proofErr w:type="spellStart"/>
       <w:r>
         <w:rPr>
           <w:rFonts w:ascii="Verdana" w:hAnsi="Verdana"/>
@@ -1081,34 +1110,33 @@
           <w:sz w:val="32"/>
           <w:szCs w:val="32"/>
         </w:rPr>
-        <w:t>mouse_sensitivity</w:t>
-      </w:r>
-      <w:proofErr w:type="spellEnd"/>
-      <w:r>
-        <w:rPr>
-          <w:rFonts w:ascii="Verdana" w:hAnsi="Verdana"/>
-          <w:sz w:val="32"/>
-          <w:szCs w:val="32"/>
-        </w:rPr>
-        <w:t xml:space="preserve">&lt;num&gt;, </w:t>
-      </w:r>
-      <w:proofErr w:type="spellStart"/>
-      <w:r>
-        <w:rPr>
-          <w:rFonts w:ascii="Verdana" w:hAnsi="Verdana"/>
-          <w:sz w:val="32"/>
-          <w:szCs w:val="32"/>
-        </w:rPr>
-        <w:t>msens</w:t>
-      </w:r>
-      <w:proofErr w:type="spellEnd"/>
-      <w:r>
-        <w:rPr>
-          <w:rFonts w:ascii="Verdana" w:hAnsi="Verdana"/>
-          <w:sz w:val="32"/>
-          <w:szCs w:val="32"/>
-        </w:rPr>
-        <w:t xml:space="preserve"> &lt;num&gt;: sets mouse sensitivity to this value.</w:t>
+        <w:t>music</w:t>
+      </w:r>
+      <w:r>
+        <w:rPr>
+          <w:rFonts w:ascii="Verdana" w:hAnsi="Verdana"/>
+          <w:sz w:val="32"/>
+          <w:szCs w:val="32"/>
+        </w:rPr>
+        <w:t xml:space="preserve"> &lt;num&gt;, sound &lt;num&gt; : sets respectively music and </w:t>
+      </w:r>
+      <w:r>
+        <w:rPr>
+          <w:rFonts w:ascii="Verdana" w:hAnsi="Verdana"/>
+          <w:b/>
+          <w:bCs/>
+          <w:sz w:val="32"/>
+          <w:szCs w:val="32"/>
+        </w:rPr>
+        <w:t>sound</w:t>
+      </w:r>
+      <w:r>
+        <w:rPr>
+          <w:rFonts w:ascii="Verdana" w:hAnsi="Verdana"/>
+          <w:sz w:val="32"/>
+          <w:szCs w:val="32"/>
+        </w:rPr>
+        <w:t xml:space="preserve"> volume to this value.</w:t>
       </w:r>
     </w:p>
     <w:p>
@@ -1138,51 +1166,15 @@
           <w:sz w:val="32"/>
           <w:szCs w:val="32"/>
         </w:rPr>
-        <w:t>music</w:t>
-      </w:r>
-      <w:r>
-        <w:rPr>
-          <w:rFonts w:ascii="Verdana" w:hAnsi="Verdana"/>
-          <w:sz w:val="32"/>
-          <w:szCs w:val="32"/>
-        </w:rPr>
-        <w:t xml:space="preserve"> &lt;num&gt;, sound &lt;num</w:t>
-      </w:r>
-      <w:proofErr w:type="gramStart"/>
-      <w:r>
-        <w:rPr>
-          <w:rFonts w:ascii="Verdana" w:hAnsi="Verdana"/>
-          <w:sz w:val="32"/>
-          <w:szCs w:val="32"/>
-        </w:rPr>
-        <w:t>&gt; :</w:t>
-      </w:r>
-      <w:proofErr w:type="gramEnd"/>
-      <w:r>
-        <w:rPr>
-          <w:rFonts w:ascii="Verdana" w:hAnsi="Verdana"/>
-          <w:sz w:val="32"/>
-          <w:szCs w:val="32"/>
-        </w:rPr>
-        <w:t xml:space="preserve"> sets respectively music and </w:t>
-      </w:r>
-      <w:r>
-        <w:rPr>
-          <w:rFonts w:ascii="Verdana" w:hAnsi="Verdana"/>
-          <w:b/>
-          <w:bCs/>
-          <w:sz w:val="32"/>
-          <w:szCs w:val="32"/>
-        </w:rPr>
-        <w:t>sound</w:t>
-      </w:r>
-      <w:r>
-        <w:rPr>
-          <w:rFonts w:ascii="Verdana" w:hAnsi="Verdana"/>
-          <w:sz w:val="32"/>
-          <w:szCs w:val="32"/>
-        </w:rPr>
-        <w:t xml:space="preserve"> volume to this value.</w:t>
+        <w:t>screenshot</w:t>
+      </w:r>
+      <w:r>
+        <w:rPr>
+          <w:rFonts w:ascii="Verdana" w:hAnsi="Verdana"/>
+          <w:sz w:val="32"/>
+          <w:szCs w:val="32"/>
+        </w:rPr>
+        <w:t>: take a screenshot (uses folder screenshots).</w:t>
       </w:r>
     </w:p>
     <w:p>
@@ -1212,15 +1204,15 @@
           <w:sz w:val="32"/>
           <w:szCs w:val="32"/>
         </w:rPr>
-        <w:t>screenshot</w:t>
-      </w:r>
-      <w:r>
-        <w:rPr>
-          <w:rFonts w:ascii="Verdana" w:hAnsi="Verdana"/>
-          <w:sz w:val="32"/>
-          <w:szCs w:val="32"/>
-        </w:rPr>
-        <w:t>: take a screenshot (uses folder screenshots).</w:t>
+        <w:t>position</w:t>
+      </w:r>
+      <w:r>
+        <w:rPr>
+          <w:rFonts w:ascii="Verdana" w:hAnsi="Verdana"/>
+          <w:sz w:val="32"/>
+          <w:szCs w:val="32"/>
+        </w:rPr>
+        <w:t>: get/set position and (or) chunk.</w:t>
       </w:r>
     </w:p>
     <w:p>
@@ -1242,6 +1234,7 @@
           <w:szCs w:val="32"/>
         </w:rPr>
       </w:pPr>
+      <w:proofErr w:type="spellStart"/>
       <w:r>
         <w:rPr>
           <w:rFonts w:ascii="Verdana" w:hAnsi="Verdana"/>
@@ -1250,15 +1243,96 @@
           <w:sz w:val="32"/>
           <w:szCs w:val="32"/>
         </w:rPr>
-        <w:t>position</w:t>
-      </w:r>
-      <w:r>
-        <w:rPr>
-          <w:rFonts w:ascii="Verdana" w:hAnsi="Verdana"/>
-          <w:sz w:val="32"/>
-          <w:szCs w:val="32"/>
-        </w:rPr>
-        <w:t>: get/set position and (or) chunk.</w:t>
+        <w:t>s</w:t>
+      </w:r>
+      <w:r>
+        <w:rPr>
+          <w:rFonts w:ascii="Verdana" w:hAnsi="Verdana"/>
+          <w:b/>
+          <w:bCs/>
+          <w:sz w:val="32"/>
+          <w:szCs w:val="32"/>
+        </w:rPr>
+        <w:t>izeof</w:t>
+      </w:r>
+      <w:proofErr w:type="spellEnd"/>
+      <w:r>
+        <w:rPr>
+          <w:rFonts w:ascii="Verdana" w:hAnsi="Verdana"/>
+          <w:sz w:val="32"/>
+          <w:szCs w:val="32"/>
+        </w:rPr>
+        <w:t>[&lt;</w:t>
+      </w:r>
+      <w:proofErr w:type="spellStart"/>
+      <w:r>
+        <w:rPr>
+          <w:rFonts w:ascii="Verdana" w:hAnsi="Verdana"/>
+          <w:sz w:val="32"/>
+          <w:szCs w:val="32"/>
+        </w:rPr>
+        <w:t>chunk</w:t>
+      </w:r>
+      <w:r>
+        <w:rPr>
+          <w:rFonts w:ascii="Verdana" w:hAnsi="Verdana"/>
+          <w:sz w:val="32"/>
+          <w:szCs w:val="32"/>
+        </w:rPr>
+        <w:t>I</w:t>
+      </w:r>
+      <w:r>
+        <w:rPr>
+          <w:rFonts w:ascii="Verdana" w:hAnsi="Verdana"/>
+          <w:sz w:val="32"/>
+          <w:szCs w:val="32"/>
+        </w:rPr>
+        <w:t>d</w:t>
+      </w:r>
+      <w:proofErr w:type="spellEnd"/>
+      <w:r>
+        <w:rPr>
+          <w:rFonts w:ascii="Verdana" w:hAnsi="Verdana"/>
+          <w:sz w:val="32"/>
+          <w:szCs w:val="32"/>
+        </w:rPr>
+        <w:t xml:space="preserve">&gt;]: get total size without </w:t>
+      </w:r>
+      <w:proofErr w:type="spellStart"/>
+      <w:r>
+        <w:rPr>
+          <w:rFonts w:ascii="Verdana" w:hAnsi="Verdana"/>
+          <w:sz w:val="32"/>
+          <w:szCs w:val="32"/>
+        </w:rPr>
+        <w:t>args</w:t>
+      </w:r>
+      <w:proofErr w:type="spellEnd"/>
+      <w:r>
+        <w:rPr>
+          <w:rFonts w:ascii="Verdana" w:hAnsi="Verdana"/>
+          <w:sz w:val="32"/>
+          <w:szCs w:val="32"/>
+        </w:rPr>
+        <w:t xml:space="preserve">, if </w:t>
+      </w:r>
+      <w:proofErr w:type="spellStart"/>
+      <w:r>
+        <w:rPr>
+          <w:rFonts w:ascii="Verdana" w:hAnsi="Verdana"/>
+          <w:sz w:val="32"/>
+          <w:szCs w:val="32"/>
+        </w:rPr>
+        <w:t>args</w:t>
+      </w:r>
+      <w:proofErr w:type="spellEnd"/>
+      <w:r>
+        <w:rPr>
+          <w:rFonts w:ascii="Verdana" w:hAnsi="Verdana"/>
+          <w:sz w:val="32"/>
+          <w:szCs w:val="32"/>
+        </w:rPr>
+        <w:t xml:space="preserve"> provided size of blocks of that chunk.</w:t>
       </w:r>
     </w:p>
     <w:p>
@@ -1280,105 +1354,21 @@
           <w:szCs w:val="32"/>
         </w:rPr>
       </w:pPr>
-      <w:proofErr w:type="spellStart"/>
-      <w:r>
-        <w:rPr>
-          <w:rFonts w:ascii="Verdana" w:hAnsi="Verdana"/>
-          <w:b/>
-          <w:bCs/>
-          <w:sz w:val="32"/>
-          <w:szCs w:val="32"/>
-        </w:rPr>
-        <w:t>s</w:t>
-      </w:r>
-      <w:r>
-        <w:rPr>
-          <w:rFonts w:ascii="Verdana" w:hAnsi="Verdana"/>
-          <w:b/>
-          <w:bCs/>
-          <w:sz w:val="32"/>
-          <w:szCs w:val="32"/>
-        </w:rPr>
-        <w:t>izeof</w:t>
-      </w:r>
-      <w:proofErr w:type="spellEnd"/>
-      <w:r>
-        <w:rPr>
-          <w:rFonts w:ascii="Verdana" w:hAnsi="Verdana"/>
-          <w:sz w:val="32"/>
-          <w:szCs w:val="32"/>
-        </w:rPr>
-        <w:t>[&lt;</w:t>
-      </w:r>
-      <w:proofErr w:type="spellStart"/>
-      <w:r>
-        <w:rPr>
-          <w:rFonts w:ascii="Verdana" w:hAnsi="Verdana"/>
-          <w:sz w:val="32"/>
-          <w:szCs w:val="32"/>
-        </w:rPr>
-        <w:t>chunk</w:t>
-      </w:r>
-      <w:r>
-        <w:rPr>
-          <w:rFonts w:ascii="Verdana" w:hAnsi="Verdana"/>
-          <w:sz w:val="32"/>
-          <w:szCs w:val="32"/>
-        </w:rPr>
-        <w:t>I</w:t>
-      </w:r>
-      <w:r>
-        <w:rPr>
-          <w:rFonts w:ascii="Verdana" w:hAnsi="Verdana"/>
-          <w:sz w:val="32"/>
-          <w:szCs w:val="32"/>
-        </w:rPr>
-        <w:t>d</w:t>
-      </w:r>
-      <w:proofErr w:type="spellEnd"/>
-      <w:r>
-        <w:rPr>
-          <w:rFonts w:ascii="Verdana" w:hAnsi="Verdana"/>
-          <w:sz w:val="32"/>
-          <w:szCs w:val="32"/>
-        </w:rPr>
-        <w:t xml:space="preserve">&gt;]: get total size without </w:t>
-      </w:r>
-      <w:proofErr w:type="spellStart"/>
-      <w:r>
-        <w:rPr>
-          <w:rFonts w:ascii="Verdana" w:hAnsi="Verdana"/>
-          <w:sz w:val="32"/>
-          <w:szCs w:val="32"/>
-        </w:rPr>
-        <w:t>args</w:t>
-      </w:r>
-      <w:proofErr w:type="spellEnd"/>
-      <w:r>
-        <w:rPr>
-          <w:rFonts w:ascii="Verdana" w:hAnsi="Verdana"/>
-          <w:sz w:val="32"/>
-          <w:szCs w:val="32"/>
-        </w:rPr>
-        <w:t xml:space="preserve">, if </w:t>
-      </w:r>
-      <w:proofErr w:type="spellStart"/>
-      <w:r>
-        <w:rPr>
-          <w:rFonts w:ascii="Verdana" w:hAnsi="Verdana"/>
-          <w:sz w:val="32"/>
-          <w:szCs w:val="32"/>
-        </w:rPr>
-        <w:t>args</w:t>
-      </w:r>
-      <w:proofErr w:type="spellEnd"/>
-      <w:r>
-        <w:rPr>
-          <w:rFonts w:ascii="Verdana" w:hAnsi="Verdana"/>
-          <w:sz w:val="32"/>
-          <w:szCs w:val="32"/>
-        </w:rPr>
-        <w:t xml:space="preserve"> provided size of blocks of that chunk.</w:t>
+      <w:r>
+        <w:rPr>
+          <w:rFonts w:ascii="Verdana" w:hAnsi="Verdana"/>
+          <w:sz w:val="32"/>
+          <w:szCs w:val="32"/>
+        </w:rPr>
+        <w:t>quit, exit</w:t>
+      </w:r>
+      <w:r>
+        <w:rPr>
+          <w:rFonts w:ascii="Verdana" w:hAnsi="Verdana"/>
+          <w:sz w:val="32"/>
+          <w:szCs w:val="32"/>
+        </w:rPr>
+        <w:t xml:space="preserve"> : leaves the game.</w:t>
       </w:r>
     </w:p>
     <w:p>
@@ -1403,36 +1393,28 @@
       <w:r>
         <w:rPr>
           <w:rFonts w:ascii="Verdana" w:hAnsi="Verdana"/>
-          <w:sz w:val="32"/>
-          <w:szCs w:val="32"/>
-        </w:rPr>
-        <w:t xml:space="preserve">quit, </w:t>
-      </w:r>
-      <w:proofErr w:type="gramStart"/>
-      <w:r>
-        <w:rPr>
-          <w:rFonts w:ascii="Verdana" w:hAnsi="Verdana"/>
-          <w:sz w:val="32"/>
-          <w:szCs w:val="32"/>
-        </w:rPr>
-        <w:t>exit</w:t>
-      </w:r>
-      <w:r>
-        <w:rPr>
-          <w:rFonts w:ascii="Verdana" w:hAnsi="Verdana"/>
-          <w:sz w:val="32"/>
-          <w:szCs w:val="32"/>
-        </w:rPr>
-        <w:t xml:space="preserve"> :</w:t>
-      </w:r>
-      <w:proofErr w:type="gramEnd"/>
-      <w:r>
-        <w:rPr>
-          <w:rFonts w:ascii="Verdana" w:hAnsi="Verdana"/>
-          <w:sz w:val="32"/>
-          <w:szCs w:val="32"/>
-        </w:rPr>
-        <w:t xml:space="preserve"> leaves the game.</w:t>
+          <w:b/>
+          <w:bCs/>
+          <w:sz w:val="32"/>
+          <w:szCs w:val="32"/>
+        </w:rPr>
+        <w:t>cache</w:t>
+      </w:r>
+      <w:r>
+        <w:rPr>
+          <w:rFonts w:ascii="Verdana" w:hAnsi="Verdana"/>
+          <w:sz w:val="32"/>
+          <w:szCs w:val="32"/>
+        </w:rPr>
+        <w:t>:</w:t>
+      </w:r>
+      <w:r>
+        <w:rPr>
+          <w:rFonts w:ascii="Verdana" w:hAnsi="Verdana"/>
+          <w:sz w:val="32"/>
+          <w:szCs w:val="32"/>
+        </w:rPr>
+        <w:t xml:space="preserve"> displays info about cached chunks: &lt;id&gt;&lt;size&gt;&lt;filename&gt;</w:t>
       </w:r>
     </w:p>
     <w:p>
@@ -1462,7 +1444,7 @@
           <w:sz w:val="32"/>
           <w:szCs w:val="32"/>
         </w:rPr>
-        <w:t>cache</w:t>
+        <w:t>clear</w:t>
       </w:r>
       <w:r>
         <w:rPr>
@@ -1475,10 +1457,20 @@
       <w:r>
         <w:rPr>
           <w:rFonts w:ascii="Verdana" w:hAnsi="Verdana"/>
-          <w:sz w:val="32"/>
-          <w:szCs w:val="32"/>
-        </w:rPr>
-        <w:t xml:space="preserve"> displays info about cached chunks: &lt;id&gt;&lt;size&gt;&lt;filename&gt;</w:t>
+          <w:b/>
+          <w:bCs/>
+          <w:sz w:val="32"/>
+          <w:szCs w:val="32"/>
+        </w:rPr>
+        <w:t xml:space="preserve"> </w:t>
+      </w:r>
+      <w:r>
+        <w:rPr>
+          <w:rFonts w:ascii="Verdana" w:hAnsi="Verdana"/>
+          <w:sz w:val="32"/>
+          <w:szCs w:val="32"/>
+        </w:rPr>
+        <w:t>clears the console history.</w:t>
       </w:r>
     </w:p>
     <w:p>
@@ -1500,6 +1492,7 @@
           <w:szCs w:val="32"/>
         </w:rPr>
       </w:pPr>
+      <w:proofErr w:type="spellStart"/>
       <w:r>
         <w:rPr>
           <w:rFonts w:ascii="Verdana" w:hAnsi="Verdana"/>
@@ -1508,7 +1501,60 @@
           <w:sz w:val="32"/>
           <w:szCs w:val="32"/>
         </w:rPr>
-        <w:t>clear</w:t>
+        <w:t>game_ticks</w:t>
+      </w:r>
+      <w:proofErr w:type="spellEnd"/>
+      <w:r>
+        <w:rPr>
+          <w:rFonts w:ascii="Verdana" w:hAnsi="Verdana"/>
+          <w:b/>
+          <w:bCs/>
+          <w:sz w:val="32"/>
+          <w:szCs w:val="32"/>
+        </w:rPr>
+        <w:t xml:space="preserve"> </w:t>
+      </w:r>
+      <w:r>
+        <w:rPr>
+          <w:rFonts w:ascii="Verdana" w:hAnsi="Verdana"/>
+          <w:sz w:val="32"/>
+          <w:szCs w:val="32"/>
+        </w:rPr>
+        <w:t>&lt;</w:t>
+      </w:r>
+      <w:proofErr w:type="spellStart"/>
+      <w:r>
+        <w:rPr>
+          <w:rFonts w:ascii="Verdana" w:hAnsi="Verdana"/>
+          <w:sz w:val="32"/>
+          <w:szCs w:val="32"/>
+        </w:rPr>
+        <w:t>ticks</w:t>
+      </w:r>
+      <w:r>
+        <w:rPr>
+          <w:rFonts w:ascii="Verdana" w:hAnsi="Verdana"/>
+          <w:sz w:val="32"/>
+          <w:szCs w:val="32"/>
+        </w:rPr>
+        <w:t>_</w:t>
+      </w:r>
+      <w:r>
+        <w:rPr>
+          <w:rFonts w:ascii="Verdana" w:hAnsi="Verdana"/>
+          <w:sz w:val="32"/>
+          <w:szCs w:val="32"/>
+        </w:rPr>
+        <w:t>num</w:t>
+      </w:r>
+      <w:proofErr w:type="spellEnd"/>
+      <w:r>
+        <w:rPr>
+          <w:rFonts w:ascii="Verdana" w:hAnsi="Verdana"/>
+          <w:sz w:val="32"/>
+          <w:szCs w:val="32"/>
+        </w:rPr>
+        <w:t>&gt;</w:t>
       </w:r>
       <w:r>
         <w:rPr>
@@ -1521,20 +1567,34 @@
       <w:r>
         <w:rPr>
           <w:rFonts w:ascii="Verdana" w:hAnsi="Verdana"/>
-          <w:b/>
-          <w:bCs/>
-          <w:sz w:val="32"/>
-          <w:szCs w:val="32"/>
-        </w:rPr>
-        <w:t xml:space="preserve"> </w:t>
-      </w:r>
-      <w:r>
-        <w:rPr>
-          <w:rFonts w:ascii="Verdana" w:hAnsi="Verdana"/>
-          <w:sz w:val="32"/>
-          <w:szCs w:val="32"/>
-        </w:rPr>
-        <w:t>clears the console history.</w:t>
+          <w:sz w:val="32"/>
+          <w:szCs w:val="32"/>
+        </w:rPr>
+        <w:t xml:space="preserve"> change</w:t>
+      </w:r>
+      <w:r>
+        <w:rPr>
+          <w:rFonts w:ascii="Verdana" w:hAnsi="Verdana"/>
+          <w:sz w:val="32"/>
+          <w:szCs w:val="32"/>
+        </w:rPr>
+        <w:t xml:space="preserve"> game</w:t>
+      </w:r>
+      <w:r>
+        <w:rPr>
+          <w:rFonts w:ascii="Verdana" w:hAnsi="Verdana"/>
+          <w:sz w:val="32"/>
+          <w:szCs w:val="32"/>
+        </w:rPr>
+        <w:t xml:space="preserve"> time</w:t>
+      </w:r>
+      <w:r>
+        <w:rPr>
+          <w:rFonts w:ascii="Verdana" w:hAnsi="Verdana"/>
+          <w:sz w:val="32"/>
+          <w:szCs w:val="32"/>
+        </w:rPr>
+        <w:t>.</w:t>
       </w:r>
     </w:p>
     <w:p>
@@ -1829,6 +1889,166 @@
         </w:pBdr>
         <w:rPr>
           <w:rFonts w:ascii="Verdana" w:hAnsi="Verdana"/>
+          <w:sz w:val="32"/>
+          <w:szCs w:val="32"/>
+        </w:rPr>
+      </w:pPr>
+    </w:p>
+    <w:p>
+      <w:pPr>
+        <w:pStyle w:val="NoSpacing"/>
+        <w:pBdr>
+          <w:top w:val="single" w:sz="4" w:space="1" w:color="auto"/>
+          <w:left w:val="single" w:sz="4" w:space="4" w:color="auto"/>
+          <w:bottom w:val="single" w:sz="4" w:space="1" w:color="auto"/>
+          <w:right w:val="single" w:sz="4" w:space="4" w:color="auto"/>
+        </w:pBdr>
+        <w:rPr>
+          <w:rFonts w:ascii="Verdana" w:hAnsi="Verdana"/>
+          <w:b/>
+          <w:bCs/>
+          <w:sz w:val="32"/>
+          <w:szCs w:val="32"/>
+        </w:rPr>
+      </w:pPr>
+      <w:r>
+        <w:rPr>
+          <w:rFonts w:ascii="Verdana" w:hAnsi="Verdana"/>
+          <w:b/>
+          <w:bCs/>
+          <w:sz w:val="32"/>
+          <w:szCs w:val="32"/>
+        </w:rPr>
+        <w:t>Observer functions:</w:t>
+      </w:r>
+    </w:p>
+    <w:p>
+      <w:pPr>
+        <w:pStyle w:val="NoSpacing"/>
+        <w:pBdr>
+          <w:top w:val="single" w:sz="4" w:space="1" w:color="auto"/>
+          <w:left w:val="single" w:sz="4" w:space="4" w:color="auto"/>
+          <w:bottom w:val="single" w:sz="4" w:space="1" w:color="auto"/>
+          <w:right w:val="single" w:sz="4" w:space="4" w:color="auto"/>
+        </w:pBdr>
+        <w:rPr>
+          <w:rFonts w:ascii="Verdana" w:hAnsi="Verdana"/>
+          <w:sz w:val="32"/>
+          <w:szCs w:val="32"/>
+        </w:rPr>
+      </w:pPr>
+      <w:proofErr w:type="spellStart"/>
+      <w:r>
+        <w:rPr>
+          <w:rFonts w:ascii="Verdana" w:hAnsi="Verdana"/>
+          <w:sz w:val="32"/>
+          <w:szCs w:val="32"/>
+        </w:rPr>
+        <w:t>PageUp</w:t>
+      </w:r>
+      <w:proofErr w:type="spellEnd"/>
+      <w:r>
+        <w:rPr>
+          <w:rFonts w:ascii="Verdana" w:hAnsi="Verdana"/>
+          <w:sz w:val="32"/>
+          <w:szCs w:val="32"/>
+        </w:rPr>
+        <w:t xml:space="preserve"> = </w:t>
+      </w:r>
+      <w:r>
+        <w:rPr>
+          <w:rFonts w:ascii="Verdana" w:hAnsi="Verdana"/>
+          <w:sz w:val="32"/>
+          <w:szCs w:val="32"/>
+        </w:rPr>
+        <w:t>Ascend (Fly Up)</w:t>
+      </w:r>
+    </w:p>
+    <w:p>
+      <w:pPr>
+        <w:pStyle w:val="NoSpacing"/>
+        <w:pBdr>
+          <w:top w:val="single" w:sz="4" w:space="1" w:color="auto"/>
+          <w:left w:val="single" w:sz="4" w:space="4" w:color="auto"/>
+          <w:bottom w:val="single" w:sz="4" w:space="1" w:color="auto"/>
+          <w:right w:val="single" w:sz="4" w:space="4" w:color="auto"/>
+        </w:pBdr>
+        <w:rPr>
+          <w:rFonts w:ascii="Verdana" w:hAnsi="Verdana"/>
+          <w:sz w:val="32"/>
+          <w:szCs w:val="32"/>
+        </w:rPr>
+      </w:pPr>
+      <w:proofErr w:type="spellStart"/>
+      <w:r>
+        <w:rPr>
+          <w:rFonts w:ascii="Verdana" w:hAnsi="Verdana"/>
+          <w:sz w:val="32"/>
+          <w:szCs w:val="32"/>
+        </w:rPr>
+        <w:t>Page</w:t>
+      </w:r>
+      <w:r>
+        <w:rPr>
+          <w:rFonts w:ascii="Verdana" w:hAnsi="Verdana"/>
+          <w:sz w:val="32"/>
+          <w:szCs w:val="32"/>
+        </w:rPr>
+        <w:t>Down</w:t>
+      </w:r>
+      <w:proofErr w:type="spellEnd"/>
+      <w:r>
+        <w:rPr>
+          <w:rFonts w:ascii="Verdana" w:hAnsi="Verdana"/>
+          <w:sz w:val="32"/>
+          <w:szCs w:val="32"/>
+        </w:rPr>
+        <w:t xml:space="preserve"> = </w:t>
+      </w:r>
+      <w:r>
+        <w:rPr>
+          <w:rFonts w:ascii="Verdana" w:hAnsi="Verdana"/>
+          <w:sz w:val="32"/>
+          <w:szCs w:val="32"/>
+        </w:rPr>
+        <w:t>De</w:t>
+      </w:r>
+      <w:r>
+        <w:rPr>
+          <w:rFonts w:ascii="Verdana" w:hAnsi="Verdana"/>
+          <w:sz w:val="32"/>
+          <w:szCs w:val="32"/>
+        </w:rPr>
+        <w:t xml:space="preserve">scend (Fly </w:t>
+      </w:r>
+      <w:r>
+        <w:rPr>
+          <w:rFonts w:ascii="Verdana" w:hAnsi="Verdana"/>
+          <w:sz w:val="32"/>
+          <w:szCs w:val="32"/>
+        </w:rPr>
+        <w:t>Down</w:t>
+      </w:r>
+      <w:r>
+        <w:rPr>
+          <w:rFonts w:ascii="Verdana" w:hAnsi="Verdana"/>
+          <w:sz w:val="32"/>
+          <w:szCs w:val="32"/>
+        </w:rPr>
+        <w:t>)</w:t>
+      </w:r>
+    </w:p>
+    <w:p>
+      <w:pPr>
+        <w:pStyle w:val="NoSpacing"/>
+        <w:pBdr>
+          <w:top w:val="single" w:sz="4" w:space="1" w:color="auto"/>
+          <w:left w:val="single" w:sz="4" w:space="4" w:color="auto"/>
+          <w:bottom w:val="single" w:sz="4" w:space="1" w:color="auto"/>
+          <w:right w:val="single" w:sz="4" w:space="4" w:color="auto"/>
+        </w:pBdr>
+        <w:rPr>
+          <w:rFonts w:ascii="Verdana" w:hAnsi="Verdana"/>
           <w:b/>
           <w:sz w:val="32"/>
           <w:szCs w:val="32"/>
@@ -1882,176 +2102,32 @@
           <w:sz w:val="32"/>
           <w:szCs w:val="32"/>
         </w:rPr>
-        <w:t>1 = Pistol</w:t>
-      </w:r>
-    </w:p>
-    <w:p>
-      <w:pPr>
-        <w:pStyle w:val="NoSpacing"/>
-        <w:pBdr>
-          <w:top w:val="single" w:sz="4" w:space="1" w:color="auto"/>
-          <w:left w:val="single" w:sz="4" w:space="4" w:color="auto"/>
-          <w:bottom w:val="single" w:sz="4" w:space="1" w:color="auto"/>
-          <w:right w:val="single" w:sz="4" w:space="4" w:color="auto"/>
-        </w:pBdr>
-        <w:rPr>
-          <w:rFonts w:ascii="Verdana" w:hAnsi="Verdana"/>
-          <w:sz w:val="32"/>
-          <w:szCs w:val="32"/>
-        </w:rPr>
-      </w:pPr>
-      <w:r>
-        <w:rPr>
-          <w:rFonts w:ascii="Verdana" w:hAnsi="Verdana"/>
-          <w:sz w:val="32"/>
-          <w:szCs w:val="32"/>
-        </w:rPr>
-        <w:t>2 = Sub Machine Gun</w:t>
-      </w:r>
-    </w:p>
-    <w:p>
-      <w:pPr>
-        <w:pStyle w:val="NoSpacing"/>
-        <w:pBdr>
-          <w:top w:val="single" w:sz="4" w:space="1" w:color="auto"/>
-          <w:left w:val="single" w:sz="4" w:space="4" w:color="auto"/>
-          <w:bottom w:val="single" w:sz="4" w:space="1" w:color="auto"/>
-          <w:right w:val="single" w:sz="4" w:space="4" w:color="auto"/>
-        </w:pBdr>
-        <w:rPr>
-          <w:rFonts w:ascii="Verdana" w:hAnsi="Verdana"/>
-          <w:sz w:val="32"/>
-          <w:szCs w:val="32"/>
-        </w:rPr>
-      </w:pPr>
-      <w:r>
-        <w:rPr>
-          <w:rFonts w:ascii="Verdana" w:hAnsi="Verdana"/>
-          <w:sz w:val="32"/>
-          <w:szCs w:val="32"/>
-        </w:rPr>
-        <w:t>3 = Shotgun</w:t>
-      </w:r>
-    </w:p>
-    <w:p>
-      <w:pPr>
-        <w:pStyle w:val="NoSpacing"/>
-        <w:pBdr>
-          <w:top w:val="single" w:sz="4" w:space="1" w:color="auto"/>
-          <w:left w:val="single" w:sz="4" w:space="4" w:color="auto"/>
-          <w:bottom w:val="single" w:sz="4" w:space="1" w:color="auto"/>
-          <w:right w:val="single" w:sz="4" w:space="4" w:color="auto"/>
-        </w:pBdr>
-        <w:rPr>
-          <w:rFonts w:ascii="Verdana" w:hAnsi="Verdana"/>
-          <w:sz w:val="32"/>
-          <w:szCs w:val="32"/>
-        </w:rPr>
-      </w:pPr>
-      <w:r>
-        <w:rPr>
-          <w:rFonts w:ascii="Verdana" w:hAnsi="Verdana"/>
-          <w:sz w:val="32"/>
-          <w:szCs w:val="32"/>
-        </w:rPr>
-        <w:t>4 = Assault Rifle</w:t>
-      </w:r>
-    </w:p>
-    <w:p>
-      <w:pPr>
-        <w:pStyle w:val="NoSpacing"/>
-        <w:pBdr>
-          <w:top w:val="single" w:sz="4" w:space="1" w:color="auto"/>
-          <w:left w:val="single" w:sz="4" w:space="4" w:color="auto"/>
-          <w:bottom w:val="single" w:sz="4" w:space="1" w:color="auto"/>
-          <w:right w:val="single" w:sz="4" w:space="4" w:color="auto"/>
-        </w:pBdr>
-        <w:rPr>
-          <w:rFonts w:ascii="Verdana" w:hAnsi="Verdana"/>
-          <w:sz w:val="32"/>
-          <w:szCs w:val="32"/>
-        </w:rPr>
-      </w:pPr>
-      <w:r>
-        <w:rPr>
-          <w:rFonts w:ascii="Verdana" w:hAnsi="Verdana"/>
-          <w:sz w:val="32"/>
-          <w:szCs w:val="32"/>
-        </w:rPr>
-        <w:t>5 = Machine Gun</w:t>
-      </w:r>
-    </w:p>
-    <w:p>
-      <w:pPr>
-        <w:pStyle w:val="NoSpacing"/>
-        <w:pBdr>
-          <w:top w:val="single" w:sz="4" w:space="1" w:color="auto"/>
-          <w:left w:val="single" w:sz="4" w:space="4" w:color="auto"/>
-          <w:bottom w:val="single" w:sz="4" w:space="1" w:color="auto"/>
-          <w:right w:val="single" w:sz="4" w:space="4" w:color="auto"/>
-        </w:pBdr>
-        <w:rPr>
-          <w:rFonts w:ascii="Verdana" w:hAnsi="Verdana"/>
-          <w:sz w:val="32"/>
-          <w:szCs w:val="32"/>
-        </w:rPr>
-      </w:pPr>
-      <w:r>
-        <w:rPr>
-          <w:rFonts w:ascii="Verdana" w:hAnsi="Verdana"/>
-          <w:sz w:val="32"/>
-          <w:szCs w:val="32"/>
-        </w:rPr>
-        <w:t>6 = Sniper Rifle</w:t>
-      </w:r>
-    </w:p>
-    <w:p>
-      <w:pPr>
-        <w:pStyle w:val="NoSpacing"/>
-        <w:pBdr>
-          <w:top w:val="single" w:sz="4" w:space="1" w:color="auto"/>
-          <w:left w:val="single" w:sz="4" w:space="4" w:color="auto"/>
-          <w:bottom w:val="single" w:sz="4" w:space="1" w:color="auto"/>
-          <w:right w:val="single" w:sz="4" w:space="4" w:color="auto"/>
-        </w:pBdr>
-        <w:rPr>
-          <w:rFonts w:ascii="Verdana" w:hAnsi="Verdana"/>
-          <w:sz w:val="32"/>
-          <w:szCs w:val="32"/>
-        </w:rPr>
-      </w:pPr>
-      <w:r>
-        <w:rPr>
-          <w:rFonts w:ascii="Verdana" w:hAnsi="Verdana"/>
-          <w:sz w:val="32"/>
-          <w:szCs w:val="32"/>
-        </w:rPr>
-        <w:t>Mouse1 = Fire [Not implemented]</w:t>
-      </w:r>
-    </w:p>
-    <w:p>
-      <w:pPr>
-        <w:pStyle w:val="NoSpacing"/>
-        <w:pBdr>
-          <w:top w:val="single" w:sz="4" w:space="1" w:color="auto"/>
-          <w:left w:val="single" w:sz="4" w:space="4" w:color="auto"/>
-          <w:bottom w:val="single" w:sz="4" w:space="1" w:color="auto"/>
-          <w:right w:val="single" w:sz="4" w:space="4" w:color="auto"/>
-        </w:pBdr>
-        <w:rPr>
-          <w:rFonts w:ascii="Verdana" w:hAnsi="Verdana"/>
-          <w:b/>
-          <w:sz w:val="32"/>
-          <w:szCs w:val="32"/>
-        </w:rPr>
-      </w:pPr>
-      <w:r>
-        <w:rPr>
-          <w:rFonts w:ascii="Verdana" w:hAnsi="Verdana"/>
-          <w:sz w:val="32"/>
-          <w:szCs w:val="32"/>
-        </w:rPr>
-        <w:t>Mouse2 = Alt-Fire [Not implemented]</w:t>
+        <w:t>Space = Jump</w:t>
+      </w:r>
+    </w:p>
+    <w:p>
+      <w:pPr>
+        <w:pStyle w:val="NoSpacing"/>
+        <w:pBdr>
+          <w:top w:val="single" w:sz="4" w:space="1" w:color="auto"/>
+          <w:left w:val="single" w:sz="4" w:space="4" w:color="auto"/>
+          <w:bottom w:val="single" w:sz="4" w:space="1" w:color="auto"/>
+          <w:right w:val="single" w:sz="4" w:space="4" w:color="auto"/>
+        </w:pBdr>
+        <w:rPr>
+          <w:rFonts w:ascii="Verdana" w:hAnsi="Verdana"/>
+          <w:b/>
+          <w:sz w:val="32"/>
+          <w:szCs w:val="32"/>
+        </w:rPr>
+      </w:pPr>
+      <w:r>
+        <w:rPr>
+          <w:rFonts w:ascii="Verdana" w:hAnsi="Verdana"/>
+          <w:sz w:val="32"/>
+          <w:szCs w:val="32"/>
+        </w:rPr>
+        <w:t>Ctrl = Crouch/Sink</w:t>
       </w:r>
     </w:p>
     <w:p>
@@ -2334,25 +2410,7 @@
           <w:sz w:val="32"/>
           <w:szCs w:val="32"/>
         </w:rPr>
-        <w:t>[</w:t>
-      </w:r>
-      <w:proofErr w:type="gramStart"/>
-      <w:r>
-        <w:rPr>
-          <w:rFonts w:ascii="Verdana" w:hAnsi="Verdana"/>
-          <w:sz w:val="32"/>
-          <w:szCs w:val="32"/>
-        </w:rPr>
-        <w:t>, ]</w:t>
-      </w:r>
-      <w:proofErr w:type="gramEnd"/>
-      <w:r>
-        <w:rPr>
-          <w:rFonts w:ascii="Verdana" w:hAnsi="Verdana"/>
-          <w:sz w:val="32"/>
-          <w:szCs w:val="32"/>
-        </w:rPr>
-        <w:t xml:space="preserve"> = Change Texture For New Block</w:t>
+        <w:t>[, ] = Change Texture For New Block</w:t>
       </w:r>
     </w:p>
     <w:p>
@@ -2563,44 +2621,44 @@
           <w:sz w:val="32"/>
           <w:szCs w:val="32"/>
         </w:rPr>
+        <w:t>P = Change Crosshair Color</w:t>
+      </w:r>
+    </w:p>
+    <w:p>
+      <w:pPr>
+        <w:pStyle w:val="NoSpacing"/>
+        <w:rPr>
+          <w:rFonts w:ascii="Verdana" w:hAnsi="Verdana"/>
+          <w:b/>
+          <w:sz w:val="32"/>
+          <w:szCs w:val="32"/>
+        </w:rPr>
+      </w:pPr>
+    </w:p>
+    <w:p>
+      <w:pPr>
+        <w:pStyle w:val="NoSpacing"/>
+        <w:pBdr>
+          <w:top w:val="single" w:sz="4" w:space="1" w:color="auto"/>
+          <w:left w:val="single" w:sz="4" w:space="4" w:color="auto"/>
+          <w:bottom w:val="single" w:sz="4" w:space="1" w:color="auto"/>
+          <w:right w:val="single" w:sz="4" w:space="4" w:color="auto"/>
+        </w:pBdr>
+        <w:rPr>
+          <w:rFonts w:ascii="Verdana" w:hAnsi="Verdana"/>
+          <w:b/>
+          <w:sz w:val="48"/>
+          <w:szCs w:val="32"/>
+        </w:rPr>
+      </w:pPr>
+      <w:r>
+        <w:rPr>
+          <w:rFonts w:ascii="Verdana" w:hAnsi="Verdana"/>
+          <w:b/>
+          <w:sz w:val="48"/>
+          <w:szCs w:val="32"/>
+        </w:rPr>
         <w:lastRenderedPageBreak/>
-        <w:t>P = Change Crosshair Color</w:t>
-      </w:r>
-    </w:p>
-    <w:p>
-      <w:pPr>
-        <w:pStyle w:val="NoSpacing"/>
-        <w:rPr>
-          <w:rFonts w:ascii="Verdana" w:hAnsi="Verdana"/>
-          <w:b/>
-          <w:sz w:val="32"/>
-          <w:szCs w:val="32"/>
-        </w:rPr>
-      </w:pPr>
-    </w:p>
-    <w:p>
-      <w:pPr>
-        <w:pStyle w:val="NoSpacing"/>
-        <w:pBdr>
-          <w:top w:val="single" w:sz="4" w:space="1" w:color="auto"/>
-          <w:left w:val="single" w:sz="4" w:space="4" w:color="auto"/>
-          <w:bottom w:val="single" w:sz="4" w:space="1" w:color="auto"/>
-          <w:right w:val="single" w:sz="4" w:space="4" w:color="auto"/>
-        </w:pBdr>
-        <w:rPr>
-          <w:rFonts w:ascii="Verdana" w:hAnsi="Verdana"/>
-          <w:b/>
-          <w:sz w:val="48"/>
-          <w:szCs w:val="32"/>
-        </w:rPr>
-      </w:pPr>
-      <w:r>
-        <w:rPr>
-          <w:rFonts w:ascii="Verdana" w:hAnsi="Verdana"/>
-          <w:b/>
-          <w:sz w:val="48"/>
-          <w:szCs w:val="32"/>
-        </w:rPr>
         <w:t>N</w:t>
       </w:r>
       <w:r>
@@ -2640,6 +2698,14 @@
         </w:rPr>
         <w:t>Game uses LWJGL 3.2.3 since v 02 (BELARUS).</w:t>
       </w:r>
+      <w:r>
+        <w:rPr>
+          <w:rFonts w:ascii="Verdana" w:hAnsi="Verdana"/>
+          <w:sz w:val="32"/>
+          <w:szCs w:val="32"/>
+        </w:rPr>
+        <w:t xml:space="preserve"> V36G and later use LWGJL 3.3.3.</w:t>
+      </w:r>
     </w:p>
     <w:p>
       <w:pPr>
@@ -2786,25 +2852,55 @@
           <w:sz w:val="32"/>
           <w:szCs w:val="32"/>
         </w:rPr>
-        <w:t>Game is implemented using Java version 1.8. (</w:t>
-      </w:r>
-      <w:proofErr w:type="gramStart"/>
-      <w:r>
-        <w:rPr>
-          <w:rFonts w:ascii="Verdana" w:hAnsi="Verdana"/>
-          <w:sz w:val="32"/>
-          <w:szCs w:val="32"/>
-        </w:rPr>
-        <w:t>requires</w:t>
-      </w:r>
-      <w:proofErr w:type="gramEnd"/>
-      <w:r>
-        <w:rPr>
-          <w:rFonts w:ascii="Verdana" w:hAnsi="Verdana"/>
-          <w:sz w:val="32"/>
-          <w:szCs w:val="32"/>
-        </w:rPr>
-        <w:t xml:space="preserve"> 1.8 or higher).</w:t>
+        <w:t xml:space="preserve">Game is implemented using Java </w:t>
+      </w:r>
+      <w:r>
+        <w:rPr>
+          <w:rFonts w:ascii="Verdana" w:hAnsi="Verdana"/>
+          <w:sz w:val="32"/>
+          <w:szCs w:val="32"/>
+        </w:rPr>
+        <w:t xml:space="preserve">11 </w:t>
+      </w:r>
+      <w:r>
+        <w:rPr>
+          <w:rFonts w:ascii="Verdana" w:hAnsi="Verdana"/>
+          <w:sz w:val="32"/>
+          <w:szCs w:val="32"/>
+        </w:rPr>
+        <w:t xml:space="preserve">(requires </w:t>
+      </w:r>
+      <w:r>
+        <w:rPr>
+          <w:rFonts w:ascii="Verdana" w:hAnsi="Verdana"/>
+          <w:sz w:val="32"/>
+          <w:szCs w:val="32"/>
+        </w:rPr>
+        <w:t xml:space="preserve">Java </w:t>
+      </w:r>
+      <w:r>
+        <w:rPr>
+          <w:rFonts w:ascii="Verdana" w:hAnsi="Verdana"/>
+          <w:sz w:val="32"/>
+          <w:szCs w:val="32"/>
+        </w:rPr>
+        <w:t>1</w:t>
+      </w:r>
+      <w:r>
+        <w:rPr>
+          <w:rFonts w:ascii="Verdana" w:hAnsi="Verdana"/>
+          <w:sz w:val="32"/>
+          <w:szCs w:val="32"/>
+        </w:rPr>
+        <w:t>1</w:t>
+      </w:r>
+      <w:r>
+        <w:rPr>
+          <w:rFonts w:ascii="Verdana" w:hAnsi="Verdana"/>
+          <w:sz w:val="32"/>
+          <w:szCs w:val="32"/>
+        </w:rPr>
+        <w:t xml:space="preserve"> or higher).</w:t>
       </w:r>
     </w:p>
     <w:p>
@@ -4093,7 +4189,7 @@
     <w:charset w:val="00"/>
     <w:family w:val="swiss"/>
     <w:pitch w:val="variable"/>
-    <w:sig w:usb0="E4002EFF" w:usb1="C000247B" w:usb2="00000009" w:usb3="00000000" w:csb0="000001FF" w:csb1="00000000"/>
+    <w:sig w:usb0="E4002EFF" w:usb1="C200247B" w:usb2="00000009" w:usb3="00000000" w:csb0="000001FF" w:csb1="00000000"/>
   </w:font>
   <w:font w:name="Tahoma">
     <w:panose1 w:val="020B0604030504040204"/>
@@ -4121,7 +4217,7 @@
     <w:charset w:val="00"/>
     <w:family w:val="swiss"/>
     <w:pitch w:val="variable"/>
-    <w:sig w:usb0="E4002EFF" w:usb1="C000247B" w:usb2="00000009" w:usb3="00000000" w:csb0="000001FF" w:csb1="00000000"/>
+    <w:sig w:usb0="E4002EFF" w:usb1="C200247B" w:usb2="00000009" w:usb3="00000000" w:csb0="000001FF" w:csb1="00000000"/>
   </w:font>
 </w:fonts>
 </file>
@@ -4145,6 +4241,7 @@
     <w:rsid w:val="000F63D0"/>
     <w:rsid w:val="00133C44"/>
     <w:rsid w:val="001F1795"/>
+    <w:rsid w:val="003C3C1D"/>
     <w:rsid w:val="00585F61"/>
     <w:rsid w:val="005D2204"/>
     <w:rsid w:val="00721E18"/>

</xml_diff>

<commit_message>
Build V38. Impl/Fix shadow renderer. Shadow box. Add external. Add config/option menu for shadows.
</commit_message>
<xml_diff>
--- a/Support Manual.docx
+++ b/Support Manual.docx
@@ -12,23 +12,13 @@
           <w:sz w:val="48"/>
         </w:rPr>
       </w:pPr>
-      <w:proofErr w:type="spellStart"/>
       <w:r>
         <w:rPr>
           <w:rFonts w:ascii="Verdana" w:hAnsi="Verdana"/>
           <w:b/>
           <w:sz w:val="48"/>
         </w:rPr>
-        <w:t>Ermac</w:t>
-      </w:r>
-      <w:proofErr w:type="spellEnd"/>
-      <w:r>
-        <w:rPr>
-          <w:rFonts w:ascii="Verdana" w:hAnsi="Verdana"/>
-          <w:b/>
-          <w:sz w:val="48"/>
-        </w:rPr>
-        <w:t xml:space="preserve"> Voxel Game </w:t>
+        <w:t xml:space="preserve">Ermac Voxel Game </w:t>
       </w:r>
     </w:p>
     <w:p>
@@ -393,23 +383,13 @@
           <w:sz w:val="48"/>
         </w:rPr>
       </w:pPr>
-      <w:proofErr w:type="spellStart"/>
       <w:r>
         <w:rPr>
           <w:rFonts w:ascii="Verdana" w:hAnsi="Verdana"/>
           <w:b/>
           <w:sz w:val="48"/>
         </w:rPr>
-        <w:t>intrface</w:t>
-      </w:r>
-      <w:proofErr w:type="spellEnd"/>
-      <w:r>
-        <w:rPr>
-          <w:rFonts w:ascii="Verdana" w:hAnsi="Verdana"/>
-          <w:b/>
-          <w:sz w:val="48"/>
-        </w:rPr>
-        <w:t xml:space="preserve"> </w:t>
+        <w:t xml:space="preserve">intrface </w:t>
       </w:r>
       <w:r>
         <w:rPr>
@@ -465,23 +445,7 @@
           <w:rFonts w:ascii="Verdana" w:hAnsi="Verdana"/>
           <w:sz w:val="32"/>
         </w:rPr>
-        <w:t>models (.obj format) and textures (.</w:t>
-      </w:r>
-      <w:proofErr w:type="spellStart"/>
-      <w:r>
-        <w:rPr>
-          <w:rFonts w:ascii="Verdana" w:hAnsi="Verdana"/>
-          <w:sz w:val="32"/>
-        </w:rPr>
-        <w:t>png</w:t>
-      </w:r>
-      <w:proofErr w:type="spellEnd"/>
-      <w:r>
-        <w:rPr>
-          <w:rFonts w:ascii="Verdana" w:hAnsi="Verdana"/>
-          <w:sz w:val="32"/>
-        </w:rPr>
-        <w:t xml:space="preserve"> format) for the player assets;</w:t>
+        <w:t>models (.obj format) and textures (.png format) for the player assets;</w:t>
       </w:r>
     </w:p>
     <w:p>
@@ -523,39 +487,7 @@
           <w:rFonts w:ascii="Verdana" w:hAnsi="Verdana"/>
           <w:sz w:val="32"/>
         </w:rPr>
-        <w:t xml:space="preserve">contains music and sound </w:t>
-      </w:r>
-      <w:proofErr w:type="spellStart"/>
-      <w:r>
-        <w:rPr>
-          <w:rFonts w:ascii="Verdana" w:hAnsi="Verdana"/>
-          <w:sz w:val="32"/>
-        </w:rPr>
-        <w:t>fx</w:t>
-      </w:r>
-      <w:proofErr w:type="spellEnd"/>
-      <w:r>
-        <w:rPr>
-          <w:rFonts w:ascii="Verdana" w:hAnsi="Verdana"/>
-          <w:sz w:val="32"/>
-        </w:rPr>
-        <w:t xml:space="preserve"> audio files (.</w:t>
-      </w:r>
-      <w:proofErr w:type="spellStart"/>
-      <w:r>
-        <w:rPr>
-          <w:rFonts w:ascii="Verdana" w:hAnsi="Verdana"/>
-          <w:sz w:val="32"/>
-        </w:rPr>
-        <w:t>ogg</w:t>
-      </w:r>
-      <w:proofErr w:type="spellEnd"/>
-      <w:r>
-        <w:rPr>
-          <w:rFonts w:ascii="Verdana" w:hAnsi="Verdana"/>
-          <w:sz w:val="32"/>
-        </w:rPr>
-        <w:t xml:space="preserve"> format);</w:t>
+        <w:t>contains music and sound fx audio files (.ogg format);</w:t>
       </w:r>
     </w:p>
     <w:p>
@@ -597,23 +529,7 @@
           <w:rFonts w:ascii="Verdana" w:hAnsi="Verdana"/>
           <w:sz w:val="32"/>
         </w:rPr>
-        <w:t>contains models (.obj format) and textures (.</w:t>
-      </w:r>
-      <w:proofErr w:type="spellStart"/>
-      <w:r>
-        <w:rPr>
-          <w:rFonts w:ascii="Verdana" w:hAnsi="Verdana"/>
-          <w:sz w:val="32"/>
-        </w:rPr>
-        <w:t>png</w:t>
-      </w:r>
-      <w:proofErr w:type="spellEnd"/>
-      <w:r>
-        <w:rPr>
-          <w:rFonts w:ascii="Verdana" w:hAnsi="Verdana"/>
-          <w:sz w:val="32"/>
-        </w:rPr>
-        <w:t xml:space="preserve"> format) for blocks which make environment as it is.</w:t>
+        <w:t>contains models (.obj format) and textures (.png format) for blocks which make environment as it is.</w:t>
       </w:r>
     </w:p>
     <w:p>
@@ -716,7 +632,6 @@
           <w:szCs w:val="32"/>
         </w:rPr>
       </w:pPr>
-      <w:proofErr w:type="spellStart"/>
       <w:r>
         <w:rPr>
           <w:rFonts w:ascii="Verdana" w:hAnsi="Verdana"/>
@@ -727,32 +642,13 @@
         </w:rPr>
         <w:t>fps_max</w:t>
       </w:r>
-      <w:proofErr w:type="spellEnd"/>
-      <w:r>
-        <w:rPr>
-          <w:rFonts w:ascii="Verdana" w:hAnsi="Verdana"/>
-          <w:sz w:val="32"/>
-          <w:szCs w:val="32"/>
-        </w:rPr>
-        <w:t xml:space="preserve">&lt;num&gt;, </w:t>
-      </w:r>
-      <w:proofErr w:type="spellStart"/>
-      <w:r>
-        <w:rPr>
-          <w:rFonts w:ascii="Verdana" w:hAnsi="Verdana"/>
-          <w:sz w:val="32"/>
-          <w:szCs w:val="32"/>
-        </w:rPr>
-        <w:t>fpsMax</w:t>
-      </w:r>
-      <w:proofErr w:type="spellEnd"/>
-      <w:r>
-        <w:rPr>
-          <w:rFonts w:ascii="Verdana" w:hAnsi="Verdana"/>
-          <w:sz w:val="32"/>
-          <w:szCs w:val="32"/>
-        </w:rPr>
-        <w:t>&lt;num&gt;: allowing to change max fps (it must be positive number)</w:t>
+      <w:r>
+        <w:rPr>
+          <w:rFonts w:ascii="Verdana" w:hAnsi="Verdana"/>
+          <w:sz w:val="32"/>
+          <w:szCs w:val="32"/>
+        </w:rPr>
+        <w:t>&lt;num&gt;, fpsMax&lt;num&gt;: allowing to change max fps (it must be positive number)</w:t>
       </w:r>
       <w:r>
         <w:rPr>
@@ -818,7 +714,6 @@
           <w:szCs w:val="32"/>
         </w:rPr>
       </w:pPr>
-      <w:proofErr w:type="spellStart"/>
       <w:r>
         <w:rPr>
           <w:rFonts w:ascii="Verdana" w:hAnsi="Verdana"/>
@@ -829,7 +724,6 @@
         </w:rPr>
         <w:t>fullscreen</w:t>
       </w:r>
-      <w:proofErr w:type="spellEnd"/>
       <w:r>
         <w:rPr>
           <w:rFonts w:ascii="Verdana" w:hAnsi="Verdana"/>
@@ -862,18 +756,8 @@
           <w:sz w:val="32"/>
           <w:szCs w:val="32"/>
         </w:rPr>
-        <w:t xml:space="preserve"> makes your game run </w:t>
-      </w:r>
-      <w:proofErr w:type="spellStart"/>
-      <w:r>
-        <w:rPr>
-          <w:rFonts w:ascii="Verdana" w:hAnsi="Verdana"/>
-          <w:sz w:val="32"/>
-          <w:szCs w:val="32"/>
-        </w:rPr>
-        <w:t>fullscreen</w:t>
-      </w:r>
-      <w:proofErr w:type="spellEnd"/>
+        <w:t xml:space="preserve"> makes your game run fullscreen</w:t>
+      </w:r>
       <w:r>
         <w:rPr>
           <w:rFonts w:ascii="Verdana" w:hAnsi="Verdana"/>
@@ -910,7 +794,6 @@
           <w:szCs w:val="32"/>
         </w:rPr>
       </w:pPr>
-      <w:proofErr w:type="spellStart"/>
       <w:r>
         <w:rPr>
           <w:rFonts w:ascii="Verdana" w:hAnsi="Verdana"/>
@@ -921,68 +804,13 @@
         </w:rPr>
         <w:t>v_sync</w:t>
       </w:r>
-      <w:proofErr w:type="spellEnd"/>
-      <w:r>
-        <w:rPr>
-          <w:rFonts w:ascii="Verdana" w:hAnsi="Verdana"/>
-          <w:sz w:val="32"/>
-          <w:szCs w:val="32"/>
-        </w:rPr>
-        <w:t xml:space="preserve"> &lt;bool&gt;, </w:t>
-      </w:r>
-      <w:proofErr w:type="spellStart"/>
-      <w:r>
-        <w:rPr>
-          <w:rFonts w:ascii="Verdana" w:hAnsi="Verdana"/>
-          <w:sz w:val="32"/>
-          <w:szCs w:val="32"/>
-        </w:rPr>
-        <w:t>vsync</w:t>
-      </w:r>
-      <w:proofErr w:type="spellEnd"/>
-      <w:r>
-        <w:rPr>
-          <w:rFonts w:ascii="Verdana" w:hAnsi="Verdana"/>
-          <w:sz w:val="32"/>
-          <w:szCs w:val="32"/>
-        </w:rPr>
-        <w:t xml:space="preserve">&lt;bool&gt;: whether or not you </w:t>
-      </w:r>
-      <w:proofErr w:type="spellStart"/>
-      <w:r>
-        <w:rPr>
-          <w:rFonts w:ascii="Verdana" w:hAnsi="Verdana"/>
-          <w:sz w:val="32"/>
-          <w:szCs w:val="32"/>
-        </w:rPr>
-        <w:t>wanna</w:t>
-      </w:r>
-      <w:proofErr w:type="spellEnd"/>
-      <w:r>
-        <w:rPr>
-          <w:rFonts w:ascii="Verdana" w:hAnsi="Verdana"/>
-          <w:sz w:val="32"/>
-          <w:szCs w:val="32"/>
-        </w:rPr>
-        <w:t xml:space="preserve"> </w:t>
-      </w:r>
-      <w:proofErr w:type="spellStart"/>
-      <w:r>
-        <w:rPr>
-          <w:rFonts w:ascii="Verdana" w:hAnsi="Verdana"/>
-          <w:sz w:val="32"/>
-          <w:szCs w:val="32"/>
-        </w:rPr>
-        <w:t>vsync</w:t>
-      </w:r>
-      <w:proofErr w:type="spellEnd"/>
-      <w:r>
-        <w:rPr>
-          <w:rFonts w:ascii="Verdana" w:hAnsi="Verdana"/>
-          <w:sz w:val="32"/>
-          <w:szCs w:val="32"/>
-        </w:rPr>
-        <w:t xml:space="preserve"> on or off. If it’s on (you’ve set it to true) your fps is capped to your monitor refresh rate.</w:t>
+      <w:r>
+        <w:rPr>
+          <w:rFonts w:ascii="Verdana" w:hAnsi="Verdana"/>
+          <w:sz w:val="32"/>
+          <w:szCs w:val="32"/>
+        </w:rPr>
+        <w:t xml:space="preserve"> &lt;bool&gt;, vsync&lt;bool&gt;: whether or not you wanna vsync on or off. If it’s on (you’ve set it to true) your fps is capped to your monitor refresh rate.</w:t>
       </w:r>
     </w:p>
     <w:p>
@@ -1004,7 +832,6 @@
           <w:szCs w:val="32"/>
         </w:rPr>
       </w:pPr>
-      <w:proofErr w:type="spellStart"/>
       <w:r>
         <w:rPr>
           <w:rFonts w:ascii="Verdana" w:hAnsi="Verdana"/>
@@ -1013,16 +840,67 @@
           <w:sz w:val="32"/>
           <w:szCs w:val="32"/>
         </w:rPr>
-        <w:t>water_efects</w:t>
-      </w:r>
-      <w:proofErr w:type="spellEnd"/>
-      <w:r>
-        <w:rPr>
-          <w:rFonts w:ascii="Verdana" w:hAnsi="Verdana"/>
-          <w:sz w:val="32"/>
-          <w:szCs w:val="32"/>
-        </w:rPr>
-        <w:t xml:space="preserve"> &lt;bool&gt;: enables (true) or disables (false) water effects (such as reflection).</w:t>
+        <w:t>water_ef</w:t>
+      </w:r>
+      <w:r>
+        <w:rPr>
+          <w:rFonts w:ascii="Verdana" w:hAnsi="Verdana"/>
+          <w:b/>
+          <w:bCs/>
+          <w:sz w:val="32"/>
+          <w:szCs w:val="32"/>
+        </w:rPr>
+        <w:t>f</w:t>
+      </w:r>
+      <w:r>
+        <w:rPr>
+          <w:rFonts w:ascii="Verdana" w:hAnsi="Verdana"/>
+          <w:b/>
+          <w:bCs/>
+          <w:sz w:val="32"/>
+          <w:szCs w:val="32"/>
+        </w:rPr>
+        <w:t>ects</w:t>
+      </w:r>
+      <w:r>
+        <w:rPr>
+          <w:rFonts w:ascii="Verdana" w:hAnsi="Verdana"/>
+          <w:sz w:val="32"/>
+          <w:szCs w:val="32"/>
+        </w:rPr>
+        <w:t xml:space="preserve"> &lt;</w:t>
+      </w:r>
+      <w:r>
+        <w:rPr>
+          <w:rFonts w:ascii="Verdana" w:hAnsi="Verdana"/>
+          <w:sz w:val="32"/>
+          <w:szCs w:val="32"/>
+        </w:rPr>
+        <w:t>enum</w:t>
+      </w:r>
+      <w:r>
+        <w:rPr>
+          <w:rFonts w:ascii="Verdana" w:hAnsi="Verdana"/>
+          <w:sz w:val="32"/>
+          <w:szCs w:val="32"/>
+        </w:rPr>
+        <w:t xml:space="preserve">&gt;: </w:t>
+      </w:r>
+      <w:r>
+        <w:rPr>
+          <w:rFonts w:ascii="Verdana" w:hAnsi="Verdana"/>
+          <w:sz w:val="32"/>
+          <w:szCs w:val="32"/>
+        </w:rPr>
+        <w:t>NONE (disabled), LOW, MEDIUM, HIGH, ULTRA</w:t>
+      </w:r>
+      <w:r>
+        <w:rPr>
+          <w:rFonts w:ascii="Verdana" w:hAnsi="Verdana"/>
+          <w:sz w:val="32"/>
+          <w:szCs w:val="32"/>
+        </w:rPr>
+        <w:t>.</w:t>
       </w:r>
     </w:p>
     <w:p>
@@ -1044,7 +922,6 @@
           <w:szCs w:val="32"/>
         </w:rPr>
       </w:pPr>
-      <w:proofErr w:type="spellStart"/>
       <w:r>
         <w:rPr>
           <w:rFonts w:ascii="Verdana" w:hAnsi="Verdana"/>
@@ -1053,34 +930,77 @@
           <w:sz w:val="32"/>
           <w:szCs w:val="32"/>
         </w:rPr>
-        <w:t>mouse_sensitivity</w:t>
-      </w:r>
-      <w:proofErr w:type="spellEnd"/>
-      <w:r>
-        <w:rPr>
-          <w:rFonts w:ascii="Verdana" w:hAnsi="Verdana"/>
-          <w:sz w:val="32"/>
-          <w:szCs w:val="32"/>
-        </w:rPr>
-        <w:t xml:space="preserve">&lt;num&gt;, </w:t>
-      </w:r>
-      <w:proofErr w:type="spellStart"/>
-      <w:r>
-        <w:rPr>
-          <w:rFonts w:ascii="Verdana" w:hAnsi="Verdana"/>
-          <w:sz w:val="32"/>
-          <w:szCs w:val="32"/>
-        </w:rPr>
-        <w:t>msens</w:t>
-      </w:r>
-      <w:proofErr w:type="spellEnd"/>
-      <w:r>
-        <w:rPr>
-          <w:rFonts w:ascii="Verdana" w:hAnsi="Verdana"/>
-          <w:sz w:val="32"/>
-          <w:szCs w:val="32"/>
-        </w:rPr>
-        <w:t xml:space="preserve"> &lt;num&gt;: sets mouse sensitivity to this value.</w:t>
+        <w:t>shadow</w:t>
+      </w:r>
+      <w:r>
+        <w:rPr>
+          <w:rFonts w:ascii="Verdana" w:hAnsi="Verdana"/>
+          <w:b/>
+          <w:bCs/>
+          <w:sz w:val="32"/>
+          <w:szCs w:val="32"/>
+        </w:rPr>
+        <w:t>_ef</w:t>
+      </w:r>
+      <w:r>
+        <w:rPr>
+          <w:rFonts w:ascii="Verdana" w:hAnsi="Verdana"/>
+          <w:b/>
+          <w:bCs/>
+          <w:sz w:val="32"/>
+          <w:szCs w:val="32"/>
+        </w:rPr>
+        <w:t>f</w:t>
+      </w:r>
+      <w:r>
+        <w:rPr>
+          <w:rFonts w:ascii="Verdana" w:hAnsi="Verdana"/>
+          <w:b/>
+          <w:bCs/>
+          <w:sz w:val="32"/>
+          <w:szCs w:val="32"/>
+        </w:rPr>
+        <w:t>ects</w:t>
+      </w:r>
+      <w:r>
+        <w:rPr>
+          <w:rFonts w:ascii="Verdana" w:hAnsi="Verdana"/>
+          <w:sz w:val="32"/>
+          <w:szCs w:val="32"/>
+        </w:rPr>
+        <w:t xml:space="preserve"> &lt;</w:t>
+      </w:r>
+      <w:r>
+        <w:rPr>
+          <w:rFonts w:ascii="Verdana" w:hAnsi="Verdana"/>
+          <w:sz w:val="32"/>
+          <w:szCs w:val="32"/>
+        </w:rPr>
+        <w:t>enum</w:t>
+      </w:r>
+      <w:r>
+        <w:rPr>
+          <w:rFonts w:ascii="Verdana" w:hAnsi="Verdana"/>
+          <w:sz w:val="32"/>
+          <w:szCs w:val="32"/>
+        </w:rPr>
+        <w:t xml:space="preserve">&gt;: </w:t>
+      </w:r>
+      <w:r>
+        <w:rPr>
+          <w:rFonts w:ascii="Verdana" w:hAnsi="Verdana"/>
+          <w:sz w:val="32"/>
+          <w:szCs w:val="32"/>
+        </w:rPr>
+        <w:t>NONE (disabled), LOW, MEDIUM, HIGH, ULTRA</w:t>
+      </w:r>
+      <w:r>
+        <w:rPr>
+          <w:rFonts w:ascii="Verdana" w:hAnsi="Verdana"/>
+          <w:sz w:val="32"/>
+          <w:szCs w:val="32"/>
+        </w:rPr>
+        <w:t>.</w:t>
       </w:r>
     </w:p>
     <w:p>
@@ -1110,33 +1030,15 @@
           <w:sz w:val="32"/>
           <w:szCs w:val="32"/>
         </w:rPr>
-        <w:t>music</w:t>
-      </w:r>
-      <w:r>
-        <w:rPr>
-          <w:rFonts w:ascii="Verdana" w:hAnsi="Verdana"/>
-          <w:sz w:val="32"/>
-          <w:szCs w:val="32"/>
-        </w:rPr>
-        <w:t xml:space="preserve"> &lt;num&gt;, sound &lt;num&gt; : sets respectively music and </w:t>
-      </w:r>
-      <w:r>
-        <w:rPr>
-          <w:rFonts w:ascii="Verdana" w:hAnsi="Verdana"/>
-          <w:b/>
-          <w:bCs/>
-          <w:sz w:val="32"/>
-          <w:szCs w:val="32"/>
-        </w:rPr>
-        <w:t>sound</w:t>
-      </w:r>
-      <w:r>
-        <w:rPr>
-          <w:rFonts w:ascii="Verdana" w:hAnsi="Verdana"/>
-          <w:sz w:val="32"/>
-          <w:szCs w:val="32"/>
-        </w:rPr>
-        <w:t xml:space="preserve"> volume to this value.</w:t>
+        <w:t>mouse_sensitivity</w:t>
+      </w:r>
+      <w:r>
+        <w:rPr>
+          <w:rFonts w:ascii="Verdana" w:hAnsi="Verdana"/>
+          <w:sz w:val="32"/>
+          <w:szCs w:val="32"/>
+        </w:rPr>
+        <w:t>&lt;num&gt;, msens &lt;num&gt;: sets mouse sensitivity to this value.</w:t>
       </w:r>
     </w:p>
     <w:p>
@@ -1166,15 +1068,33 @@
           <w:sz w:val="32"/>
           <w:szCs w:val="32"/>
         </w:rPr>
-        <w:t>screenshot</w:t>
-      </w:r>
-      <w:r>
-        <w:rPr>
-          <w:rFonts w:ascii="Verdana" w:hAnsi="Verdana"/>
-          <w:sz w:val="32"/>
-          <w:szCs w:val="32"/>
-        </w:rPr>
-        <w:t>: take a screenshot (uses folder screenshots).</w:t>
+        <w:t>music</w:t>
+      </w:r>
+      <w:r>
+        <w:rPr>
+          <w:rFonts w:ascii="Verdana" w:hAnsi="Verdana"/>
+          <w:sz w:val="32"/>
+          <w:szCs w:val="32"/>
+        </w:rPr>
+        <w:t xml:space="preserve"> &lt;num&gt;, sound &lt;num&gt; : sets respectively music and </w:t>
+      </w:r>
+      <w:r>
+        <w:rPr>
+          <w:rFonts w:ascii="Verdana" w:hAnsi="Verdana"/>
+          <w:b/>
+          <w:bCs/>
+          <w:sz w:val="32"/>
+          <w:szCs w:val="32"/>
+        </w:rPr>
+        <w:t>sound</w:t>
+      </w:r>
+      <w:r>
+        <w:rPr>
+          <w:rFonts w:ascii="Verdana" w:hAnsi="Verdana"/>
+          <w:sz w:val="32"/>
+          <w:szCs w:val="32"/>
+        </w:rPr>
+        <w:t xml:space="preserve"> volume to this value.</w:t>
       </w:r>
     </w:p>
     <w:p>
@@ -1204,15 +1124,15 @@
           <w:sz w:val="32"/>
           <w:szCs w:val="32"/>
         </w:rPr>
-        <w:t>position</w:t>
-      </w:r>
-      <w:r>
-        <w:rPr>
-          <w:rFonts w:ascii="Verdana" w:hAnsi="Verdana"/>
-          <w:sz w:val="32"/>
-          <w:szCs w:val="32"/>
-        </w:rPr>
-        <w:t>: get/set position and (or) chunk.</w:t>
+        <w:t>screenshot</w:t>
+      </w:r>
+      <w:r>
+        <w:rPr>
+          <w:rFonts w:ascii="Verdana" w:hAnsi="Verdana"/>
+          <w:sz w:val="32"/>
+          <w:szCs w:val="32"/>
+        </w:rPr>
+        <w:t>: take a screenshot (uses folder screenshots).</w:t>
       </w:r>
     </w:p>
     <w:p>
@@ -1234,7 +1154,6 @@
           <w:szCs w:val="32"/>
         </w:rPr>
       </w:pPr>
-      <w:proofErr w:type="spellStart"/>
       <w:r>
         <w:rPr>
           <w:rFonts w:ascii="Verdana" w:hAnsi="Verdana"/>
@@ -1243,96 +1162,15 @@
           <w:sz w:val="32"/>
           <w:szCs w:val="32"/>
         </w:rPr>
-        <w:t>s</w:t>
-      </w:r>
-      <w:r>
-        <w:rPr>
-          <w:rFonts w:ascii="Verdana" w:hAnsi="Verdana"/>
-          <w:b/>
-          <w:bCs/>
-          <w:sz w:val="32"/>
-          <w:szCs w:val="32"/>
-        </w:rPr>
-        <w:t>izeof</w:t>
-      </w:r>
-      <w:proofErr w:type="spellEnd"/>
-      <w:r>
-        <w:rPr>
-          <w:rFonts w:ascii="Verdana" w:hAnsi="Verdana"/>
-          <w:sz w:val="32"/>
-          <w:szCs w:val="32"/>
-        </w:rPr>
-        <w:t>[&lt;</w:t>
-      </w:r>
-      <w:proofErr w:type="spellStart"/>
-      <w:r>
-        <w:rPr>
-          <w:rFonts w:ascii="Verdana" w:hAnsi="Verdana"/>
-          <w:sz w:val="32"/>
-          <w:szCs w:val="32"/>
-        </w:rPr>
-        <w:t>chunk</w:t>
-      </w:r>
-      <w:r>
-        <w:rPr>
-          <w:rFonts w:ascii="Verdana" w:hAnsi="Verdana"/>
-          <w:sz w:val="32"/>
-          <w:szCs w:val="32"/>
-        </w:rPr>
-        <w:t>I</w:t>
-      </w:r>
-      <w:r>
-        <w:rPr>
-          <w:rFonts w:ascii="Verdana" w:hAnsi="Verdana"/>
-          <w:sz w:val="32"/>
-          <w:szCs w:val="32"/>
-        </w:rPr>
-        <w:t>d</w:t>
-      </w:r>
-      <w:proofErr w:type="spellEnd"/>
-      <w:r>
-        <w:rPr>
-          <w:rFonts w:ascii="Verdana" w:hAnsi="Verdana"/>
-          <w:sz w:val="32"/>
-          <w:szCs w:val="32"/>
-        </w:rPr>
-        <w:t xml:space="preserve">&gt;]: get total size without </w:t>
-      </w:r>
-      <w:proofErr w:type="spellStart"/>
-      <w:r>
-        <w:rPr>
-          <w:rFonts w:ascii="Verdana" w:hAnsi="Verdana"/>
-          <w:sz w:val="32"/>
-          <w:szCs w:val="32"/>
-        </w:rPr>
-        <w:t>args</w:t>
-      </w:r>
-      <w:proofErr w:type="spellEnd"/>
-      <w:r>
-        <w:rPr>
-          <w:rFonts w:ascii="Verdana" w:hAnsi="Verdana"/>
-          <w:sz w:val="32"/>
-          <w:szCs w:val="32"/>
-        </w:rPr>
-        <w:t xml:space="preserve">, if </w:t>
-      </w:r>
-      <w:proofErr w:type="spellStart"/>
-      <w:r>
-        <w:rPr>
-          <w:rFonts w:ascii="Verdana" w:hAnsi="Verdana"/>
-          <w:sz w:val="32"/>
-          <w:szCs w:val="32"/>
-        </w:rPr>
-        <w:t>args</w:t>
-      </w:r>
-      <w:proofErr w:type="spellEnd"/>
-      <w:r>
-        <w:rPr>
-          <w:rFonts w:ascii="Verdana" w:hAnsi="Verdana"/>
-          <w:sz w:val="32"/>
-          <w:szCs w:val="32"/>
-        </w:rPr>
-        <w:t xml:space="preserve"> provided size of blocks of that chunk.</w:t>
+        <w:t>position</w:t>
+      </w:r>
+      <w:r>
+        <w:rPr>
+          <w:rFonts w:ascii="Verdana" w:hAnsi="Verdana"/>
+          <w:sz w:val="32"/>
+          <w:szCs w:val="32"/>
+        </w:rPr>
+        <w:t>: get/set position and (or) chunk.</w:t>
       </w:r>
     </w:p>
     <w:p>
@@ -1357,18 +1195,46 @@
       <w:r>
         <w:rPr>
           <w:rFonts w:ascii="Verdana" w:hAnsi="Verdana"/>
-          <w:sz w:val="32"/>
-          <w:szCs w:val="32"/>
-        </w:rPr>
-        <w:t>quit, exit</w:t>
-      </w:r>
-      <w:r>
-        <w:rPr>
-          <w:rFonts w:ascii="Verdana" w:hAnsi="Verdana"/>
-          <w:sz w:val="32"/>
-          <w:szCs w:val="32"/>
-        </w:rPr>
-        <w:t xml:space="preserve"> : leaves the game.</w:t>
+          <w:b/>
+          <w:bCs/>
+          <w:sz w:val="32"/>
+          <w:szCs w:val="32"/>
+        </w:rPr>
+        <w:t>s</w:t>
+      </w:r>
+      <w:r>
+        <w:rPr>
+          <w:rFonts w:ascii="Verdana" w:hAnsi="Verdana"/>
+          <w:b/>
+          <w:bCs/>
+          <w:sz w:val="32"/>
+          <w:szCs w:val="32"/>
+        </w:rPr>
+        <w:t>izeof</w:t>
+      </w:r>
+      <w:r>
+        <w:rPr>
+          <w:rFonts w:ascii="Verdana" w:hAnsi="Verdana"/>
+          <w:sz w:val="32"/>
+          <w:szCs w:val="32"/>
+        </w:rPr>
+        <w:t>[&lt;chunk</w:t>
+      </w:r>
+      <w:r>
+        <w:rPr>
+          <w:rFonts w:ascii="Verdana" w:hAnsi="Verdana"/>
+          <w:sz w:val="32"/>
+          <w:szCs w:val="32"/>
+        </w:rPr>
+        <w:t>I</w:t>
+      </w:r>
+      <w:r>
+        <w:rPr>
+          <w:rFonts w:ascii="Verdana" w:hAnsi="Verdana"/>
+          <w:sz w:val="32"/>
+          <w:szCs w:val="32"/>
+        </w:rPr>
+        <w:t>d&gt;]: get total size without args, if args provided size of blocks of that chunk.</w:t>
       </w:r>
     </w:p>
     <w:p>
@@ -1393,28 +1259,18 @@
       <w:r>
         <w:rPr>
           <w:rFonts w:ascii="Verdana" w:hAnsi="Verdana"/>
-          <w:b/>
-          <w:bCs/>
-          <w:sz w:val="32"/>
-          <w:szCs w:val="32"/>
-        </w:rPr>
-        <w:t>cache</w:t>
-      </w:r>
-      <w:r>
-        <w:rPr>
-          <w:rFonts w:ascii="Verdana" w:hAnsi="Verdana"/>
-          <w:sz w:val="32"/>
-          <w:szCs w:val="32"/>
-        </w:rPr>
-        <w:t>:</w:t>
-      </w:r>
-      <w:r>
-        <w:rPr>
-          <w:rFonts w:ascii="Verdana" w:hAnsi="Verdana"/>
-          <w:sz w:val="32"/>
-          <w:szCs w:val="32"/>
-        </w:rPr>
-        <w:t xml:space="preserve"> displays info about cached chunks: &lt;id&gt;&lt;size&gt;&lt;filename&gt;</w:t>
+          <w:sz w:val="32"/>
+          <w:szCs w:val="32"/>
+        </w:rPr>
+        <w:t>quit, exit</w:t>
+      </w:r>
+      <w:r>
+        <w:rPr>
+          <w:rFonts w:ascii="Verdana" w:hAnsi="Verdana"/>
+          <w:sz w:val="32"/>
+          <w:szCs w:val="32"/>
+        </w:rPr>
+        <w:t xml:space="preserve"> : leaves the game.</w:t>
       </w:r>
     </w:p>
     <w:p>
@@ -1444,7 +1300,7 @@
           <w:sz w:val="32"/>
           <w:szCs w:val="32"/>
         </w:rPr>
-        <w:t>clear</w:t>
+        <w:t>cache</w:t>
       </w:r>
       <w:r>
         <w:rPr>
@@ -1457,20 +1313,10 @@
       <w:r>
         <w:rPr>
           <w:rFonts w:ascii="Verdana" w:hAnsi="Verdana"/>
-          <w:b/>
-          <w:bCs/>
-          <w:sz w:val="32"/>
-          <w:szCs w:val="32"/>
-        </w:rPr>
-        <w:t xml:space="preserve"> </w:t>
-      </w:r>
-      <w:r>
-        <w:rPr>
-          <w:rFonts w:ascii="Verdana" w:hAnsi="Verdana"/>
-          <w:sz w:val="32"/>
-          <w:szCs w:val="32"/>
-        </w:rPr>
-        <w:t>clears the console history.</w:t>
+          <w:sz w:val="32"/>
+          <w:szCs w:val="32"/>
+        </w:rPr>
+        <w:t xml:space="preserve"> displays info about cached chunks: &lt;id&gt;&lt;size&gt;&lt;filename&gt;</w:t>
       </w:r>
     </w:p>
     <w:p>
@@ -1492,7 +1338,6 @@
           <w:szCs w:val="32"/>
         </w:rPr>
       </w:pPr>
-      <w:proofErr w:type="spellStart"/>
       <w:r>
         <w:rPr>
           <w:rFonts w:ascii="Verdana" w:hAnsi="Verdana"/>
@@ -1501,9 +1346,16 @@
           <w:sz w:val="32"/>
           <w:szCs w:val="32"/>
         </w:rPr>
-        <w:t>game_ticks</w:t>
-      </w:r>
-      <w:proofErr w:type="spellEnd"/>
+        <w:t>clear</w:t>
+      </w:r>
+      <w:r>
+        <w:rPr>
+          <w:rFonts w:ascii="Verdana" w:hAnsi="Verdana"/>
+          <w:sz w:val="32"/>
+          <w:szCs w:val="32"/>
+        </w:rPr>
+        <w:t>:</w:t>
+      </w:r>
       <w:r>
         <w:rPr>
           <w:rFonts w:ascii="Verdana" w:hAnsi="Verdana"/>
@@ -1520,1155 +1372,7 @@
           <w:sz w:val="32"/>
           <w:szCs w:val="32"/>
         </w:rPr>
-        <w:t>&lt;</w:t>
-      </w:r>
-      <w:proofErr w:type="spellStart"/>
-      <w:r>
-        <w:rPr>
-          <w:rFonts w:ascii="Verdana" w:hAnsi="Verdana"/>
-          <w:sz w:val="32"/>
-          <w:szCs w:val="32"/>
-        </w:rPr>
-        <w:t>ticks</w:t>
-      </w:r>
-      <w:r>
-        <w:rPr>
-          <w:rFonts w:ascii="Verdana" w:hAnsi="Verdana"/>
-          <w:sz w:val="32"/>
-          <w:szCs w:val="32"/>
-        </w:rPr>
-        <w:t>_</w:t>
-      </w:r>
-      <w:r>
-        <w:rPr>
-          <w:rFonts w:ascii="Verdana" w:hAnsi="Verdana"/>
-          <w:sz w:val="32"/>
-          <w:szCs w:val="32"/>
-        </w:rPr>
-        <w:t>num</w:t>
-      </w:r>
-      <w:proofErr w:type="spellEnd"/>
-      <w:r>
-        <w:rPr>
-          <w:rFonts w:ascii="Verdana" w:hAnsi="Verdana"/>
-          <w:sz w:val="32"/>
-          <w:szCs w:val="32"/>
-        </w:rPr>
-        <w:t>&gt;</w:t>
-      </w:r>
-      <w:r>
-        <w:rPr>
-          <w:rFonts w:ascii="Verdana" w:hAnsi="Verdana"/>
-          <w:sz w:val="32"/>
-          <w:szCs w:val="32"/>
-        </w:rPr>
-        <w:t>:</w:t>
-      </w:r>
-      <w:r>
-        <w:rPr>
-          <w:rFonts w:ascii="Verdana" w:hAnsi="Verdana"/>
-          <w:sz w:val="32"/>
-          <w:szCs w:val="32"/>
-        </w:rPr>
-        <w:t xml:space="preserve"> change</w:t>
-      </w:r>
-      <w:r>
-        <w:rPr>
-          <w:rFonts w:ascii="Verdana" w:hAnsi="Verdana"/>
-          <w:sz w:val="32"/>
-          <w:szCs w:val="32"/>
-        </w:rPr>
-        <w:t xml:space="preserve"> game</w:t>
-      </w:r>
-      <w:r>
-        <w:rPr>
-          <w:rFonts w:ascii="Verdana" w:hAnsi="Verdana"/>
-          <w:sz w:val="32"/>
-          <w:szCs w:val="32"/>
-        </w:rPr>
-        <w:t xml:space="preserve"> time</w:t>
-      </w:r>
-      <w:r>
-        <w:rPr>
-          <w:rFonts w:ascii="Verdana" w:hAnsi="Verdana"/>
-          <w:sz w:val="32"/>
-          <w:szCs w:val="32"/>
-        </w:rPr>
-        <w:t>.</w:t>
-      </w:r>
-    </w:p>
-    <w:p>
-      <w:pPr>
-        <w:pStyle w:val="NoSpacing"/>
-        <w:rPr>
-          <w:rFonts w:ascii="Verdana" w:hAnsi="Verdana"/>
-          <w:b/>
-          <w:sz w:val="32"/>
-          <w:szCs w:val="32"/>
-        </w:rPr>
-      </w:pPr>
-    </w:p>
-    <w:p>
-      <w:pPr>
-        <w:pStyle w:val="NoSpacing"/>
-        <w:pBdr>
-          <w:top w:val="single" w:sz="4" w:space="1" w:color="auto"/>
-          <w:left w:val="single" w:sz="4" w:space="4" w:color="auto"/>
-          <w:bottom w:val="single" w:sz="4" w:space="1" w:color="auto"/>
-          <w:right w:val="single" w:sz="4" w:space="4" w:color="auto"/>
-        </w:pBdr>
-        <w:rPr>
-          <w:rFonts w:ascii="Verdana" w:hAnsi="Verdana"/>
-          <w:b/>
-          <w:sz w:val="32"/>
-          <w:szCs w:val="32"/>
-        </w:rPr>
-      </w:pPr>
-      <w:r>
-        <w:rPr>
-          <w:rFonts w:ascii="Verdana" w:hAnsi="Verdana"/>
-          <w:b/>
-          <w:sz w:val="32"/>
-          <w:szCs w:val="32"/>
-        </w:rPr>
-        <w:t xml:space="preserve">HELP </w:t>
-      </w:r>
-    </w:p>
-    <w:p>
-      <w:pPr>
-        <w:pStyle w:val="NoSpacing"/>
-        <w:pBdr>
-          <w:top w:val="single" w:sz="4" w:space="1" w:color="auto"/>
-          <w:left w:val="single" w:sz="4" w:space="4" w:color="auto"/>
-          <w:bottom w:val="single" w:sz="4" w:space="1" w:color="auto"/>
-          <w:right w:val="single" w:sz="4" w:space="4" w:color="auto"/>
-        </w:pBdr>
-        <w:rPr>
-          <w:rFonts w:ascii="Verdana" w:hAnsi="Verdana"/>
-          <w:b/>
-          <w:sz w:val="32"/>
-          <w:szCs w:val="32"/>
-        </w:rPr>
-      </w:pPr>
-    </w:p>
-    <w:p>
-      <w:pPr>
-        <w:pStyle w:val="NoSpacing"/>
-        <w:pBdr>
-          <w:top w:val="single" w:sz="4" w:space="1" w:color="auto"/>
-          <w:left w:val="single" w:sz="4" w:space="4" w:color="auto"/>
-          <w:bottom w:val="single" w:sz="4" w:space="1" w:color="auto"/>
-          <w:right w:val="single" w:sz="4" w:space="4" w:color="auto"/>
-        </w:pBdr>
-        <w:rPr>
-          <w:rFonts w:ascii="Verdana" w:hAnsi="Verdana"/>
-          <w:b/>
-          <w:sz w:val="32"/>
-          <w:szCs w:val="32"/>
-        </w:rPr>
-      </w:pPr>
-      <w:r>
-        <w:rPr>
-          <w:rFonts w:ascii="Verdana" w:hAnsi="Verdana"/>
-          <w:b/>
-          <w:sz w:val="32"/>
-          <w:szCs w:val="32"/>
-        </w:rPr>
-        <w:t>Camera movements:</w:t>
-      </w:r>
-    </w:p>
-    <w:p>
-      <w:pPr>
-        <w:pStyle w:val="NoSpacing"/>
-        <w:pBdr>
-          <w:top w:val="single" w:sz="4" w:space="1" w:color="auto"/>
-          <w:left w:val="single" w:sz="4" w:space="4" w:color="auto"/>
-          <w:bottom w:val="single" w:sz="4" w:space="1" w:color="auto"/>
-          <w:right w:val="single" w:sz="4" w:space="4" w:color="auto"/>
-        </w:pBdr>
-        <w:rPr>
-          <w:rFonts w:ascii="Verdana" w:hAnsi="Verdana"/>
-          <w:sz w:val="32"/>
-          <w:szCs w:val="32"/>
-        </w:rPr>
-      </w:pPr>
-      <w:r>
-        <w:rPr>
-          <w:rFonts w:ascii="Verdana" w:hAnsi="Verdana"/>
-          <w:sz w:val="32"/>
-          <w:szCs w:val="32"/>
-        </w:rPr>
-        <w:lastRenderedPageBreak/>
-        <w:t xml:space="preserve">W, </w:t>
-      </w:r>
-      <w:proofErr w:type="spellStart"/>
-      <w:r>
-        <w:rPr>
-          <w:rFonts w:ascii="Verdana" w:hAnsi="Verdana"/>
-          <w:sz w:val="32"/>
-          <w:szCs w:val="32"/>
-        </w:rPr>
-        <w:t>UpArrow</w:t>
-      </w:r>
-      <w:proofErr w:type="spellEnd"/>
-      <w:r>
-        <w:rPr>
-          <w:rFonts w:ascii="Verdana" w:hAnsi="Verdana"/>
-          <w:sz w:val="32"/>
-          <w:szCs w:val="32"/>
-        </w:rPr>
-        <w:t xml:space="preserve"> = Forward</w:t>
-      </w:r>
-    </w:p>
-    <w:p>
-      <w:pPr>
-        <w:pStyle w:val="NoSpacing"/>
-        <w:pBdr>
-          <w:top w:val="single" w:sz="4" w:space="1" w:color="auto"/>
-          <w:left w:val="single" w:sz="4" w:space="4" w:color="auto"/>
-          <w:bottom w:val="single" w:sz="4" w:space="1" w:color="auto"/>
-          <w:right w:val="single" w:sz="4" w:space="4" w:color="auto"/>
-        </w:pBdr>
-        <w:rPr>
-          <w:rFonts w:ascii="Verdana" w:hAnsi="Verdana"/>
-          <w:sz w:val="32"/>
-          <w:szCs w:val="32"/>
-        </w:rPr>
-      </w:pPr>
-      <w:r>
-        <w:rPr>
-          <w:rFonts w:ascii="Verdana" w:hAnsi="Verdana"/>
-          <w:sz w:val="32"/>
-          <w:szCs w:val="32"/>
-        </w:rPr>
-        <w:t xml:space="preserve">A, </w:t>
-      </w:r>
-      <w:proofErr w:type="spellStart"/>
-      <w:r>
-        <w:rPr>
-          <w:rFonts w:ascii="Verdana" w:hAnsi="Verdana"/>
-          <w:sz w:val="32"/>
-          <w:szCs w:val="32"/>
-        </w:rPr>
-        <w:t>DownArrow</w:t>
-      </w:r>
-      <w:proofErr w:type="spellEnd"/>
-      <w:r>
-        <w:rPr>
-          <w:rFonts w:ascii="Verdana" w:hAnsi="Verdana"/>
-          <w:sz w:val="32"/>
-          <w:szCs w:val="32"/>
-        </w:rPr>
-        <w:t xml:space="preserve"> = Backward</w:t>
-      </w:r>
-    </w:p>
-    <w:p>
-      <w:pPr>
-        <w:pStyle w:val="NoSpacing"/>
-        <w:pBdr>
-          <w:top w:val="single" w:sz="4" w:space="1" w:color="auto"/>
-          <w:left w:val="single" w:sz="4" w:space="4" w:color="auto"/>
-          <w:bottom w:val="single" w:sz="4" w:space="1" w:color="auto"/>
-          <w:right w:val="single" w:sz="4" w:space="4" w:color="auto"/>
-        </w:pBdr>
-        <w:rPr>
-          <w:rFonts w:ascii="Verdana" w:hAnsi="Verdana"/>
-          <w:sz w:val="32"/>
-          <w:szCs w:val="32"/>
-        </w:rPr>
-      </w:pPr>
-      <w:r>
-        <w:rPr>
-          <w:rFonts w:ascii="Verdana" w:hAnsi="Verdana"/>
-          <w:sz w:val="32"/>
-          <w:szCs w:val="32"/>
-        </w:rPr>
-        <w:t>S = Strafe Left</w:t>
-      </w:r>
-    </w:p>
-    <w:p>
-      <w:pPr>
-        <w:pStyle w:val="NoSpacing"/>
-        <w:pBdr>
-          <w:top w:val="single" w:sz="4" w:space="1" w:color="auto"/>
-          <w:left w:val="single" w:sz="4" w:space="4" w:color="auto"/>
-          <w:bottom w:val="single" w:sz="4" w:space="1" w:color="auto"/>
-          <w:right w:val="single" w:sz="4" w:space="4" w:color="auto"/>
-        </w:pBdr>
-        <w:rPr>
-          <w:rFonts w:ascii="Verdana" w:hAnsi="Verdana"/>
-          <w:sz w:val="32"/>
-          <w:szCs w:val="32"/>
-        </w:rPr>
-      </w:pPr>
-      <w:r>
-        <w:rPr>
-          <w:rFonts w:ascii="Verdana" w:hAnsi="Verdana"/>
-          <w:sz w:val="32"/>
-          <w:szCs w:val="32"/>
-        </w:rPr>
-        <w:t>D = Strafe Right</w:t>
-      </w:r>
-    </w:p>
-    <w:p>
-      <w:pPr>
-        <w:pStyle w:val="NoSpacing"/>
-        <w:pBdr>
-          <w:top w:val="single" w:sz="4" w:space="1" w:color="auto"/>
-          <w:left w:val="single" w:sz="4" w:space="4" w:color="auto"/>
-          <w:bottom w:val="single" w:sz="4" w:space="1" w:color="auto"/>
-          <w:right w:val="single" w:sz="4" w:space="4" w:color="auto"/>
-        </w:pBdr>
-        <w:rPr>
-          <w:rFonts w:ascii="Verdana" w:hAnsi="Verdana"/>
-          <w:sz w:val="32"/>
-          <w:szCs w:val="32"/>
-        </w:rPr>
-      </w:pPr>
-      <w:proofErr w:type="spellStart"/>
-      <w:r>
-        <w:rPr>
-          <w:rFonts w:ascii="Verdana" w:hAnsi="Verdana"/>
-          <w:sz w:val="32"/>
-          <w:szCs w:val="32"/>
-        </w:rPr>
-        <w:t>LeftArrow</w:t>
-      </w:r>
-      <w:proofErr w:type="spellEnd"/>
-      <w:r>
-        <w:rPr>
-          <w:rFonts w:ascii="Verdana" w:hAnsi="Verdana"/>
-          <w:sz w:val="32"/>
-          <w:szCs w:val="32"/>
-        </w:rPr>
-        <w:t xml:space="preserve"> = Turn Left</w:t>
-      </w:r>
-    </w:p>
-    <w:p>
-      <w:pPr>
-        <w:pStyle w:val="NoSpacing"/>
-        <w:pBdr>
-          <w:top w:val="single" w:sz="4" w:space="1" w:color="auto"/>
-          <w:left w:val="single" w:sz="4" w:space="4" w:color="auto"/>
-          <w:bottom w:val="single" w:sz="4" w:space="1" w:color="auto"/>
-          <w:right w:val="single" w:sz="4" w:space="4" w:color="auto"/>
-        </w:pBdr>
-        <w:rPr>
-          <w:rFonts w:ascii="Verdana" w:hAnsi="Verdana"/>
-          <w:sz w:val="32"/>
-          <w:szCs w:val="32"/>
-        </w:rPr>
-      </w:pPr>
-      <w:proofErr w:type="spellStart"/>
-      <w:r>
-        <w:rPr>
-          <w:rFonts w:ascii="Verdana" w:hAnsi="Verdana"/>
-          <w:sz w:val="32"/>
-          <w:szCs w:val="32"/>
-        </w:rPr>
-        <w:t>RightArrow</w:t>
-      </w:r>
-      <w:proofErr w:type="spellEnd"/>
-      <w:r>
-        <w:rPr>
-          <w:rFonts w:ascii="Verdana" w:hAnsi="Verdana"/>
-          <w:sz w:val="32"/>
-          <w:szCs w:val="32"/>
-        </w:rPr>
-        <w:t xml:space="preserve"> = Turn Right</w:t>
-      </w:r>
-    </w:p>
-    <w:p>
-      <w:pPr>
-        <w:pStyle w:val="NoSpacing"/>
-        <w:pBdr>
-          <w:top w:val="single" w:sz="4" w:space="1" w:color="auto"/>
-          <w:left w:val="single" w:sz="4" w:space="4" w:color="auto"/>
-          <w:bottom w:val="single" w:sz="4" w:space="1" w:color="auto"/>
-          <w:right w:val="single" w:sz="4" w:space="4" w:color="auto"/>
-        </w:pBdr>
-        <w:rPr>
-          <w:rFonts w:ascii="Verdana" w:hAnsi="Verdana"/>
-          <w:sz w:val="32"/>
-          <w:szCs w:val="32"/>
-        </w:rPr>
-      </w:pPr>
-    </w:p>
-    <w:p>
-      <w:pPr>
-        <w:pStyle w:val="NoSpacing"/>
-        <w:pBdr>
-          <w:top w:val="single" w:sz="4" w:space="1" w:color="auto"/>
-          <w:left w:val="single" w:sz="4" w:space="4" w:color="auto"/>
-          <w:bottom w:val="single" w:sz="4" w:space="1" w:color="auto"/>
-          <w:right w:val="single" w:sz="4" w:space="4" w:color="auto"/>
-        </w:pBdr>
-        <w:rPr>
-          <w:rFonts w:ascii="Verdana" w:hAnsi="Verdana"/>
-          <w:b/>
-          <w:bCs/>
-          <w:sz w:val="32"/>
-          <w:szCs w:val="32"/>
-        </w:rPr>
-      </w:pPr>
-      <w:r>
-        <w:rPr>
-          <w:rFonts w:ascii="Verdana" w:hAnsi="Verdana"/>
-          <w:b/>
-          <w:bCs/>
-          <w:sz w:val="32"/>
-          <w:szCs w:val="32"/>
-        </w:rPr>
-        <w:t>Observer functions:</w:t>
-      </w:r>
-    </w:p>
-    <w:p>
-      <w:pPr>
-        <w:pStyle w:val="NoSpacing"/>
-        <w:pBdr>
-          <w:top w:val="single" w:sz="4" w:space="1" w:color="auto"/>
-          <w:left w:val="single" w:sz="4" w:space="4" w:color="auto"/>
-          <w:bottom w:val="single" w:sz="4" w:space="1" w:color="auto"/>
-          <w:right w:val="single" w:sz="4" w:space="4" w:color="auto"/>
-        </w:pBdr>
-        <w:rPr>
-          <w:rFonts w:ascii="Verdana" w:hAnsi="Verdana"/>
-          <w:sz w:val="32"/>
-          <w:szCs w:val="32"/>
-        </w:rPr>
-      </w:pPr>
-      <w:proofErr w:type="spellStart"/>
-      <w:r>
-        <w:rPr>
-          <w:rFonts w:ascii="Verdana" w:hAnsi="Verdana"/>
-          <w:sz w:val="32"/>
-          <w:szCs w:val="32"/>
-        </w:rPr>
-        <w:t>PageUp</w:t>
-      </w:r>
-      <w:proofErr w:type="spellEnd"/>
-      <w:r>
-        <w:rPr>
-          <w:rFonts w:ascii="Verdana" w:hAnsi="Verdana"/>
-          <w:sz w:val="32"/>
-          <w:szCs w:val="32"/>
-        </w:rPr>
-        <w:t xml:space="preserve"> = </w:t>
-      </w:r>
-      <w:r>
-        <w:rPr>
-          <w:rFonts w:ascii="Verdana" w:hAnsi="Verdana"/>
-          <w:sz w:val="32"/>
-          <w:szCs w:val="32"/>
-        </w:rPr>
-        <w:t>Ascend (Fly Up)</w:t>
-      </w:r>
-    </w:p>
-    <w:p>
-      <w:pPr>
-        <w:pStyle w:val="NoSpacing"/>
-        <w:pBdr>
-          <w:top w:val="single" w:sz="4" w:space="1" w:color="auto"/>
-          <w:left w:val="single" w:sz="4" w:space="4" w:color="auto"/>
-          <w:bottom w:val="single" w:sz="4" w:space="1" w:color="auto"/>
-          <w:right w:val="single" w:sz="4" w:space="4" w:color="auto"/>
-        </w:pBdr>
-        <w:rPr>
-          <w:rFonts w:ascii="Verdana" w:hAnsi="Verdana"/>
-          <w:sz w:val="32"/>
-          <w:szCs w:val="32"/>
-        </w:rPr>
-      </w:pPr>
-      <w:proofErr w:type="spellStart"/>
-      <w:r>
-        <w:rPr>
-          <w:rFonts w:ascii="Verdana" w:hAnsi="Verdana"/>
-          <w:sz w:val="32"/>
-          <w:szCs w:val="32"/>
-        </w:rPr>
-        <w:t>Page</w:t>
-      </w:r>
-      <w:r>
-        <w:rPr>
-          <w:rFonts w:ascii="Verdana" w:hAnsi="Verdana"/>
-          <w:sz w:val="32"/>
-          <w:szCs w:val="32"/>
-        </w:rPr>
-        <w:t>Down</w:t>
-      </w:r>
-      <w:proofErr w:type="spellEnd"/>
-      <w:r>
-        <w:rPr>
-          <w:rFonts w:ascii="Verdana" w:hAnsi="Verdana"/>
-          <w:sz w:val="32"/>
-          <w:szCs w:val="32"/>
-        </w:rPr>
-        <w:t xml:space="preserve"> = </w:t>
-      </w:r>
-      <w:r>
-        <w:rPr>
-          <w:rFonts w:ascii="Verdana" w:hAnsi="Verdana"/>
-          <w:sz w:val="32"/>
-          <w:szCs w:val="32"/>
-        </w:rPr>
-        <w:t>De</w:t>
-      </w:r>
-      <w:r>
-        <w:rPr>
-          <w:rFonts w:ascii="Verdana" w:hAnsi="Verdana"/>
-          <w:sz w:val="32"/>
-          <w:szCs w:val="32"/>
-        </w:rPr>
-        <w:t xml:space="preserve">scend (Fly </w:t>
-      </w:r>
-      <w:r>
-        <w:rPr>
-          <w:rFonts w:ascii="Verdana" w:hAnsi="Verdana"/>
-          <w:sz w:val="32"/>
-          <w:szCs w:val="32"/>
-        </w:rPr>
-        <w:t>Down</w:t>
-      </w:r>
-      <w:r>
-        <w:rPr>
-          <w:rFonts w:ascii="Verdana" w:hAnsi="Verdana"/>
-          <w:sz w:val="32"/>
-          <w:szCs w:val="32"/>
-        </w:rPr>
-        <w:t>)</w:t>
-      </w:r>
-    </w:p>
-    <w:p>
-      <w:pPr>
-        <w:pStyle w:val="NoSpacing"/>
-        <w:pBdr>
-          <w:top w:val="single" w:sz="4" w:space="1" w:color="auto"/>
-          <w:left w:val="single" w:sz="4" w:space="4" w:color="auto"/>
-          <w:bottom w:val="single" w:sz="4" w:space="1" w:color="auto"/>
-          <w:right w:val="single" w:sz="4" w:space="4" w:color="auto"/>
-        </w:pBdr>
-        <w:rPr>
-          <w:rFonts w:ascii="Verdana" w:hAnsi="Verdana"/>
-          <w:b/>
-          <w:sz w:val="32"/>
-          <w:szCs w:val="32"/>
-        </w:rPr>
-      </w:pPr>
-    </w:p>
-    <w:p>
-      <w:pPr>
-        <w:pStyle w:val="NoSpacing"/>
-        <w:pBdr>
-          <w:top w:val="single" w:sz="4" w:space="1" w:color="auto"/>
-          <w:left w:val="single" w:sz="4" w:space="4" w:color="auto"/>
-          <w:bottom w:val="single" w:sz="4" w:space="1" w:color="auto"/>
-          <w:right w:val="single" w:sz="4" w:space="4" w:color="auto"/>
-        </w:pBdr>
-        <w:rPr>
-          <w:rFonts w:ascii="Verdana" w:hAnsi="Verdana"/>
-          <w:b/>
-          <w:sz w:val="32"/>
-          <w:szCs w:val="32"/>
-        </w:rPr>
-      </w:pPr>
-      <w:r>
-        <w:rPr>
-          <w:rFonts w:ascii="Verdana" w:hAnsi="Verdana"/>
-          <w:b/>
-          <w:sz w:val="32"/>
-          <w:szCs w:val="32"/>
-        </w:rPr>
-        <w:t>Player functions:</w:t>
-      </w:r>
-    </w:p>
-    <w:p>
-      <w:pPr>
-        <w:pStyle w:val="NoSpacing"/>
-        <w:pBdr>
-          <w:top w:val="single" w:sz="4" w:space="1" w:color="auto"/>
-          <w:left w:val="single" w:sz="4" w:space="4" w:color="auto"/>
-          <w:bottom w:val="single" w:sz="4" w:space="1" w:color="auto"/>
-          <w:right w:val="single" w:sz="4" w:space="4" w:color="auto"/>
-        </w:pBdr>
-        <w:rPr>
-          <w:rFonts w:ascii="Verdana" w:hAnsi="Verdana"/>
-          <w:sz w:val="32"/>
-          <w:szCs w:val="32"/>
-        </w:rPr>
-      </w:pPr>
-      <w:r>
-        <w:rPr>
-          <w:rFonts w:ascii="Verdana" w:hAnsi="Verdana"/>
-          <w:sz w:val="32"/>
-          <w:szCs w:val="32"/>
-        </w:rPr>
-        <w:t>Space = Jump</w:t>
-      </w:r>
-    </w:p>
-    <w:p>
-      <w:pPr>
-        <w:pStyle w:val="NoSpacing"/>
-        <w:pBdr>
-          <w:top w:val="single" w:sz="4" w:space="1" w:color="auto"/>
-          <w:left w:val="single" w:sz="4" w:space="4" w:color="auto"/>
-          <w:bottom w:val="single" w:sz="4" w:space="1" w:color="auto"/>
-          <w:right w:val="single" w:sz="4" w:space="4" w:color="auto"/>
-        </w:pBdr>
-        <w:rPr>
-          <w:rFonts w:ascii="Verdana" w:hAnsi="Verdana"/>
-          <w:b/>
-          <w:sz w:val="32"/>
-          <w:szCs w:val="32"/>
-        </w:rPr>
-      </w:pPr>
-      <w:r>
-        <w:rPr>
-          <w:rFonts w:ascii="Verdana" w:hAnsi="Verdana"/>
-          <w:sz w:val="32"/>
-          <w:szCs w:val="32"/>
-        </w:rPr>
-        <w:t>Ctrl = Crouch/Sink</w:t>
-      </w:r>
-    </w:p>
-    <w:p>
-      <w:pPr>
-        <w:pStyle w:val="NoSpacing"/>
-        <w:pBdr>
-          <w:top w:val="single" w:sz="4" w:space="1" w:color="auto"/>
-          <w:left w:val="single" w:sz="4" w:space="4" w:color="auto"/>
-          <w:bottom w:val="single" w:sz="4" w:space="1" w:color="auto"/>
-          <w:right w:val="single" w:sz="4" w:space="4" w:color="auto"/>
-        </w:pBdr>
-        <w:rPr>
-          <w:rFonts w:ascii="Verdana" w:hAnsi="Verdana"/>
-          <w:b/>
-          <w:sz w:val="32"/>
-          <w:szCs w:val="32"/>
-        </w:rPr>
-      </w:pPr>
-    </w:p>
-    <w:p>
-      <w:pPr>
-        <w:pStyle w:val="NoSpacing"/>
-        <w:pBdr>
-          <w:top w:val="single" w:sz="4" w:space="1" w:color="auto"/>
-          <w:left w:val="single" w:sz="4" w:space="4" w:color="auto"/>
-          <w:bottom w:val="single" w:sz="4" w:space="1" w:color="auto"/>
-          <w:right w:val="single" w:sz="4" w:space="4" w:color="auto"/>
-        </w:pBdr>
-        <w:rPr>
-          <w:rFonts w:ascii="Verdana" w:hAnsi="Verdana"/>
-          <w:b/>
-          <w:sz w:val="32"/>
-          <w:szCs w:val="32"/>
-        </w:rPr>
-      </w:pPr>
-      <w:r>
-        <w:rPr>
-          <w:rFonts w:ascii="Verdana" w:hAnsi="Verdana"/>
-          <w:b/>
-          <w:sz w:val="32"/>
-          <w:szCs w:val="32"/>
-        </w:rPr>
-        <w:t>Editor functions:</w:t>
-      </w:r>
-    </w:p>
-    <w:p>
-      <w:pPr>
-        <w:pStyle w:val="NoSpacing"/>
-        <w:pBdr>
-          <w:top w:val="single" w:sz="4" w:space="1" w:color="auto"/>
-          <w:left w:val="single" w:sz="4" w:space="4" w:color="auto"/>
-          <w:bottom w:val="single" w:sz="4" w:space="1" w:color="auto"/>
-          <w:right w:val="single" w:sz="4" w:space="4" w:color="auto"/>
-        </w:pBdr>
-        <w:rPr>
-          <w:rFonts w:ascii="Verdana" w:hAnsi="Verdana"/>
-          <w:sz w:val="32"/>
-          <w:szCs w:val="32"/>
-        </w:rPr>
-      </w:pPr>
-      <w:r>
-        <w:rPr>
-          <w:rFonts w:ascii="Verdana" w:hAnsi="Verdana"/>
-          <w:sz w:val="32"/>
-          <w:szCs w:val="32"/>
-        </w:rPr>
-        <w:t>N = Create New Block</w:t>
-      </w:r>
-    </w:p>
-    <w:p>
-      <w:pPr>
-        <w:pStyle w:val="NoSpacing"/>
-        <w:pBdr>
-          <w:top w:val="single" w:sz="4" w:space="1" w:color="auto"/>
-          <w:left w:val="single" w:sz="4" w:space="4" w:color="auto"/>
-          <w:bottom w:val="single" w:sz="4" w:space="1" w:color="auto"/>
-          <w:right w:val="single" w:sz="4" w:space="4" w:color="auto"/>
-        </w:pBdr>
-        <w:rPr>
-          <w:rFonts w:ascii="Verdana" w:hAnsi="Verdana"/>
-          <w:sz w:val="32"/>
-          <w:szCs w:val="32"/>
-        </w:rPr>
-      </w:pPr>
-      <w:r>
-        <w:rPr>
-          <w:rFonts w:ascii="Verdana" w:hAnsi="Verdana"/>
-          <w:sz w:val="32"/>
-          <w:szCs w:val="32"/>
-        </w:rPr>
-        <w:t>M = Change Block Color</w:t>
-      </w:r>
-    </w:p>
-    <w:p>
-      <w:pPr>
-        <w:pStyle w:val="NoSpacing"/>
-        <w:pBdr>
-          <w:top w:val="single" w:sz="4" w:space="1" w:color="auto"/>
-          <w:left w:val="single" w:sz="4" w:space="4" w:color="auto"/>
-          <w:bottom w:val="single" w:sz="4" w:space="1" w:color="auto"/>
-          <w:right w:val="single" w:sz="4" w:space="4" w:color="auto"/>
-        </w:pBdr>
-        <w:rPr>
-          <w:rFonts w:ascii="Verdana" w:hAnsi="Verdana"/>
-          <w:sz w:val="32"/>
-          <w:szCs w:val="32"/>
-        </w:rPr>
-      </w:pPr>
-      <w:r>
-        <w:rPr>
-          <w:rFonts w:ascii="Verdana" w:hAnsi="Verdana"/>
-          <w:sz w:val="32"/>
-          <w:szCs w:val="32"/>
-        </w:rPr>
-        <w:t>Mouse1 = Select Solid Block</w:t>
-      </w:r>
-    </w:p>
-    <w:p>
-      <w:pPr>
-        <w:pStyle w:val="NoSpacing"/>
-        <w:pBdr>
-          <w:top w:val="single" w:sz="4" w:space="1" w:color="auto"/>
-          <w:left w:val="single" w:sz="4" w:space="4" w:color="auto"/>
-          <w:bottom w:val="single" w:sz="4" w:space="1" w:color="auto"/>
-          <w:right w:val="single" w:sz="4" w:space="4" w:color="auto"/>
-        </w:pBdr>
-        <w:rPr>
-          <w:rFonts w:ascii="Verdana" w:hAnsi="Verdana"/>
-          <w:sz w:val="32"/>
-          <w:szCs w:val="32"/>
-        </w:rPr>
-      </w:pPr>
-      <w:r>
-        <w:rPr>
-          <w:rFonts w:ascii="Verdana" w:hAnsi="Verdana"/>
-          <w:sz w:val="32"/>
-          <w:szCs w:val="32"/>
-        </w:rPr>
-        <w:t>Mouse1 + SHIFT = Select Fluid Block</w:t>
-      </w:r>
-    </w:p>
-    <w:p>
-      <w:pPr>
-        <w:pStyle w:val="NoSpacing"/>
-        <w:pBdr>
-          <w:top w:val="single" w:sz="4" w:space="1" w:color="auto"/>
-          <w:left w:val="single" w:sz="4" w:space="4" w:color="auto"/>
-          <w:bottom w:val="single" w:sz="4" w:space="1" w:color="auto"/>
-          <w:right w:val="single" w:sz="4" w:space="4" w:color="auto"/>
-        </w:pBdr>
-        <w:rPr>
-          <w:rFonts w:ascii="Verdana" w:hAnsi="Verdana"/>
-          <w:sz w:val="32"/>
-          <w:szCs w:val="32"/>
-        </w:rPr>
-      </w:pPr>
-      <w:r>
-        <w:rPr>
-          <w:rFonts w:ascii="Verdana" w:hAnsi="Verdana"/>
-          <w:sz w:val="32"/>
-          <w:szCs w:val="32"/>
-        </w:rPr>
-        <w:t>Mouse2 = Place New Block</w:t>
-      </w:r>
-    </w:p>
-    <w:p>
-      <w:pPr>
-        <w:pStyle w:val="NoSpacing"/>
-        <w:pBdr>
-          <w:top w:val="single" w:sz="4" w:space="1" w:color="auto"/>
-          <w:left w:val="single" w:sz="4" w:space="4" w:color="auto"/>
-          <w:bottom w:val="single" w:sz="4" w:space="1" w:color="auto"/>
-          <w:right w:val="single" w:sz="4" w:space="4" w:color="auto"/>
-        </w:pBdr>
-        <w:rPr>
-          <w:rFonts w:ascii="Verdana" w:hAnsi="Verdana"/>
-          <w:sz w:val="32"/>
-          <w:szCs w:val="32"/>
-        </w:rPr>
-      </w:pPr>
-      <w:r>
-        <w:rPr>
-          <w:rFonts w:ascii="Verdana" w:hAnsi="Verdana"/>
-          <w:sz w:val="32"/>
-          <w:szCs w:val="32"/>
-        </w:rPr>
-        <w:t>1-6 = Select Adjacent Solid Block</w:t>
-      </w:r>
-    </w:p>
-    <w:p>
-      <w:pPr>
-        <w:pStyle w:val="NoSpacing"/>
-        <w:pBdr>
-          <w:top w:val="single" w:sz="4" w:space="1" w:color="auto"/>
-          <w:left w:val="single" w:sz="4" w:space="4" w:color="auto"/>
-          <w:bottom w:val="single" w:sz="4" w:space="1" w:color="auto"/>
-          <w:right w:val="single" w:sz="4" w:space="4" w:color="auto"/>
-        </w:pBdr>
-        <w:rPr>
-          <w:rFonts w:ascii="Verdana" w:hAnsi="Verdana"/>
-          <w:sz w:val="32"/>
-          <w:szCs w:val="32"/>
-        </w:rPr>
-      </w:pPr>
-      <w:r>
-        <w:rPr>
-          <w:rFonts w:ascii="Verdana" w:hAnsi="Verdana"/>
-          <w:sz w:val="32"/>
-          <w:szCs w:val="32"/>
-        </w:rPr>
-        <w:t>1-6 + SHIFT = Select Adjacent Fluid Block</w:t>
-      </w:r>
-    </w:p>
-    <w:p>
-      <w:pPr>
-        <w:pStyle w:val="NoSpacing"/>
-        <w:pBdr>
-          <w:top w:val="single" w:sz="4" w:space="1" w:color="auto"/>
-          <w:left w:val="single" w:sz="4" w:space="4" w:color="auto"/>
-          <w:bottom w:val="single" w:sz="4" w:space="1" w:color="auto"/>
-          <w:right w:val="single" w:sz="4" w:space="4" w:color="auto"/>
-        </w:pBdr>
-        <w:rPr>
-          <w:rFonts w:ascii="Verdana" w:hAnsi="Verdana"/>
-          <w:sz w:val="32"/>
-          <w:szCs w:val="32"/>
-        </w:rPr>
-      </w:pPr>
-      <w:r>
-        <w:rPr>
-          <w:rFonts w:ascii="Verdana" w:hAnsi="Verdana"/>
-          <w:sz w:val="32"/>
-          <w:szCs w:val="32"/>
-        </w:rPr>
-        <w:t>F, 0 = Deselect</w:t>
-      </w:r>
-    </w:p>
-    <w:p>
-      <w:pPr>
-        <w:pStyle w:val="NoSpacing"/>
-        <w:pBdr>
-          <w:top w:val="single" w:sz="4" w:space="1" w:color="auto"/>
-          <w:left w:val="single" w:sz="4" w:space="4" w:color="auto"/>
-          <w:bottom w:val="single" w:sz="4" w:space="1" w:color="auto"/>
-          <w:right w:val="single" w:sz="4" w:space="4" w:color="auto"/>
-        </w:pBdr>
-        <w:rPr>
-          <w:rFonts w:ascii="Verdana" w:hAnsi="Verdana"/>
-          <w:sz w:val="32"/>
-          <w:szCs w:val="32"/>
-        </w:rPr>
-      </w:pPr>
-      <w:r>
-        <w:rPr>
-          <w:rFonts w:ascii="Verdana" w:hAnsi="Verdana"/>
-          <w:sz w:val="32"/>
-          <w:szCs w:val="32"/>
-        </w:rPr>
-        <w:t>R = Remove Selected Block</w:t>
-      </w:r>
-    </w:p>
-    <w:p>
-      <w:pPr>
-        <w:pStyle w:val="NoSpacing"/>
-        <w:pBdr>
-          <w:top w:val="single" w:sz="4" w:space="1" w:color="auto"/>
-          <w:left w:val="single" w:sz="4" w:space="4" w:color="auto"/>
-          <w:bottom w:val="single" w:sz="4" w:space="1" w:color="auto"/>
-          <w:right w:val="single" w:sz="4" w:space="4" w:color="auto"/>
-        </w:pBdr>
-        <w:rPr>
-          <w:rFonts w:ascii="Verdana" w:hAnsi="Verdana"/>
-          <w:sz w:val="32"/>
-          <w:szCs w:val="32"/>
-        </w:rPr>
-      </w:pPr>
-      <w:r>
-        <w:rPr>
-          <w:rFonts w:ascii="Verdana" w:hAnsi="Verdana"/>
-          <w:sz w:val="32"/>
-          <w:szCs w:val="32"/>
-        </w:rPr>
-        <w:t>[, ] = Change Texture For New Block</w:t>
-      </w:r>
-    </w:p>
-    <w:p>
-      <w:pPr>
-        <w:pStyle w:val="NoSpacing"/>
-        <w:pBdr>
-          <w:top w:val="single" w:sz="4" w:space="1" w:color="auto"/>
-          <w:left w:val="single" w:sz="4" w:space="4" w:color="auto"/>
-          <w:bottom w:val="single" w:sz="4" w:space="1" w:color="auto"/>
-          <w:right w:val="single" w:sz="4" w:space="4" w:color="auto"/>
-        </w:pBdr>
-        <w:rPr>
-          <w:rFonts w:ascii="Verdana" w:hAnsi="Verdana"/>
-          <w:b/>
-          <w:sz w:val="32"/>
-          <w:szCs w:val="32"/>
-        </w:rPr>
-      </w:pPr>
-    </w:p>
-    <w:p>
-      <w:pPr>
-        <w:pStyle w:val="NoSpacing"/>
-        <w:pBdr>
-          <w:top w:val="single" w:sz="4" w:space="1" w:color="auto"/>
-          <w:left w:val="single" w:sz="4" w:space="4" w:color="auto"/>
-          <w:bottom w:val="single" w:sz="4" w:space="1" w:color="auto"/>
-          <w:right w:val="single" w:sz="4" w:space="4" w:color="auto"/>
-        </w:pBdr>
-        <w:rPr>
-          <w:rFonts w:ascii="Verdana" w:hAnsi="Verdana"/>
-          <w:b/>
-          <w:sz w:val="32"/>
-          <w:szCs w:val="32"/>
-        </w:rPr>
-      </w:pPr>
-      <w:r>
-        <w:rPr>
-          <w:rFonts w:ascii="Verdana" w:hAnsi="Verdana"/>
-          <w:b/>
-          <w:sz w:val="32"/>
-          <w:szCs w:val="32"/>
-        </w:rPr>
-        <w:t>Other functions:</w:t>
-      </w:r>
-    </w:p>
-    <w:p>
-      <w:pPr>
-        <w:pStyle w:val="NoSpacing"/>
-        <w:pBdr>
-          <w:top w:val="single" w:sz="4" w:space="1" w:color="auto"/>
-          <w:left w:val="single" w:sz="4" w:space="4" w:color="auto"/>
-          <w:bottom w:val="single" w:sz="4" w:space="1" w:color="auto"/>
-          <w:right w:val="single" w:sz="4" w:space="4" w:color="auto"/>
-        </w:pBdr>
-        <w:rPr>
-          <w:rFonts w:ascii="Verdana" w:hAnsi="Verdana"/>
-          <w:sz w:val="32"/>
-          <w:szCs w:val="32"/>
-        </w:rPr>
-      </w:pPr>
-      <w:r>
-        <w:rPr>
-          <w:rFonts w:ascii="Verdana" w:hAnsi="Verdana"/>
-          <w:sz w:val="32"/>
-          <w:szCs w:val="32"/>
-        </w:rPr>
-        <w:t>` = Enter Command</w:t>
-      </w:r>
-    </w:p>
-    <w:p>
-      <w:pPr>
-        <w:pStyle w:val="NoSpacing"/>
-        <w:pBdr>
-          <w:top w:val="single" w:sz="4" w:space="1" w:color="auto"/>
-          <w:left w:val="single" w:sz="4" w:space="4" w:color="auto"/>
-          <w:bottom w:val="single" w:sz="4" w:space="1" w:color="auto"/>
-          <w:right w:val="single" w:sz="4" w:space="4" w:color="auto"/>
-        </w:pBdr>
-        <w:rPr>
-          <w:rFonts w:ascii="Verdana" w:hAnsi="Verdana"/>
-          <w:sz w:val="32"/>
-          <w:szCs w:val="32"/>
-        </w:rPr>
-      </w:pPr>
-      <w:r>
-        <w:rPr>
-          <w:rFonts w:ascii="Verdana" w:hAnsi="Verdana"/>
-          <w:sz w:val="32"/>
-          <w:szCs w:val="32"/>
-        </w:rPr>
-        <w:t>ESC = Main Menu</w:t>
-      </w:r>
-    </w:p>
-    <w:p>
-      <w:pPr>
-        <w:pStyle w:val="NoSpacing"/>
-        <w:pBdr>
-          <w:top w:val="single" w:sz="4" w:space="1" w:color="auto"/>
-          <w:left w:val="single" w:sz="4" w:space="4" w:color="auto"/>
-          <w:bottom w:val="single" w:sz="4" w:space="1" w:color="auto"/>
-          <w:right w:val="single" w:sz="4" w:space="4" w:color="auto"/>
-        </w:pBdr>
-        <w:rPr>
-          <w:rFonts w:ascii="Verdana" w:hAnsi="Verdana"/>
-          <w:sz w:val="32"/>
-          <w:szCs w:val="32"/>
-        </w:rPr>
-      </w:pPr>
-      <w:r>
-        <w:rPr>
-          <w:rFonts w:ascii="Verdana" w:hAnsi="Verdana"/>
-          <w:sz w:val="32"/>
-          <w:szCs w:val="32"/>
-        </w:rPr>
-        <w:t>F1 = Help</w:t>
-      </w:r>
-    </w:p>
-    <w:p>
-      <w:pPr>
-        <w:pStyle w:val="NoSpacing"/>
-        <w:pBdr>
-          <w:top w:val="single" w:sz="4" w:space="1" w:color="auto"/>
-          <w:left w:val="single" w:sz="4" w:space="4" w:color="auto"/>
-          <w:bottom w:val="single" w:sz="4" w:space="1" w:color="auto"/>
-          <w:right w:val="single" w:sz="4" w:space="4" w:color="auto"/>
-        </w:pBdr>
-        <w:rPr>
-          <w:rFonts w:ascii="Verdana" w:hAnsi="Verdana"/>
-          <w:sz w:val="32"/>
-          <w:szCs w:val="32"/>
-        </w:rPr>
-      </w:pPr>
-      <w:r>
-        <w:rPr>
-          <w:rFonts w:ascii="Verdana" w:hAnsi="Verdana"/>
-          <w:sz w:val="32"/>
-          <w:szCs w:val="32"/>
-        </w:rPr>
-        <w:t>F2 = Save Level</w:t>
-      </w:r>
-    </w:p>
-    <w:p>
-      <w:pPr>
-        <w:pStyle w:val="NoSpacing"/>
-        <w:pBdr>
-          <w:top w:val="single" w:sz="4" w:space="1" w:color="auto"/>
-          <w:left w:val="single" w:sz="4" w:space="4" w:color="auto"/>
-          <w:bottom w:val="single" w:sz="4" w:space="1" w:color="auto"/>
-          <w:right w:val="single" w:sz="4" w:space="4" w:color="auto"/>
-        </w:pBdr>
-        <w:rPr>
-          <w:rFonts w:ascii="Verdana" w:hAnsi="Verdana"/>
-          <w:sz w:val="32"/>
-          <w:szCs w:val="32"/>
-        </w:rPr>
-      </w:pPr>
-      <w:r>
-        <w:rPr>
-          <w:rFonts w:ascii="Verdana" w:hAnsi="Verdana"/>
-          <w:sz w:val="32"/>
-          <w:szCs w:val="32"/>
-        </w:rPr>
-        <w:t>F3 = Load Level</w:t>
-      </w:r>
-    </w:p>
-    <w:p>
-      <w:pPr>
-        <w:pStyle w:val="NoSpacing"/>
-        <w:pBdr>
-          <w:top w:val="single" w:sz="4" w:space="1" w:color="auto"/>
-          <w:left w:val="single" w:sz="4" w:space="4" w:color="auto"/>
-          <w:bottom w:val="single" w:sz="4" w:space="1" w:color="auto"/>
-          <w:right w:val="single" w:sz="4" w:space="4" w:color="auto"/>
-        </w:pBdr>
-        <w:rPr>
-          <w:rFonts w:ascii="Verdana" w:hAnsi="Verdana"/>
-          <w:sz w:val="32"/>
-          <w:szCs w:val="32"/>
-        </w:rPr>
-      </w:pPr>
-      <w:r>
-        <w:rPr>
-          <w:rFonts w:ascii="Verdana" w:hAnsi="Verdana"/>
-          <w:sz w:val="32"/>
-          <w:szCs w:val="32"/>
-        </w:rPr>
-        <w:t>F12 = Take Screenshot</w:t>
-      </w:r>
-    </w:p>
-    <w:p>
-      <w:pPr>
-        <w:pStyle w:val="NoSpacing"/>
-        <w:pBdr>
-          <w:top w:val="single" w:sz="4" w:space="1" w:color="auto"/>
-          <w:left w:val="single" w:sz="4" w:space="4" w:color="auto"/>
-          <w:bottom w:val="single" w:sz="4" w:space="1" w:color="auto"/>
-          <w:right w:val="single" w:sz="4" w:space="4" w:color="auto"/>
-        </w:pBdr>
-        <w:rPr>
-          <w:rFonts w:ascii="Verdana" w:hAnsi="Verdana"/>
-          <w:sz w:val="32"/>
-          <w:szCs w:val="32"/>
-        </w:rPr>
-      </w:pPr>
-      <w:r>
-        <w:rPr>
-          <w:rFonts w:ascii="Verdana" w:hAnsi="Verdana"/>
-          <w:sz w:val="32"/>
-          <w:szCs w:val="32"/>
-        </w:rPr>
-        <w:t>P = Change Crosshair Color</w:t>
-      </w:r>
-    </w:p>
-    <w:p>
-      <w:pPr>
-        <w:pStyle w:val="NoSpacing"/>
-        <w:rPr>
-          <w:rFonts w:ascii="Verdana" w:hAnsi="Verdana"/>
-          <w:b/>
-          <w:sz w:val="32"/>
-          <w:szCs w:val="32"/>
-        </w:rPr>
-      </w:pPr>
-    </w:p>
-    <w:p>
-      <w:pPr>
-        <w:pStyle w:val="NoSpacing"/>
-        <w:pBdr>
-          <w:top w:val="single" w:sz="4" w:space="1" w:color="auto"/>
-          <w:left w:val="single" w:sz="4" w:space="4" w:color="auto"/>
-          <w:bottom w:val="single" w:sz="4" w:space="1" w:color="auto"/>
-          <w:right w:val="single" w:sz="4" w:space="4" w:color="auto"/>
-        </w:pBdr>
-        <w:rPr>
-          <w:rFonts w:ascii="Verdana" w:hAnsi="Verdana"/>
-          <w:b/>
-          <w:sz w:val="48"/>
-          <w:szCs w:val="32"/>
-        </w:rPr>
-      </w:pPr>
-      <w:r>
-        <w:rPr>
-          <w:rFonts w:ascii="Verdana" w:hAnsi="Verdana"/>
-          <w:b/>
-          <w:sz w:val="48"/>
-          <w:szCs w:val="32"/>
-        </w:rPr>
-        <w:lastRenderedPageBreak/>
-        <w:t>N</w:t>
-      </w:r>
-      <w:r>
-        <w:rPr>
-          <w:rFonts w:ascii="Verdana" w:hAnsi="Verdana"/>
-          <w:b/>
-          <w:sz w:val="48"/>
-          <w:szCs w:val="32"/>
-        </w:rPr>
-        <w:t>otes:</w:t>
+        <w:t>clears the console history.</w:t>
       </w:r>
     </w:p>
     <w:p>
@@ -2693,18 +1397,1075 @@
       <w:r>
         <w:rPr>
           <w:rFonts w:ascii="Verdana" w:hAnsi="Verdana"/>
-          <w:sz w:val="32"/>
-          <w:szCs w:val="32"/>
-        </w:rPr>
-        <w:t>Game uses LWJGL 3.2.3 since v 02 (BELARUS).</w:t>
-      </w:r>
-      <w:r>
-        <w:rPr>
-          <w:rFonts w:ascii="Verdana" w:hAnsi="Verdana"/>
-          <w:sz w:val="32"/>
-          <w:szCs w:val="32"/>
-        </w:rPr>
-        <w:t xml:space="preserve"> V36G and later use LWGJL 3.3.3.</w:t>
+          <w:b/>
+          <w:bCs/>
+          <w:sz w:val="32"/>
+          <w:szCs w:val="32"/>
+        </w:rPr>
+        <w:t>game_ticks</w:t>
+      </w:r>
+      <w:r>
+        <w:rPr>
+          <w:rFonts w:ascii="Verdana" w:hAnsi="Verdana"/>
+          <w:b/>
+          <w:bCs/>
+          <w:sz w:val="32"/>
+          <w:szCs w:val="32"/>
+        </w:rPr>
+        <w:t xml:space="preserve"> </w:t>
+      </w:r>
+      <w:r>
+        <w:rPr>
+          <w:rFonts w:ascii="Verdana" w:hAnsi="Verdana"/>
+          <w:sz w:val="32"/>
+          <w:szCs w:val="32"/>
+        </w:rPr>
+        <w:t>&lt;</w:t>
+      </w:r>
+      <w:r>
+        <w:rPr>
+          <w:rFonts w:ascii="Verdana" w:hAnsi="Verdana"/>
+          <w:sz w:val="32"/>
+          <w:szCs w:val="32"/>
+        </w:rPr>
+        <w:t>ticks</w:t>
+      </w:r>
+      <w:r>
+        <w:rPr>
+          <w:rFonts w:ascii="Verdana" w:hAnsi="Verdana"/>
+          <w:sz w:val="32"/>
+          <w:szCs w:val="32"/>
+        </w:rPr>
+        <w:t>_</w:t>
+      </w:r>
+      <w:r>
+        <w:rPr>
+          <w:rFonts w:ascii="Verdana" w:hAnsi="Verdana"/>
+          <w:sz w:val="32"/>
+          <w:szCs w:val="32"/>
+        </w:rPr>
+        <w:t>num&gt;</w:t>
+      </w:r>
+      <w:r>
+        <w:rPr>
+          <w:rFonts w:ascii="Verdana" w:hAnsi="Verdana"/>
+          <w:sz w:val="32"/>
+          <w:szCs w:val="32"/>
+        </w:rPr>
+        <w:t>:</w:t>
+      </w:r>
+      <w:r>
+        <w:rPr>
+          <w:rFonts w:ascii="Verdana" w:hAnsi="Verdana"/>
+          <w:sz w:val="32"/>
+          <w:szCs w:val="32"/>
+        </w:rPr>
+        <w:t xml:space="preserve"> change</w:t>
+      </w:r>
+      <w:r>
+        <w:rPr>
+          <w:rFonts w:ascii="Verdana" w:hAnsi="Verdana"/>
+          <w:sz w:val="32"/>
+          <w:szCs w:val="32"/>
+        </w:rPr>
+        <w:t xml:space="preserve"> game</w:t>
+      </w:r>
+      <w:r>
+        <w:rPr>
+          <w:rFonts w:ascii="Verdana" w:hAnsi="Verdana"/>
+          <w:sz w:val="32"/>
+          <w:szCs w:val="32"/>
+        </w:rPr>
+        <w:t xml:space="preserve"> time</w:t>
+      </w:r>
+      <w:r>
+        <w:rPr>
+          <w:rFonts w:ascii="Verdana" w:hAnsi="Verdana"/>
+          <w:sz w:val="32"/>
+          <w:szCs w:val="32"/>
+        </w:rPr>
+        <w:t>.</w:t>
+      </w:r>
+    </w:p>
+    <w:p>
+      <w:pPr>
+        <w:pStyle w:val="NoSpacing"/>
+        <w:rPr>
+          <w:rFonts w:ascii="Verdana" w:hAnsi="Verdana"/>
+          <w:b/>
+          <w:sz w:val="32"/>
+          <w:szCs w:val="32"/>
+        </w:rPr>
+      </w:pPr>
+    </w:p>
+    <w:p>
+      <w:pPr>
+        <w:pStyle w:val="NoSpacing"/>
+        <w:pBdr>
+          <w:top w:val="single" w:sz="4" w:space="1" w:color="auto"/>
+          <w:left w:val="single" w:sz="4" w:space="4" w:color="auto"/>
+          <w:bottom w:val="single" w:sz="4" w:space="1" w:color="auto"/>
+          <w:right w:val="single" w:sz="4" w:space="4" w:color="auto"/>
+        </w:pBdr>
+        <w:rPr>
+          <w:rFonts w:ascii="Verdana" w:hAnsi="Verdana"/>
+          <w:b/>
+          <w:sz w:val="32"/>
+          <w:szCs w:val="32"/>
+        </w:rPr>
+      </w:pPr>
+      <w:r>
+        <w:rPr>
+          <w:rFonts w:ascii="Verdana" w:hAnsi="Verdana"/>
+          <w:b/>
+          <w:sz w:val="32"/>
+          <w:szCs w:val="32"/>
+        </w:rPr>
+        <w:t xml:space="preserve">HELP </w:t>
+      </w:r>
+    </w:p>
+    <w:p>
+      <w:pPr>
+        <w:pStyle w:val="NoSpacing"/>
+        <w:pBdr>
+          <w:top w:val="single" w:sz="4" w:space="1" w:color="auto"/>
+          <w:left w:val="single" w:sz="4" w:space="4" w:color="auto"/>
+          <w:bottom w:val="single" w:sz="4" w:space="1" w:color="auto"/>
+          <w:right w:val="single" w:sz="4" w:space="4" w:color="auto"/>
+        </w:pBdr>
+        <w:rPr>
+          <w:rFonts w:ascii="Verdana" w:hAnsi="Verdana"/>
+          <w:b/>
+          <w:sz w:val="32"/>
+          <w:szCs w:val="32"/>
+        </w:rPr>
+      </w:pPr>
+    </w:p>
+    <w:p>
+      <w:pPr>
+        <w:pStyle w:val="NoSpacing"/>
+        <w:pBdr>
+          <w:top w:val="single" w:sz="4" w:space="1" w:color="auto"/>
+          <w:left w:val="single" w:sz="4" w:space="4" w:color="auto"/>
+          <w:bottom w:val="single" w:sz="4" w:space="1" w:color="auto"/>
+          <w:right w:val="single" w:sz="4" w:space="4" w:color="auto"/>
+        </w:pBdr>
+        <w:rPr>
+          <w:rFonts w:ascii="Verdana" w:hAnsi="Verdana"/>
+          <w:b/>
+          <w:sz w:val="32"/>
+          <w:szCs w:val="32"/>
+        </w:rPr>
+      </w:pPr>
+      <w:r>
+        <w:rPr>
+          <w:rFonts w:ascii="Verdana" w:hAnsi="Verdana"/>
+          <w:b/>
+          <w:sz w:val="32"/>
+          <w:szCs w:val="32"/>
+        </w:rPr>
+        <w:t>Camera movements:</w:t>
+      </w:r>
+    </w:p>
+    <w:p>
+      <w:pPr>
+        <w:pStyle w:val="NoSpacing"/>
+        <w:pBdr>
+          <w:top w:val="single" w:sz="4" w:space="1" w:color="auto"/>
+          <w:left w:val="single" w:sz="4" w:space="4" w:color="auto"/>
+          <w:bottom w:val="single" w:sz="4" w:space="1" w:color="auto"/>
+          <w:right w:val="single" w:sz="4" w:space="4" w:color="auto"/>
+        </w:pBdr>
+        <w:rPr>
+          <w:rFonts w:ascii="Verdana" w:hAnsi="Verdana"/>
+          <w:sz w:val="32"/>
+          <w:szCs w:val="32"/>
+        </w:rPr>
+      </w:pPr>
+      <w:r>
+        <w:rPr>
+          <w:rFonts w:ascii="Verdana" w:hAnsi="Verdana"/>
+          <w:sz w:val="32"/>
+          <w:szCs w:val="32"/>
+        </w:rPr>
+        <w:t>W, UpArrow = Forward</w:t>
+      </w:r>
+    </w:p>
+    <w:p>
+      <w:pPr>
+        <w:pStyle w:val="NoSpacing"/>
+        <w:pBdr>
+          <w:top w:val="single" w:sz="4" w:space="1" w:color="auto"/>
+          <w:left w:val="single" w:sz="4" w:space="4" w:color="auto"/>
+          <w:bottom w:val="single" w:sz="4" w:space="1" w:color="auto"/>
+          <w:right w:val="single" w:sz="4" w:space="4" w:color="auto"/>
+        </w:pBdr>
+        <w:rPr>
+          <w:rFonts w:ascii="Verdana" w:hAnsi="Verdana"/>
+          <w:sz w:val="32"/>
+          <w:szCs w:val="32"/>
+        </w:rPr>
+      </w:pPr>
+      <w:r>
+        <w:rPr>
+          <w:rFonts w:ascii="Verdana" w:hAnsi="Verdana"/>
+          <w:sz w:val="32"/>
+          <w:szCs w:val="32"/>
+        </w:rPr>
+        <w:t>A, DownArrow = Backward</w:t>
+      </w:r>
+    </w:p>
+    <w:p>
+      <w:pPr>
+        <w:pStyle w:val="NoSpacing"/>
+        <w:pBdr>
+          <w:top w:val="single" w:sz="4" w:space="1" w:color="auto"/>
+          <w:left w:val="single" w:sz="4" w:space="4" w:color="auto"/>
+          <w:bottom w:val="single" w:sz="4" w:space="1" w:color="auto"/>
+          <w:right w:val="single" w:sz="4" w:space="4" w:color="auto"/>
+        </w:pBdr>
+        <w:rPr>
+          <w:rFonts w:ascii="Verdana" w:hAnsi="Verdana"/>
+          <w:sz w:val="32"/>
+          <w:szCs w:val="32"/>
+        </w:rPr>
+      </w:pPr>
+      <w:r>
+        <w:rPr>
+          <w:rFonts w:ascii="Verdana" w:hAnsi="Verdana"/>
+          <w:sz w:val="32"/>
+          <w:szCs w:val="32"/>
+        </w:rPr>
+        <w:t>S = Strafe Left</w:t>
+      </w:r>
+    </w:p>
+    <w:p>
+      <w:pPr>
+        <w:pStyle w:val="NoSpacing"/>
+        <w:pBdr>
+          <w:top w:val="single" w:sz="4" w:space="1" w:color="auto"/>
+          <w:left w:val="single" w:sz="4" w:space="4" w:color="auto"/>
+          <w:bottom w:val="single" w:sz="4" w:space="1" w:color="auto"/>
+          <w:right w:val="single" w:sz="4" w:space="4" w:color="auto"/>
+        </w:pBdr>
+        <w:rPr>
+          <w:rFonts w:ascii="Verdana" w:hAnsi="Verdana"/>
+          <w:sz w:val="32"/>
+          <w:szCs w:val="32"/>
+        </w:rPr>
+      </w:pPr>
+      <w:r>
+        <w:rPr>
+          <w:rFonts w:ascii="Verdana" w:hAnsi="Verdana"/>
+          <w:sz w:val="32"/>
+          <w:szCs w:val="32"/>
+        </w:rPr>
+        <w:t>D = Strafe Right</w:t>
+      </w:r>
+    </w:p>
+    <w:p>
+      <w:pPr>
+        <w:pStyle w:val="NoSpacing"/>
+        <w:pBdr>
+          <w:top w:val="single" w:sz="4" w:space="1" w:color="auto"/>
+          <w:left w:val="single" w:sz="4" w:space="4" w:color="auto"/>
+          <w:bottom w:val="single" w:sz="4" w:space="1" w:color="auto"/>
+          <w:right w:val="single" w:sz="4" w:space="4" w:color="auto"/>
+        </w:pBdr>
+        <w:rPr>
+          <w:rFonts w:ascii="Verdana" w:hAnsi="Verdana"/>
+          <w:sz w:val="32"/>
+          <w:szCs w:val="32"/>
+        </w:rPr>
+      </w:pPr>
+      <w:r>
+        <w:rPr>
+          <w:rFonts w:ascii="Verdana" w:hAnsi="Verdana"/>
+          <w:sz w:val="32"/>
+          <w:szCs w:val="32"/>
+        </w:rPr>
+        <w:t>LeftArrow = Turn Left</w:t>
+      </w:r>
+    </w:p>
+    <w:p>
+      <w:pPr>
+        <w:pStyle w:val="NoSpacing"/>
+        <w:pBdr>
+          <w:top w:val="single" w:sz="4" w:space="1" w:color="auto"/>
+          <w:left w:val="single" w:sz="4" w:space="4" w:color="auto"/>
+          <w:bottom w:val="single" w:sz="4" w:space="1" w:color="auto"/>
+          <w:right w:val="single" w:sz="4" w:space="4" w:color="auto"/>
+        </w:pBdr>
+        <w:rPr>
+          <w:rFonts w:ascii="Verdana" w:hAnsi="Verdana"/>
+          <w:sz w:val="32"/>
+          <w:szCs w:val="32"/>
+        </w:rPr>
+      </w:pPr>
+      <w:r>
+        <w:rPr>
+          <w:rFonts w:ascii="Verdana" w:hAnsi="Verdana"/>
+          <w:sz w:val="32"/>
+          <w:szCs w:val="32"/>
+        </w:rPr>
+        <w:t>RightArrow = Turn Right</w:t>
+      </w:r>
+    </w:p>
+    <w:p>
+      <w:pPr>
+        <w:pStyle w:val="NoSpacing"/>
+        <w:pBdr>
+          <w:top w:val="single" w:sz="4" w:space="1" w:color="auto"/>
+          <w:left w:val="single" w:sz="4" w:space="4" w:color="auto"/>
+          <w:bottom w:val="single" w:sz="4" w:space="1" w:color="auto"/>
+          <w:right w:val="single" w:sz="4" w:space="4" w:color="auto"/>
+        </w:pBdr>
+        <w:rPr>
+          <w:rFonts w:ascii="Verdana" w:hAnsi="Verdana"/>
+          <w:sz w:val="32"/>
+          <w:szCs w:val="32"/>
+        </w:rPr>
+      </w:pPr>
+    </w:p>
+    <w:p>
+      <w:pPr>
+        <w:pStyle w:val="NoSpacing"/>
+        <w:pBdr>
+          <w:top w:val="single" w:sz="4" w:space="1" w:color="auto"/>
+          <w:left w:val="single" w:sz="4" w:space="4" w:color="auto"/>
+          <w:bottom w:val="single" w:sz="4" w:space="1" w:color="auto"/>
+          <w:right w:val="single" w:sz="4" w:space="4" w:color="auto"/>
+        </w:pBdr>
+        <w:rPr>
+          <w:rFonts w:ascii="Verdana" w:hAnsi="Verdana"/>
+          <w:b/>
+          <w:bCs/>
+          <w:sz w:val="32"/>
+          <w:szCs w:val="32"/>
+        </w:rPr>
+      </w:pPr>
+      <w:r>
+        <w:rPr>
+          <w:rFonts w:ascii="Verdana" w:hAnsi="Verdana"/>
+          <w:b/>
+          <w:bCs/>
+          <w:sz w:val="32"/>
+          <w:szCs w:val="32"/>
+        </w:rPr>
+        <w:t>Observer functions:</w:t>
+      </w:r>
+    </w:p>
+    <w:p>
+      <w:pPr>
+        <w:pStyle w:val="NoSpacing"/>
+        <w:pBdr>
+          <w:top w:val="single" w:sz="4" w:space="1" w:color="auto"/>
+          <w:left w:val="single" w:sz="4" w:space="4" w:color="auto"/>
+          <w:bottom w:val="single" w:sz="4" w:space="1" w:color="auto"/>
+          <w:right w:val="single" w:sz="4" w:space="4" w:color="auto"/>
+        </w:pBdr>
+        <w:rPr>
+          <w:rFonts w:ascii="Verdana" w:hAnsi="Verdana"/>
+          <w:sz w:val="32"/>
+          <w:szCs w:val="32"/>
+        </w:rPr>
+      </w:pPr>
+      <w:r>
+        <w:rPr>
+          <w:rFonts w:ascii="Verdana" w:hAnsi="Verdana"/>
+          <w:sz w:val="32"/>
+          <w:szCs w:val="32"/>
+        </w:rPr>
+        <w:t>PageUp</w:t>
+      </w:r>
+      <w:r>
+        <w:rPr>
+          <w:rFonts w:ascii="Verdana" w:hAnsi="Verdana"/>
+          <w:sz w:val="32"/>
+          <w:szCs w:val="32"/>
+        </w:rPr>
+        <w:t xml:space="preserve"> = </w:t>
+      </w:r>
+      <w:r>
+        <w:rPr>
+          <w:rFonts w:ascii="Verdana" w:hAnsi="Verdana"/>
+          <w:sz w:val="32"/>
+          <w:szCs w:val="32"/>
+        </w:rPr>
+        <w:t>Ascend (Fly Up)</w:t>
+      </w:r>
+    </w:p>
+    <w:p>
+      <w:pPr>
+        <w:pStyle w:val="NoSpacing"/>
+        <w:pBdr>
+          <w:top w:val="single" w:sz="4" w:space="1" w:color="auto"/>
+          <w:left w:val="single" w:sz="4" w:space="4" w:color="auto"/>
+          <w:bottom w:val="single" w:sz="4" w:space="1" w:color="auto"/>
+          <w:right w:val="single" w:sz="4" w:space="4" w:color="auto"/>
+        </w:pBdr>
+        <w:rPr>
+          <w:rFonts w:ascii="Verdana" w:hAnsi="Verdana"/>
+          <w:sz w:val="32"/>
+          <w:szCs w:val="32"/>
+        </w:rPr>
+      </w:pPr>
+      <w:r>
+        <w:rPr>
+          <w:rFonts w:ascii="Verdana" w:hAnsi="Verdana"/>
+          <w:sz w:val="32"/>
+          <w:szCs w:val="32"/>
+        </w:rPr>
+        <w:t>PageDown</w:t>
+      </w:r>
+      <w:r>
+        <w:rPr>
+          <w:rFonts w:ascii="Verdana" w:hAnsi="Verdana"/>
+          <w:sz w:val="32"/>
+          <w:szCs w:val="32"/>
+        </w:rPr>
+        <w:t xml:space="preserve"> = </w:t>
+      </w:r>
+      <w:r>
+        <w:rPr>
+          <w:rFonts w:ascii="Verdana" w:hAnsi="Verdana"/>
+          <w:sz w:val="32"/>
+          <w:szCs w:val="32"/>
+        </w:rPr>
+        <w:t>Descend (Fly Down)</w:t>
+      </w:r>
+    </w:p>
+    <w:p>
+      <w:pPr>
+        <w:pStyle w:val="NoSpacing"/>
+        <w:pBdr>
+          <w:top w:val="single" w:sz="4" w:space="1" w:color="auto"/>
+          <w:left w:val="single" w:sz="4" w:space="4" w:color="auto"/>
+          <w:bottom w:val="single" w:sz="4" w:space="1" w:color="auto"/>
+          <w:right w:val="single" w:sz="4" w:space="4" w:color="auto"/>
+        </w:pBdr>
+        <w:rPr>
+          <w:rFonts w:ascii="Verdana" w:hAnsi="Verdana"/>
+          <w:b/>
+          <w:sz w:val="32"/>
+          <w:szCs w:val="32"/>
+        </w:rPr>
+      </w:pPr>
+    </w:p>
+    <w:p>
+      <w:pPr>
+        <w:pStyle w:val="NoSpacing"/>
+        <w:pBdr>
+          <w:top w:val="single" w:sz="4" w:space="1" w:color="auto"/>
+          <w:left w:val="single" w:sz="4" w:space="4" w:color="auto"/>
+          <w:bottom w:val="single" w:sz="4" w:space="1" w:color="auto"/>
+          <w:right w:val="single" w:sz="4" w:space="4" w:color="auto"/>
+        </w:pBdr>
+        <w:rPr>
+          <w:rFonts w:ascii="Verdana" w:hAnsi="Verdana"/>
+          <w:b/>
+          <w:sz w:val="32"/>
+          <w:szCs w:val="32"/>
+        </w:rPr>
+      </w:pPr>
+      <w:r>
+        <w:rPr>
+          <w:rFonts w:ascii="Verdana" w:hAnsi="Verdana"/>
+          <w:b/>
+          <w:sz w:val="32"/>
+          <w:szCs w:val="32"/>
+        </w:rPr>
+        <w:t>Player functions:</w:t>
+      </w:r>
+    </w:p>
+    <w:p>
+      <w:pPr>
+        <w:pStyle w:val="NoSpacing"/>
+        <w:pBdr>
+          <w:top w:val="single" w:sz="4" w:space="1" w:color="auto"/>
+          <w:left w:val="single" w:sz="4" w:space="4" w:color="auto"/>
+          <w:bottom w:val="single" w:sz="4" w:space="1" w:color="auto"/>
+          <w:right w:val="single" w:sz="4" w:space="4" w:color="auto"/>
+        </w:pBdr>
+        <w:rPr>
+          <w:rFonts w:ascii="Verdana" w:hAnsi="Verdana"/>
+          <w:sz w:val="32"/>
+          <w:szCs w:val="32"/>
+        </w:rPr>
+      </w:pPr>
+      <w:r>
+        <w:rPr>
+          <w:rFonts w:ascii="Verdana" w:hAnsi="Verdana"/>
+          <w:sz w:val="32"/>
+          <w:szCs w:val="32"/>
+        </w:rPr>
+        <w:t>Space = Jump</w:t>
+      </w:r>
+    </w:p>
+    <w:p>
+      <w:pPr>
+        <w:pStyle w:val="NoSpacing"/>
+        <w:pBdr>
+          <w:top w:val="single" w:sz="4" w:space="1" w:color="auto"/>
+          <w:left w:val="single" w:sz="4" w:space="4" w:color="auto"/>
+          <w:bottom w:val="single" w:sz="4" w:space="1" w:color="auto"/>
+          <w:right w:val="single" w:sz="4" w:space="4" w:color="auto"/>
+        </w:pBdr>
+        <w:rPr>
+          <w:rFonts w:ascii="Verdana" w:hAnsi="Verdana"/>
+          <w:b/>
+          <w:sz w:val="32"/>
+          <w:szCs w:val="32"/>
+        </w:rPr>
+      </w:pPr>
+      <w:r>
+        <w:rPr>
+          <w:rFonts w:ascii="Verdana" w:hAnsi="Verdana"/>
+          <w:sz w:val="32"/>
+          <w:szCs w:val="32"/>
+        </w:rPr>
+        <w:t>Ctrl = Crouch/Sink</w:t>
+      </w:r>
+    </w:p>
+    <w:p>
+      <w:pPr>
+        <w:pStyle w:val="NoSpacing"/>
+        <w:pBdr>
+          <w:top w:val="single" w:sz="4" w:space="1" w:color="auto"/>
+          <w:left w:val="single" w:sz="4" w:space="4" w:color="auto"/>
+          <w:bottom w:val="single" w:sz="4" w:space="1" w:color="auto"/>
+          <w:right w:val="single" w:sz="4" w:space="4" w:color="auto"/>
+        </w:pBdr>
+        <w:rPr>
+          <w:rFonts w:ascii="Verdana" w:hAnsi="Verdana"/>
+          <w:b/>
+          <w:sz w:val="32"/>
+          <w:szCs w:val="32"/>
+        </w:rPr>
+      </w:pPr>
+    </w:p>
+    <w:p>
+      <w:pPr>
+        <w:pStyle w:val="NoSpacing"/>
+        <w:pBdr>
+          <w:top w:val="single" w:sz="4" w:space="1" w:color="auto"/>
+          <w:left w:val="single" w:sz="4" w:space="4" w:color="auto"/>
+          <w:bottom w:val="single" w:sz="4" w:space="1" w:color="auto"/>
+          <w:right w:val="single" w:sz="4" w:space="4" w:color="auto"/>
+        </w:pBdr>
+        <w:rPr>
+          <w:rFonts w:ascii="Verdana" w:hAnsi="Verdana"/>
+          <w:b/>
+          <w:sz w:val="32"/>
+          <w:szCs w:val="32"/>
+        </w:rPr>
+      </w:pPr>
+      <w:r>
+        <w:rPr>
+          <w:rFonts w:ascii="Verdana" w:hAnsi="Verdana"/>
+          <w:b/>
+          <w:sz w:val="32"/>
+          <w:szCs w:val="32"/>
+        </w:rPr>
+        <w:t>Editor functions:</w:t>
+      </w:r>
+    </w:p>
+    <w:p>
+      <w:pPr>
+        <w:pStyle w:val="NoSpacing"/>
+        <w:pBdr>
+          <w:top w:val="single" w:sz="4" w:space="1" w:color="auto"/>
+          <w:left w:val="single" w:sz="4" w:space="4" w:color="auto"/>
+          <w:bottom w:val="single" w:sz="4" w:space="1" w:color="auto"/>
+          <w:right w:val="single" w:sz="4" w:space="4" w:color="auto"/>
+        </w:pBdr>
+        <w:rPr>
+          <w:rFonts w:ascii="Verdana" w:hAnsi="Verdana"/>
+          <w:sz w:val="32"/>
+          <w:szCs w:val="32"/>
+        </w:rPr>
+      </w:pPr>
+      <w:r>
+        <w:rPr>
+          <w:rFonts w:ascii="Verdana" w:hAnsi="Verdana"/>
+          <w:sz w:val="32"/>
+          <w:szCs w:val="32"/>
+        </w:rPr>
+        <w:t>N = Create New Block</w:t>
+      </w:r>
+    </w:p>
+    <w:p>
+      <w:pPr>
+        <w:pStyle w:val="NoSpacing"/>
+        <w:pBdr>
+          <w:top w:val="single" w:sz="4" w:space="1" w:color="auto"/>
+          <w:left w:val="single" w:sz="4" w:space="4" w:color="auto"/>
+          <w:bottom w:val="single" w:sz="4" w:space="1" w:color="auto"/>
+          <w:right w:val="single" w:sz="4" w:space="4" w:color="auto"/>
+        </w:pBdr>
+        <w:rPr>
+          <w:rFonts w:ascii="Verdana" w:hAnsi="Verdana"/>
+          <w:sz w:val="32"/>
+          <w:szCs w:val="32"/>
+        </w:rPr>
+      </w:pPr>
+      <w:r>
+        <w:rPr>
+          <w:rFonts w:ascii="Verdana" w:hAnsi="Verdana"/>
+          <w:sz w:val="32"/>
+          <w:szCs w:val="32"/>
+        </w:rPr>
+        <w:t>M = Change Block Color</w:t>
+      </w:r>
+    </w:p>
+    <w:p>
+      <w:pPr>
+        <w:pStyle w:val="NoSpacing"/>
+        <w:pBdr>
+          <w:top w:val="single" w:sz="4" w:space="1" w:color="auto"/>
+          <w:left w:val="single" w:sz="4" w:space="4" w:color="auto"/>
+          <w:bottom w:val="single" w:sz="4" w:space="1" w:color="auto"/>
+          <w:right w:val="single" w:sz="4" w:space="4" w:color="auto"/>
+        </w:pBdr>
+        <w:rPr>
+          <w:rFonts w:ascii="Verdana" w:hAnsi="Verdana"/>
+          <w:sz w:val="32"/>
+          <w:szCs w:val="32"/>
+        </w:rPr>
+      </w:pPr>
+      <w:r>
+        <w:rPr>
+          <w:rFonts w:ascii="Verdana" w:hAnsi="Verdana"/>
+          <w:sz w:val="32"/>
+          <w:szCs w:val="32"/>
+        </w:rPr>
+        <w:t>Mouse1 = Select Solid Block</w:t>
+      </w:r>
+    </w:p>
+    <w:p>
+      <w:pPr>
+        <w:pStyle w:val="NoSpacing"/>
+        <w:pBdr>
+          <w:top w:val="single" w:sz="4" w:space="1" w:color="auto"/>
+          <w:left w:val="single" w:sz="4" w:space="4" w:color="auto"/>
+          <w:bottom w:val="single" w:sz="4" w:space="1" w:color="auto"/>
+          <w:right w:val="single" w:sz="4" w:space="4" w:color="auto"/>
+        </w:pBdr>
+        <w:rPr>
+          <w:rFonts w:ascii="Verdana" w:hAnsi="Verdana"/>
+          <w:sz w:val="32"/>
+          <w:szCs w:val="32"/>
+        </w:rPr>
+      </w:pPr>
+      <w:r>
+        <w:rPr>
+          <w:rFonts w:ascii="Verdana" w:hAnsi="Verdana"/>
+          <w:sz w:val="32"/>
+          <w:szCs w:val="32"/>
+        </w:rPr>
+        <w:t>Mouse1 + SHIFT = Select Fluid Block</w:t>
+      </w:r>
+    </w:p>
+    <w:p>
+      <w:pPr>
+        <w:pStyle w:val="NoSpacing"/>
+        <w:pBdr>
+          <w:top w:val="single" w:sz="4" w:space="1" w:color="auto"/>
+          <w:left w:val="single" w:sz="4" w:space="4" w:color="auto"/>
+          <w:bottom w:val="single" w:sz="4" w:space="1" w:color="auto"/>
+          <w:right w:val="single" w:sz="4" w:space="4" w:color="auto"/>
+        </w:pBdr>
+        <w:rPr>
+          <w:rFonts w:ascii="Verdana" w:hAnsi="Verdana"/>
+          <w:sz w:val="32"/>
+          <w:szCs w:val="32"/>
+        </w:rPr>
+      </w:pPr>
+      <w:r>
+        <w:rPr>
+          <w:rFonts w:ascii="Verdana" w:hAnsi="Verdana"/>
+          <w:sz w:val="32"/>
+          <w:szCs w:val="32"/>
+        </w:rPr>
+        <w:t>Mouse2 = Place New Block</w:t>
+      </w:r>
+    </w:p>
+    <w:p>
+      <w:pPr>
+        <w:pStyle w:val="NoSpacing"/>
+        <w:pBdr>
+          <w:top w:val="single" w:sz="4" w:space="1" w:color="auto"/>
+          <w:left w:val="single" w:sz="4" w:space="4" w:color="auto"/>
+          <w:bottom w:val="single" w:sz="4" w:space="1" w:color="auto"/>
+          <w:right w:val="single" w:sz="4" w:space="4" w:color="auto"/>
+        </w:pBdr>
+        <w:rPr>
+          <w:rFonts w:ascii="Verdana" w:hAnsi="Verdana"/>
+          <w:sz w:val="32"/>
+          <w:szCs w:val="32"/>
+        </w:rPr>
+      </w:pPr>
+      <w:r>
+        <w:rPr>
+          <w:rFonts w:ascii="Verdana" w:hAnsi="Verdana"/>
+          <w:sz w:val="32"/>
+          <w:szCs w:val="32"/>
+        </w:rPr>
+        <w:t>1-6 = Select Adjacent Solid Block</w:t>
+      </w:r>
+    </w:p>
+    <w:p>
+      <w:pPr>
+        <w:pStyle w:val="NoSpacing"/>
+        <w:pBdr>
+          <w:top w:val="single" w:sz="4" w:space="1" w:color="auto"/>
+          <w:left w:val="single" w:sz="4" w:space="4" w:color="auto"/>
+          <w:bottom w:val="single" w:sz="4" w:space="1" w:color="auto"/>
+          <w:right w:val="single" w:sz="4" w:space="4" w:color="auto"/>
+        </w:pBdr>
+        <w:rPr>
+          <w:rFonts w:ascii="Verdana" w:hAnsi="Verdana"/>
+          <w:sz w:val="32"/>
+          <w:szCs w:val="32"/>
+        </w:rPr>
+      </w:pPr>
+      <w:r>
+        <w:rPr>
+          <w:rFonts w:ascii="Verdana" w:hAnsi="Verdana"/>
+          <w:sz w:val="32"/>
+          <w:szCs w:val="32"/>
+        </w:rPr>
+        <w:t>1-6 + SHIFT = Select Adjacent Fluid Block</w:t>
+      </w:r>
+    </w:p>
+    <w:p>
+      <w:pPr>
+        <w:pStyle w:val="NoSpacing"/>
+        <w:pBdr>
+          <w:top w:val="single" w:sz="4" w:space="1" w:color="auto"/>
+          <w:left w:val="single" w:sz="4" w:space="4" w:color="auto"/>
+          <w:bottom w:val="single" w:sz="4" w:space="1" w:color="auto"/>
+          <w:right w:val="single" w:sz="4" w:space="4" w:color="auto"/>
+        </w:pBdr>
+        <w:rPr>
+          <w:rFonts w:ascii="Verdana" w:hAnsi="Verdana"/>
+          <w:sz w:val="32"/>
+          <w:szCs w:val="32"/>
+        </w:rPr>
+      </w:pPr>
+      <w:r>
+        <w:rPr>
+          <w:rFonts w:ascii="Verdana" w:hAnsi="Verdana"/>
+          <w:sz w:val="32"/>
+          <w:szCs w:val="32"/>
+        </w:rPr>
+        <w:t>F, 0 = Deselect</w:t>
+      </w:r>
+    </w:p>
+    <w:p>
+      <w:pPr>
+        <w:pStyle w:val="NoSpacing"/>
+        <w:pBdr>
+          <w:top w:val="single" w:sz="4" w:space="1" w:color="auto"/>
+          <w:left w:val="single" w:sz="4" w:space="4" w:color="auto"/>
+          <w:bottom w:val="single" w:sz="4" w:space="1" w:color="auto"/>
+          <w:right w:val="single" w:sz="4" w:space="4" w:color="auto"/>
+        </w:pBdr>
+        <w:rPr>
+          <w:rFonts w:ascii="Verdana" w:hAnsi="Verdana"/>
+          <w:sz w:val="32"/>
+          <w:szCs w:val="32"/>
+        </w:rPr>
+      </w:pPr>
+      <w:r>
+        <w:rPr>
+          <w:rFonts w:ascii="Verdana" w:hAnsi="Verdana"/>
+          <w:sz w:val="32"/>
+          <w:szCs w:val="32"/>
+        </w:rPr>
+        <w:t>R = Remove Selected Block</w:t>
+      </w:r>
+    </w:p>
+    <w:p>
+      <w:pPr>
+        <w:pStyle w:val="NoSpacing"/>
+        <w:pBdr>
+          <w:top w:val="single" w:sz="4" w:space="1" w:color="auto"/>
+          <w:left w:val="single" w:sz="4" w:space="4" w:color="auto"/>
+          <w:bottom w:val="single" w:sz="4" w:space="1" w:color="auto"/>
+          <w:right w:val="single" w:sz="4" w:space="4" w:color="auto"/>
+        </w:pBdr>
+        <w:rPr>
+          <w:rFonts w:ascii="Verdana" w:hAnsi="Verdana"/>
+          <w:sz w:val="32"/>
+          <w:szCs w:val="32"/>
+        </w:rPr>
+      </w:pPr>
+      <w:r>
+        <w:rPr>
+          <w:rFonts w:ascii="Verdana" w:hAnsi="Verdana"/>
+          <w:sz w:val="32"/>
+          <w:szCs w:val="32"/>
+        </w:rPr>
+        <w:t>[, ] = Change Texture For New Block</w:t>
+      </w:r>
+    </w:p>
+    <w:p>
+      <w:pPr>
+        <w:pStyle w:val="NoSpacing"/>
+        <w:pBdr>
+          <w:top w:val="single" w:sz="4" w:space="1" w:color="auto"/>
+          <w:left w:val="single" w:sz="4" w:space="4" w:color="auto"/>
+          <w:bottom w:val="single" w:sz="4" w:space="1" w:color="auto"/>
+          <w:right w:val="single" w:sz="4" w:space="4" w:color="auto"/>
+        </w:pBdr>
+        <w:rPr>
+          <w:rFonts w:ascii="Verdana" w:hAnsi="Verdana"/>
+          <w:b/>
+          <w:sz w:val="32"/>
+          <w:szCs w:val="32"/>
+        </w:rPr>
+      </w:pPr>
+    </w:p>
+    <w:p>
+      <w:pPr>
+        <w:pStyle w:val="NoSpacing"/>
+        <w:pBdr>
+          <w:top w:val="single" w:sz="4" w:space="1" w:color="auto"/>
+          <w:left w:val="single" w:sz="4" w:space="4" w:color="auto"/>
+          <w:bottom w:val="single" w:sz="4" w:space="1" w:color="auto"/>
+          <w:right w:val="single" w:sz="4" w:space="4" w:color="auto"/>
+        </w:pBdr>
+        <w:rPr>
+          <w:rFonts w:ascii="Verdana" w:hAnsi="Verdana"/>
+          <w:b/>
+          <w:sz w:val="32"/>
+          <w:szCs w:val="32"/>
+        </w:rPr>
+      </w:pPr>
+      <w:r>
+        <w:rPr>
+          <w:rFonts w:ascii="Verdana" w:hAnsi="Verdana"/>
+          <w:b/>
+          <w:sz w:val="32"/>
+          <w:szCs w:val="32"/>
+        </w:rPr>
+        <w:t>Other functions:</w:t>
+      </w:r>
+    </w:p>
+    <w:p>
+      <w:pPr>
+        <w:pStyle w:val="NoSpacing"/>
+        <w:pBdr>
+          <w:top w:val="single" w:sz="4" w:space="1" w:color="auto"/>
+          <w:left w:val="single" w:sz="4" w:space="4" w:color="auto"/>
+          <w:bottom w:val="single" w:sz="4" w:space="1" w:color="auto"/>
+          <w:right w:val="single" w:sz="4" w:space="4" w:color="auto"/>
+        </w:pBdr>
+        <w:rPr>
+          <w:rFonts w:ascii="Verdana" w:hAnsi="Verdana"/>
+          <w:sz w:val="32"/>
+          <w:szCs w:val="32"/>
+        </w:rPr>
+      </w:pPr>
+      <w:r>
+        <w:rPr>
+          <w:rFonts w:ascii="Verdana" w:hAnsi="Verdana"/>
+          <w:sz w:val="32"/>
+          <w:szCs w:val="32"/>
+        </w:rPr>
+        <w:t>` = Enter Command</w:t>
+      </w:r>
+    </w:p>
+    <w:p>
+      <w:pPr>
+        <w:pStyle w:val="NoSpacing"/>
+        <w:pBdr>
+          <w:top w:val="single" w:sz="4" w:space="1" w:color="auto"/>
+          <w:left w:val="single" w:sz="4" w:space="4" w:color="auto"/>
+          <w:bottom w:val="single" w:sz="4" w:space="1" w:color="auto"/>
+          <w:right w:val="single" w:sz="4" w:space="4" w:color="auto"/>
+        </w:pBdr>
+        <w:rPr>
+          <w:rFonts w:ascii="Verdana" w:hAnsi="Verdana"/>
+          <w:sz w:val="32"/>
+          <w:szCs w:val="32"/>
+        </w:rPr>
+      </w:pPr>
+      <w:r>
+        <w:rPr>
+          <w:rFonts w:ascii="Verdana" w:hAnsi="Verdana"/>
+          <w:sz w:val="32"/>
+          <w:szCs w:val="32"/>
+        </w:rPr>
+        <w:t>ESC = Main Menu</w:t>
+      </w:r>
+    </w:p>
+    <w:p>
+      <w:pPr>
+        <w:pStyle w:val="NoSpacing"/>
+        <w:pBdr>
+          <w:top w:val="single" w:sz="4" w:space="1" w:color="auto"/>
+          <w:left w:val="single" w:sz="4" w:space="4" w:color="auto"/>
+          <w:bottom w:val="single" w:sz="4" w:space="1" w:color="auto"/>
+          <w:right w:val="single" w:sz="4" w:space="4" w:color="auto"/>
+        </w:pBdr>
+        <w:rPr>
+          <w:rFonts w:ascii="Verdana" w:hAnsi="Verdana"/>
+          <w:sz w:val="32"/>
+          <w:szCs w:val="32"/>
+        </w:rPr>
+      </w:pPr>
+      <w:r>
+        <w:rPr>
+          <w:rFonts w:ascii="Verdana" w:hAnsi="Verdana"/>
+          <w:sz w:val="32"/>
+          <w:szCs w:val="32"/>
+        </w:rPr>
+        <w:t>F1 = Help</w:t>
+      </w:r>
+    </w:p>
+    <w:p>
+      <w:pPr>
+        <w:pStyle w:val="NoSpacing"/>
+        <w:pBdr>
+          <w:top w:val="single" w:sz="4" w:space="1" w:color="auto"/>
+          <w:left w:val="single" w:sz="4" w:space="4" w:color="auto"/>
+          <w:bottom w:val="single" w:sz="4" w:space="1" w:color="auto"/>
+          <w:right w:val="single" w:sz="4" w:space="4" w:color="auto"/>
+        </w:pBdr>
+        <w:rPr>
+          <w:rFonts w:ascii="Verdana" w:hAnsi="Verdana"/>
+          <w:sz w:val="32"/>
+          <w:szCs w:val="32"/>
+        </w:rPr>
+      </w:pPr>
+      <w:r>
+        <w:rPr>
+          <w:rFonts w:ascii="Verdana" w:hAnsi="Verdana"/>
+          <w:sz w:val="32"/>
+          <w:szCs w:val="32"/>
+        </w:rPr>
+        <w:t>F2 = Save Level</w:t>
+      </w:r>
+    </w:p>
+    <w:p>
+      <w:pPr>
+        <w:pStyle w:val="NoSpacing"/>
+        <w:pBdr>
+          <w:top w:val="single" w:sz="4" w:space="1" w:color="auto"/>
+          <w:left w:val="single" w:sz="4" w:space="4" w:color="auto"/>
+          <w:bottom w:val="single" w:sz="4" w:space="1" w:color="auto"/>
+          <w:right w:val="single" w:sz="4" w:space="4" w:color="auto"/>
+        </w:pBdr>
+        <w:rPr>
+          <w:rFonts w:ascii="Verdana" w:hAnsi="Verdana"/>
+          <w:sz w:val="32"/>
+          <w:szCs w:val="32"/>
+        </w:rPr>
+      </w:pPr>
+      <w:r>
+        <w:rPr>
+          <w:rFonts w:ascii="Verdana" w:hAnsi="Verdana"/>
+          <w:sz w:val="32"/>
+          <w:szCs w:val="32"/>
+        </w:rPr>
+        <w:t>F3 = Load Level</w:t>
+      </w:r>
+    </w:p>
+    <w:p>
+      <w:pPr>
+        <w:pStyle w:val="NoSpacing"/>
+        <w:pBdr>
+          <w:top w:val="single" w:sz="4" w:space="1" w:color="auto"/>
+          <w:left w:val="single" w:sz="4" w:space="4" w:color="auto"/>
+          <w:bottom w:val="single" w:sz="4" w:space="1" w:color="auto"/>
+          <w:right w:val="single" w:sz="4" w:space="4" w:color="auto"/>
+        </w:pBdr>
+        <w:rPr>
+          <w:rFonts w:ascii="Verdana" w:hAnsi="Verdana"/>
+          <w:sz w:val="32"/>
+          <w:szCs w:val="32"/>
+        </w:rPr>
+      </w:pPr>
+      <w:r>
+        <w:rPr>
+          <w:rFonts w:ascii="Verdana" w:hAnsi="Verdana"/>
+          <w:sz w:val="32"/>
+          <w:szCs w:val="32"/>
+        </w:rPr>
+        <w:t>F12 = Take Screenshot</w:t>
+      </w:r>
+    </w:p>
+    <w:p>
+      <w:pPr>
+        <w:pStyle w:val="NoSpacing"/>
+        <w:pBdr>
+          <w:top w:val="single" w:sz="4" w:space="1" w:color="auto"/>
+          <w:left w:val="single" w:sz="4" w:space="4" w:color="auto"/>
+          <w:bottom w:val="single" w:sz="4" w:space="1" w:color="auto"/>
+          <w:right w:val="single" w:sz="4" w:space="4" w:color="auto"/>
+        </w:pBdr>
+        <w:rPr>
+          <w:rFonts w:ascii="Verdana" w:hAnsi="Verdana"/>
+          <w:sz w:val="32"/>
+          <w:szCs w:val="32"/>
+        </w:rPr>
+      </w:pPr>
+      <w:r>
+        <w:rPr>
+          <w:rFonts w:ascii="Verdana" w:hAnsi="Verdana"/>
+          <w:sz w:val="32"/>
+          <w:szCs w:val="32"/>
+        </w:rPr>
+        <w:lastRenderedPageBreak/>
+        <w:t>P = Change Crosshair Color</w:t>
+      </w:r>
+    </w:p>
+    <w:p>
+      <w:pPr>
+        <w:pStyle w:val="NoSpacing"/>
+        <w:rPr>
+          <w:rFonts w:ascii="Verdana" w:hAnsi="Verdana"/>
+          <w:b/>
+          <w:sz w:val="32"/>
+          <w:szCs w:val="32"/>
+        </w:rPr>
+      </w:pPr>
+    </w:p>
+    <w:p>
+      <w:pPr>
+        <w:pStyle w:val="NoSpacing"/>
+        <w:pBdr>
+          <w:top w:val="single" w:sz="4" w:space="1" w:color="auto"/>
+          <w:left w:val="single" w:sz="4" w:space="4" w:color="auto"/>
+          <w:bottom w:val="single" w:sz="4" w:space="1" w:color="auto"/>
+          <w:right w:val="single" w:sz="4" w:space="4" w:color="auto"/>
+        </w:pBdr>
+        <w:rPr>
+          <w:rFonts w:ascii="Verdana" w:hAnsi="Verdana"/>
+          <w:b/>
+          <w:sz w:val="48"/>
+          <w:szCs w:val="32"/>
+        </w:rPr>
+      </w:pPr>
+      <w:r>
+        <w:rPr>
+          <w:rFonts w:ascii="Verdana" w:hAnsi="Verdana"/>
+          <w:b/>
+          <w:sz w:val="48"/>
+          <w:szCs w:val="32"/>
+        </w:rPr>
+        <w:t>N</w:t>
+      </w:r>
+      <w:r>
+        <w:rPr>
+          <w:rFonts w:ascii="Verdana" w:hAnsi="Verdana"/>
+          <w:b/>
+          <w:sz w:val="48"/>
+          <w:szCs w:val="32"/>
+        </w:rPr>
+        <w:t>otes:</w:t>
       </w:r>
     </w:p>
     <w:p>
@@ -2732,71 +2493,15 @@
           <w:sz w:val="32"/>
           <w:szCs w:val="32"/>
         </w:rPr>
-        <w:t xml:space="preserve">Game requires Quad Core processor with support for at least 4 threads. </w:t>
-      </w:r>
-      <w:r>
-        <w:rPr>
-          <w:rFonts w:ascii="Verdana" w:hAnsi="Verdana"/>
-          <w:sz w:val="32"/>
-          <w:szCs w:val="32"/>
-        </w:rPr>
-        <w:t>Game implementation is multithreaded (</w:t>
-      </w:r>
-      <w:r>
-        <w:rPr>
-          <w:rFonts w:ascii="Verdana" w:hAnsi="Verdana"/>
-          <w:sz w:val="32"/>
-          <w:szCs w:val="32"/>
-        </w:rPr>
-        <w:t xml:space="preserve">at most time </w:t>
-      </w:r>
-      <w:r>
-        <w:rPr>
-          <w:rFonts w:ascii="Verdana" w:hAnsi="Verdana"/>
-          <w:sz w:val="32"/>
-          <w:szCs w:val="32"/>
-        </w:rPr>
-        <w:t>3</w:t>
-      </w:r>
-      <w:r>
-        <w:rPr>
-          <w:rFonts w:ascii="Verdana" w:hAnsi="Verdana"/>
-          <w:sz w:val="32"/>
-          <w:szCs w:val="32"/>
-        </w:rPr>
-        <w:t xml:space="preserve"> </w:t>
-      </w:r>
-      <w:r>
-        <w:rPr>
-          <w:rFonts w:ascii="Verdana" w:hAnsi="Verdana"/>
-          <w:sz w:val="32"/>
-          <w:szCs w:val="32"/>
-        </w:rPr>
-        <w:t>threads will</w:t>
-      </w:r>
-      <w:r>
-        <w:rPr>
-          <w:rFonts w:ascii="Verdana" w:hAnsi="Verdana"/>
-          <w:sz w:val="32"/>
-          <w:szCs w:val="32"/>
-        </w:rPr>
-        <w:t xml:space="preserve"> be active</w:t>
-      </w:r>
-      <w:r>
-        <w:rPr>
-          <w:rFonts w:ascii="Verdana" w:hAnsi="Verdana"/>
-          <w:sz w:val="32"/>
-          <w:szCs w:val="32"/>
-        </w:rPr>
-        <w:t xml:space="preserve"> + 1 additional thread if random level generator is being used or when loading or saving level is in progress</w:t>
-      </w:r>
-      <w:r>
-        <w:rPr>
-          <w:rFonts w:ascii="Verdana" w:hAnsi="Verdana"/>
-          <w:sz w:val="32"/>
-          <w:szCs w:val="32"/>
-        </w:rPr>
-        <w:t>).</w:t>
+        <w:t>Game uses LWJGL 3.2.3 since v 02 (BELARUS).</w:t>
+      </w:r>
+      <w:r>
+        <w:rPr>
+          <w:rFonts w:ascii="Verdana" w:hAnsi="Verdana"/>
+          <w:sz w:val="32"/>
+          <w:szCs w:val="32"/>
+        </w:rPr>
+        <w:t xml:space="preserve"> V36G and later use LWGJL 3.3.3.</w:t>
       </w:r>
     </w:p>
     <w:p>
@@ -2824,7 +2529,71 @@
           <w:sz w:val="32"/>
           <w:szCs w:val="32"/>
         </w:rPr>
-        <w:t>Running the game requires OpenGL 3.3 (on graphic cards since March 2010) or later.</w:t>
+        <w:t xml:space="preserve">Game requires Quad Core processor with support for at least 4 threads. </w:t>
+      </w:r>
+      <w:r>
+        <w:rPr>
+          <w:rFonts w:ascii="Verdana" w:hAnsi="Verdana"/>
+          <w:sz w:val="32"/>
+          <w:szCs w:val="32"/>
+        </w:rPr>
+        <w:t>Game implementation is multithreaded (</w:t>
+      </w:r>
+      <w:r>
+        <w:rPr>
+          <w:rFonts w:ascii="Verdana" w:hAnsi="Verdana"/>
+          <w:sz w:val="32"/>
+          <w:szCs w:val="32"/>
+        </w:rPr>
+        <w:t xml:space="preserve">at most time </w:t>
+      </w:r>
+      <w:r>
+        <w:rPr>
+          <w:rFonts w:ascii="Verdana" w:hAnsi="Verdana"/>
+          <w:sz w:val="32"/>
+          <w:szCs w:val="32"/>
+        </w:rPr>
+        <w:t>3</w:t>
+      </w:r>
+      <w:r>
+        <w:rPr>
+          <w:rFonts w:ascii="Verdana" w:hAnsi="Verdana"/>
+          <w:sz w:val="32"/>
+          <w:szCs w:val="32"/>
+        </w:rPr>
+        <w:t xml:space="preserve"> </w:t>
+      </w:r>
+      <w:r>
+        <w:rPr>
+          <w:rFonts w:ascii="Verdana" w:hAnsi="Verdana"/>
+          <w:sz w:val="32"/>
+          <w:szCs w:val="32"/>
+        </w:rPr>
+        <w:t>threads will</w:t>
+      </w:r>
+      <w:r>
+        <w:rPr>
+          <w:rFonts w:ascii="Verdana" w:hAnsi="Verdana"/>
+          <w:sz w:val="32"/>
+          <w:szCs w:val="32"/>
+        </w:rPr>
+        <w:t xml:space="preserve"> be active</w:t>
+      </w:r>
+      <w:r>
+        <w:rPr>
+          <w:rFonts w:ascii="Verdana" w:hAnsi="Verdana"/>
+          <w:sz w:val="32"/>
+          <w:szCs w:val="32"/>
+        </w:rPr>
+        <w:t xml:space="preserve"> + 1 additional thread if random level generator is being used or when loading or saving level is in progress</w:t>
+      </w:r>
+      <w:r>
+        <w:rPr>
+          <w:rFonts w:ascii="Verdana" w:hAnsi="Verdana"/>
+          <w:sz w:val="32"/>
+          <w:szCs w:val="32"/>
+        </w:rPr>
+        <w:t>).</w:t>
       </w:r>
     </w:p>
     <w:p>
@@ -2852,6 +2621,34 @@
           <w:sz w:val="32"/>
           <w:szCs w:val="32"/>
         </w:rPr>
+        <w:t>Running the game requires OpenGL 3.3 (on graphic cards since March 2010) or later.</w:t>
+      </w:r>
+    </w:p>
+    <w:p>
+      <w:pPr>
+        <w:pStyle w:val="NoSpacing"/>
+        <w:numPr>
+          <w:ilvl w:val="0"/>
+          <w:numId w:val="1"/>
+        </w:numPr>
+        <w:pBdr>
+          <w:top w:val="single" w:sz="4" w:space="1" w:color="auto"/>
+          <w:left w:val="single" w:sz="4" w:space="4" w:color="auto"/>
+          <w:bottom w:val="single" w:sz="4" w:space="1" w:color="auto"/>
+          <w:right w:val="single" w:sz="4" w:space="4" w:color="auto"/>
+        </w:pBdr>
+        <w:rPr>
+          <w:rFonts w:ascii="Verdana" w:hAnsi="Verdana"/>
+          <w:sz w:val="32"/>
+          <w:szCs w:val="32"/>
+        </w:rPr>
+      </w:pPr>
+      <w:r>
+        <w:rPr>
+          <w:rFonts w:ascii="Verdana" w:hAnsi="Verdana"/>
+          <w:sz w:val="32"/>
+          <w:szCs w:val="32"/>
+        </w:rPr>
         <w:t xml:space="preserve">Game is implemented using Java </w:t>
       </w:r>
       <w:r>
@@ -2908,15 +2705,7 @@
         <w:pStyle w:val="NoSpacing"/>
       </w:pPr>
       <w:r>
-        <w:t>Author: Alexander “</w:t>
-      </w:r>
-      <w:proofErr w:type="spellStart"/>
-      <w:r>
-        <w:t>Ermac</w:t>
-      </w:r>
-      <w:proofErr w:type="spellEnd"/>
-      <w:r>
-        <w:t xml:space="preserve">” Stojanovich (email: </w:t>
+        <w:t xml:space="preserve">Author: Alexander “Ermac” Stojanovich (email: </w:t>
       </w:r>
       <w:hyperlink r:id="rId9" w:history="1">
         <w:r>
@@ -2927,31 +2716,15 @@
         </w:r>
       </w:hyperlink>
       <w:r>
-        <w:t xml:space="preserve">; Discord: </w:t>
-      </w:r>
-      <w:proofErr w:type="spellStart"/>
-      <w:r>
-        <w:t>ermac</w:t>
-      </w:r>
-      <w:proofErr w:type="spellEnd"/>
-      <w:r>
-        <w:t xml:space="preserve"> #1844)</w:t>
-      </w:r>
-    </w:p>
-    <w:p>
-      <w:pPr>
-        <w:pStyle w:val="NoSpacing"/>
-      </w:pPr>
-      <w:r>
-        <w:t xml:space="preserve">Testers: </w:t>
-      </w:r>
-      <w:proofErr w:type="spellStart"/>
-      <w:r>
-        <w:t>JSomnia</w:t>
-      </w:r>
-      <w:proofErr w:type="spellEnd"/>
-      <w:r>
-        <w:t>, Hellblade64</w:t>
+        <w:t>; Discord: ermac #1844)</w:t>
+      </w:r>
+    </w:p>
+    <w:p>
+      <w:pPr>
+        <w:pStyle w:val="NoSpacing"/>
+      </w:pPr>
+      <w:r>
+        <w:t>Testers: JSomnia, Hellblade64</w:t>
       </w:r>
     </w:p>
     <w:p>
@@ -3273,23 +3046,13 @@
             <w:szCs w:val="32"/>
           </w:rPr>
         </w:pPr>
-        <w:proofErr w:type="spellStart"/>
         <w:r>
           <w:rPr>
             <w:rFonts w:ascii="Verdana" w:hAnsi="Verdana"/>
             <w:sz w:val="24"/>
             <w:szCs w:val="32"/>
           </w:rPr>
-          <w:t>Ermac</w:t>
-        </w:r>
-        <w:proofErr w:type="spellEnd"/>
-        <w:r>
-          <w:rPr>
-            <w:rFonts w:ascii="Verdana" w:hAnsi="Verdana"/>
-            <w:sz w:val="24"/>
-            <w:szCs w:val="32"/>
-          </w:rPr>
-          <w:t xml:space="preserve"> Voxel Game - </w:t>
+          <w:t xml:space="preserve">Ermac Voxel Game - </w:t>
         </w:r>
         <w:r>
           <w:rPr>
@@ -3297,25 +3060,7 @@
             <w:sz w:val="24"/>
             <w:szCs w:val="32"/>
           </w:rPr>
-          <w:t>Alexander “</w:t>
-        </w:r>
-        <w:proofErr w:type="spellStart"/>
-        <w:r>
-          <w:rPr>
-            <w:rFonts w:ascii="Verdana" w:hAnsi="Verdana"/>
-            <w:sz w:val="24"/>
-            <w:szCs w:val="32"/>
-          </w:rPr>
-          <w:t>Ermac</w:t>
-        </w:r>
-        <w:proofErr w:type="spellEnd"/>
-        <w:r>
-          <w:rPr>
-            <w:rFonts w:ascii="Verdana" w:hAnsi="Verdana"/>
-            <w:sz w:val="24"/>
-            <w:szCs w:val="32"/>
-          </w:rPr>
-          <w:t>” Stojanovich</w:t>
+          <w:t>Alexander “Ermac” Stojanovich</w:t>
         </w:r>
         <w:r>
           <w:rPr>
@@ -3325,23 +3070,13 @@
           </w:rPr>
           <w:t xml:space="preserve">, </w:t>
         </w:r>
-        <w:proofErr w:type="spellStart"/>
         <w:r>
           <w:rPr>
             <w:rFonts w:ascii="Verdana" w:hAnsi="Verdana"/>
             <w:sz w:val="24"/>
             <w:szCs w:val="32"/>
           </w:rPr>
-          <w:t>JSomnia</w:t>
-        </w:r>
-        <w:proofErr w:type="spellEnd"/>
-        <w:r>
-          <w:rPr>
-            <w:rFonts w:ascii="Verdana" w:hAnsi="Verdana"/>
-            <w:sz w:val="24"/>
-            <w:szCs w:val="32"/>
-          </w:rPr>
-          <w:t>, Hellblade64</w:t>
+          <w:t>JSomnia, Hellblade64</w:t>
         </w:r>
       </w:p>
     </w:sdtContent>
@@ -4241,6 +3976,7 @@
     <w:rsid w:val="000F63D0"/>
     <w:rsid w:val="00133C44"/>
     <w:rsid w:val="001F1795"/>
+    <w:rsid w:val="00293559"/>
     <w:rsid w:val="003C3C1D"/>
     <w:rsid w:val="00585F61"/>
     <w:rsid w:val="005D2204"/>

</xml_diff>

<commit_message>
Build V41. Update Support Manual.docx. Also ini.
</commit_message>
<xml_diff>
--- a/Support Manual.docx
+++ b/Support Manual.docx
@@ -1,6 +1,6 @@
 
 <file path=word/document.xml><?xml version="1.0" encoding="utf-8"?>
-<w:document xmlns:wpc="http://schemas.microsoft.com/office/word/2010/wordprocessingCanvas" xmlns:cx="http://schemas.microsoft.com/office/drawing/2014/chartex" xmlns:cx1="http://schemas.microsoft.com/office/drawing/2015/9/8/chartex" xmlns:cx2="http://schemas.microsoft.com/office/drawing/2015/10/21/chartex" xmlns:cx3="http://schemas.microsoft.com/office/drawing/2016/5/9/chartex" xmlns:cx4="http://schemas.microsoft.com/office/drawing/2016/5/10/chartex" xmlns:cx5="http://schemas.microsoft.com/office/drawing/2016/5/11/chartex" xmlns:cx6="http://schemas.microsoft.com/office/drawing/2016/5/12/chartex" xmlns:cx7="http://schemas.microsoft.com/office/drawing/2016/5/13/chartex" xmlns:cx8="http://schemas.microsoft.com/office/drawing/2016/5/14/chartex" xmlns:mc="http://schemas.openxmlformats.org/markup-compatibility/2006" xmlns:aink="http://schemas.microsoft.com/office/drawing/2016/ink" xmlns:am3d="http://schemas.microsoft.com/office/drawing/2017/model3d" xmlns:o="urn:schemas-microsoft-com:office:office" xmlns:oel="http://schemas.microsoft.com/office/2019/extlst" xmlns:r="http://schemas.openxmlformats.org/officeDocument/2006/relationships" xmlns:m="http://schemas.openxmlformats.org/officeDocument/2006/math" xmlns:v="urn:schemas-microsoft-com:vml" xmlns:wp14="http://schemas.microsoft.com/office/word/2010/wordprocessingDrawing" xmlns:wp="http://schemas.openxmlformats.org/drawingml/2006/wordprocessingDrawing" xmlns:w10="urn:schemas-microsoft-com:office:word" xmlns:w="http://schemas.openxmlformats.org/wordprocessingml/2006/main" xmlns:w14="http://schemas.microsoft.com/office/word/2010/wordml" xmlns:w15="http://schemas.microsoft.com/office/word/2012/wordml" xmlns:w16cex="http://schemas.microsoft.com/office/word/2018/wordml/cex" xmlns:w16cid="http://schemas.microsoft.com/office/word/2016/wordml/cid" xmlns:w16="http://schemas.microsoft.com/office/word/2018/wordml" xmlns:w16sdtdh="http://schemas.microsoft.com/office/word/2020/wordml/sdtdatahash" xmlns:w16se="http://schemas.microsoft.com/office/word/2015/wordml/symex" xmlns:wpg="http://schemas.microsoft.com/office/word/2010/wordprocessingGroup" xmlns:wpi="http://schemas.microsoft.com/office/word/2010/wordprocessingInk" xmlns:wne="http://schemas.microsoft.com/office/word/2006/wordml" xmlns:wps="http://schemas.microsoft.com/office/word/2010/wordprocessingShape" mc:Ignorable="w14 w15 w16se w16cid w16 w16cex w16sdtdh wp14">
+<w:document xmlns:wpc="http://schemas.microsoft.com/office/word/2010/wordprocessingCanvas" xmlns:cx="http://schemas.microsoft.com/office/drawing/2014/chartex" xmlns:cx1="http://schemas.microsoft.com/office/drawing/2015/9/8/chartex" xmlns:cx2="http://schemas.microsoft.com/office/drawing/2015/10/21/chartex" xmlns:cx3="http://schemas.microsoft.com/office/drawing/2016/5/9/chartex" xmlns:cx4="http://schemas.microsoft.com/office/drawing/2016/5/10/chartex" xmlns:cx5="http://schemas.microsoft.com/office/drawing/2016/5/11/chartex" xmlns:cx6="http://schemas.microsoft.com/office/drawing/2016/5/12/chartex" xmlns:cx7="http://schemas.microsoft.com/office/drawing/2016/5/13/chartex" xmlns:cx8="http://schemas.microsoft.com/office/drawing/2016/5/14/chartex" xmlns:mc="http://schemas.openxmlformats.org/markup-compatibility/2006" xmlns:aink="http://schemas.microsoft.com/office/drawing/2016/ink" xmlns:am3d="http://schemas.microsoft.com/office/drawing/2017/model3d" xmlns:o="urn:schemas-microsoft-com:office:office" xmlns:oel="http://schemas.microsoft.com/office/2019/extlst" xmlns:r="http://schemas.openxmlformats.org/officeDocument/2006/relationships" xmlns:m="http://schemas.openxmlformats.org/officeDocument/2006/math" xmlns:v="urn:schemas-microsoft-com:vml" xmlns:wp14="http://schemas.microsoft.com/office/word/2010/wordprocessingDrawing" xmlns:wp="http://schemas.openxmlformats.org/drawingml/2006/wordprocessingDrawing" xmlns:w10="urn:schemas-microsoft-com:office:word" xmlns:w="http://schemas.openxmlformats.org/wordprocessingml/2006/main" xmlns:w14="http://schemas.microsoft.com/office/word/2010/wordml" xmlns:w15="http://schemas.microsoft.com/office/word/2012/wordml" xmlns:w16cex="http://schemas.microsoft.com/office/word/2018/wordml/cex" xmlns:w16cid="http://schemas.microsoft.com/office/word/2016/wordml/cid" xmlns:w16="http://schemas.microsoft.com/office/word/2018/wordml" xmlns:w16du="http://schemas.microsoft.com/office/word/2023/wordml/word16du" xmlns:w16sdtdh="http://schemas.microsoft.com/office/word/2020/wordml/sdtdatahash" xmlns:w16se="http://schemas.microsoft.com/office/word/2015/wordml/symex" xmlns:wpg="http://schemas.microsoft.com/office/word/2010/wordprocessingGroup" xmlns:wpi="http://schemas.microsoft.com/office/word/2010/wordprocessingInk" xmlns:wne="http://schemas.microsoft.com/office/word/2006/wordml" xmlns:wps="http://schemas.microsoft.com/office/word/2010/wordprocessingShape" mc:Ignorable="w14 w15 w16se w16cid w16 w16cex w16sdtdh w16du wp14">
   <w:body>
     <w:p>
       <w:pPr>
@@ -12,13 +12,23 @@
           <w:sz w:val="48"/>
         </w:rPr>
       </w:pPr>
+      <w:proofErr w:type="spellStart"/>
       <w:r>
         <w:rPr>
           <w:rFonts w:ascii="Verdana" w:hAnsi="Verdana"/>
           <w:b/>
           <w:sz w:val="48"/>
         </w:rPr>
-        <w:t xml:space="preserve">Ermac Voxel Game </w:t>
+        <w:t>Ermac</w:t>
+      </w:r>
+      <w:proofErr w:type="spellEnd"/>
+      <w:r>
+        <w:rPr>
+          <w:rFonts w:ascii="Verdana" w:hAnsi="Verdana"/>
+          <w:b/>
+          <w:sz w:val="48"/>
+        </w:rPr>
+        <w:t xml:space="preserve"> Voxel Game </w:t>
       </w:r>
     </w:p>
     <w:p>
@@ -383,13 +393,23 @@
           <w:sz w:val="48"/>
         </w:rPr>
       </w:pPr>
+      <w:proofErr w:type="spellStart"/>
       <w:r>
         <w:rPr>
           <w:rFonts w:ascii="Verdana" w:hAnsi="Verdana"/>
           <w:b/>
           <w:sz w:val="48"/>
         </w:rPr>
-        <w:t xml:space="preserve">intrface </w:t>
+        <w:t>intrface</w:t>
+      </w:r>
+      <w:proofErr w:type="spellEnd"/>
+      <w:r>
+        <w:rPr>
+          <w:rFonts w:ascii="Verdana" w:hAnsi="Verdana"/>
+          <w:b/>
+          <w:sz w:val="48"/>
+        </w:rPr>
+        <w:t xml:space="preserve"> </w:t>
       </w:r>
       <w:r>
         <w:rPr>
@@ -431,13 +451,21 @@
           <w:b/>
           <w:sz w:val="48"/>
         </w:rPr>
-        <w:t xml:space="preserve">player </w:t>
-      </w:r>
-      <w:r>
-        <w:rPr>
-          <w:rFonts w:ascii="Verdana" w:hAnsi="Verdana"/>
+        <w:t>character</w:t>
+      </w:r>
+      <w:r>
+        <w:rPr>
+          <w:rFonts w:ascii="Verdana" w:hAnsi="Verdana"/>
+          <w:b/>
           <w:sz w:val="48"/>
         </w:rPr>
+        <w:t xml:space="preserve"> </w:t>
+      </w:r>
+      <w:r>
+        <w:rPr>
+          <w:rFonts w:ascii="Verdana" w:hAnsi="Verdana"/>
+          <w:sz w:val="48"/>
+        </w:rPr>
         <w:t xml:space="preserve">– </w:t>
       </w:r>
       <w:r>
@@ -445,7 +473,23 @@
           <w:rFonts w:ascii="Verdana" w:hAnsi="Verdana"/>
           <w:sz w:val="32"/>
         </w:rPr>
-        <w:t>models (.obj format) and textures (.png format) for the player assets;</w:t>
+        <w:t>models (.obj format) and textures (.</w:t>
+      </w:r>
+      <w:proofErr w:type="spellStart"/>
+      <w:r>
+        <w:rPr>
+          <w:rFonts w:ascii="Verdana" w:hAnsi="Verdana"/>
+          <w:sz w:val="32"/>
+        </w:rPr>
+        <w:t>png</w:t>
+      </w:r>
+      <w:proofErr w:type="spellEnd"/>
+      <w:r>
+        <w:rPr>
+          <w:rFonts w:ascii="Verdana" w:hAnsi="Verdana"/>
+          <w:sz w:val="32"/>
+        </w:rPr>
+        <w:t xml:space="preserve"> format) for the player assets;</w:t>
       </w:r>
     </w:p>
     <w:p>
@@ -487,7 +531,39 @@
           <w:rFonts w:ascii="Verdana" w:hAnsi="Verdana"/>
           <w:sz w:val="32"/>
         </w:rPr>
-        <w:t>contains music and sound fx audio files (.ogg format);</w:t>
+        <w:t xml:space="preserve">contains music and sound </w:t>
+      </w:r>
+      <w:proofErr w:type="spellStart"/>
+      <w:r>
+        <w:rPr>
+          <w:rFonts w:ascii="Verdana" w:hAnsi="Verdana"/>
+          <w:sz w:val="32"/>
+        </w:rPr>
+        <w:t>fx</w:t>
+      </w:r>
+      <w:proofErr w:type="spellEnd"/>
+      <w:r>
+        <w:rPr>
+          <w:rFonts w:ascii="Verdana" w:hAnsi="Verdana"/>
+          <w:sz w:val="32"/>
+        </w:rPr>
+        <w:t xml:space="preserve"> audio files (.</w:t>
+      </w:r>
+      <w:proofErr w:type="spellStart"/>
+      <w:r>
+        <w:rPr>
+          <w:rFonts w:ascii="Verdana" w:hAnsi="Verdana"/>
+          <w:sz w:val="32"/>
+        </w:rPr>
+        <w:t>ogg</w:t>
+      </w:r>
+      <w:proofErr w:type="spellEnd"/>
+      <w:r>
+        <w:rPr>
+          <w:rFonts w:ascii="Verdana" w:hAnsi="Verdana"/>
+          <w:sz w:val="32"/>
+        </w:rPr>
+        <w:t xml:space="preserve"> format);</w:t>
       </w:r>
     </w:p>
     <w:p>
@@ -529,32 +605,138 @@
           <w:rFonts w:ascii="Verdana" w:hAnsi="Verdana"/>
           <w:sz w:val="32"/>
         </w:rPr>
-        <w:t>contains models (.obj format) and textures (.png format) for blocks which make environment as it is.</w:t>
-      </w:r>
-    </w:p>
-    <w:p>
-      <w:pPr>
-        <w:pStyle w:val="NoSpacing"/>
-        <w:pBdr>
-          <w:top w:val="single" w:sz="4" w:space="1" w:color="auto"/>
-          <w:left w:val="single" w:sz="4" w:space="4" w:color="auto"/>
-          <w:bottom w:val="single" w:sz="4" w:space="1" w:color="auto"/>
-          <w:right w:val="single" w:sz="4" w:space="4" w:color="auto"/>
-        </w:pBdr>
+        <w:t>contains models (.obj format) and textures (.</w:t>
+      </w:r>
+      <w:proofErr w:type="spellStart"/>
+      <w:r>
+        <w:rPr>
+          <w:rFonts w:ascii="Verdana" w:hAnsi="Verdana"/>
+          <w:sz w:val="32"/>
+        </w:rPr>
+        <w:t>png</w:t>
+      </w:r>
+      <w:proofErr w:type="spellEnd"/>
+      <w:r>
+        <w:rPr>
+          <w:rFonts w:ascii="Verdana" w:hAnsi="Verdana"/>
+          <w:sz w:val="32"/>
+        </w:rPr>
+        <w:t xml:space="preserve"> format) for blocks which make environment as it is.</w:t>
+      </w:r>
+    </w:p>
+    <w:p>
+      <w:pPr>
+        <w:pStyle w:val="NoSpacing"/>
+        <w:numPr>
+          <w:ilvl w:val="0"/>
+          <w:numId w:val="2"/>
+        </w:numPr>
+        <w:pBdr>
+          <w:top w:val="single" w:sz="4" w:space="1" w:color="auto"/>
+          <w:left w:val="single" w:sz="4" w:space="4" w:color="auto"/>
+          <w:bottom w:val="single" w:sz="4" w:space="1" w:color="auto"/>
+          <w:right w:val="single" w:sz="4" w:space="4" w:color="auto"/>
+        </w:pBdr>
+        <w:rPr>
+          <w:rFonts w:ascii="Verdana" w:hAnsi="Verdana"/>
+          <w:b/>
+          <w:sz w:val="40"/>
+        </w:rPr>
+      </w:pPr>
+      <w:r>
         <w:rPr>
           <w:rFonts w:ascii="Verdana" w:hAnsi="Verdana"/>
           <w:b/>
           <w:sz w:val="48"/>
         </w:rPr>
-      </w:pPr>
-      <w:r>
-        <w:rPr>
-          <w:rFonts w:ascii="Verdana" w:hAnsi="Verdana"/>
-          <w:b/>
-          <w:sz w:val="32"/>
-        </w:rPr>
         <w:lastRenderedPageBreak/>
-        <w:t>All five entries constitute together one archive which is dsynergy.zip.</w:t>
+        <w:t xml:space="preserve">weapons – </w:t>
+      </w:r>
+      <w:r>
+        <w:rPr>
+          <w:rFonts w:ascii="Verdana" w:hAnsi="Verdana"/>
+          <w:sz w:val="32"/>
+        </w:rPr>
+        <w:t>contains</w:t>
+      </w:r>
+      <w:r>
+        <w:rPr>
+          <w:rFonts w:ascii="Verdana" w:hAnsi="Verdana"/>
+          <w:sz w:val="32"/>
+        </w:rPr>
+        <w:t xml:space="preserve"> models for weapons (not used).</w:t>
+      </w:r>
+    </w:p>
+    <w:p>
+      <w:pPr>
+        <w:pStyle w:val="NoSpacing"/>
+        <w:pBdr>
+          <w:top w:val="single" w:sz="4" w:space="1" w:color="auto"/>
+          <w:left w:val="single" w:sz="4" w:space="4" w:color="auto"/>
+          <w:bottom w:val="single" w:sz="4" w:space="1" w:color="auto"/>
+          <w:right w:val="single" w:sz="4" w:space="4" w:color="auto"/>
+        </w:pBdr>
+        <w:rPr>
+          <w:rFonts w:ascii="Verdana" w:hAnsi="Verdana"/>
+          <w:b/>
+          <w:sz w:val="48"/>
+        </w:rPr>
+      </w:pPr>
+      <w:r>
+        <w:rPr>
+          <w:rFonts w:ascii="Verdana" w:hAnsi="Verdana"/>
+          <w:b/>
+          <w:sz w:val="32"/>
+        </w:rPr>
+        <w:t xml:space="preserve">All </w:t>
+      </w:r>
+      <w:r>
+        <w:rPr>
+          <w:rFonts w:ascii="Verdana" w:hAnsi="Verdana"/>
+          <w:b/>
+          <w:sz w:val="32"/>
+        </w:rPr>
+        <w:t>six</w:t>
+      </w:r>
+      <w:r>
+        <w:rPr>
+          <w:rFonts w:ascii="Verdana" w:hAnsi="Verdana"/>
+          <w:b/>
+          <w:sz w:val="32"/>
+        </w:rPr>
+        <w:t xml:space="preserve"> entries </w:t>
+      </w:r>
+      <w:r>
+        <w:rPr>
+          <w:rFonts w:ascii="Verdana" w:hAnsi="Verdana"/>
+          <w:b/>
+          <w:sz w:val="32"/>
+        </w:rPr>
+        <w:t>are contained</w:t>
+      </w:r>
+      <w:r>
+        <w:rPr>
+          <w:rFonts w:ascii="Verdana" w:hAnsi="Verdana"/>
+          <w:b/>
+          <w:sz w:val="32"/>
+        </w:rPr>
+        <w:t xml:space="preserve"> together </w:t>
+      </w:r>
+      <w:r>
+        <w:rPr>
+          <w:rFonts w:ascii="Verdana" w:hAnsi="Verdana"/>
+          <w:b/>
+          <w:sz w:val="32"/>
+        </w:rPr>
+        <w:t xml:space="preserve">as </w:t>
+      </w:r>
+      <w:r>
+        <w:rPr>
+          <w:rFonts w:ascii="Verdana" w:hAnsi="Verdana"/>
+          <w:b/>
+          <w:sz w:val="32"/>
+        </w:rPr>
+        <w:t>one archive which is dsynergy.zip.</w:t>
       </w:r>
     </w:p>
     <w:p>
@@ -632,6 +814,7 @@
           <w:szCs w:val="32"/>
         </w:rPr>
       </w:pPr>
+      <w:proofErr w:type="spellStart"/>
       <w:r>
         <w:rPr>
           <w:rFonts w:ascii="Verdana" w:hAnsi="Verdana"/>
@@ -642,13 +825,32 @@
         </w:rPr>
         <w:t>fps_max</w:t>
       </w:r>
-      <w:r>
-        <w:rPr>
-          <w:rFonts w:ascii="Verdana" w:hAnsi="Verdana"/>
-          <w:sz w:val="32"/>
-          <w:szCs w:val="32"/>
-        </w:rPr>
-        <w:t>&lt;num&gt;, fpsMax&lt;num&gt;: allowing to change max fps (it must be positive number)</w:t>
+      <w:proofErr w:type="spellEnd"/>
+      <w:r>
+        <w:rPr>
+          <w:rFonts w:ascii="Verdana" w:hAnsi="Verdana"/>
+          <w:sz w:val="32"/>
+          <w:szCs w:val="32"/>
+        </w:rPr>
+        <w:t xml:space="preserve">&lt;num&gt;, </w:t>
+      </w:r>
+      <w:proofErr w:type="spellStart"/>
+      <w:r>
+        <w:rPr>
+          <w:rFonts w:ascii="Verdana" w:hAnsi="Verdana"/>
+          <w:sz w:val="32"/>
+          <w:szCs w:val="32"/>
+        </w:rPr>
+        <w:t>fpsMax</w:t>
+      </w:r>
+      <w:proofErr w:type="spellEnd"/>
+      <w:r>
+        <w:rPr>
+          <w:rFonts w:ascii="Verdana" w:hAnsi="Verdana"/>
+          <w:sz w:val="32"/>
+          <w:szCs w:val="32"/>
+        </w:rPr>
+        <w:t>&lt;num&gt;: allowing to change max fps (it must be positive number)</w:t>
       </w:r>
       <w:r>
         <w:rPr>
@@ -714,6 +916,7 @@
           <w:szCs w:val="32"/>
         </w:rPr>
       </w:pPr>
+      <w:proofErr w:type="spellStart"/>
       <w:r>
         <w:rPr>
           <w:rFonts w:ascii="Verdana" w:hAnsi="Verdana"/>
@@ -724,6 +927,7 @@
         </w:rPr>
         <w:t>fullscreen</w:t>
       </w:r>
+      <w:proofErr w:type="spellEnd"/>
       <w:r>
         <w:rPr>
           <w:rFonts w:ascii="Verdana" w:hAnsi="Verdana"/>
@@ -756,8 +960,18 @@
           <w:sz w:val="32"/>
           <w:szCs w:val="32"/>
         </w:rPr>
-        <w:t xml:space="preserve"> makes your game run fullscreen</w:t>
-      </w:r>
+        <w:t xml:space="preserve"> makes your game run </w:t>
+      </w:r>
+      <w:proofErr w:type="spellStart"/>
+      <w:r>
+        <w:rPr>
+          <w:rFonts w:ascii="Verdana" w:hAnsi="Verdana"/>
+          <w:sz w:val="32"/>
+          <w:szCs w:val="32"/>
+        </w:rPr>
+        <w:t>fullscreen</w:t>
+      </w:r>
+      <w:proofErr w:type="spellEnd"/>
       <w:r>
         <w:rPr>
           <w:rFonts w:ascii="Verdana" w:hAnsi="Verdana"/>
@@ -794,6 +1008,7 @@
           <w:szCs w:val="32"/>
         </w:rPr>
       </w:pPr>
+      <w:proofErr w:type="spellStart"/>
       <w:r>
         <w:rPr>
           <w:rFonts w:ascii="Verdana" w:hAnsi="Verdana"/>
@@ -804,13 +1019,68 @@
         </w:rPr>
         <w:t>v_sync</w:t>
       </w:r>
-      <w:r>
-        <w:rPr>
-          <w:rFonts w:ascii="Verdana" w:hAnsi="Verdana"/>
-          <w:sz w:val="32"/>
-          <w:szCs w:val="32"/>
-        </w:rPr>
-        <w:t xml:space="preserve"> &lt;bool&gt;, vsync&lt;bool&gt;: whether or not you wanna vsync on or off. If it’s on (you’ve set it to true) your fps is capped to your monitor refresh rate.</w:t>
+      <w:proofErr w:type="spellEnd"/>
+      <w:r>
+        <w:rPr>
+          <w:rFonts w:ascii="Verdana" w:hAnsi="Verdana"/>
+          <w:sz w:val="32"/>
+          <w:szCs w:val="32"/>
+        </w:rPr>
+        <w:t xml:space="preserve"> &lt;bool&gt;, </w:t>
+      </w:r>
+      <w:proofErr w:type="spellStart"/>
+      <w:r>
+        <w:rPr>
+          <w:rFonts w:ascii="Verdana" w:hAnsi="Verdana"/>
+          <w:sz w:val="32"/>
+          <w:szCs w:val="32"/>
+        </w:rPr>
+        <w:t>vsync</w:t>
+      </w:r>
+      <w:proofErr w:type="spellEnd"/>
+      <w:r>
+        <w:rPr>
+          <w:rFonts w:ascii="Verdana" w:hAnsi="Verdana"/>
+          <w:sz w:val="32"/>
+          <w:szCs w:val="32"/>
+        </w:rPr>
+        <w:t xml:space="preserve">&lt;bool&gt;: whether or not you </w:t>
+      </w:r>
+      <w:proofErr w:type="spellStart"/>
+      <w:r>
+        <w:rPr>
+          <w:rFonts w:ascii="Verdana" w:hAnsi="Verdana"/>
+          <w:sz w:val="32"/>
+          <w:szCs w:val="32"/>
+        </w:rPr>
+        <w:t>wanna</w:t>
+      </w:r>
+      <w:proofErr w:type="spellEnd"/>
+      <w:r>
+        <w:rPr>
+          <w:rFonts w:ascii="Verdana" w:hAnsi="Verdana"/>
+          <w:sz w:val="32"/>
+          <w:szCs w:val="32"/>
+        </w:rPr>
+        <w:t xml:space="preserve"> </w:t>
+      </w:r>
+      <w:proofErr w:type="spellStart"/>
+      <w:r>
+        <w:rPr>
+          <w:rFonts w:ascii="Verdana" w:hAnsi="Verdana"/>
+          <w:sz w:val="32"/>
+          <w:szCs w:val="32"/>
+        </w:rPr>
+        <w:t>vsync</w:t>
+      </w:r>
+      <w:proofErr w:type="spellEnd"/>
+      <w:r>
+        <w:rPr>
+          <w:rFonts w:ascii="Verdana" w:hAnsi="Verdana"/>
+          <w:sz w:val="32"/>
+          <w:szCs w:val="32"/>
+        </w:rPr>
+        <w:t xml:space="preserve"> on or off. If it’s on (you’ve set it to true) your fps is capped to your monitor refresh rate.</w:t>
       </w:r>
     </w:p>
     <w:p>
@@ -832,6 +1102,7 @@
           <w:szCs w:val="32"/>
         </w:rPr>
       </w:pPr>
+      <w:proofErr w:type="spellStart"/>
       <w:r>
         <w:rPr>
           <w:rFonts w:ascii="Verdana" w:hAnsi="Verdana"/>
@@ -862,6 +1133,7 @@
         </w:rPr>
         <w:t>ects</w:t>
       </w:r>
+      <w:proofErr w:type="spellEnd"/>
       <w:r>
         <w:rPr>
           <w:rFonts w:ascii="Verdana" w:hAnsi="Verdana"/>
@@ -870,6 +1142,7 @@
         </w:rPr>
         <w:t xml:space="preserve"> &lt;</w:t>
       </w:r>
+      <w:proofErr w:type="spellStart"/>
       <w:r>
         <w:rPr>
           <w:rFonts w:ascii="Verdana" w:hAnsi="Verdana"/>
@@ -878,6 +1151,7 @@
         </w:rPr>
         <w:t>enum</w:t>
       </w:r>
+      <w:proofErr w:type="spellEnd"/>
       <w:r>
         <w:rPr>
           <w:rFonts w:ascii="Verdana" w:hAnsi="Verdana"/>
@@ -922,6 +1196,7 @@
           <w:szCs w:val="32"/>
         </w:rPr>
       </w:pPr>
+      <w:proofErr w:type="spellStart"/>
       <w:r>
         <w:rPr>
           <w:rFonts w:ascii="Verdana" w:hAnsi="Verdana"/>
@@ -962,6 +1237,7 @@
         </w:rPr>
         <w:t>ects</w:t>
       </w:r>
+      <w:proofErr w:type="spellEnd"/>
       <w:r>
         <w:rPr>
           <w:rFonts w:ascii="Verdana" w:hAnsi="Verdana"/>
@@ -970,6 +1246,7 @@
         </w:rPr>
         <w:t xml:space="preserve"> &lt;</w:t>
       </w:r>
+      <w:proofErr w:type="spellStart"/>
       <w:r>
         <w:rPr>
           <w:rFonts w:ascii="Verdana" w:hAnsi="Verdana"/>
@@ -978,6 +1255,7 @@
         </w:rPr>
         <w:t>enum</w:t>
       </w:r>
+      <w:proofErr w:type="spellEnd"/>
       <w:r>
         <w:rPr>
           <w:rFonts w:ascii="Verdana" w:hAnsi="Verdana"/>
@@ -1022,6 +1300,7 @@
           <w:szCs w:val="32"/>
         </w:rPr>
       </w:pPr>
+      <w:proofErr w:type="spellStart"/>
       <w:r>
         <w:rPr>
           <w:rFonts w:ascii="Verdana" w:hAnsi="Verdana"/>
@@ -1032,13 +1311,32 @@
         </w:rPr>
         <w:t>mouse_sensitivity</w:t>
       </w:r>
-      <w:r>
-        <w:rPr>
-          <w:rFonts w:ascii="Verdana" w:hAnsi="Verdana"/>
-          <w:sz w:val="32"/>
-          <w:szCs w:val="32"/>
-        </w:rPr>
-        <w:t>&lt;num&gt;, msens &lt;num&gt;: sets mouse sensitivity to this value.</w:t>
+      <w:proofErr w:type="spellEnd"/>
+      <w:r>
+        <w:rPr>
+          <w:rFonts w:ascii="Verdana" w:hAnsi="Verdana"/>
+          <w:sz w:val="32"/>
+          <w:szCs w:val="32"/>
+        </w:rPr>
+        <w:t xml:space="preserve">&lt;num&gt;, </w:t>
+      </w:r>
+      <w:proofErr w:type="spellStart"/>
+      <w:r>
+        <w:rPr>
+          <w:rFonts w:ascii="Verdana" w:hAnsi="Verdana"/>
+          <w:sz w:val="32"/>
+          <w:szCs w:val="32"/>
+        </w:rPr>
+        <w:t>msens</w:t>
+      </w:r>
+      <w:proofErr w:type="spellEnd"/>
+      <w:r>
+        <w:rPr>
+          <w:rFonts w:ascii="Verdana" w:hAnsi="Verdana"/>
+          <w:sz w:val="32"/>
+          <w:szCs w:val="32"/>
+        </w:rPr>
+        <w:t xml:space="preserve"> &lt;num&gt;: sets mouse sensitivity to this value.</w:t>
       </w:r>
     </w:p>
     <w:p>
@@ -1192,6 +1490,7 @@
           <w:szCs w:val="32"/>
         </w:rPr>
       </w:pPr>
+      <w:proofErr w:type="spellStart"/>
       <w:r>
         <w:rPr>
           <w:rFonts w:ascii="Verdana" w:hAnsi="Verdana"/>
@@ -1212,13 +1511,23 @@
         </w:rPr>
         <w:t>izeof</w:t>
       </w:r>
-      <w:r>
-        <w:rPr>
-          <w:rFonts w:ascii="Verdana" w:hAnsi="Verdana"/>
-          <w:sz w:val="32"/>
-          <w:szCs w:val="32"/>
-        </w:rPr>
-        <w:t>[&lt;chunk</w:t>
+      <w:proofErr w:type="spellEnd"/>
+      <w:r>
+        <w:rPr>
+          <w:rFonts w:ascii="Verdana" w:hAnsi="Verdana"/>
+          <w:sz w:val="32"/>
+          <w:szCs w:val="32"/>
+        </w:rPr>
+        <w:t>[&lt;</w:t>
+      </w:r>
+      <w:proofErr w:type="spellStart"/>
+      <w:r>
+        <w:rPr>
+          <w:rFonts w:ascii="Verdana" w:hAnsi="Verdana"/>
+          <w:sz w:val="32"/>
+          <w:szCs w:val="32"/>
+        </w:rPr>
+        <w:t>chunk</w:t>
       </w:r>
       <w:r>
         <w:rPr>
@@ -1234,7 +1543,52 @@
           <w:sz w:val="32"/>
           <w:szCs w:val="32"/>
         </w:rPr>
-        <w:t>d&gt;]: get total size without args, if args provided size of blocks of that chunk.</w:t>
+        <w:t>d</w:t>
+      </w:r>
+      <w:proofErr w:type="spellEnd"/>
+      <w:r>
+        <w:rPr>
+          <w:rFonts w:ascii="Verdana" w:hAnsi="Verdana"/>
+          <w:sz w:val="32"/>
+          <w:szCs w:val="32"/>
+        </w:rPr>
+        <w:t xml:space="preserve">&gt;]: get total size without </w:t>
+      </w:r>
+      <w:proofErr w:type="spellStart"/>
+      <w:r>
+        <w:rPr>
+          <w:rFonts w:ascii="Verdana" w:hAnsi="Verdana"/>
+          <w:sz w:val="32"/>
+          <w:szCs w:val="32"/>
+        </w:rPr>
+        <w:t>args</w:t>
+      </w:r>
+      <w:proofErr w:type="spellEnd"/>
+      <w:r>
+        <w:rPr>
+          <w:rFonts w:ascii="Verdana" w:hAnsi="Verdana"/>
+          <w:sz w:val="32"/>
+          <w:szCs w:val="32"/>
+        </w:rPr>
+        <w:t xml:space="preserve">, if </w:t>
+      </w:r>
+      <w:proofErr w:type="spellStart"/>
+      <w:r>
+        <w:rPr>
+          <w:rFonts w:ascii="Verdana" w:hAnsi="Verdana"/>
+          <w:sz w:val="32"/>
+          <w:szCs w:val="32"/>
+        </w:rPr>
+        <w:t>args</w:t>
+      </w:r>
+      <w:proofErr w:type="spellEnd"/>
+      <w:r>
+        <w:rPr>
+          <w:rFonts w:ascii="Verdana" w:hAnsi="Verdana"/>
+          <w:sz w:val="32"/>
+          <w:szCs w:val="32"/>
+        </w:rPr>
+        <w:t xml:space="preserve"> provided size of blocks of that chunk.</w:t>
       </w:r>
     </w:p>
     <w:p>
@@ -1394,6 +1748,7 @@
           <w:szCs w:val="32"/>
         </w:rPr>
       </w:pPr>
+      <w:proofErr w:type="spellStart"/>
       <w:r>
         <w:rPr>
           <w:rFonts w:ascii="Verdana" w:hAnsi="Verdana"/>
@@ -1404,6 +1759,7 @@
         </w:rPr>
         <w:t>game_ticks</w:t>
       </w:r>
+      <w:proofErr w:type="spellEnd"/>
       <w:r>
         <w:rPr>
           <w:rFonts w:ascii="Verdana" w:hAnsi="Verdana"/>
@@ -1422,6 +1778,7 @@
         </w:rPr>
         <w:t>&lt;</w:t>
       </w:r>
+      <w:proofErr w:type="spellStart"/>
       <w:r>
         <w:rPr>
           <w:rFonts w:ascii="Verdana" w:hAnsi="Verdana"/>
@@ -1444,7 +1801,16 @@
           <w:sz w:val="32"/>
           <w:szCs w:val="32"/>
         </w:rPr>
-        <w:t>num&gt;</w:t>
+        <w:t>num</w:t>
+      </w:r>
+      <w:proofErr w:type="spellEnd"/>
+      <w:r>
+        <w:rPr>
+          <w:rFonts w:ascii="Verdana" w:hAnsi="Verdana"/>
+          <w:sz w:val="32"/>
+          <w:szCs w:val="32"/>
+        </w:rPr>
+        <w:t>&gt;</w:t>
       </w:r>
       <w:r>
         <w:rPr>
@@ -1485,987 +1851,6 @@
           <w:szCs w:val="32"/>
         </w:rPr>
         <w:t>.</w:t>
-      </w:r>
-    </w:p>
-    <w:p>
-      <w:pPr>
-        <w:pStyle w:val="NoSpacing"/>
-        <w:rPr>
-          <w:rFonts w:ascii="Verdana" w:hAnsi="Verdana"/>
-          <w:b/>
-          <w:sz w:val="32"/>
-          <w:szCs w:val="32"/>
-        </w:rPr>
-      </w:pPr>
-    </w:p>
-    <w:p>
-      <w:pPr>
-        <w:pStyle w:val="NoSpacing"/>
-        <w:pBdr>
-          <w:top w:val="single" w:sz="4" w:space="1" w:color="auto"/>
-          <w:left w:val="single" w:sz="4" w:space="4" w:color="auto"/>
-          <w:bottom w:val="single" w:sz="4" w:space="1" w:color="auto"/>
-          <w:right w:val="single" w:sz="4" w:space="4" w:color="auto"/>
-        </w:pBdr>
-        <w:rPr>
-          <w:rFonts w:ascii="Verdana" w:hAnsi="Verdana"/>
-          <w:b/>
-          <w:sz w:val="32"/>
-          <w:szCs w:val="32"/>
-        </w:rPr>
-      </w:pPr>
-      <w:r>
-        <w:rPr>
-          <w:rFonts w:ascii="Verdana" w:hAnsi="Verdana"/>
-          <w:b/>
-          <w:sz w:val="32"/>
-          <w:szCs w:val="32"/>
-        </w:rPr>
-        <w:t xml:space="preserve">HELP </w:t>
-      </w:r>
-    </w:p>
-    <w:p>
-      <w:pPr>
-        <w:pStyle w:val="NoSpacing"/>
-        <w:pBdr>
-          <w:top w:val="single" w:sz="4" w:space="1" w:color="auto"/>
-          <w:left w:val="single" w:sz="4" w:space="4" w:color="auto"/>
-          <w:bottom w:val="single" w:sz="4" w:space="1" w:color="auto"/>
-          <w:right w:val="single" w:sz="4" w:space="4" w:color="auto"/>
-        </w:pBdr>
-        <w:rPr>
-          <w:rFonts w:ascii="Verdana" w:hAnsi="Verdana"/>
-          <w:b/>
-          <w:sz w:val="32"/>
-          <w:szCs w:val="32"/>
-        </w:rPr>
-      </w:pPr>
-    </w:p>
-    <w:p>
-      <w:pPr>
-        <w:pStyle w:val="NoSpacing"/>
-        <w:pBdr>
-          <w:top w:val="single" w:sz="4" w:space="1" w:color="auto"/>
-          <w:left w:val="single" w:sz="4" w:space="4" w:color="auto"/>
-          <w:bottom w:val="single" w:sz="4" w:space="1" w:color="auto"/>
-          <w:right w:val="single" w:sz="4" w:space="4" w:color="auto"/>
-        </w:pBdr>
-        <w:rPr>
-          <w:rFonts w:ascii="Verdana" w:hAnsi="Verdana"/>
-          <w:b/>
-          <w:sz w:val="32"/>
-          <w:szCs w:val="32"/>
-        </w:rPr>
-      </w:pPr>
-      <w:r>
-        <w:rPr>
-          <w:rFonts w:ascii="Verdana" w:hAnsi="Verdana"/>
-          <w:b/>
-          <w:sz w:val="32"/>
-          <w:szCs w:val="32"/>
-        </w:rPr>
-        <w:t>Camera movements:</w:t>
-      </w:r>
-    </w:p>
-    <w:p>
-      <w:pPr>
-        <w:pStyle w:val="NoSpacing"/>
-        <w:pBdr>
-          <w:top w:val="single" w:sz="4" w:space="1" w:color="auto"/>
-          <w:left w:val="single" w:sz="4" w:space="4" w:color="auto"/>
-          <w:bottom w:val="single" w:sz="4" w:space="1" w:color="auto"/>
-          <w:right w:val="single" w:sz="4" w:space="4" w:color="auto"/>
-        </w:pBdr>
-        <w:rPr>
-          <w:rFonts w:ascii="Verdana" w:hAnsi="Verdana"/>
-          <w:sz w:val="32"/>
-          <w:szCs w:val="32"/>
-        </w:rPr>
-      </w:pPr>
-      <w:r>
-        <w:rPr>
-          <w:rFonts w:ascii="Verdana" w:hAnsi="Verdana"/>
-          <w:sz w:val="32"/>
-          <w:szCs w:val="32"/>
-        </w:rPr>
-        <w:t>W, UpArrow = Forward</w:t>
-      </w:r>
-    </w:p>
-    <w:p>
-      <w:pPr>
-        <w:pStyle w:val="NoSpacing"/>
-        <w:pBdr>
-          <w:top w:val="single" w:sz="4" w:space="1" w:color="auto"/>
-          <w:left w:val="single" w:sz="4" w:space="4" w:color="auto"/>
-          <w:bottom w:val="single" w:sz="4" w:space="1" w:color="auto"/>
-          <w:right w:val="single" w:sz="4" w:space="4" w:color="auto"/>
-        </w:pBdr>
-        <w:rPr>
-          <w:rFonts w:ascii="Verdana" w:hAnsi="Verdana"/>
-          <w:sz w:val="32"/>
-          <w:szCs w:val="32"/>
-        </w:rPr>
-      </w:pPr>
-      <w:r>
-        <w:rPr>
-          <w:rFonts w:ascii="Verdana" w:hAnsi="Verdana"/>
-          <w:sz w:val="32"/>
-          <w:szCs w:val="32"/>
-        </w:rPr>
-        <w:t>A, DownArrow = Backward</w:t>
-      </w:r>
-    </w:p>
-    <w:p>
-      <w:pPr>
-        <w:pStyle w:val="NoSpacing"/>
-        <w:pBdr>
-          <w:top w:val="single" w:sz="4" w:space="1" w:color="auto"/>
-          <w:left w:val="single" w:sz="4" w:space="4" w:color="auto"/>
-          <w:bottom w:val="single" w:sz="4" w:space="1" w:color="auto"/>
-          <w:right w:val="single" w:sz="4" w:space="4" w:color="auto"/>
-        </w:pBdr>
-        <w:rPr>
-          <w:rFonts w:ascii="Verdana" w:hAnsi="Verdana"/>
-          <w:sz w:val="32"/>
-          <w:szCs w:val="32"/>
-        </w:rPr>
-      </w:pPr>
-      <w:r>
-        <w:rPr>
-          <w:rFonts w:ascii="Verdana" w:hAnsi="Verdana"/>
-          <w:sz w:val="32"/>
-          <w:szCs w:val="32"/>
-        </w:rPr>
-        <w:t>S = Strafe Left</w:t>
-      </w:r>
-    </w:p>
-    <w:p>
-      <w:pPr>
-        <w:pStyle w:val="NoSpacing"/>
-        <w:pBdr>
-          <w:top w:val="single" w:sz="4" w:space="1" w:color="auto"/>
-          <w:left w:val="single" w:sz="4" w:space="4" w:color="auto"/>
-          <w:bottom w:val="single" w:sz="4" w:space="1" w:color="auto"/>
-          <w:right w:val="single" w:sz="4" w:space="4" w:color="auto"/>
-        </w:pBdr>
-        <w:rPr>
-          <w:rFonts w:ascii="Verdana" w:hAnsi="Verdana"/>
-          <w:sz w:val="32"/>
-          <w:szCs w:val="32"/>
-        </w:rPr>
-      </w:pPr>
-      <w:r>
-        <w:rPr>
-          <w:rFonts w:ascii="Verdana" w:hAnsi="Verdana"/>
-          <w:sz w:val="32"/>
-          <w:szCs w:val="32"/>
-        </w:rPr>
-        <w:t>D = Strafe Right</w:t>
-      </w:r>
-    </w:p>
-    <w:p>
-      <w:pPr>
-        <w:pStyle w:val="NoSpacing"/>
-        <w:pBdr>
-          <w:top w:val="single" w:sz="4" w:space="1" w:color="auto"/>
-          <w:left w:val="single" w:sz="4" w:space="4" w:color="auto"/>
-          <w:bottom w:val="single" w:sz="4" w:space="1" w:color="auto"/>
-          <w:right w:val="single" w:sz="4" w:space="4" w:color="auto"/>
-        </w:pBdr>
-        <w:rPr>
-          <w:rFonts w:ascii="Verdana" w:hAnsi="Verdana"/>
-          <w:sz w:val="32"/>
-          <w:szCs w:val="32"/>
-        </w:rPr>
-      </w:pPr>
-      <w:r>
-        <w:rPr>
-          <w:rFonts w:ascii="Verdana" w:hAnsi="Verdana"/>
-          <w:sz w:val="32"/>
-          <w:szCs w:val="32"/>
-        </w:rPr>
-        <w:t>LeftArrow = Turn Left</w:t>
-      </w:r>
-    </w:p>
-    <w:p>
-      <w:pPr>
-        <w:pStyle w:val="NoSpacing"/>
-        <w:pBdr>
-          <w:top w:val="single" w:sz="4" w:space="1" w:color="auto"/>
-          <w:left w:val="single" w:sz="4" w:space="4" w:color="auto"/>
-          <w:bottom w:val="single" w:sz="4" w:space="1" w:color="auto"/>
-          <w:right w:val="single" w:sz="4" w:space="4" w:color="auto"/>
-        </w:pBdr>
-        <w:rPr>
-          <w:rFonts w:ascii="Verdana" w:hAnsi="Verdana"/>
-          <w:sz w:val="32"/>
-          <w:szCs w:val="32"/>
-        </w:rPr>
-      </w:pPr>
-      <w:r>
-        <w:rPr>
-          <w:rFonts w:ascii="Verdana" w:hAnsi="Verdana"/>
-          <w:sz w:val="32"/>
-          <w:szCs w:val="32"/>
-        </w:rPr>
-        <w:t>RightArrow = Turn Right</w:t>
-      </w:r>
-    </w:p>
-    <w:p>
-      <w:pPr>
-        <w:pStyle w:val="NoSpacing"/>
-        <w:pBdr>
-          <w:top w:val="single" w:sz="4" w:space="1" w:color="auto"/>
-          <w:left w:val="single" w:sz="4" w:space="4" w:color="auto"/>
-          <w:bottom w:val="single" w:sz="4" w:space="1" w:color="auto"/>
-          <w:right w:val="single" w:sz="4" w:space="4" w:color="auto"/>
-        </w:pBdr>
-        <w:rPr>
-          <w:rFonts w:ascii="Verdana" w:hAnsi="Verdana"/>
-          <w:sz w:val="32"/>
-          <w:szCs w:val="32"/>
-        </w:rPr>
-      </w:pPr>
-    </w:p>
-    <w:p>
-      <w:pPr>
-        <w:pStyle w:val="NoSpacing"/>
-        <w:pBdr>
-          <w:top w:val="single" w:sz="4" w:space="1" w:color="auto"/>
-          <w:left w:val="single" w:sz="4" w:space="4" w:color="auto"/>
-          <w:bottom w:val="single" w:sz="4" w:space="1" w:color="auto"/>
-          <w:right w:val="single" w:sz="4" w:space="4" w:color="auto"/>
-        </w:pBdr>
-        <w:rPr>
-          <w:rFonts w:ascii="Verdana" w:hAnsi="Verdana"/>
-          <w:b/>
-          <w:bCs/>
-          <w:sz w:val="32"/>
-          <w:szCs w:val="32"/>
-        </w:rPr>
-      </w:pPr>
-      <w:r>
-        <w:rPr>
-          <w:rFonts w:ascii="Verdana" w:hAnsi="Verdana"/>
-          <w:b/>
-          <w:bCs/>
-          <w:sz w:val="32"/>
-          <w:szCs w:val="32"/>
-        </w:rPr>
-        <w:t>Observer functions:</w:t>
-      </w:r>
-    </w:p>
-    <w:p>
-      <w:pPr>
-        <w:pStyle w:val="NoSpacing"/>
-        <w:pBdr>
-          <w:top w:val="single" w:sz="4" w:space="1" w:color="auto"/>
-          <w:left w:val="single" w:sz="4" w:space="4" w:color="auto"/>
-          <w:bottom w:val="single" w:sz="4" w:space="1" w:color="auto"/>
-          <w:right w:val="single" w:sz="4" w:space="4" w:color="auto"/>
-        </w:pBdr>
-        <w:rPr>
-          <w:rFonts w:ascii="Verdana" w:hAnsi="Verdana"/>
-          <w:sz w:val="32"/>
-          <w:szCs w:val="32"/>
-        </w:rPr>
-      </w:pPr>
-      <w:r>
-        <w:rPr>
-          <w:rFonts w:ascii="Verdana" w:hAnsi="Verdana"/>
-          <w:sz w:val="32"/>
-          <w:szCs w:val="32"/>
-        </w:rPr>
-        <w:t>PageUp</w:t>
-      </w:r>
-      <w:r>
-        <w:rPr>
-          <w:rFonts w:ascii="Verdana" w:hAnsi="Verdana"/>
-          <w:sz w:val="32"/>
-          <w:szCs w:val="32"/>
-        </w:rPr>
-        <w:t xml:space="preserve"> = </w:t>
-      </w:r>
-      <w:r>
-        <w:rPr>
-          <w:rFonts w:ascii="Verdana" w:hAnsi="Verdana"/>
-          <w:sz w:val="32"/>
-          <w:szCs w:val="32"/>
-        </w:rPr>
-        <w:t>Ascend (Fly Up)</w:t>
-      </w:r>
-    </w:p>
-    <w:p>
-      <w:pPr>
-        <w:pStyle w:val="NoSpacing"/>
-        <w:pBdr>
-          <w:top w:val="single" w:sz="4" w:space="1" w:color="auto"/>
-          <w:left w:val="single" w:sz="4" w:space="4" w:color="auto"/>
-          <w:bottom w:val="single" w:sz="4" w:space="1" w:color="auto"/>
-          <w:right w:val="single" w:sz="4" w:space="4" w:color="auto"/>
-        </w:pBdr>
-        <w:rPr>
-          <w:rFonts w:ascii="Verdana" w:hAnsi="Verdana"/>
-          <w:sz w:val="32"/>
-          <w:szCs w:val="32"/>
-        </w:rPr>
-      </w:pPr>
-      <w:r>
-        <w:rPr>
-          <w:rFonts w:ascii="Verdana" w:hAnsi="Verdana"/>
-          <w:sz w:val="32"/>
-          <w:szCs w:val="32"/>
-        </w:rPr>
-        <w:t>PageDown</w:t>
-      </w:r>
-      <w:r>
-        <w:rPr>
-          <w:rFonts w:ascii="Verdana" w:hAnsi="Verdana"/>
-          <w:sz w:val="32"/>
-          <w:szCs w:val="32"/>
-        </w:rPr>
-        <w:t xml:space="preserve"> = </w:t>
-      </w:r>
-      <w:r>
-        <w:rPr>
-          <w:rFonts w:ascii="Verdana" w:hAnsi="Verdana"/>
-          <w:sz w:val="32"/>
-          <w:szCs w:val="32"/>
-        </w:rPr>
-        <w:t>Descend (Fly Down)</w:t>
-      </w:r>
-    </w:p>
-    <w:p>
-      <w:pPr>
-        <w:pStyle w:val="NoSpacing"/>
-        <w:pBdr>
-          <w:top w:val="single" w:sz="4" w:space="1" w:color="auto"/>
-          <w:left w:val="single" w:sz="4" w:space="4" w:color="auto"/>
-          <w:bottom w:val="single" w:sz="4" w:space="1" w:color="auto"/>
-          <w:right w:val="single" w:sz="4" w:space="4" w:color="auto"/>
-        </w:pBdr>
-        <w:rPr>
-          <w:rFonts w:ascii="Verdana" w:hAnsi="Verdana"/>
-          <w:b/>
-          <w:sz w:val="32"/>
-          <w:szCs w:val="32"/>
-        </w:rPr>
-      </w:pPr>
-    </w:p>
-    <w:p>
-      <w:pPr>
-        <w:pStyle w:val="NoSpacing"/>
-        <w:pBdr>
-          <w:top w:val="single" w:sz="4" w:space="1" w:color="auto"/>
-          <w:left w:val="single" w:sz="4" w:space="4" w:color="auto"/>
-          <w:bottom w:val="single" w:sz="4" w:space="1" w:color="auto"/>
-          <w:right w:val="single" w:sz="4" w:space="4" w:color="auto"/>
-        </w:pBdr>
-        <w:rPr>
-          <w:rFonts w:ascii="Verdana" w:hAnsi="Verdana"/>
-          <w:b/>
-          <w:sz w:val="32"/>
-          <w:szCs w:val="32"/>
-        </w:rPr>
-      </w:pPr>
-      <w:r>
-        <w:rPr>
-          <w:rFonts w:ascii="Verdana" w:hAnsi="Verdana"/>
-          <w:b/>
-          <w:sz w:val="32"/>
-          <w:szCs w:val="32"/>
-        </w:rPr>
-        <w:t>Player functions:</w:t>
-      </w:r>
-    </w:p>
-    <w:p>
-      <w:pPr>
-        <w:pStyle w:val="NoSpacing"/>
-        <w:pBdr>
-          <w:top w:val="single" w:sz="4" w:space="1" w:color="auto"/>
-          <w:left w:val="single" w:sz="4" w:space="4" w:color="auto"/>
-          <w:bottom w:val="single" w:sz="4" w:space="1" w:color="auto"/>
-          <w:right w:val="single" w:sz="4" w:space="4" w:color="auto"/>
-        </w:pBdr>
-        <w:rPr>
-          <w:rFonts w:ascii="Verdana" w:hAnsi="Verdana"/>
-          <w:sz w:val="32"/>
-          <w:szCs w:val="32"/>
-        </w:rPr>
-      </w:pPr>
-      <w:r>
-        <w:rPr>
-          <w:rFonts w:ascii="Verdana" w:hAnsi="Verdana"/>
-          <w:sz w:val="32"/>
-          <w:szCs w:val="32"/>
-        </w:rPr>
-        <w:t>Space = Jump</w:t>
-      </w:r>
-    </w:p>
-    <w:p>
-      <w:pPr>
-        <w:pStyle w:val="NoSpacing"/>
-        <w:pBdr>
-          <w:top w:val="single" w:sz="4" w:space="1" w:color="auto"/>
-          <w:left w:val="single" w:sz="4" w:space="4" w:color="auto"/>
-          <w:bottom w:val="single" w:sz="4" w:space="1" w:color="auto"/>
-          <w:right w:val="single" w:sz="4" w:space="4" w:color="auto"/>
-        </w:pBdr>
-        <w:rPr>
-          <w:rFonts w:ascii="Verdana" w:hAnsi="Verdana"/>
-          <w:b/>
-          <w:sz w:val="32"/>
-          <w:szCs w:val="32"/>
-        </w:rPr>
-      </w:pPr>
-      <w:r>
-        <w:rPr>
-          <w:rFonts w:ascii="Verdana" w:hAnsi="Verdana"/>
-          <w:sz w:val="32"/>
-          <w:szCs w:val="32"/>
-        </w:rPr>
-        <w:t>Ctrl = Crouch/Sink</w:t>
-      </w:r>
-    </w:p>
-    <w:p>
-      <w:pPr>
-        <w:pStyle w:val="NoSpacing"/>
-        <w:pBdr>
-          <w:top w:val="single" w:sz="4" w:space="1" w:color="auto"/>
-          <w:left w:val="single" w:sz="4" w:space="4" w:color="auto"/>
-          <w:bottom w:val="single" w:sz="4" w:space="1" w:color="auto"/>
-          <w:right w:val="single" w:sz="4" w:space="4" w:color="auto"/>
-        </w:pBdr>
-        <w:rPr>
-          <w:rFonts w:ascii="Verdana" w:hAnsi="Verdana"/>
-          <w:b/>
-          <w:sz w:val="32"/>
-          <w:szCs w:val="32"/>
-        </w:rPr>
-      </w:pPr>
-    </w:p>
-    <w:p>
-      <w:pPr>
-        <w:pStyle w:val="NoSpacing"/>
-        <w:pBdr>
-          <w:top w:val="single" w:sz="4" w:space="1" w:color="auto"/>
-          <w:left w:val="single" w:sz="4" w:space="4" w:color="auto"/>
-          <w:bottom w:val="single" w:sz="4" w:space="1" w:color="auto"/>
-          <w:right w:val="single" w:sz="4" w:space="4" w:color="auto"/>
-        </w:pBdr>
-        <w:rPr>
-          <w:rFonts w:ascii="Verdana" w:hAnsi="Verdana"/>
-          <w:b/>
-          <w:sz w:val="32"/>
-          <w:szCs w:val="32"/>
-        </w:rPr>
-      </w:pPr>
-      <w:r>
-        <w:rPr>
-          <w:rFonts w:ascii="Verdana" w:hAnsi="Verdana"/>
-          <w:b/>
-          <w:sz w:val="32"/>
-          <w:szCs w:val="32"/>
-        </w:rPr>
-        <w:t>Editor functions:</w:t>
-      </w:r>
-    </w:p>
-    <w:p>
-      <w:pPr>
-        <w:pStyle w:val="NoSpacing"/>
-        <w:pBdr>
-          <w:top w:val="single" w:sz="4" w:space="1" w:color="auto"/>
-          <w:left w:val="single" w:sz="4" w:space="4" w:color="auto"/>
-          <w:bottom w:val="single" w:sz="4" w:space="1" w:color="auto"/>
-          <w:right w:val="single" w:sz="4" w:space="4" w:color="auto"/>
-        </w:pBdr>
-        <w:rPr>
-          <w:rFonts w:ascii="Verdana" w:hAnsi="Verdana"/>
-          <w:sz w:val="32"/>
-          <w:szCs w:val="32"/>
-        </w:rPr>
-      </w:pPr>
-      <w:r>
-        <w:rPr>
-          <w:rFonts w:ascii="Verdana" w:hAnsi="Verdana"/>
-          <w:sz w:val="32"/>
-          <w:szCs w:val="32"/>
-        </w:rPr>
-        <w:t>N = Create New Block</w:t>
-      </w:r>
-    </w:p>
-    <w:p>
-      <w:pPr>
-        <w:pStyle w:val="NoSpacing"/>
-        <w:pBdr>
-          <w:top w:val="single" w:sz="4" w:space="1" w:color="auto"/>
-          <w:left w:val="single" w:sz="4" w:space="4" w:color="auto"/>
-          <w:bottom w:val="single" w:sz="4" w:space="1" w:color="auto"/>
-          <w:right w:val="single" w:sz="4" w:space="4" w:color="auto"/>
-        </w:pBdr>
-        <w:rPr>
-          <w:rFonts w:ascii="Verdana" w:hAnsi="Verdana"/>
-          <w:sz w:val="32"/>
-          <w:szCs w:val="32"/>
-        </w:rPr>
-      </w:pPr>
-      <w:r>
-        <w:rPr>
-          <w:rFonts w:ascii="Verdana" w:hAnsi="Verdana"/>
-          <w:sz w:val="32"/>
-          <w:szCs w:val="32"/>
-        </w:rPr>
-        <w:t>M = Change Block Color</w:t>
-      </w:r>
-    </w:p>
-    <w:p>
-      <w:pPr>
-        <w:pStyle w:val="NoSpacing"/>
-        <w:pBdr>
-          <w:top w:val="single" w:sz="4" w:space="1" w:color="auto"/>
-          <w:left w:val="single" w:sz="4" w:space="4" w:color="auto"/>
-          <w:bottom w:val="single" w:sz="4" w:space="1" w:color="auto"/>
-          <w:right w:val="single" w:sz="4" w:space="4" w:color="auto"/>
-        </w:pBdr>
-        <w:rPr>
-          <w:rFonts w:ascii="Verdana" w:hAnsi="Verdana"/>
-          <w:sz w:val="32"/>
-          <w:szCs w:val="32"/>
-        </w:rPr>
-      </w:pPr>
-      <w:r>
-        <w:rPr>
-          <w:rFonts w:ascii="Verdana" w:hAnsi="Verdana"/>
-          <w:sz w:val="32"/>
-          <w:szCs w:val="32"/>
-        </w:rPr>
-        <w:t>Mouse1 = Select Solid Block</w:t>
-      </w:r>
-    </w:p>
-    <w:p>
-      <w:pPr>
-        <w:pStyle w:val="NoSpacing"/>
-        <w:pBdr>
-          <w:top w:val="single" w:sz="4" w:space="1" w:color="auto"/>
-          <w:left w:val="single" w:sz="4" w:space="4" w:color="auto"/>
-          <w:bottom w:val="single" w:sz="4" w:space="1" w:color="auto"/>
-          <w:right w:val="single" w:sz="4" w:space="4" w:color="auto"/>
-        </w:pBdr>
-        <w:rPr>
-          <w:rFonts w:ascii="Verdana" w:hAnsi="Verdana"/>
-          <w:sz w:val="32"/>
-          <w:szCs w:val="32"/>
-        </w:rPr>
-      </w:pPr>
-      <w:r>
-        <w:rPr>
-          <w:rFonts w:ascii="Verdana" w:hAnsi="Verdana"/>
-          <w:sz w:val="32"/>
-          <w:szCs w:val="32"/>
-        </w:rPr>
-        <w:t>Mouse1 + SHIFT = Select Fluid Block</w:t>
-      </w:r>
-    </w:p>
-    <w:p>
-      <w:pPr>
-        <w:pStyle w:val="NoSpacing"/>
-        <w:pBdr>
-          <w:top w:val="single" w:sz="4" w:space="1" w:color="auto"/>
-          <w:left w:val="single" w:sz="4" w:space="4" w:color="auto"/>
-          <w:bottom w:val="single" w:sz="4" w:space="1" w:color="auto"/>
-          <w:right w:val="single" w:sz="4" w:space="4" w:color="auto"/>
-        </w:pBdr>
-        <w:rPr>
-          <w:rFonts w:ascii="Verdana" w:hAnsi="Verdana"/>
-          <w:sz w:val="32"/>
-          <w:szCs w:val="32"/>
-        </w:rPr>
-      </w:pPr>
-      <w:r>
-        <w:rPr>
-          <w:rFonts w:ascii="Verdana" w:hAnsi="Verdana"/>
-          <w:sz w:val="32"/>
-          <w:szCs w:val="32"/>
-        </w:rPr>
-        <w:t>Mouse2 = Place New Block</w:t>
-      </w:r>
-    </w:p>
-    <w:p>
-      <w:pPr>
-        <w:pStyle w:val="NoSpacing"/>
-        <w:pBdr>
-          <w:top w:val="single" w:sz="4" w:space="1" w:color="auto"/>
-          <w:left w:val="single" w:sz="4" w:space="4" w:color="auto"/>
-          <w:bottom w:val="single" w:sz="4" w:space="1" w:color="auto"/>
-          <w:right w:val="single" w:sz="4" w:space="4" w:color="auto"/>
-        </w:pBdr>
-        <w:rPr>
-          <w:rFonts w:ascii="Verdana" w:hAnsi="Verdana"/>
-          <w:sz w:val="32"/>
-          <w:szCs w:val="32"/>
-        </w:rPr>
-      </w:pPr>
-      <w:r>
-        <w:rPr>
-          <w:rFonts w:ascii="Verdana" w:hAnsi="Verdana"/>
-          <w:sz w:val="32"/>
-          <w:szCs w:val="32"/>
-        </w:rPr>
-        <w:t>1-6 = Select Adjacent Solid Block</w:t>
-      </w:r>
-    </w:p>
-    <w:p>
-      <w:pPr>
-        <w:pStyle w:val="NoSpacing"/>
-        <w:pBdr>
-          <w:top w:val="single" w:sz="4" w:space="1" w:color="auto"/>
-          <w:left w:val="single" w:sz="4" w:space="4" w:color="auto"/>
-          <w:bottom w:val="single" w:sz="4" w:space="1" w:color="auto"/>
-          <w:right w:val="single" w:sz="4" w:space="4" w:color="auto"/>
-        </w:pBdr>
-        <w:rPr>
-          <w:rFonts w:ascii="Verdana" w:hAnsi="Verdana"/>
-          <w:sz w:val="32"/>
-          <w:szCs w:val="32"/>
-        </w:rPr>
-      </w:pPr>
-      <w:r>
-        <w:rPr>
-          <w:rFonts w:ascii="Verdana" w:hAnsi="Verdana"/>
-          <w:sz w:val="32"/>
-          <w:szCs w:val="32"/>
-        </w:rPr>
-        <w:t>1-6 + SHIFT = Select Adjacent Fluid Block</w:t>
-      </w:r>
-    </w:p>
-    <w:p>
-      <w:pPr>
-        <w:pStyle w:val="NoSpacing"/>
-        <w:pBdr>
-          <w:top w:val="single" w:sz="4" w:space="1" w:color="auto"/>
-          <w:left w:val="single" w:sz="4" w:space="4" w:color="auto"/>
-          <w:bottom w:val="single" w:sz="4" w:space="1" w:color="auto"/>
-          <w:right w:val="single" w:sz="4" w:space="4" w:color="auto"/>
-        </w:pBdr>
-        <w:rPr>
-          <w:rFonts w:ascii="Verdana" w:hAnsi="Verdana"/>
-          <w:sz w:val="32"/>
-          <w:szCs w:val="32"/>
-        </w:rPr>
-      </w:pPr>
-      <w:r>
-        <w:rPr>
-          <w:rFonts w:ascii="Verdana" w:hAnsi="Verdana"/>
-          <w:sz w:val="32"/>
-          <w:szCs w:val="32"/>
-        </w:rPr>
-        <w:t>F, 0 = Deselect</w:t>
-      </w:r>
-    </w:p>
-    <w:p>
-      <w:pPr>
-        <w:pStyle w:val="NoSpacing"/>
-        <w:pBdr>
-          <w:top w:val="single" w:sz="4" w:space="1" w:color="auto"/>
-          <w:left w:val="single" w:sz="4" w:space="4" w:color="auto"/>
-          <w:bottom w:val="single" w:sz="4" w:space="1" w:color="auto"/>
-          <w:right w:val="single" w:sz="4" w:space="4" w:color="auto"/>
-        </w:pBdr>
-        <w:rPr>
-          <w:rFonts w:ascii="Verdana" w:hAnsi="Verdana"/>
-          <w:sz w:val="32"/>
-          <w:szCs w:val="32"/>
-        </w:rPr>
-      </w:pPr>
-      <w:r>
-        <w:rPr>
-          <w:rFonts w:ascii="Verdana" w:hAnsi="Verdana"/>
-          <w:sz w:val="32"/>
-          <w:szCs w:val="32"/>
-        </w:rPr>
-        <w:t>R = Remove Selected Block</w:t>
-      </w:r>
-    </w:p>
-    <w:p>
-      <w:pPr>
-        <w:pStyle w:val="NoSpacing"/>
-        <w:pBdr>
-          <w:top w:val="single" w:sz="4" w:space="1" w:color="auto"/>
-          <w:left w:val="single" w:sz="4" w:space="4" w:color="auto"/>
-          <w:bottom w:val="single" w:sz="4" w:space="1" w:color="auto"/>
-          <w:right w:val="single" w:sz="4" w:space="4" w:color="auto"/>
-        </w:pBdr>
-        <w:rPr>
-          <w:rFonts w:ascii="Verdana" w:hAnsi="Verdana"/>
-          <w:sz w:val="32"/>
-          <w:szCs w:val="32"/>
-        </w:rPr>
-      </w:pPr>
-      <w:r>
-        <w:rPr>
-          <w:rFonts w:ascii="Verdana" w:hAnsi="Verdana"/>
-          <w:sz w:val="32"/>
-          <w:szCs w:val="32"/>
-        </w:rPr>
-        <w:t>[, ] = Change Texture For New Block</w:t>
-      </w:r>
-    </w:p>
-    <w:p>
-      <w:pPr>
-        <w:pStyle w:val="NoSpacing"/>
-        <w:pBdr>
-          <w:top w:val="single" w:sz="4" w:space="1" w:color="auto"/>
-          <w:left w:val="single" w:sz="4" w:space="4" w:color="auto"/>
-          <w:bottom w:val="single" w:sz="4" w:space="1" w:color="auto"/>
-          <w:right w:val="single" w:sz="4" w:space="4" w:color="auto"/>
-        </w:pBdr>
-        <w:rPr>
-          <w:rFonts w:ascii="Verdana" w:hAnsi="Verdana"/>
-          <w:b/>
-          <w:sz w:val="32"/>
-          <w:szCs w:val="32"/>
-        </w:rPr>
-      </w:pPr>
-    </w:p>
-    <w:p>
-      <w:pPr>
-        <w:pStyle w:val="NoSpacing"/>
-        <w:pBdr>
-          <w:top w:val="single" w:sz="4" w:space="1" w:color="auto"/>
-          <w:left w:val="single" w:sz="4" w:space="4" w:color="auto"/>
-          <w:bottom w:val="single" w:sz="4" w:space="1" w:color="auto"/>
-          <w:right w:val="single" w:sz="4" w:space="4" w:color="auto"/>
-        </w:pBdr>
-        <w:rPr>
-          <w:rFonts w:ascii="Verdana" w:hAnsi="Verdana"/>
-          <w:b/>
-          <w:sz w:val="32"/>
-          <w:szCs w:val="32"/>
-        </w:rPr>
-      </w:pPr>
-      <w:r>
-        <w:rPr>
-          <w:rFonts w:ascii="Verdana" w:hAnsi="Verdana"/>
-          <w:b/>
-          <w:sz w:val="32"/>
-          <w:szCs w:val="32"/>
-        </w:rPr>
-        <w:t>Other functions:</w:t>
-      </w:r>
-    </w:p>
-    <w:p>
-      <w:pPr>
-        <w:pStyle w:val="NoSpacing"/>
-        <w:pBdr>
-          <w:top w:val="single" w:sz="4" w:space="1" w:color="auto"/>
-          <w:left w:val="single" w:sz="4" w:space="4" w:color="auto"/>
-          <w:bottom w:val="single" w:sz="4" w:space="1" w:color="auto"/>
-          <w:right w:val="single" w:sz="4" w:space="4" w:color="auto"/>
-        </w:pBdr>
-        <w:rPr>
-          <w:rFonts w:ascii="Verdana" w:hAnsi="Verdana"/>
-          <w:sz w:val="32"/>
-          <w:szCs w:val="32"/>
-        </w:rPr>
-      </w:pPr>
-      <w:r>
-        <w:rPr>
-          <w:rFonts w:ascii="Verdana" w:hAnsi="Verdana"/>
-          <w:sz w:val="32"/>
-          <w:szCs w:val="32"/>
-        </w:rPr>
-        <w:t>` = Enter Command</w:t>
-      </w:r>
-    </w:p>
-    <w:p>
-      <w:pPr>
-        <w:pStyle w:val="NoSpacing"/>
-        <w:pBdr>
-          <w:top w:val="single" w:sz="4" w:space="1" w:color="auto"/>
-          <w:left w:val="single" w:sz="4" w:space="4" w:color="auto"/>
-          <w:bottom w:val="single" w:sz="4" w:space="1" w:color="auto"/>
-          <w:right w:val="single" w:sz="4" w:space="4" w:color="auto"/>
-        </w:pBdr>
-        <w:rPr>
-          <w:rFonts w:ascii="Verdana" w:hAnsi="Verdana"/>
-          <w:sz w:val="32"/>
-          <w:szCs w:val="32"/>
-        </w:rPr>
-      </w:pPr>
-      <w:r>
-        <w:rPr>
-          <w:rFonts w:ascii="Verdana" w:hAnsi="Verdana"/>
-          <w:sz w:val="32"/>
-          <w:szCs w:val="32"/>
-        </w:rPr>
-        <w:t>ESC = Main Menu</w:t>
-      </w:r>
-    </w:p>
-    <w:p>
-      <w:pPr>
-        <w:pStyle w:val="NoSpacing"/>
-        <w:pBdr>
-          <w:top w:val="single" w:sz="4" w:space="1" w:color="auto"/>
-          <w:left w:val="single" w:sz="4" w:space="4" w:color="auto"/>
-          <w:bottom w:val="single" w:sz="4" w:space="1" w:color="auto"/>
-          <w:right w:val="single" w:sz="4" w:space="4" w:color="auto"/>
-        </w:pBdr>
-        <w:rPr>
-          <w:rFonts w:ascii="Verdana" w:hAnsi="Verdana"/>
-          <w:sz w:val="32"/>
-          <w:szCs w:val="32"/>
-        </w:rPr>
-      </w:pPr>
-      <w:r>
-        <w:rPr>
-          <w:rFonts w:ascii="Verdana" w:hAnsi="Verdana"/>
-          <w:sz w:val="32"/>
-          <w:szCs w:val="32"/>
-        </w:rPr>
-        <w:t>F1 = Help</w:t>
-      </w:r>
-    </w:p>
-    <w:p>
-      <w:pPr>
-        <w:pStyle w:val="NoSpacing"/>
-        <w:pBdr>
-          <w:top w:val="single" w:sz="4" w:space="1" w:color="auto"/>
-          <w:left w:val="single" w:sz="4" w:space="4" w:color="auto"/>
-          <w:bottom w:val="single" w:sz="4" w:space="1" w:color="auto"/>
-          <w:right w:val="single" w:sz="4" w:space="4" w:color="auto"/>
-        </w:pBdr>
-        <w:rPr>
-          <w:rFonts w:ascii="Verdana" w:hAnsi="Verdana"/>
-          <w:sz w:val="32"/>
-          <w:szCs w:val="32"/>
-        </w:rPr>
-      </w:pPr>
-      <w:r>
-        <w:rPr>
-          <w:rFonts w:ascii="Verdana" w:hAnsi="Verdana"/>
-          <w:sz w:val="32"/>
-          <w:szCs w:val="32"/>
-        </w:rPr>
-        <w:t>F2 = Save Level</w:t>
-      </w:r>
-    </w:p>
-    <w:p>
-      <w:pPr>
-        <w:pStyle w:val="NoSpacing"/>
-        <w:pBdr>
-          <w:top w:val="single" w:sz="4" w:space="1" w:color="auto"/>
-          <w:left w:val="single" w:sz="4" w:space="4" w:color="auto"/>
-          <w:bottom w:val="single" w:sz="4" w:space="1" w:color="auto"/>
-          <w:right w:val="single" w:sz="4" w:space="4" w:color="auto"/>
-        </w:pBdr>
-        <w:rPr>
-          <w:rFonts w:ascii="Verdana" w:hAnsi="Verdana"/>
-          <w:sz w:val="32"/>
-          <w:szCs w:val="32"/>
-        </w:rPr>
-      </w:pPr>
-      <w:r>
-        <w:rPr>
-          <w:rFonts w:ascii="Verdana" w:hAnsi="Verdana"/>
-          <w:sz w:val="32"/>
-          <w:szCs w:val="32"/>
-        </w:rPr>
-        <w:t>F3 = Load Level</w:t>
-      </w:r>
-    </w:p>
-    <w:p>
-      <w:pPr>
-        <w:pStyle w:val="NoSpacing"/>
-        <w:pBdr>
-          <w:top w:val="single" w:sz="4" w:space="1" w:color="auto"/>
-          <w:left w:val="single" w:sz="4" w:space="4" w:color="auto"/>
-          <w:bottom w:val="single" w:sz="4" w:space="1" w:color="auto"/>
-          <w:right w:val="single" w:sz="4" w:space="4" w:color="auto"/>
-        </w:pBdr>
-        <w:rPr>
-          <w:rFonts w:ascii="Verdana" w:hAnsi="Verdana"/>
-          <w:sz w:val="32"/>
-          <w:szCs w:val="32"/>
-        </w:rPr>
-      </w:pPr>
-      <w:r>
-        <w:rPr>
-          <w:rFonts w:ascii="Verdana" w:hAnsi="Verdana"/>
-          <w:sz w:val="32"/>
-          <w:szCs w:val="32"/>
-        </w:rPr>
-        <w:t>F12 = Take Screenshot</w:t>
-      </w:r>
-    </w:p>
-    <w:p>
-      <w:pPr>
-        <w:pStyle w:val="NoSpacing"/>
-        <w:pBdr>
-          <w:top w:val="single" w:sz="4" w:space="1" w:color="auto"/>
-          <w:left w:val="single" w:sz="4" w:space="4" w:color="auto"/>
-          <w:bottom w:val="single" w:sz="4" w:space="1" w:color="auto"/>
-          <w:right w:val="single" w:sz="4" w:space="4" w:color="auto"/>
-        </w:pBdr>
-        <w:rPr>
-          <w:rFonts w:ascii="Verdana" w:hAnsi="Verdana"/>
-          <w:sz w:val="32"/>
-          <w:szCs w:val="32"/>
-        </w:rPr>
-      </w:pPr>
-      <w:r>
-        <w:rPr>
-          <w:rFonts w:ascii="Verdana" w:hAnsi="Verdana"/>
-          <w:sz w:val="32"/>
-          <w:szCs w:val="32"/>
-        </w:rPr>
-        <w:lastRenderedPageBreak/>
-        <w:t>P = Change Crosshair Color</w:t>
-      </w:r>
-    </w:p>
-    <w:p>
-      <w:pPr>
-        <w:pStyle w:val="NoSpacing"/>
-        <w:rPr>
-          <w:rFonts w:ascii="Verdana" w:hAnsi="Verdana"/>
-          <w:b/>
-          <w:sz w:val="32"/>
-          <w:szCs w:val="32"/>
-        </w:rPr>
-      </w:pPr>
-    </w:p>
-    <w:p>
-      <w:pPr>
-        <w:pStyle w:val="NoSpacing"/>
-        <w:pBdr>
-          <w:top w:val="single" w:sz="4" w:space="1" w:color="auto"/>
-          <w:left w:val="single" w:sz="4" w:space="4" w:color="auto"/>
-          <w:bottom w:val="single" w:sz="4" w:space="1" w:color="auto"/>
-          <w:right w:val="single" w:sz="4" w:space="4" w:color="auto"/>
-        </w:pBdr>
-        <w:rPr>
-          <w:rFonts w:ascii="Verdana" w:hAnsi="Verdana"/>
-          <w:b/>
-          <w:sz w:val="48"/>
-          <w:szCs w:val="32"/>
-        </w:rPr>
-      </w:pPr>
-      <w:r>
-        <w:rPr>
-          <w:rFonts w:ascii="Verdana" w:hAnsi="Verdana"/>
-          <w:b/>
-          <w:sz w:val="48"/>
-          <w:szCs w:val="32"/>
-        </w:rPr>
-        <w:t>N</w:t>
-      </w:r>
-      <w:r>
-        <w:rPr>
-          <w:rFonts w:ascii="Verdana" w:hAnsi="Verdana"/>
-          <w:b/>
-          <w:sz w:val="48"/>
-          <w:szCs w:val="32"/>
-        </w:rPr>
-        <w:t>otes:</w:t>
       </w:r>
     </w:p>
     <w:p>
@@ -2483,25 +1868,1125 @@
         </w:pBdr>
         <w:rPr>
           <w:rFonts w:ascii="Verdana" w:hAnsi="Verdana"/>
-          <w:sz w:val="32"/>
-          <w:szCs w:val="32"/>
-        </w:rPr>
-      </w:pPr>
-      <w:r>
-        <w:rPr>
-          <w:rFonts w:ascii="Verdana" w:hAnsi="Verdana"/>
-          <w:sz w:val="32"/>
-          <w:szCs w:val="32"/>
-        </w:rPr>
-        <w:t>Game uses LWJGL 3.2.3 since v 02 (BELARUS).</w:t>
-      </w:r>
-      <w:r>
-        <w:rPr>
-          <w:rFonts w:ascii="Verdana" w:hAnsi="Verdana"/>
-          <w:sz w:val="32"/>
-          <w:szCs w:val="32"/>
-        </w:rPr>
-        <w:t xml:space="preserve"> V36G and later use LWGJL 3.3.3.</w:t>
+          <w:b/>
+          <w:bCs/>
+          <w:sz w:val="32"/>
+          <w:szCs w:val="32"/>
+        </w:rPr>
+      </w:pPr>
+      <w:r>
+        <w:rPr>
+          <w:rFonts w:ascii="Verdana" w:hAnsi="Verdana"/>
+          <w:b/>
+          <w:bCs/>
+          <w:sz w:val="32"/>
+          <w:szCs w:val="32"/>
+        </w:rPr>
+        <w:t>p</w:t>
+      </w:r>
+      <w:r>
+        <w:rPr>
+          <w:rFonts w:ascii="Verdana" w:hAnsi="Verdana"/>
+          <w:b/>
+          <w:bCs/>
+          <w:sz w:val="32"/>
+          <w:szCs w:val="32"/>
+        </w:rPr>
+        <w:t>ing</w:t>
+      </w:r>
+      <w:r>
+        <w:rPr>
+          <w:rFonts w:ascii="Verdana" w:hAnsi="Verdana"/>
+          <w:sz w:val="32"/>
+          <w:szCs w:val="32"/>
+        </w:rPr>
+        <w:t>: displays ping to server if player is non-host.</w:t>
+      </w:r>
+    </w:p>
+    <w:p>
+      <w:pPr>
+        <w:pStyle w:val="NoSpacing"/>
+        <w:rPr>
+          <w:rFonts w:ascii="Verdana" w:hAnsi="Verdana"/>
+          <w:b/>
+          <w:sz w:val="32"/>
+          <w:szCs w:val="32"/>
+        </w:rPr>
+      </w:pPr>
+    </w:p>
+    <w:p>
+      <w:pPr>
+        <w:pStyle w:val="NoSpacing"/>
+        <w:pBdr>
+          <w:top w:val="single" w:sz="4" w:space="1" w:color="auto"/>
+          <w:left w:val="single" w:sz="4" w:space="4" w:color="auto"/>
+          <w:bottom w:val="single" w:sz="4" w:space="1" w:color="auto"/>
+          <w:right w:val="single" w:sz="4" w:space="4" w:color="auto"/>
+        </w:pBdr>
+        <w:rPr>
+          <w:rFonts w:ascii="Verdana" w:hAnsi="Verdana"/>
+          <w:b/>
+          <w:sz w:val="32"/>
+          <w:szCs w:val="32"/>
+        </w:rPr>
+      </w:pPr>
+      <w:r>
+        <w:rPr>
+          <w:rFonts w:ascii="Verdana" w:hAnsi="Verdana"/>
+          <w:b/>
+          <w:sz w:val="32"/>
+          <w:szCs w:val="32"/>
+        </w:rPr>
+        <w:t xml:space="preserve">HELP </w:t>
+      </w:r>
+    </w:p>
+    <w:p>
+      <w:pPr>
+        <w:pStyle w:val="NoSpacing"/>
+        <w:pBdr>
+          <w:top w:val="single" w:sz="4" w:space="1" w:color="auto"/>
+          <w:left w:val="single" w:sz="4" w:space="4" w:color="auto"/>
+          <w:bottom w:val="single" w:sz="4" w:space="1" w:color="auto"/>
+          <w:right w:val="single" w:sz="4" w:space="4" w:color="auto"/>
+        </w:pBdr>
+        <w:rPr>
+          <w:rFonts w:ascii="Verdana" w:hAnsi="Verdana"/>
+          <w:b/>
+          <w:sz w:val="32"/>
+          <w:szCs w:val="32"/>
+        </w:rPr>
+      </w:pPr>
+    </w:p>
+    <w:p>
+      <w:pPr>
+        <w:pStyle w:val="NoSpacing"/>
+        <w:pBdr>
+          <w:top w:val="single" w:sz="4" w:space="1" w:color="auto"/>
+          <w:left w:val="single" w:sz="4" w:space="4" w:color="auto"/>
+          <w:bottom w:val="single" w:sz="4" w:space="1" w:color="auto"/>
+          <w:right w:val="single" w:sz="4" w:space="4" w:color="auto"/>
+        </w:pBdr>
+        <w:rPr>
+          <w:rFonts w:ascii="Verdana" w:hAnsi="Verdana"/>
+          <w:b/>
+          <w:sz w:val="32"/>
+          <w:szCs w:val="32"/>
+        </w:rPr>
+      </w:pPr>
+      <w:r>
+        <w:rPr>
+          <w:rFonts w:ascii="Verdana" w:hAnsi="Verdana"/>
+          <w:b/>
+          <w:sz w:val="32"/>
+          <w:szCs w:val="32"/>
+        </w:rPr>
+        <w:t>Camera movements:</w:t>
+      </w:r>
+    </w:p>
+    <w:p>
+      <w:pPr>
+        <w:pStyle w:val="NoSpacing"/>
+        <w:pBdr>
+          <w:top w:val="single" w:sz="4" w:space="1" w:color="auto"/>
+          <w:left w:val="single" w:sz="4" w:space="4" w:color="auto"/>
+          <w:bottom w:val="single" w:sz="4" w:space="1" w:color="auto"/>
+          <w:right w:val="single" w:sz="4" w:space="4" w:color="auto"/>
+        </w:pBdr>
+        <w:rPr>
+          <w:rFonts w:ascii="Verdana" w:hAnsi="Verdana"/>
+          <w:sz w:val="32"/>
+          <w:szCs w:val="32"/>
+        </w:rPr>
+      </w:pPr>
+      <w:r>
+        <w:rPr>
+          <w:rFonts w:ascii="Verdana" w:hAnsi="Verdana"/>
+          <w:sz w:val="32"/>
+          <w:szCs w:val="32"/>
+        </w:rPr>
+        <w:t xml:space="preserve">W, </w:t>
+      </w:r>
+      <w:proofErr w:type="spellStart"/>
+      <w:r>
+        <w:rPr>
+          <w:rFonts w:ascii="Verdana" w:hAnsi="Verdana"/>
+          <w:sz w:val="32"/>
+          <w:szCs w:val="32"/>
+        </w:rPr>
+        <w:t>UpArrow</w:t>
+      </w:r>
+      <w:proofErr w:type="spellEnd"/>
+      <w:r>
+        <w:rPr>
+          <w:rFonts w:ascii="Verdana" w:hAnsi="Verdana"/>
+          <w:sz w:val="32"/>
+          <w:szCs w:val="32"/>
+        </w:rPr>
+        <w:t xml:space="preserve"> = Forward</w:t>
+      </w:r>
+    </w:p>
+    <w:p>
+      <w:pPr>
+        <w:pStyle w:val="NoSpacing"/>
+        <w:pBdr>
+          <w:top w:val="single" w:sz="4" w:space="1" w:color="auto"/>
+          <w:left w:val="single" w:sz="4" w:space="4" w:color="auto"/>
+          <w:bottom w:val="single" w:sz="4" w:space="1" w:color="auto"/>
+          <w:right w:val="single" w:sz="4" w:space="4" w:color="auto"/>
+        </w:pBdr>
+        <w:rPr>
+          <w:rFonts w:ascii="Verdana" w:hAnsi="Verdana"/>
+          <w:sz w:val="32"/>
+          <w:szCs w:val="32"/>
+        </w:rPr>
+      </w:pPr>
+      <w:r>
+        <w:rPr>
+          <w:rFonts w:ascii="Verdana" w:hAnsi="Verdana"/>
+          <w:sz w:val="32"/>
+          <w:szCs w:val="32"/>
+        </w:rPr>
+        <w:t xml:space="preserve">A, </w:t>
+      </w:r>
+      <w:proofErr w:type="spellStart"/>
+      <w:r>
+        <w:rPr>
+          <w:rFonts w:ascii="Verdana" w:hAnsi="Verdana"/>
+          <w:sz w:val="32"/>
+          <w:szCs w:val="32"/>
+        </w:rPr>
+        <w:t>DownArrow</w:t>
+      </w:r>
+      <w:proofErr w:type="spellEnd"/>
+      <w:r>
+        <w:rPr>
+          <w:rFonts w:ascii="Verdana" w:hAnsi="Verdana"/>
+          <w:sz w:val="32"/>
+          <w:szCs w:val="32"/>
+        </w:rPr>
+        <w:t xml:space="preserve"> = Backward</w:t>
+      </w:r>
+    </w:p>
+    <w:p>
+      <w:pPr>
+        <w:pStyle w:val="NoSpacing"/>
+        <w:pBdr>
+          <w:top w:val="single" w:sz="4" w:space="1" w:color="auto"/>
+          <w:left w:val="single" w:sz="4" w:space="4" w:color="auto"/>
+          <w:bottom w:val="single" w:sz="4" w:space="1" w:color="auto"/>
+          <w:right w:val="single" w:sz="4" w:space="4" w:color="auto"/>
+        </w:pBdr>
+        <w:rPr>
+          <w:rFonts w:ascii="Verdana" w:hAnsi="Verdana"/>
+          <w:sz w:val="32"/>
+          <w:szCs w:val="32"/>
+        </w:rPr>
+      </w:pPr>
+      <w:r>
+        <w:rPr>
+          <w:rFonts w:ascii="Verdana" w:hAnsi="Verdana"/>
+          <w:sz w:val="32"/>
+          <w:szCs w:val="32"/>
+        </w:rPr>
+        <w:t>S = Strafe Left</w:t>
+      </w:r>
+    </w:p>
+    <w:p>
+      <w:pPr>
+        <w:pStyle w:val="NoSpacing"/>
+        <w:pBdr>
+          <w:top w:val="single" w:sz="4" w:space="1" w:color="auto"/>
+          <w:left w:val="single" w:sz="4" w:space="4" w:color="auto"/>
+          <w:bottom w:val="single" w:sz="4" w:space="1" w:color="auto"/>
+          <w:right w:val="single" w:sz="4" w:space="4" w:color="auto"/>
+        </w:pBdr>
+        <w:rPr>
+          <w:rFonts w:ascii="Verdana" w:hAnsi="Verdana"/>
+          <w:sz w:val="32"/>
+          <w:szCs w:val="32"/>
+        </w:rPr>
+      </w:pPr>
+      <w:r>
+        <w:rPr>
+          <w:rFonts w:ascii="Verdana" w:hAnsi="Verdana"/>
+          <w:sz w:val="32"/>
+          <w:szCs w:val="32"/>
+        </w:rPr>
+        <w:t>D = Strafe Right</w:t>
+      </w:r>
+    </w:p>
+    <w:p>
+      <w:pPr>
+        <w:pStyle w:val="NoSpacing"/>
+        <w:pBdr>
+          <w:top w:val="single" w:sz="4" w:space="1" w:color="auto"/>
+          <w:left w:val="single" w:sz="4" w:space="4" w:color="auto"/>
+          <w:bottom w:val="single" w:sz="4" w:space="1" w:color="auto"/>
+          <w:right w:val="single" w:sz="4" w:space="4" w:color="auto"/>
+        </w:pBdr>
+        <w:rPr>
+          <w:rFonts w:ascii="Verdana" w:hAnsi="Verdana"/>
+          <w:sz w:val="32"/>
+          <w:szCs w:val="32"/>
+        </w:rPr>
+      </w:pPr>
+      <w:proofErr w:type="spellStart"/>
+      <w:r>
+        <w:rPr>
+          <w:rFonts w:ascii="Verdana" w:hAnsi="Verdana"/>
+          <w:sz w:val="32"/>
+          <w:szCs w:val="32"/>
+        </w:rPr>
+        <w:t>LeftArrow</w:t>
+      </w:r>
+      <w:proofErr w:type="spellEnd"/>
+      <w:r>
+        <w:rPr>
+          <w:rFonts w:ascii="Verdana" w:hAnsi="Verdana"/>
+          <w:sz w:val="32"/>
+          <w:szCs w:val="32"/>
+        </w:rPr>
+        <w:t xml:space="preserve"> = Turn Left</w:t>
+      </w:r>
+    </w:p>
+    <w:p>
+      <w:pPr>
+        <w:pStyle w:val="NoSpacing"/>
+        <w:pBdr>
+          <w:top w:val="single" w:sz="4" w:space="1" w:color="auto"/>
+          <w:left w:val="single" w:sz="4" w:space="4" w:color="auto"/>
+          <w:bottom w:val="single" w:sz="4" w:space="1" w:color="auto"/>
+          <w:right w:val="single" w:sz="4" w:space="4" w:color="auto"/>
+        </w:pBdr>
+        <w:rPr>
+          <w:rFonts w:ascii="Verdana" w:hAnsi="Verdana"/>
+          <w:sz w:val="32"/>
+          <w:szCs w:val="32"/>
+        </w:rPr>
+      </w:pPr>
+      <w:proofErr w:type="spellStart"/>
+      <w:r>
+        <w:rPr>
+          <w:rFonts w:ascii="Verdana" w:hAnsi="Verdana"/>
+          <w:sz w:val="32"/>
+          <w:szCs w:val="32"/>
+        </w:rPr>
+        <w:t>RightArrow</w:t>
+      </w:r>
+      <w:proofErr w:type="spellEnd"/>
+      <w:r>
+        <w:rPr>
+          <w:rFonts w:ascii="Verdana" w:hAnsi="Verdana"/>
+          <w:sz w:val="32"/>
+          <w:szCs w:val="32"/>
+        </w:rPr>
+        <w:t xml:space="preserve"> = Turn Right</w:t>
+      </w:r>
+    </w:p>
+    <w:p>
+      <w:pPr>
+        <w:pStyle w:val="NoSpacing"/>
+        <w:pBdr>
+          <w:top w:val="single" w:sz="4" w:space="1" w:color="auto"/>
+          <w:left w:val="single" w:sz="4" w:space="4" w:color="auto"/>
+          <w:bottom w:val="single" w:sz="4" w:space="1" w:color="auto"/>
+          <w:right w:val="single" w:sz="4" w:space="4" w:color="auto"/>
+        </w:pBdr>
+        <w:rPr>
+          <w:rFonts w:ascii="Verdana" w:hAnsi="Verdana"/>
+          <w:sz w:val="32"/>
+          <w:szCs w:val="32"/>
+        </w:rPr>
+      </w:pPr>
+    </w:p>
+    <w:p>
+      <w:pPr>
+        <w:pStyle w:val="NoSpacing"/>
+        <w:pBdr>
+          <w:top w:val="single" w:sz="4" w:space="1" w:color="auto"/>
+          <w:left w:val="single" w:sz="4" w:space="4" w:color="auto"/>
+          <w:bottom w:val="single" w:sz="4" w:space="1" w:color="auto"/>
+          <w:right w:val="single" w:sz="4" w:space="4" w:color="auto"/>
+        </w:pBdr>
+        <w:rPr>
+          <w:rFonts w:ascii="Verdana" w:hAnsi="Verdana"/>
+          <w:b/>
+          <w:bCs/>
+          <w:sz w:val="32"/>
+          <w:szCs w:val="32"/>
+        </w:rPr>
+      </w:pPr>
+      <w:r>
+        <w:rPr>
+          <w:rFonts w:ascii="Verdana" w:hAnsi="Verdana"/>
+          <w:b/>
+          <w:bCs/>
+          <w:sz w:val="32"/>
+          <w:szCs w:val="32"/>
+        </w:rPr>
+        <w:t>Observer functions:</w:t>
+      </w:r>
+    </w:p>
+    <w:p>
+      <w:pPr>
+        <w:pStyle w:val="NoSpacing"/>
+        <w:pBdr>
+          <w:top w:val="single" w:sz="4" w:space="1" w:color="auto"/>
+          <w:left w:val="single" w:sz="4" w:space="4" w:color="auto"/>
+          <w:bottom w:val="single" w:sz="4" w:space="1" w:color="auto"/>
+          <w:right w:val="single" w:sz="4" w:space="4" w:color="auto"/>
+        </w:pBdr>
+        <w:rPr>
+          <w:rFonts w:ascii="Verdana" w:hAnsi="Verdana"/>
+          <w:sz w:val="32"/>
+          <w:szCs w:val="32"/>
+        </w:rPr>
+      </w:pPr>
+      <w:proofErr w:type="spellStart"/>
+      <w:r>
+        <w:rPr>
+          <w:rFonts w:ascii="Verdana" w:hAnsi="Verdana"/>
+          <w:sz w:val="32"/>
+          <w:szCs w:val="32"/>
+        </w:rPr>
+        <w:t>PageUp</w:t>
+      </w:r>
+      <w:proofErr w:type="spellEnd"/>
+      <w:r>
+        <w:rPr>
+          <w:rFonts w:ascii="Verdana" w:hAnsi="Verdana"/>
+          <w:sz w:val="32"/>
+          <w:szCs w:val="32"/>
+        </w:rPr>
+        <w:t xml:space="preserve"> = </w:t>
+      </w:r>
+      <w:r>
+        <w:rPr>
+          <w:rFonts w:ascii="Verdana" w:hAnsi="Verdana"/>
+          <w:sz w:val="32"/>
+          <w:szCs w:val="32"/>
+        </w:rPr>
+        <w:t>Ascend (Fly Up)</w:t>
+      </w:r>
+    </w:p>
+    <w:p>
+      <w:pPr>
+        <w:pStyle w:val="NoSpacing"/>
+        <w:pBdr>
+          <w:top w:val="single" w:sz="4" w:space="1" w:color="auto"/>
+          <w:left w:val="single" w:sz="4" w:space="4" w:color="auto"/>
+          <w:bottom w:val="single" w:sz="4" w:space="1" w:color="auto"/>
+          <w:right w:val="single" w:sz="4" w:space="4" w:color="auto"/>
+        </w:pBdr>
+        <w:rPr>
+          <w:rFonts w:ascii="Verdana" w:hAnsi="Verdana"/>
+          <w:sz w:val="32"/>
+          <w:szCs w:val="32"/>
+        </w:rPr>
+      </w:pPr>
+      <w:proofErr w:type="spellStart"/>
+      <w:r>
+        <w:rPr>
+          <w:rFonts w:ascii="Verdana" w:hAnsi="Verdana"/>
+          <w:sz w:val="32"/>
+          <w:szCs w:val="32"/>
+        </w:rPr>
+        <w:t>PageDown</w:t>
+      </w:r>
+      <w:proofErr w:type="spellEnd"/>
+      <w:r>
+        <w:rPr>
+          <w:rFonts w:ascii="Verdana" w:hAnsi="Verdana"/>
+          <w:sz w:val="32"/>
+          <w:szCs w:val="32"/>
+        </w:rPr>
+        <w:t xml:space="preserve"> = </w:t>
+      </w:r>
+      <w:r>
+        <w:rPr>
+          <w:rFonts w:ascii="Verdana" w:hAnsi="Verdana"/>
+          <w:sz w:val="32"/>
+          <w:szCs w:val="32"/>
+        </w:rPr>
+        <w:t>Descend (Fly Down)</w:t>
+      </w:r>
+    </w:p>
+    <w:p>
+      <w:pPr>
+        <w:pStyle w:val="NoSpacing"/>
+        <w:pBdr>
+          <w:top w:val="single" w:sz="4" w:space="1" w:color="auto"/>
+          <w:left w:val="single" w:sz="4" w:space="4" w:color="auto"/>
+          <w:bottom w:val="single" w:sz="4" w:space="1" w:color="auto"/>
+          <w:right w:val="single" w:sz="4" w:space="4" w:color="auto"/>
+        </w:pBdr>
+        <w:rPr>
+          <w:rFonts w:ascii="Verdana" w:hAnsi="Verdana"/>
+          <w:b/>
+          <w:sz w:val="32"/>
+          <w:szCs w:val="32"/>
+        </w:rPr>
+      </w:pPr>
+    </w:p>
+    <w:p>
+      <w:pPr>
+        <w:pStyle w:val="NoSpacing"/>
+        <w:pBdr>
+          <w:top w:val="single" w:sz="4" w:space="1" w:color="auto"/>
+          <w:left w:val="single" w:sz="4" w:space="4" w:color="auto"/>
+          <w:bottom w:val="single" w:sz="4" w:space="1" w:color="auto"/>
+          <w:right w:val="single" w:sz="4" w:space="4" w:color="auto"/>
+        </w:pBdr>
+        <w:rPr>
+          <w:rFonts w:ascii="Verdana" w:hAnsi="Verdana"/>
+          <w:b/>
+          <w:sz w:val="32"/>
+          <w:szCs w:val="32"/>
+        </w:rPr>
+      </w:pPr>
+      <w:r>
+        <w:rPr>
+          <w:rFonts w:ascii="Verdana" w:hAnsi="Verdana"/>
+          <w:b/>
+          <w:sz w:val="32"/>
+          <w:szCs w:val="32"/>
+        </w:rPr>
+        <w:t>Player functions:</w:t>
+      </w:r>
+    </w:p>
+    <w:p>
+      <w:pPr>
+        <w:pStyle w:val="NoSpacing"/>
+        <w:pBdr>
+          <w:top w:val="single" w:sz="4" w:space="1" w:color="auto"/>
+          <w:left w:val="single" w:sz="4" w:space="4" w:color="auto"/>
+          <w:bottom w:val="single" w:sz="4" w:space="1" w:color="auto"/>
+          <w:right w:val="single" w:sz="4" w:space="4" w:color="auto"/>
+        </w:pBdr>
+        <w:rPr>
+          <w:rFonts w:ascii="Verdana" w:hAnsi="Verdana"/>
+          <w:sz w:val="32"/>
+          <w:szCs w:val="32"/>
+        </w:rPr>
+      </w:pPr>
+      <w:r>
+        <w:rPr>
+          <w:rFonts w:ascii="Verdana" w:hAnsi="Verdana"/>
+          <w:sz w:val="32"/>
+          <w:szCs w:val="32"/>
+        </w:rPr>
+        <w:t>Space = Jump</w:t>
+      </w:r>
+    </w:p>
+    <w:p>
+      <w:pPr>
+        <w:pStyle w:val="NoSpacing"/>
+        <w:pBdr>
+          <w:top w:val="single" w:sz="4" w:space="1" w:color="auto"/>
+          <w:left w:val="single" w:sz="4" w:space="4" w:color="auto"/>
+          <w:bottom w:val="single" w:sz="4" w:space="1" w:color="auto"/>
+          <w:right w:val="single" w:sz="4" w:space="4" w:color="auto"/>
+        </w:pBdr>
+        <w:rPr>
+          <w:rFonts w:ascii="Verdana" w:hAnsi="Verdana"/>
+          <w:b/>
+          <w:sz w:val="32"/>
+          <w:szCs w:val="32"/>
+        </w:rPr>
+      </w:pPr>
+      <w:r>
+        <w:rPr>
+          <w:rFonts w:ascii="Verdana" w:hAnsi="Verdana"/>
+          <w:sz w:val="32"/>
+          <w:szCs w:val="32"/>
+        </w:rPr>
+        <w:t>Ctrl = Crouch/Sink</w:t>
+      </w:r>
+    </w:p>
+    <w:p>
+      <w:pPr>
+        <w:pStyle w:val="NoSpacing"/>
+        <w:pBdr>
+          <w:top w:val="single" w:sz="4" w:space="1" w:color="auto"/>
+          <w:left w:val="single" w:sz="4" w:space="4" w:color="auto"/>
+          <w:bottom w:val="single" w:sz="4" w:space="1" w:color="auto"/>
+          <w:right w:val="single" w:sz="4" w:space="4" w:color="auto"/>
+        </w:pBdr>
+        <w:rPr>
+          <w:rFonts w:ascii="Verdana" w:hAnsi="Verdana"/>
+          <w:bCs/>
+          <w:sz w:val="32"/>
+          <w:szCs w:val="32"/>
+        </w:rPr>
+      </w:pPr>
+      <w:r>
+        <w:rPr>
+          <w:rFonts w:ascii="Verdana" w:hAnsi="Verdana"/>
+          <w:bCs/>
+          <w:sz w:val="32"/>
+          <w:szCs w:val="32"/>
+        </w:rPr>
+        <w:t>V = Change camera first person / 3</w:t>
+      </w:r>
+      <w:r>
+        <w:rPr>
+          <w:rFonts w:ascii="Verdana" w:hAnsi="Verdana"/>
+          <w:bCs/>
+          <w:sz w:val="32"/>
+          <w:szCs w:val="32"/>
+          <w:vertAlign w:val="superscript"/>
+        </w:rPr>
+        <w:t>rd</w:t>
+      </w:r>
+      <w:r>
+        <w:rPr>
+          <w:rFonts w:ascii="Verdana" w:hAnsi="Verdana"/>
+          <w:bCs/>
+          <w:sz w:val="32"/>
+          <w:szCs w:val="32"/>
+        </w:rPr>
+        <w:t xml:space="preserve"> person mode.</w:t>
+      </w:r>
+    </w:p>
+    <w:p>
+      <w:pPr>
+        <w:pStyle w:val="NoSpacing"/>
+        <w:pBdr>
+          <w:top w:val="single" w:sz="4" w:space="1" w:color="auto"/>
+          <w:left w:val="single" w:sz="4" w:space="4" w:color="auto"/>
+          <w:bottom w:val="single" w:sz="4" w:space="1" w:color="auto"/>
+          <w:right w:val="single" w:sz="4" w:space="4" w:color="auto"/>
+        </w:pBdr>
+        <w:rPr>
+          <w:rFonts w:ascii="Verdana" w:hAnsi="Verdana"/>
+          <w:b/>
+          <w:sz w:val="32"/>
+          <w:szCs w:val="32"/>
+        </w:rPr>
+      </w:pPr>
+    </w:p>
+    <w:p>
+      <w:pPr>
+        <w:pStyle w:val="NoSpacing"/>
+        <w:pBdr>
+          <w:top w:val="single" w:sz="4" w:space="1" w:color="auto"/>
+          <w:left w:val="single" w:sz="4" w:space="4" w:color="auto"/>
+          <w:bottom w:val="single" w:sz="4" w:space="1" w:color="auto"/>
+          <w:right w:val="single" w:sz="4" w:space="4" w:color="auto"/>
+        </w:pBdr>
+        <w:rPr>
+          <w:rFonts w:ascii="Verdana" w:hAnsi="Verdana"/>
+          <w:b/>
+          <w:sz w:val="32"/>
+          <w:szCs w:val="32"/>
+        </w:rPr>
+      </w:pPr>
+      <w:r>
+        <w:rPr>
+          <w:rFonts w:ascii="Verdana" w:hAnsi="Verdana"/>
+          <w:b/>
+          <w:sz w:val="32"/>
+          <w:szCs w:val="32"/>
+        </w:rPr>
+        <w:t>Editor functions:</w:t>
+      </w:r>
+    </w:p>
+    <w:p>
+      <w:pPr>
+        <w:pStyle w:val="NoSpacing"/>
+        <w:pBdr>
+          <w:top w:val="single" w:sz="4" w:space="1" w:color="auto"/>
+          <w:left w:val="single" w:sz="4" w:space="4" w:color="auto"/>
+          <w:bottom w:val="single" w:sz="4" w:space="1" w:color="auto"/>
+          <w:right w:val="single" w:sz="4" w:space="4" w:color="auto"/>
+        </w:pBdr>
+        <w:rPr>
+          <w:rFonts w:ascii="Verdana" w:hAnsi="Verdana"/>
+          <w:sz w:val="32"/>
+          <w:szCs w:val="32"/>
+        </w:rPr>
+      </w:pPr>
+      <w:r>
+        <w:rPr>
+          <w:rFonts w:ascii="Verdana" w:hAnsi="Verdana"/>
+          <w:sz w:val="32"/>
+          <w:szCs w:val="32"/>
+        </w:rPr>
+        <w:t>N = Create New Block</w:t>
+      </w:r>
+    </w:p>
+    <w:p>
+      <w:pPr>
+        <w:pStyle w:val="NoSpacing"/>
+        <w:pBdr>
+          <w:top w:val="single" w:sz="4" w:space="1" w:color="auto"/>
+          <w:left w:val="single" w:sz="4" w:space="4" w:color="auto"/>
+          <w:bottom w:val="single" w:sz="4" w:space="1" w:color="auto"/>
+          <w:right w:val="single" w:sz="4" w:space="4" w:color="auto"/>
+        </w:pBdr>
+        <w:rPr>
+          <w:rFonts w:ascii="Verdana" w:hAnsi="Verdana"/>
+          <w:sz w:val="32"/>
+          <w:szCs w:val="32"/>
+        </w:rPr>
+      </w:pPr>
+      <w:r>
+        <w:rPr>
+          <w:rFonts w:ascii="Verdana" w:hAnsi="Verdana"/>
+          <w:sz w:val="32"/>
+          <w:szCs w:val="32"/>
+        </w:rPr>
+        <w:t>M = Change Block Color</w:t>
+      </w:r>
+    </w:p>
+    <w:p>
+      <w:pPr>
+        <w:pStyle w:val="NoSpacing"/>
+        <w:pBdr>
+          <w:top w:val="single" w:sz="4" w:space="1" w:color="auto"/>
+          <w:left w:val="single" w:sz="4" w:space="4" w:color="auto"/>
+          <w:bottom w:val="single" w:sz="4" w:space="1" w:color="auto"/>
+          <w:right w:val="single" w:sz="4" w:space="4" w:color="auto"/>
+        </w:pBdr>
+        <w:rPr>
+          <w:rFonts w:ascii="Verdana" w:hAnsi="Verdana"/>
+          <w:sz w:val="32"/>
+          <w:szCs w:val="32"/>
+        </w:rPr>
+      </w:pPr>
+      <w:r>
+        <w:rPr>
+          <w:rFonts w:ascii="Verdana" w:hAnsi="Verdana"/>
+          <w:sz w:val="32"/>
+          <w:szCs w:val="32"/>
+        </w:rPr>
+        <w:t>Mouse1 = Select Solid Block</w:t>
+      </w:r>
+    </w:p>
+    <w:p>
+      <w:pPr>
+        <w:pStyle w:val="NoSpacing"/>
+        <w:pBdr>
+          <w:top w:val="single" w:sz="4" w:space="1" w:color="auto"/>
+          <w:left w:val="single" w:sz="4" w:space="4" w:color="auto"/>
+          <w:bottom w:val="single" w:sz="4" w:space="1" w:color="auto"/>
+          <w:right w:val="single" w:sz="4" w:space="4" w:color="auto"/>
+        </w:pBdr>
+        <w:rPr>
+          <w:rFonts w:ascii="Verdana" w:hAnsi="Verdana"/>
+          <w:sz w:val="32"/>
+          <w:szCs w:val="32"/>
+        </w:rPr>
+      </w:pPr>
+      <w:r>
+        <w:rPr>
+          <w:rFonts w:ascii="Verdana" w:hAnsi="Verdana"/>
+          <w:sz w:val="32"/>
+          <w:szCs w:val="32"/>
+        </w:rPr>
+        <w:t>Mouse1 + SHIFT = Select Fluid Block</w:t>
+      </w:r>
+    </w:p>
+    <w:p>
+      <w:pPr>
+        <w:pStyle w:val="NoSpacing"/>
+        <w:pBdr>
+          <w:top w:val="single" w:sz="4" w:space="1" w:color="auto"/>
+          <w:left w:val="single" w:sz="4" w:space="4" w:color="auto"/>
+          <w:bottom w:val="single" w:sz="4" w:space="1" w:color="auto"/>
+          <w:right w:val="single" w:sz="4" w:space="4" w:color="auto"/>
+        </w:pBdr>
+        <w:rPr>
+          <w:rFonts w:ascii="Verdana" w:hAnsi="Verdana"/>
+          <w:sz w:val="32"/>
+          <w:szCs w:val="32"/>
+        </w:rPr>
+      </w:pPr>
+      <w:r>
+        <w:rPr>
+          <w:rFonts w:ascii="Verdana" w:hAnsi="Verdana"/>
+          <w:sz w:val="32"/>
+          <w:szCs w:val="32"/>
+        </w:rPr>
+        <w:t>Mouse2 = Place New Block</w:t>
+      </w:r>
+    </w:p>
+    <w:p>
+      <w:pPr>
+        <w:pStyle w:val="NoSpacing"/>
+        <w:pBdr>
+          <w:top w:val="single" w:sz="4" w:space="1" w:color="auto"/>
+          <w:left w:val="single" w:sz="4" w:space="4" w:color="auto"/>
+          <w:bottom w:val="single" w:sz="4" w:space="1" w:color="auto"/>
+          <w:right w:val="single" w:sz="4" w:space="4" w:color="auto"/>
+        </w:pBdr>
+        <w:rPr>
+          <w:rFonts w:ascii="Verdana" w:hAnsi="Verdana"/>
+          <w:sz w:val="32"/>
+          <w:szCs w:val="32"/>
+        </w:rPr>
+      </w:pPr>
+      <w:r>
+        <w:rPr>
+          <w:rFonts w:ascii="Verdana" w:hAnsi="Verdana"/>
+          <w:sz w:val="32"/>
+          <w:szCs w:val="32"/>
+        </w:rPr>
+        <w:t>1-6 = Select Adjacent Solid Block</w:t>
+      </w:r>
+    </w:p>
+    <w:p>
+      <w:pPr>
+        <w:pStyle w:val="NoSpacing"/>
+        <w:pBdr>
+          <w:top w:val="single" w:sz="4" w:space="1" w:color="auto"/>
+          <w:left w:val="single" w:sz="4" w:space="4" w:color="auto"/>
+          <w:bottom w:val="single" w:sz="4" w:space="1" w:color="auto"/>
+          <w:right w:val="single" w:sz="4" w:space="4" w:color="auto"/>
+        </w:pBdr>
+        <w:rPr>
+          <w:rFonts w:ascii="Verdana" w:hAnsi="Verdana"/>
+          <w:sz w:val="32"/>
+          <w:szCs w:val="32"/>
+        </w:rPr>
+      </w:pPr>
+      <w:r>
+        <w:rPr>
+          <w:rFonts w:ascii="Verdana" w:hAnsi="Verdana"/>
+          <w:sz w:val="32"/>
+          <w:szCs w:val="32"/>
+        </w:rPr>
+        <w:t>1-6 + SHIFT = Select Adjacent Fluid Block</w:t>
+      </w:r>
+    </w:p>
+    <w:p>
+      <w:pPr>
+        <w:pStyle w:val="NoSpacing"/>
+        <w:pBdr>
+          <w:top w:val="single" w:sz="4" w:space="1" w:color="auto"/>
+          <w:left w:val="single" w:sz="4" w:space="4" w:color="auto"/>
+          <w:bottom w:val="single" w:sz="4" w:space="1" w:color="auto"/>
+          <w:right w:val="single" w:sz="4" w:space="4" w:color="auto"/>
+        </w:pBdr>
+        <w:rPr>
+          <w:rFonts w:ascii="Verdana" w:hAnsi="Verdana"/>
+          <w:sz w:val="32"/>
+          <w:szCs w:val="32"/>
+        </w:rPr>
+      </w:pPr>
+      <w:r>
+        <w:rPr>
+          <w:rFonts w:ascii="Verdana" w:hAnsi="Verdana"/>
+          <w:sz w:val="32"/>
+          <w:szCs w:val="32"/>
+        </w:rPr>
+        <w:t>F, 0 = Deselect</w:t>
+      </w:r>
+    </w:p>
+    <w:p>
+      <w:pPr>
+        <w:pStyle w:val="NoSpacing"/>
+        <w:pBdr>
+          <w:top w:val="single" w:sz="4" w:space="1" w:color="auto"/>
+          <w:left w:val="single" w:sz="4" w:space="4" w:color="auto"/>
+          <w:bottom w:val="single" w:sz="4" w:space="1" w:color="auto"/>
+          <w:right w:val="single" w:sz="4" w:space="4" w:color="auto"/>
+        </w:pBdr>
+        <w:rPr>
+          <w:rFonts w:ascii="Verdana" w:hAnsi="Verdana"/>
+          <w:sz w:val="32"/>
+          <w:szCs w:val="32"/>
+        </w:rPr>
+      </w:pPr>
+      <w:r>
+        <w:rPr>
+          <w:rFonts w:ascii="Verdana" w:hAnsi="Verdana"/>
+          <w:sz w:val="32"/>
+          <w:szCs w:val="32"/>
+        </w:rPr>
+        <w:t>R = Remove Selected Block</w:t>
+      </w:r>
+    </w:p>
+    <w:p>
+      <w:pPr>
+        <w:pStyle w:val="NoSpacing"/>
+        <w:pBdr>
+          <w:top w:val="single" w:sz="4" w:space="1" w:color="auto"/>
+          <w:left w:val="single" w:sz="4" w:space="4" w:color="auto"/>
+          <w:bottom w:val="single" w:sz="4" w:space="1" w:color="auto"/>
+          <w:right w:val="single" w:sz="4" w:space="4" w:color="auto"/>
+        </w:pBdr>
+        <w:rPr>
+          <w:rFonts w:ascii="Verdana" w:hAnsi="Verdana"/>
+          <w:sz w:val="32"/>
+          <w:szCs w:val="32"/>
+        </w:rPr>
+      </w:pPr>
+      <w:r>
+        <w:rPr>
+          <w:rFonts w:ascii="Verdana" w:hAnsi="Verdana"/>
+          <w:sz w:val="32"/>
+          <w:szCs w:val="32"/>
+        </w:rPr>
+        <w:t>[, ] = Change Texture For New Block</w:t>
+      </w:r>
+    </w:p>
+    <w:p>
+      <w:pPr>
+        <w:pStyle w:val="NoSpacing"/>
+        <w:pBdr>
+          <w:top w:val="single" w:sz="4" w:space="1" w:color="auto"/>
+          <w:left w:val="single" w:sz="4" w:space="4" w:color="auto"/>
+          <w:bottom w:val="single" w:sz="4" w:space="1" w:color="auto"/>
+          <w:right w:val="single" w:sz="4" w:space="4" w:color="auto"/>
+        </w:pBdr>
+        <w:rPr>
+          <w:rFonts w:ascii="Verdana" w:hAnsi="Verdana"/>
+          <w:b/>
+          <w:sz w:val="32"/>
+          <w:szCs w:val="32"/>
+        </w:rPr>
+      </w:pPr>
+    </w:p>
+    <w:p>
+      <w:pPr>
+        <w:pStyle w:val="NoSpacing"/>
+        <w:pBdr>
+          <w:top w:val="single" w:sz="4" w:space="1" w:color="auto"/>
+          <w:left w:val="single" w:sz="4" w:space="4" w:color="auto"/>
+          <w:bottom w:val="single" w:sz="4" w:space="1" w:color="auto"/>
+          <w:right w:val="single" w:sz="4" w:space="4" w:color="auto"/>
+        </w:pBdr>
+        <w:rPr>
+          <w:rFonts w:ascii="Verdana" w:hAnsi="Verdana"/>
+          <w:b/>
+          <w:sz w:val="32"/>
+          <w:szCs w:val="32"/>
+        </w:rPr>
+      </w:pPr>
+      <w:r>
+        <w:rPr>
+          <w:rFonts w:ascii="Verdana" w:hAnsi="Verdana"/>
+          <w:b/>
+          <w:sz w:val="32"/>
+          <w:szCs w:val="32"/>
+        </w:rPr>
+        <w:t>Other functions:</w:t>
+      </w:r>
+    </w:p>
+    <w:p>
+      <w:pPr>
+        <w:pStyle w:val="NoSpacing"/>
+        <w:pBdr>
+          <w:top w:val="single" w:sz="4" w:space="1" w:color="auto"/>
+          <w:left w:val="single" w:sz="4" w:space="4" w:color="auto"/>
+          <w:bottom w:val="single" w:sz="4" w:space="1" w:color="auto"/>
+          <w:right w:val="single" w:sz="4" w:space="4" w:color="auto"/>
+        </w:pBdr>
+        <w:rPr>
+          <w:rFonts w:ascii="Verdana" w:hAnsi="Verdana"/>
+          <w:sz w:val="32"/>
+          <w:szCs w:val="32"/>
+        </w:rPr>
+      </w:pPr>
+      <w:r>
+        <w:rPr>
+          <w:rFonts w:ascii="Verdana" w:hAnsi="Verdana"/>
+          <w:sz w:val="32"/>
+          <w:szCs w:val="32"/>
+        </w:rPr>
+        <w:t>` = Enter Command</w:t>
+      </w:r>
+    </w:p>
+    <w:p>
+      <w:pPr>
+        <w:pStyle w:val="NoSpacing"/>
+        <w:pBdr>
+          <w:top w:val="single" w:sz="4" w:space="1" w:color="auto"/>
+          <w:left w:val="single" w:sz="4" w:space="4" w:color="auto"/>
+          <w:bottom w:val="single" w:sz="4" w:space="1" w:color="auto"/>
+          <w:right w:val="single" w:sz="4" w:space="4" w:color="auto"/>
+        </w:pBdr>
+        <w:rPr>
+          <w:rFonts w:ascii="Verdana" w:hAnsi="Verdana"/>
+          <w:sz w:val="32"/>
+          <w:szCs w:val="32"/>
+        </w:rPr>
+      </w:pPr>
+      <w:r>
+        <w:rPr>
+          <w:rFonts w:ascii="Verdana" w:hAnsi="Verdana"/>
+          <w:sz w:val="32"/>
+          <w:szCs w:val="32"/>
+        </w:rPr>
+        <w:t>ESC = Main Menu</w:t>
+      </w:r>
+    </w:p>
+    <w:p>
+      <w:pPr>
+        <w:pStyle w:val="NoSpacing"/>
+        <w:pBdr>
+          <w:top w:val="single" w:sz="4" w:space="1" w:color="auto"/>
+          <w:left w:val="single" w:sz="4" w:space="4" w:color="auto"/>
+          <w:bottom w:val="single" w:sz="4" w:space="1" w:color="auto"/>
+          <w:right w:val="single" w:sz="4" w:space="4" w:color="auto"/>
+        </w:pBdr>
+        <w:rPr>
+          <w:rFonts w:ascii="Verdana" w:hAnsi="Verdana"/>
+          <w:sz w:val="32"/>
+          <w:szCs w:val="32"/>
+        </w:rPr>
+      </w:pPr>
+      <w:r>
+        <w:rPr>
+          <w:rFonts w:ascii="Verdana" w:hAnsi="Verdana"/>
+          <w:sz w:val="32"/>
+          <w:szCs w:val="32"/>
+        </w:rPr>
+        <w:t>F1 = Help</w:t>
+      </w:r>
+    </w:p>
+    <w:p>
+      <w:pPr>
+        <w:pStyle w:val="NoSpacing"/>
+        <w:pBdr>
+          <w:top w:val="single" w:sz="4" w:space="1" w:color="auto"/>
+          <w:left w:val="single" w:sz="4" w:space="4" w:color="auto"/>
+          <w:bottom w:val="single" w:sz="4" w:space="1" w:color="auto"/>
+          <w:right w:val="single" w:sz="4" w:space="4" w:color="auto"/>
+        </w:pBdr>
+        <w:rPr>
+          <w:rFonts w:ascii="Verdana" w:hAnsi="Verdana"/>
+          <w:sz w:val="32"/>
+          <w:szCs w:val="32"/>
+        </w:rPr>
+      </w:pPr>
+      <w:r>
+        <w:rPr>
+          <w:rFonts w:ascii="Verdana" w:hAnsi="Verdana"/>
+          <w:sz w:val="32"/>
+          <w:szCs w:val="32"/>
+        </w:rPr>
+        <w:lastRenderedPageBreak/>
+        <w:t>F2 = Save Level</w:t>
+      </w:r>
+    </w:p>
+    <w:p>
+      <w:pPr>
+        <w:pStyle w:val="NoSpacing"/>
+        <w:pBdr>
+          <w:top w:val="single" w:sz="4" w:space="1" w:color="auto"/>
+          <w:left w:val="single" w:sz="4" w:space="4" w:color="auto"/>
+          <w:bottom w:val="single" w:sz="4" w:space="1" w:color="auto"/>
+          <w:right w:val="single" w:sz="4" w:space="4" w:color="auto"/>
+        </w:pBdr>
+        <w:rPr>
+          <w:rFonts w:ascii="Verdana" w:hAnsi="Verdana"/>
+          <w:sz w:val="32"/>
+          <w:szCs w:val="32"/>
+        </w:rPr>
+      </w:pPr>
+      <w:r>
+        <w:rPr>
+          <w:rFonts w:ascii="Verdana" w:hAnsi="Verdana"/>
+          <w:sz w:val="32"/>
+          <w:szCs w:val="32"/>
+        </w:rPr>
+        <w:t>F3 = Load Level</w:t>
+      </w:r>
+    </w:p>
+    <w:p>
+      <w:pPr>
+        <w:pStyle w:val="NoSpacing"/>
+        <w:pBdr>
+          <w:top w:val="single" w:sz="4" w:space="1" w:color="auto"/>
+          <w:left w:val="single" w:sz="4" w:space="4" w:color="auto"/>
+          <w:bottom w:val="single" w:sz="4" w:space="1" w:color="auto"/>
+          <w:right w:val="single" w:sz="4" w:space="4" w:color="auto"/>
+        </w:pBdr>
+        <w:rPr>
+          <w:rFonts w:ascii="Verdana" w:hAnsi="Verdana"/>
+          <w:sz w:val="32"/>
+          <w:szCs w:val="32"/>
+        </w:rPr>
+      </w:pPr>
+      <w:r>
+        <w:rPr>
+          <w:rFonts w:ascii="Verdana" w:hAnsi="Verdana"/>
+          <w:sz w:val="32"/>
+          <w:szCs w:val="32"/>
+        </w:rPr>
+        <w:t>F12 = Take Screenshot</w:t>
+      </w:r>
+    </w:p>
+    <w:p>
+      <w:pPr>
+        <w:pStyle w:val="NoSpacing"/>
+        <w:pBdr>
+          <w:top w:val="single" w:sz="4" w:space="1" w:color="auto"/>
+          <w:left w:val="single" w:sz="4" w:space="4" w:color="auto"/>
+          <w:bottom w:val="single" w:sz="4" w:space="1" w:color="auto"/>
+          <w:right w:val="single" w:sz="4" w:space="4" w:color="auto"/>
+        </w:pBdr>
+        <w:rPr>
+          <w:rFonts w:ascii="Verdana" w:hAnsi="Verdana"/>
+          <w:sz w:val="32"/>
+          <w:szCs w:val="32"/>
+        </w:rPr>
+      </w:pPr>
+      <w:r>
+        <w:rPr>
+          <w:rFonts w:ascii="Verdana" w:hAnsi="Verdana"/>
+          <w:sz w:val="32"/>
+          <w:szCs w:val="32"/>
+        </w:rPr>
+        <w:t>P = Change Crosshair Color</w:t>
+      </w:r>
+    </w:p>
+    <w:p>
+      <w:pPr>
+        <w:pStyle w:val="NoSpacing"/>
+        <w:rPr>
+          <w:rFonts w:ascii="Verdana" w:hAnsi="Verdana"/>
+          <w:b/>
+          <w:sz w:val="32"/>
+          <w:szCs w:val="32"/>
+        </w:rPr>
+      </w:pPr>
+    </w:p>
+    <w:p>
+      <w:pPr>
+        <w:pStyle w:val="NoSpacing"/>
+        <w:pBdr>
+          <w:top w:val="single" w:sz="4" w:space="1" w:color="auto"/>
+          <w:left w:val="single" w:sz="4" w:space="4" w:color="auto"/>
+          <w:bottom w:val="single" w:sz="4" w:space="1" w:color="auto"/>
+          <w:right w:val="single" w:sz="4" w:space="4" w:color="auto"/>
+        </w:pBdr>
+        <w:rPr>
+          <w:rFonts w:ascii="Verdana" w:hAnsi="Verdana"/>
+          <w:b/>
+          <w:sz w:val="48"/>
+          <w:szCs w:val="32"/>
+        </w:rPr>
+      </w:pPr>
+      <w:r>
+        <w:rPr>
+          <w:rFonts w:ascii="Verdana" w:hAnsi="Verdana"/>
+          <w:b/>
+          <w:sz w:val="48"/>
+          <w:szCs w:val="32"/>
+        </w:rPr>
+        <w:t>N</w:t>
+      </w:r>
+      <w:r>
+        <w:rPr>
+          <w:rFonts w:ascii="Verdana" w:hAnsi="Verdana"/>
+          <w:b/>
+          <w:sz w:val="48"/>
+          <w:szCs w:val="32"/>
+        </w:rPr>
+        <w:t>otes:</w:t>
       </w:r>
     </w:p>
     <w:p>
@@ -2529,71 +3014,15 @@
           <w:sz w:val="32"/>
           <w:szCs w:val="32"/>
         </w:rPr>
-        <w:t xml:space="preserve">Game requires Quad Core processor with support for at least 4 threads. </w:t>
-      </w:r>
-      <w:r>
-        <w:rPr>
-          <w:rFonts w:ascii="Verdana" w:hAnsi="Verdana"/>
-          <w:sz w:val="32"/>
-          <w:szCs w:val="32"/>
-        </w:rPr>
-        <w:t>Game implementation is multithreaded (</w:t>
-      </w:r>
-      <w:r>
-        <w:rPr>
-          <w:rFonts w:ascii="Verdana" w:hAnsi="Verdana"/>
-          <w:sz w:val="32"/>
-          <w:szCs w:val="32"/>
-        </w:rPr>
-        <w:t xml:space="preserve">at most time </w:t>
-      </w:r>
-      <w:r>
-        <w:rPr>
-          <w:rFonts w:ascii="Verdana" w:hAnsi="Verdana"/>
-          <w:sz w:val="32"/>
-          <w:szCs w:val="32"/>
-        </w:rPr>
-        <w:t>3</w:t>
-      </w:r>
-      <w:r>
-        <w:rPr>
-          <w:rFonts w:ascii="Verdana" w:hAnsi="Verdana"/>
-          <w:sz w:val="32"/>
-          <w:szCs w:val="32"/>
-        </w:rPr>
-        <w:t xml:space="preserve"> </w:t>
-      </w:r>
-      <w:r>
-        <w:rPr>
-          <w:rFonts w:ascii="Verdana" w:hAnsi="Verdana"/>
-          <w:sz w:val="32"/>
-          <w:szCs w:val="32"/>
-        </w:rPr>
-        <w:t>threads will</w:t>
-      </w:r>
-      <w:r>
-        <w:rPr>
-          <w:rFonts w:ascii="Verdana" w:hAnsi="Verdana"/>
-          <w:sz w:val="32"/>
-          <w:szCs w:val="32"/>
-        </w:rPr>
-        <w:t xml:space="preserve"> be active</w:t>
-      </w:r>
-      <w:r>
-        <w:rPr>
-          <w:rFonts w:ascii="Verdana" w:hAnsi="Verdana"/>
-          <w:sz w:val="32"/>
-          <w:szCs w:val="32"/>
-        </w:rPr>
-        <w:t xml:space="preserve"> + 1 additional thread if random level generator is being used or when loading or saving level is in progress</w:t>
-      </w:r>
-      <w:r>
-        <w:rPr>
-          <w:rFonts w:ascii="Verdana" w:hAnsi="Verdana"/>
-          <w:sz w:val="32"/>
-          <w:szCs w:val="32"/>
-        </w:rPr>
-        <w:t>).</w:t>
+        <w:t>Game uses LWJGL 3.2.3 since v 02 (BELARUS).</w:t>
+      </w:r>
+      <w:r>
+        <w:rPr>
+          <w:rFonts w:ascii="Verdana" w:hAnsi="Verdana"/>
+          <w:sz w:val="32"/>
+          <w:szCs w:val="32"/>
+        </w:rPr>
+        <w:t xml:space="preserve"> V36G and later use LWGJL 3.3.3.</w:t>
       </w:r>
     </w:p>
     <w:p>
@@ -2621,7 +3050,71 @@
           <w:sz w:val="32"/>
           <w:szCs w:val="32"/>
         </w:rPr>
-        <w:t>Running the game requires OpenGL 3.3 (on graphic cards since March 2010) or later.</w:t>
+        <w:t xml:space="preserve">Game requires Quad Core processor with support for at least 4 threads. </w:t>
+      </w:r>
+      <w:r>
+        <w:rPr>
+          <w:rFonts w:ascii="Verdana" w:hAnsi="Verdana"/>
+          <w:sz w:val="32"/>
+          <w:szCs w:val="32"/>
+        </w:rPr>
+        <w:t>Game implementation is multithreaded (</w:t>
+      </w:r>
+      <w:r>
+        <w:rPr>
+          <w:rFonts w:ascii="Verdana" w:hAnsi="Verdana"/>
+          <w:sz w:val="32"/>
+          <w:szCs w:val="32"/>
+        </w:rPr>
+        <w:t xml:space="preserve">at most time </w:t>
+      </w:r>
+      <w:r>
+        <w:rPr>
+          <w:rFonts w:ascii="Verdana" w:hAnsi="Verdana"/>
+          <w:sz w:val="32"/>
+          <w:szCs w:val="32"/>
+        </w:rPr>
+        <w:t>3</w:t>
+      </w:r>
+      <w:r>
+        <w:rPr>
+          <w:rFonts w:ascii="Verdana" w:hAnsi="Verdana"/>
+          <w:sz w:val="32"/>
+          <w:szCs w:val="32"/>
+        </w:rPr>
+        <w:t xml:space="preserve"> </w:t>
+      </w:r>
+      <w:r>
+        <w:rPr>
+          <w:rFonts w:ascii="Verdana" w:hAnsi="Verdana"/>
+          <w:sz w:val="32"/>
+          <w:szCs w:val="32"/>
+        </w:rPr>
+        <w:t>threads will</w:t>
+      </w:r>
+      <w:r>
+        <w:rPr>
+          <w:rFonts w:ascii="Verdana" w:hAnsi="Verdana"/>
+          <w:sz w:val="32"/>
+          <w:szCs w:val="32"/>
+        </w:rPr>
+        <w:t xml:space="preserve"> be active</w:t>
+      </w:r>
+      <w:r>
+        <w:rPr>
+          <w:rFonts w:ascii="Verdana" w:hAnsi="Verdana"/>
+          <w:sz w:val="32"/>
+          <w:szCs w:val="32"/>
+        </w:rPr>
+        <w:t xml:space="preserve"> + 1 additional thread if random level generator is being used or when loading or saving level is in progress</w:t>
+      </w:r>
+      <w:r>
+        <w:rPr>
+          <w:rFonts w:ascii="Verdana" w:hAnsi="Verdana"/>
+          <w:sz w:val="32"/>
+          <w:szCs w:val="32"/>
+        </w:rPr>
+        <w:t>).</w:t>
       </w:r>
     </w:p>
     <w:p>
@@ -2649,6 +3142,34 @@
           <w:sz w:val="32"/>
           <w:szCs w:val="32"/>
         </w:rPr>
+        <w:t>Running the game requires OpenGL 3.3 (on graphic cards since March 2010) or later.</w:t>
+      </w:r>
+    </w:p>
+    <w:p>
+      <w:pPr>
+        <w:pStyle w:val="NoSpacing"/>
+        <w:numPr>
+          <w:ilvl w:val="0"/>
+          <w:numId w:val="1"/>
+        </w:numPr>
+        <w:pBdr>
+          <w:top w:val="single" w:sz="4" w:space="1" w:color="auto"/>
+          <w:left w:val="single" w:sz="4" w:space="4" w:color="auto"/>
+          <w:bottom w:val="single" w:sz="4" w:space="1" w:color="auto"/>
+          <w:right w:val="single" w:sz="4" w:space="4" w:color="auto"/>
+        </w:pBdr>
+        <w:rPr>
+          <w:rFonts w:ascii="Verdana" w:hAnsi="Verdana"/>
+          <w:sz w:val="32"/>
+          <w:szCs w:val="32"/>
+        </w:rPr>
+      </w:pPr>
+      <w:r>
+        <w:rPr>
+          <w:rFonts w:ascii="Verdana" w:hAnsi="Verdana"/>
+          <w:sz w:val="32"/>
+          <w:szCs w:val="32"/>
+        </w:rPr>
         <w:t xml:space="preserve">Game is implemented using Java </w:t>
       </w:r>
       <w:r>
@@ -2703,9 +3224,45 @@
     <w:p>
       <w:pPr>
         <w:pStyle w:val="NoSpacing"/>
-      </w:pPr>
-      <w:r>
-        <w:t xml:space="preserve">Author: Alexander “Ermac” Stojanovich (email: </w:t>
+        <w:numPr>
+          <w:ilvl w:val="0"/>
+          <w:numId w:val="1"/>
+        </w:numPr>
+        <w:pBdr>
+          <w:top w:val="single" w:sz="4" w:space="1" w:color="auto"/>
+          <w:left w:val="single" w:sz="4" w:space="4" w:color="auto"/>
+          <w:bottom w:val="single" w:sz="4" w:space="1" w:color="auto"/>
+          <w:right w:val="single" w:sz="4" w:space="4" w:color="auto"/>
+        </w:pBdr>
+        <w:rPr>
+          <w:rFonts w:ascii="Verdana" w:hAnsi="Verdana"/>
+          <w:sz w:val="32"/>
+          <w:szCs w:val="32"/>
+        </w:rPr>
+      </w:pPr>
+      <w:r>
+        <w:rPr>
+          <w:rFonts w:ascii="Verdana" w:hAnsi="Verdana"/>
+          <w:sz w:val="32"/>
+          <w:szCs w:val="32"/>
+        </w:rPr>
+        <w:t>Game Client and Game Server are using UDP protocol.</w:t>
+      </w:r>
+    </w:p>
+    <w:p>
+      <w:pPr>
+        <w:pStyle w:val="NoSpacing"/>
+      </w:pPr>
+      <w:r>
+        <w:t>Author: Alexander “</w:t>
+      </w:r>
+      <w:proofErr w:type="spellStart"/>
+      <w:r>
+        <w:t>Ermac</w:t>
+      </w:r>
+      <w:proofErr w:type="spellEnd"/>
+      <w:r>
+        <w:t xml:space="preserve">” Stojanovich (email: </w:t>
       </w:r>
       <w:hyperlink r:id="rId9" w:history="1">
         <w:r>
@@ -2716,23 +3273,34 @@
         </w:r>
       </w:hyperlink>
       <w:r>
-        <w:t>; Discord: ermac #1844)</w:t>
-      </w:r>
-    </w:p>
-    <w:p>
-      <w:pPr>
-        <w:pStyle w:val="NoSpacing"/>
-      </w:pPr>
-      <w:r>
-        <w:t>Testers: JSomnia, Hellblade64</w:t>
-      </w:r>
-    </w:p>
-    <w:p>
-      <w:pPr>
-        <w:pStyle w:val="NoSpacing"/>
-      </w:pPr>
-      <w:r>
-        <w:t>Audio material was provided from freesound.org by Erokia.</w:t>
+        <w:t>; Discord: ermac1844)</w:t>
+      </w:r>
+    </w:p>
+    <w:p>
+      <w:pPr>
+        <w:pStyle w:val="NoSpacing"/>
+      </w:pPr>
+      <w:r>
+        <w:t xml:space="preserve">Testers: </w:t>
+      </w:r>
+      <w:r>
+        <w:t>13</w:t>
+      </w:r>
+    </w:p>
+    <w:p>
+      <w:pPr>
+        <w:pStyle w:val="NoSpacing"/>
+      </w:pPr>
+      <w:r>
+        <w:t xml:space="preserve">Audio material was provided from freesound.org by </w:t>
+      </w:r>
+      <w:proofErr w:type="spellStart"/>
+      <w:r>
+        <w:t>Erokia</w:t>
+      </w:r>
+      <w:proofErr w:type="spellEnd"/>
+      <w:r>
+        <w:t>.</w:t>
       </w:r>
     </w:p>
     <w:sectPr>
@@ -2748,7 +3316,7 @@
 </file>
 
 <file path=word/endnotes.xml><?xml version="1.0" encoding="utf-8"?>
-<w:endnotes xmlns:wpc="http://schemas.microsoft.com/office/word/2010/wordprocessingCanvas" xmlns:cx="http://schemas.microsoft.com/office/drawing/2014/chartex" xmlns:cx1="http://schemas.microsoft.com/office/drawing/2015/9/8/chartex" xmlns:cx2="http://schemas.microsoft.com/office/drawing/2015/10/21/chartex" xmlns:cx3="http://schemas.microsoft.com/office/drawing/2016/5/9/chartex" xmlns:cx4="http://schemas.microsoft.com/office/drawing/2016/5/10/chartex" xmlns:cx5="http://schemas.microsoft.com/office/drawing/2016/5/11/chartex" xmlns:cx6="http://schemas.microsoft.com/office/drawing/2016/5/12/chartex" xmlns:cx7="http://schemas.microsoft.com/office/drawing/2016/5/13/chartex" xmlns:cx8="http://schemas.microsoft.com/office/drawing/2016/5/14/chartex" xmlns:mc="http://schemas.openxmlformats.org/markup-compatibility/2006" xmlns:aink="http://schemas.microsoft.com/office/drawing/2016/ink" xmlns:am3d="http://schemas.microsoft.com/office/drawing/2017/model3d" xmlns:o="urn:schemas-microsoft-com:office:office" xmlns:oel="http://schemas.microsoft.com/office/2019/extlst" xmlns:r="http://schemas.openxmlformats.org/officeDocument/2006/relationships" xmlns:m="http://schemas.openxmlformats.org/officeDocument/2006/math" xmlns:v="urn:schemas-microsoft-com:vml" xmlns:wp14="http://schemas.microsoft.com/office/word/2010/wordprocessingDrawing" xmlns:wp="http://schemas.openxmlformats.org/drawingml/2006/wordprocessingDrawing" xmlns:w10="urn:schemas-microsoft-com:office:word" xmlns:w="http://schemas.openxmlformats.org/wordprocessingml/2006/main" xmlns:w14="http://schemas.microsoft.com/office/word/2010/wordml" xmlns:w15="http://schemas.microsoft.com/office/word/2012/wordml" xmlns:w16cex="http://schemas.microsoft.com/office/word/2018/wordml/cex" xmlns:w16cid="http://schemas.microsoft.com/office/word/2016/wordml/cid" xmlns:w16="http://schemas.microsoft.com/office/word/2018/wordml" xmlns:w16sdtdh="http://schemas.microsoft.com/office/word/2020/wordml/sdtdatahash" xmlns:w16se="http://schemas.microsoft.com/office/word/2015/wordml/symex" xmlns:wpg="http://schemas.microsoft.com/office/word/2010/wordprocessingGroup" xmlns:wpi="http://schemas.microsoft.com/office/word/2010/wordprocessingInk" xmlns:wne="http://schemas.microsoft.com/office/word/2006/wordml" xmlns:wps="http://schemas.microsoft.com/office/word/2010/wordprocessingShape" mc:Ignorable="w14 w15 w16se w16cid w16 w16cex w16sdtdh wp14">
+<w:endnotes xmlns:wpc="http://schemas.microsoft.com/office/word/2010/wordprocessingCanvas" xmlns:cx="http://schemas.microsoft.com/office/drawing/2014/chartex" xmlns:cx1="http://schemas.microsoft.com/office/drawing/2015/9/8/chartex" xmlns:cx2="http://schemas.microsoft.com/office/drawing/2015/10/21/chartex" xmlns:cx3="http://schemas.microsoft.com/office/drawing/2016/5/9/chartex" xmlns:cx4="http://schemas.microsoft.com/office/drawing/2016/5/10/chartex" xmlns:cx5="http://schemas.microsoft.com/office/drawing/2016/5/11/chartex" xmlns:cx6="http://schemas.microsoft.com/office/drawing/2016/5/12/chartex" xmlns:cx7="http://schemas.microsoft.com/office/drawing/2016/5/13/chartex" xmlns:cx8="http://schemas.microsoft.com/office/drawing/2016/5/14/chartex" xmlns:mc="http://schemas.openxmlformats.org/markup-compatibility/2006" xmlns:aink="http://schemas.microsoft.com/office/drawing/2016/ink" xmlns:am3d="http://schemas.microsoft.com/office/drawing/2017/model3d" xmlns:o="urn:schemas-microsoft-com:office:office" xmlns:oel="http://schemas.microsoft.com/office/2019/extlst" xmlns:r="http://schemas.openxmlformats.org/officeDocument/2006/relationships" xmlns:m="http://schemas.openxmlformats.org/officeDocument/2006/math" xmlns:v="urn:schemas-microsoft-com:vml" xmlns:wp14="http://schemas.microsoft.com/office/word/2010/wordprocessingDrawing" xmlns:wp="http://schemas.openxmlformats.org/drawingml/2006/wordprocessingDrawing" xmlns:w10="urn:schemas-microsoft-com:office:word" xmlns:w="http://schemas.openxmlformats.org/wordprocessingml/2006/main" xmlns:w14="http://schemas.microsoft.com/office/word/2010/wordml" xmlns:w15="http://schemas.microsoft.com/office/word/2012/wordml" xmlns:w16cex="http://schemas.microsoft.com/office/word/2018/wordml/cex" xmlns:w16cid="http://schemas.microsoft.com/office/word/2016/wordml/cid" xmlns:w16="http://schemas.microsoft.com/office/word/2018/wordml" xmlns:w16du="http://schemas.microsoft.com/office/word/2023/wordml/word16du" xmlns:w16sdtdh="http://schemas.microsoft.com/office/word/2020/wordml/sdtdatahash" xmlns:w16se="http://schemas.microsoft.com/office/word/2015/wordml/symex" xmlns:wpg="http://schemas.microsoft.com/office/word/2010/wordprocessingGroup" xmlns:wpi="http://schemas.microsoft.com/office/word/2010/wordprocessingInk" xmlns:wne="http://schemas.microsoft.com/office/word/2006/wordml" xmlns:wps="http://schemas.microsoft.com/office/word/2010/wordprocessingShape" mc:Ignorable="w14 w15 w16se w16cid w16 w16cex w16sdtdh w16du wp14">
   <w:endnote w:type="separator" w:id="-1">
     <w:p>
       <w:pPr>
@@ -2773,7 +3341,7 @@
 </file>
 
 <file path=word/footer1.xml><?xml version="1.0" encoding="utf-8"?>
-<w:ftr xmlns:wpc="http://schemas.microsoft.com/office/word/2010/wordprocessingCanvas" xmlns:cx="http://schemas.microsoft.com/office/drawing/2014/chartex" xmlns:cx1="http://schemas.microsoft.com/office/drawing/2015/9/8/chartex" xmlns:cx2="http://schemas.microsoft.com/office/drawing/2015/10/21/chartex" xmlns:cx3="http://schemas.microsoft.com/office/drawing/2016/5/9/chartex" xmlns:cx4="http://schemas.microsoft.com/office/drawing/2016/5/10/chartex" xmlns:cx5="http://schemas.microsoft.com/office/drawing/2016/5/11/chartex" xmlns:cx6="http://schemas.microsoft.com/office/drawing/2016/5/12/chartex" xmlns:cx7="http://schemas.microsoft.com/office/drawing/2016/5/13/chartex" xmlns:cx8="http://schemas.microsoft.com/office/drawing/2016/5/14/chartex" xmlns:mc="http://schemas.openxmlformats.org/markup-compatibility/2006" xmlns:aink="http://schemas.microsoft.com/office/drawing/2016/ink" xmlns:am3d="http://schemas.microsoft.com/office/drawing/2017/model3d" xmlns:o="urn:schemas-microsoft-com:office:office" xmlns:oel="http://schemas.microsoft.com/office/2019/extlst" xmlns:r="http://schemas.openxmlformats.org/officeDocument/2006/relationships" xmlns:m="http://schemas.openxmlformats.org/officeDocument/2006/math" xmlns:v="urn:schemas-microsoft-com:vml" xmlns:wp14="http://schemas.microsoft.com/office/word/2010/wordprocessingDrawing" xmlns:wp="http://schemas.openxmlformats.org/drawingml/2006/wordprocessingDrawing" xmlns:w10="urn:schemas-microsoft-com:office:word" xmlns:w="http://schemas.openxmlformats.org/wordprocessingml/2006/main" xmlns:w14="http://schemas.microsoft.com/office/word/2010/wordml" xmlns:w15="http://schemas.microsoft.com/office/word/2012/wordml" xmlns:w16cex="http://schemas.microsoft.com/office/word/2018/wordml/cex" xmlns:w16cid="http://schemas.microsoft.com/office/word/2016/wordml/cid" xmlns:w16="http://schemas.microsoft.com/office/word/2018/wordml" xmlns:w16sdtdh="http://schemas.microsoft.com/office/word/2020/wordml/sdtdatahash" xmlns:w16se="http://schemas.microsoft.com/office/word/2015/wordml/symex" xmlns:wpg="http://schemas.microsoft.com/office/word/2010/wordprocessingGroup" xmlns:wpi="http://schemas.microsoft.com/office/word/2010/wordprocessingInk" xmlns:wne="http://schemas.microsoft.com/office/word/2006/wordml" xmlns:wps="http://schemas.microsoft.com/office/word/2010/wordprocessingShape" mc:Ignorable="w14 w15 w16se w16cid w16 w16cex w16sdtdh wp14">
+<w:ftr xmlns:wpc="http://schemas.microsoft.com/office/word/2010/wordprocessingCanvas" xmlns:cx="http://schemas.microsoft.com/office/drawing/2014/chartex" xmlns:cx1="http://schemas.microsoft.com/office/drawing/2015/9/8/chartex" xmlns:cx2="http://schemas.microsoft.com/office/drawing/2015/10/21/chartex" xmlns:cx3="http://schemas.microsoft.com/office/drawing/2016/5/9/chartex" xmlns:cx4="http://schemas.microsoft.com/office/drawing/2016/5/10/chartex" xmlns:cx5="http://schemas.microsoft.com/office/drawing/2016/5/11/chartex" xmlns:cx6="http://schemas.microsoft.com/office/drawing/2016/5/12/chartex" xmlns:cx7="http://schemas.microsoft.com/office/drawing/2016/5/13/chartex" xmlns:cx8="http://schemas.microsoft.com/office/drawing/2016/5/14/chartex" xmlns:mc="http://schemas.openxmlformats.org/markup-compatibility/2006" xmlns:aink="http://schemas.microsoft.com/office/drawing/2016/ink" xmlns:am3d="http://schemas.microsoft.com/office/drawing/2017/model3d" xmlns:o="urn:schemas-microsoft-com:office:office" xmlns:oel="http://schemas.microsoft.com/office/2019/extlst" xmlns:r="http://schemas.openxmlformats.org/officeDocument/2006/relationships" xmlns:m="http://schemas.openxmlformats.org/officeDocument/2006/math" xmlns:v="urn:schemas-microsoft-com:vml" xmlns:wp14="http://schemas.microsoft.com/office/word/2010/wordprocessingDrawing" xmlns:wp="http://schemas.openxmlformats.org/drawingml/2006/wordprocessingDrawing" xmlns:w10="urn:schemas-microsoft-com:office:word" xmlns:w="http://schemas.openxmlformats.org/wordprocessingml/2006/main" xmlns:w14="http://schemas.microsoft.com/office/word/2010/wordml" xmlns:w15="http://schemas.microsoft.com/office/word/2012/wordml" xmlns:w16cex="http://schemas.microsoft.com/office/word/2018/wordml/cex" xmlns:w16cid="http://schemas.microsoft.com/office/word/2016/wordml/cid" xmlns:w16="http://schemas.microsoft.com/office/word/2018/wordml" xmlns:w16du="http://schemas.microsoft.com/office/word/2023/wordml/word16du" xmlns:w16sdtdh="http://schemas.microsoft.com/office/word/2020/wordml/sdtdatahash" xmlns:w16se="http://schemas.microsoft.com/office/word/2015/wordml/symex" xmlns:wpg="http://schemas.microsoft.com/office/word/2010/wordprocessingGroup" xmlns:wpi="http://schemas.microsoft.com/office/word/2010/wordprocessingInk" xmlns:wne="http://schemas.microsoft.com/office/word/2006/wordml" xmlns:wps="http://schemas.microsoft.com/office/word/2010/wordprocessingShape" mc:Ignorable="w14 w15 w16se w16cid w16 w16cex w16sdtdh w16du wp14">
   <w:sdt>
     <w:sdtPr>
       <w:rPr>
@@ -2991,7 +3559,7 @@
 </file>
 
 <file path=word/footnotes.xml><?xml version="1.0" encoding="utf-8"?>
-<w:footnotes xmlns:wpc="http://schemas.microsoft.com/office/word/2010/wordprocessingCanvas" xmlns:cx="http://schemas.microsoft.com/office/drawing/2014/chartex" xmlns:cx1="http://schemas.microsoft.com/office/drawing/2015/9/8/chartex" xmlns:cx2="http://schemas.microsoft.com/office/drawing/2015/10/21/chartex" xmlns:cx3="http://schemas.microsoft.com/office/drawing/2016/5/9/chartex" xmlns:cx4="http://schemas.microsoft.com/office/drawing/2016/5/10/chartex" xmlns:cx5="http://schemas.microsoft.com/office/drawing/2016/5/11/chartex" xmlns:cx6="http://schemas.microsoft.com/office/drawing/2016/5/12/chartex" xmlns:cx7="http://schemas.microsoft.com/office/drawing/2016/5/13/chartex" xmlns:cx8="http://schemas.microsoft.com/office/drawing/2016/5/14/chartex" xmlns:mc="http://schemas.openxmlformats.org/markup-compatibility/2006" xmlns:aink="http://schemas.microsoft.com/office/drawing/2016/ink" xmlns:am3d="http://schemas.microsoft.com/office/drawing/2017/model3d" xmlns:o="urn:schemas-microsoft-com:office:office" xmlns:oel="http://schemas.microsoft.com/office/2019/extlst" xmlns:r="http://schemas.openxmlformats.org/officeDocument/2006/relationships" xmlns:m="http://schemas.openxmlformats.org/officeDocument/2006/math" xmlns:v="urn:schemas-microsoft-com:vml" xmlns:wp14="http://schemas.microsoft.com/office/word/2010/wordprocessingDrawing" xmlns:wp="http://schemas.openxmlformats.org/drawingml/2006/wordprocessingDrawing" xmlns:w10="urn:schemas-microsoft-com:office:word" xmlns:w="http://schemas.openxmlformats.org/wordprocessingml/2006/main" xmlns:w14="http://schemas.microsoft.com/office/word/2010/wordml" xmlns:w15="http://schemas.microsoft.com/office/word/2012/wordml" xmlns:w16cex="http://schemas.microsoft.com/office/word/2018/wordml/cex" xmlns:w16cid="http://schemas.microsoft.com/office/word/2016/wordml/cid" xmlns:w16="http://schemas.microsoft.com/office/word/2018/wordml" xmlns:w16sdtdh="http://schemas.microsoft.com/office/word/2020/wordml/sdtdatahash" xmlns:w16se="http://schemas.microsoft.com/office/word/2015/wordml/symex" xmlns:wpg="http://schemas.microsoft.com/office/word/2010/wordprocessingGroup" xmlns:wpi="http://schemas.microsoft.com/office/word/2010/wordprocessingInk" xmlns:wne="http://schemas.microsoft.com/office/word/2006/wordml" xmlns:wps="http://schemas.microsoft.com/office/word/2010/wordprocessingShape" mc:Ignorable="w14 w15 w16se w16cid w16 w16cex w16sdtdh wp14">
+<w:footnotes xmlns:wpc="http://schemas.microsoft.com/office/word/2010/wordprocessingCanvas" xmlns:cx="http://schemas.microsoft.com/office/drawing/2014/chartex" xmlns:cx1="http://schemas.microsoft.com/office/drawing/2015/9/8/chartex" xmlns:cx2="http://schemas.microsoft.com/office/drawing/2015/10/21/chartex" xmlns:cx3="http://schemas.microsoft.com/office/drawing/2016/5/9/chartex" xmlns:cx4="http://schemas.microsoft.com/office/drawing/2016/5/10/chartex" xmlns:cx5="http://schemas.microsoft.com/office/drawing/2016/5/11/chartex" xmlns:cx6="http://schemas.microsoft.com/office/drawing/2016/5/12/chartex" xmlns:cx7="http://schemas.microsoft.com/office/drawing/2016/5/13/chartex" xmlns:cx8="http://schemas.microsoft.com/office/drawing/2016/5/14/chartex" xmlns:mc="http://schemas.openxmlformats.org/markup-compatibility/2006" xmlns:aink="http://schemas.microsoft.com/office/drawing/2016/ink" xmlns:am3d="http://schemas.microsoft.com/office/drawing/2017/model3d" xmlns:o="urn:schemas-microsoft-com:office:office" xmlns:oel="http://schemas.microsoft.com/office/2019/extlst" xmlns:r="http://schemas.openxmlformats.org/officeDocument/2006/relationships" xmlns:m="http://schemas.openxmlformats.org/officeDocument/2006/math" xmlns:v="urn:schemas-microsoft-com:vml" xmlns:wp14="http://schemas.microsoft.com/office/word/2010/wordprocessingDrawing" xmlns:wp="http://schemas.openxmlformats.org/drawingml/2006/wordprocessingDrawing" xmlns:w10="urn:schemas-microsoft-com:office:word" xmlns:w="http://schemas.openxmlformats.org/wordprocessingml/2006/main" xmlns:w14="http://schemas.microsoft.com/office/word/2010/wordml" xmlns:w15="http://schemas.microsoft.com/office/word/2012/wordml" xmlns:w16cex="http://schemas.microsoft.com/office/word/2018/wordml/cex" xmlns:w16cid="http://schemas.microsoft.com/office/word/2016/wordml/cid" xmlns:w16="http://schemas.microsoft.com/office/word/2018/wordml" xmlns:w16du="http://schemas.microsoft.com/office/word/2023/wordml/word16du" xmlns:w16sdtdh="http://schemas.microsoft.com/office/word/2020/wordml/sdtdatahash" xmlns:w16se="http://schemas.microsoft.com/office/word/2015/wordml/symex" xmlns:wpg="http://schemas.microsoft.com/office/word/2010/wordprocessingGroup" xmlns:wpi="http://schemas.microsoft.com/office/word/2010/wordprocessingInk" xmlns:wne="http://schemas.microsoft.com/office/word/2006/wordml" xmlns:wps="http://schemas.microsoft.com/office/word/2010/wordprocessingShape" mc:Ignorable="w14 w15 w16se w16cid w16 w16cex w16sdtdh w16du wp14">
   <w:footnote w:type="separator" w:id="-1">
     <w:p>
       <w:pPr>
@@ -3016,7 +3584,7 @@
 </file>
 
 <file path=word/header1.xml><?xml version="1.0" encoding="utf-8"?>
-<w:hdr xmlns:wpc="http://schemas.microsoft.com/office/word/2010/wordprocessingCanvas" xmlns:cx="http://schemas.microsoft.com/office/drawing/2014/chartex" xmlns:cx1="http://schemas.microsoft.com/office/drawing/2015/9/8/chartex" xmlns:cx2="http://schemas.microsoft.com/office/drawing/2015/10/21/chartex" xmlns:cx3="http://schemas.microsoft.com/office/drawing/2016/5/9/chartex" xmlns:cx4="http://schemas.microsoft.com/office/drawing/2016/5/10/chartex" xmlns:cx5="http://schemas.microsoft.com/office/drawing/2016/5/11/chartex" xmlns:cx6="http://schemas.microsoft.com/office/drawing/2016/5/12/chartex" xmlns:cx7="http://schemas.microsoft.com/office/drawing/2016/5/13/chartex" xmlns:cx8="http://schemas.microsoft.com/office/drawing/2016/5/14/chartex" xmlns:mc="http://schemas.openxmlformats.org/markup-compatibility/2006" xmlns:aink="http://schemas.microsoft.com/office/drawing/2016/ink" xmlns:am3d="http://schemas.microsoft.com/office/drawing/2017/model3d" xmlns:o="urn:schemas-microsoft-com:office:office" xmlns:oel="http://schemas.microsoft.com/office/2019/extlst" xmlns:r="http://schemas.openxmlformats.org/officeDocument/2006/relationships" xmlns:m="http://schemas.openxmlformats.org/officeDocument/2006/math" xmlns:v="urn:schemas-microsoft-com:vml" xmlns:wp14="http://schemas.microsoft.com/office/word/2010/wordprocessingDrawing" xmlns:wp="http://schemas.openxmlformats.org/drawingml/2006/wordprocessingDrawing" xmlns:w10="urn:schemas-microsoft-com:office:word" xmlns:w="http://schemas.openxmlformats.org/wordprocessingml/2006/main" xmlns:w14="http://schemas.microsoft.com/office/word/2010/wordml" xmlns:w15="http://schemas.microsoft.com/office/word/2012/wordml" xmlns:w16cex="http://schemas.microsoft.com/office/word/2018/wordml/cex" xmlns:w16cid="http://schemas.microsoft.com/office/word/2016/wordml/cid" xmlns:w16="http://schemas.microsoft.com/office/word/2018/wordml" xmlns:w16sdtdh="http://schemas.microsoft.com/office/word/2020/wordml/sdtdatahash" xmlns:w16se="http://schemas.microsoft.com/office/word/2015/wordml/symex" xmlns:wpg="http://schemas.microsoft.com/office/word/2010/wordprocessingGroup" xmlns:wpi="http://schemas.microsoft.com/office/word/2010/wordprocessingInk" xmlns:wne="http://schemas.microsoft.com/office/word/2006/wordml" xmlns:wps="http://schemas.microsoft.com/office/word/2010/wordprocessingShape" mc:Ignorable="w14 w15 w16se w16cid w16 w16cex w16sdtdh wp14">
+<w:hdr xmlns:wpc="http://schemas.microsoft.com/office/word/2010/wordprocessingCanvas" xmlns:cx="http://schemas.microsoft.com/office/drawing/2014/chartex" xmlns:cx1="http://schemas.microsoft.com/office/drawing/2015/9/8/chartex" xmlns:cx2="http://schemas.microsoft.com/office/drawing/2015/10/21/chartex" xmlns:cx3="http://schemas.microsoft.com/office/drawing/2016/5/9/chartex" xmlns:cx4="http://schemas.microsoft.com/office/drawing/2016/5/10/chartex" xmlns:cx5="http://schemas.microsoft.com/office/drawing/2016/5/11/chartex" xmlns:cx6="http://schemas.microsoft.com/office/drawing/2016/5/12/chartex" xmlns:cx7="http://schemas.microsoft.com/office/drawing/2016/5/13/chartex" xmlns:cx8="http://schemas.microsoft.com/office/drawing/2016/5/14/chartex" xmlns:mc="http://schemas.openxmlformats.org/markup-compatibility/2006" xmlns:aink="http://schemas.microsoft.com/office/drawing/2016/ink" xmlns:am3d="http://schemas.microsoft.com/office/drawing/2017/model3d" xmlns:o="urn:schemas-microsoft-com:office:office" xmlns:oel="http://schemas.microsoft.com/office/2019/extlst" xmlns:r="http://schemas.openxmlformats.org/officeDocument/2006/relationships" xmlns:m="http://schemas.openxmlformats.org/officeDocument/2006/math" xmlns:v="urn:schemas-microsoft-com:vml" xmlns:wp14="http://schemas.microsoft.com/office/word/2010/wordprocessingDrawing" xmlns:wp="http://schemas.openxmlformats.org/drawingml/2006/wordprocessingDrawing" xmlns:w10="urn:schemas-microsoft-com:office:word" xmlns:w="http://schemas.openxmlformats.org/wordprocessingml/2006/main" xmlns:w14="http://schemas.microsoft.com/office/word/2010/wordml" xmlns:w15="http://schemas.microsoft.com/office/word/2012/wordml" xmlns:w16cex="http://schemas.microsoft.com/office/word/2018/wordml/cex" xmlns:w16cid="http://schemas.microsoft.com/office/word/2016/wordml/cid" xmlns:w16="http://schemas.microsoft.com/office/word/2018/wordml" xmlns:w16du="http://schemas.microsoft.com/office/word/2023/wordml/word16du" xmlns:w16sdtdh="http://schemas.microsoft.com/office/word/2020/wordml/sdtdatahash" xmlns:w16se="http://schemas.microsoft.com/office/word/2015/wordml/symex" xmlns:wpg="http://schemas.microsoft.com/office/word/2010/wordprocessingGroup" xmlns:wpi="http://schemas.microsoft.com/office/word/2010/wordprocessingInk" xmlns:wne="http://schemas.microsoft.com/office/word/2006/wordml" xmlns:wps="http://schemas.microsoft.com/office/word/2010/wordprocessingShape" mc:Ignorable="w14 w15 w16se w16cid w16 w16cex w16sdtdh w16du wp14">
   <w:sdt>
     <w:sdtPr>
       <w:rPr>
@@ -3046,13 +3614,23 @@
             <w:szCs w:val="32"/>
           </w:rPr>
         </w:pPr>
+        <w:proofErr w:type="spellStart"/>
         <w:r>
           <w:rPr>
             <w:rFonts w:ascii="Verdana" w:hAnsi="Verdana"/>
             <w:sz w:val="24"/>
             <w:szCs w:val="32"/>
           </w:rPr>
-          <w:t xml:space="preserve">Ermac Voxel Game - </w:t>
+          <w:t>Ermac</w:t>
+        </w:r>
+        <w:proofErr w:type="spellEnd"/>
+        <w:r>
+          <w:rPr>
+            <w:rFonts w:ascii="Verdana" w:hAnsi="Verdana"/>
+            <w:sz w:val="24"/>
+            <w:szCs w:val="32"/>
+          </w:rPr>
+          <w:t xml:space="preserve"> Voxel Game - </w:t>
         </w:r>
         <w:r>
           <w:rPr>
@@ -3060,7 +3638,25 @@
             <w:sz w:val="24"/>
             <w:szCs w:val="32"/>
           </w:rPr>
-          <w:t>Alexander “Ermac” Stojanovich</w:t>
+          <w:t>Alexander “</w:t>
+        </w:r>
+        <w:proofErr w:type="spellStart"/>
+        <w:r>
+          <w:rPr>
+            <w:rFonts w:ascii="Verdana" w:hAnsi="Verdana"/>
+            <w:sz w:val="24"/>
+            <w:szCs w:val="32"/>
+          </w:rPr>
+          <w:t>Ermac</w:t>
+        </w:r>
+        <w:proofErr w:type="spellEnd"/>
+        <w:r>
+          <w:rPr>
+            <w:rFonts w:ascii="Verdana" w:hAnsi="Verdana"/>
+            <w:sz w:val="24"/>
+            <w:szCs w:val="32"/>
+          </w:rPr>
+          <w:t>” Stojanovich</w:t>
         </w:r>
         <w:r>
           <w:rPr>
@@ -3076,7 +3672,7 @@
             <w:sz w:val="24"/>
             <w:szCs w:val="32"/>
           </w:rPr>
-          <w:t>JSomnia, Hellblade64</w:t>
+          <w:t>13</w:t>
         </w:r>
       </w:p>
     </w:sdtContent>
@@ -3090,7 +3686,7 @@
 </file>
 
 <file path=word/numbering.xml><?xml version="1.0" encoding="utf-8"?>
-<w:numbering xmlns:wpc="http://schemas.microsoft.com/office/word/2010/wordprocessingCanvas" xmlns:cx="http://schemas.microsoft.com/office/drawing/2014/chartex" xmlns:cx1="http://schemas.microsoft.com/office/drawing/2015/9/8/chartex" xmlns:cx2="http://schemas.microsoft.com/office/drawing/2015/10/21/chartex" xmlns:cx3="http://schemas.microsoft.com/office/drawing/2016/5/9/chartex" xmlns:cx4="http://schemas.microsoft.com/office/drawing/2016/5/10/chartex" xmlns:cx5="http://schemas.microsoft.com/office/drawing/2016/5/11/chartex" xmlns:cx6="http://schemas.microsoft.com/office/drawing/2016/5/12/chartex" xmlns:cx7="http://schemas.microsoft.com/office/drawing/2016/5/13/chartex" xmlns:cx8="http://schemas.microsoft.com/office/drawing/2016/5/14/chartex" xmlns:mc="http://schemas.openxmlformats.org/markup-compatibility/2006" xmlns:aink="http://schemas.microsoft.com/office/drawing/2016/ink" xmlns:am3d="http://schemas.microsoft.com/office/drawing/2017/model3d" xmlns:o="urn:schemas-microsoft-com:office:office" xmlns:oel="http://schemas.microsoft.com/office/2019/extlst" xmlns:r="http://schemas.openxmlformats.org/officeDocument/2006/relationships" xmlns:m="http://schemas.openxmlformats.org/officeDocument/2006/math" xmlns:v="urn:schemas-microsoft-com:vml" xmlns:wp14="http://schemas.microsoft.com/office/word/2010/wordprocessingDrawing" xmlns:wp="http://schemas.openxmlformats.org/drawingml/2006/wordprocessingDrawing" xmlns:w10="urn:schemas-microsoft-com:office:word" xmlns:w="http://schemas.openxmlformats.org/wordprocessingml/2006/main" xmlns:w14="http://schemas.microsoft.com/office/word/2010/wordml" xmlns:w15="http://schemas.microsoft.com/office/word/2012/wordml" xmlns:w16cex="http://schemas.microsoft.com/office/word/2018/wordml/cex" xmlns:w16cid="http://schemas.microsoft.com/office/word/2016/wordml/cid" xmlns:w16="http://schemas.microsoft.com/office/word/2018/wordml" xmlns:w16sdtdh="http://schemas.microsoft.com/office/word/2020/wordml/sdtdatahash" xmlns:w16se="http://schemas.microsoft.com/office/word/2015/wordml/symex" xmlns:wpg="http://schemas.microsoft.com/office/word/2010/wordprocessingGroup" xmlns:wpi="http://schemas.microsoft.com/office/word/2010/wordprocessingInk" xmlns:wne="http://schemas.microsoft.com/office/word/2006/wordml" xmlns:wps="http://schemas.microsoft.com/office/word/2010/wordprocessingShape" mc:Ignorable="w14 w15 w16se w16cid w16 w16cex w16sdtdh wp14">
+<w:numbering xmlns:wpc="http://schemas.microsoft.com/office/word/2010/wordprocessingCanvas" xmlns:cx="http://schemas.microsoft.com/office/drawing/2014/chartex" xmlns:cx1="http://schemas.microsoft.com/office/drawing/2015/9/8/chartex" xmlns:cx2="http://schemas.microsoft.com/office/drawing/2015/10/21/chartex" xmlns:cx3="http://schemas.microsoft.com/office/drawing/2016/5/9/chartex" xmlns:cx4="http://schemas.microsoft.com/office/drawing/2016/5/10/chartex" xmlns:cx5="http://schemas.microsoft.com/office/drawing/2016/5/11/chartex" xmlns:cx6="http://schemas.microsoft.com/office/drawing/2016/5/12/chartex" xmlns:cx7="http://schemas.microsoft.com/office/drawing/2016/5/13/chartex" xmlns:cx8="http://schemas.microsoft.com/office/drawing/2016/5/14/chartex" xmlns:mc="http://schemas.openxmlformats.org/markup-compatibility/2006" xmlns:aink="http://schemas.microsoft.com/office/drawing/2016/ink" xmlns:am3d="http://schemas.microsoft.com/office/drawing/2017/model3d" xmlns:o="urn:schemas-microsoft-com:office:office" xmlns:oel="http://schemas.microsoft.com/office/2019/extlst" xmlns:r="http://schemas.openxmlformats.org/officeDocument/2006/relationships" xmlns:m="http://schemas.openxmlformats.org/officeDocument/2006/math" xmlns:v="urn:schemas-microsoft-com:vml" xmlns:wp14="http://schemas.microsoft.com/office/word/2010/wordprocessingDrawing" xmlns:wp="http://schemas.openxmlformats.org/drawingml/2006/wordprocessingDrawing" xmlns:w10="urn:schemas-microsoft-com:office:word" xmlns:w="http://schemas.openxmlformats.org/wordprocessingml/2006/main" xmlns:w14="http://schemas.microsoft.com/office/word/2010/wordml" xmlns:w15="http://schemas.microsoft.com/office/word/2012/wordml" xmlns:w16cex="http://schemas.microsoft.com/office/word/2018/wordml/cex" xmlns:w16cid="http://schemas.microsoft.com/office/word/2016/wordml/cid" xmlns:w16="http://schemas.microsoft.com/office/word/2018/wordml" xmlns:w16du="http://schemas.microsoft.com/office/word/2023/wordml/word16du" xmlns:w16sdtdh="http://schemas.microsoft.com/office/word/2020/wordml/sdtdatahash" xmlns:w16se="http://schemas.microsoft.com/office/word/2015/wordml/symex" xmlns:wpg="http://schemas.microsoft.com/office/word/2010/wordprocessingGroup" xmlns:wpi="http://schemas.microsoft.com/office/word/2010/wordprocessingInk" xmlns:wne="http://schemas.microsoft.com/office/word/2006/wordml" xmlns:wps="http://schemas.microsoft.com/office/word/2010/wordprocessingShape" mc:Ignorable="w14 w15 w16se w16cid w16 w16cex w16sdtdh w16du wp14">
   <w:abstractNum w:abstractNumId="0" w15:restartNumberingAfterBreak="0">
     <w:nsid w:val="165453AA"/>
     <w:multiLevelType w:val="hybridMultilevel"/>
@@ -3329,7 +3925,7 @@
 </file>
 
 <file path=word/styles.xml><?xml version="1.0" encoding="utf-8"?>
-<w:styles xmlns:mc="http://schemas.openxmlformats.org/markup-compatibility/2006" xmlns:r="http://schemas.openxmlformats.org/officeDocument/2006/relationships" xmlns:w="http://schemas.openxmlformats.org/wordprocessingml/2006/main" xmlns:w14="http://schemas.microsoft.com/office/word/2010/wordml" xmlns:w15="http://schemas.microsoft.com/office/word/2012/wordml" xmlns:w16cex="http://schemas.microsoft.com/office/word/2018/wordml/cex" xmlns:w16cid="http://schemas.microsoft.com/office/word/2016/wordml/cid" xmlns:w16="http://schemas.microsoft.com/office/word/2018/wordml" xmlns:w16sdtdh="http://schemas.microsoft.com/office/word/2020/wordml/sdtdatahash" xmlns:w16se="http://schemas.microsoft.com/office/word/2015/wordml/symex" mc:Ignorable="w14 w15 w16se w16cid w16 w16cex w16sdtdh">
+<w:styles xmlns:mc="http://schemas.openxmlformats.org/markup-compatibility/2006" xmlns:r="http://schemas.openxmlformats.org/officeDocument/2006/relationships" xmlns:w="http://schemas.openxmlformats.org/wordprocessingml/2006/main" xmlns:w14="http://schemas.microsoft.com/office/word/2010/wordml" xmlns:w15="http://schemas.microsoft.com/office/word/2012/wordml" xmlns:w16cex="http://schemas.microsoft.com/office/word/2018/wordml/cex" xmlns:w16cid="http://schemas.microsoft.com/office/word/2016/wordml/cid" xmlns:w16="http://schemas.microsoft.com/office/word/2018/wordml" xmlns:w16du="http://schemas.microsoft.com/office/word/2023/wordml/word16du" xmlns:w16sdtdh="http://schemas.microsoft.com/office/word/2020/wordml/sdtdatahash" xmlns:w16se="http://schemas.microsoft.com/office/word/2015/wordml/symex" mc:Ignorable="w14 w15 w16se w16cid w16 w16cex w16sdtdh w16du">
   <w:docDefaults>
     <w:rPrDefault>
       <w:rPr>
@@ -3852,7 +4448,7 @@
 </file>
 
 <file path=word/glossary/document.xml><?xml version="1.0" encoding="utf-8"?>
-<w:glossaryDocument xmlns:wpc="http://schemas.microsoft.com/office/word/2010/wordprocessingCanvas" xmlns:cx="http://schemas.microsoft.com/office/drawing/2014/chartex" xmlns:cx1="http://schemas.microsoft.com/office/drawing/2015/9/8/chartex" xmlns:cx2="http://schemas.microsoft.com/office/drawing/2015/10/21/chartex" xmlns:cx3="http://schemas.microsoft.com/office/drawing/2016/5/9/chartex" xmlns:cx4="http://schemas.microsoft.com/office/drawing/2016/5/10/chartex" xmlns:cx5="http://schemas.microsoft.com/office/drawing/2016/5/11/chartex" xmlns:cx6="http://schemas.microsoft.com/office/drawing/2016/5/12/chartex" xmlns:cx7="http://schemas.microsoft.com/office/drawing/2016/5/13/chartex" xmlns:cx8="http://schemas.microsoft.com/office/drawing/2016/5/14/chartex" xmlns:mc="http://schemas.openxmlformats.org/markup-compatibility/2006" xmlns:aink="http://schemas.microsoft.com/office/drawing/2016/ink" xmlns:am3d="http://schemas.microsoft.com/office/drawing/2017/model3d" xmlns:o="urn:schemas-microsoft-com:office:office" xmlns:oel="http://schemas.microsoft.com/office/2019/extlst" xmlns:r="http://schemas.openxmlformats.org/officeDocument/2006/relationships" xmlns:m="http://schemas.openxmlformats.org/officeDocument/2006/math" xmlns:v="urn:schemas-microsoft-com:vml" xmlns:wp14="http://schemas.microsoft.com/office/word/2010/wordprocessingDrawing" xmlns:wp="http://schemas.openxmlformats.org/drawingml/2006/wordprocessingDrawing" xmlns:w10="urn:schemas-microsoft-com:office:word" xmlns:w="http://schemas.openxmlformats.org/wordprocessingml/2006/main" xmlns:w14="http://schemas.microsoft.com/office/word/2010/wordml" xmlns:w15="http://schemas.microsoft.com/office/word/2012/wordml" xmlns:w16cex="http://schemas.microsoft.com/office/word/2018/wordml/cex" xmlns:w16cid="http://schemas.microsoft.com/office/word/2016/wordml/cid" xmlns:w16="http://schemas.microsoft.com/office/word/2018/wordml" xmlns:w16sdtdh="http://schemas.microsoft.com/office/word/2020/wordml/sdtdatahash" xmlns:w16se="http://schemas.microsoft.com/office/word/2015/wordml/symex" xmlns:wpg="http://schemas.microsoft.com/office/word/2010/wordprocessingGroup" xmlns:wpi="http://schemas.microsoft.com/office/word/2010/wordprocessingInk" xmlns:wne="http://schemas.microsoft.com/office/word/2006/wordml" xmlns:wps="http://schemas.microsoft.com/office/word/2010/wordprocessingShape" mc:Ignorable="w14 w15 w16se w16cid w16 w16cex w16sdtdh wp14">
+<w:glossaryDocument xmlns:wpc="http://schemas.microsoft.com/office/word/2010/wordprocessingCanvas" xmlns:cx="http://schemas.microsoft.com/office/drawing/2014/chartex" xmlns:cx1="http://schemas.microsoft.com/office/drawing/2015/9/8/chartex" xmlns:cx2="http://schemas.microsoft.com/office/drawing/2015/10/21/chartex" xmlns:cx3="http://schemas.microsoft.com/office/drawing/2016/5/9/chartex" xmlns:cx4="http://schemas.microsoft.com/office/drawing/2016/5/10/chartex" xmlns:cx5="http://schemas.microsoft.com/office/drawing/2016/5/11/chartex" xmlns:cx6="http://schemas.microsoft.com/office/drawing/2016/5/12/chartex" xmlns:cx7="http://schemas.microsoft.com/office/drawing/2016/5/13/chartex" xmlns:cx8="http://schemas.microsoft.com/office/drawing/2016/5/14/chartex" xmlns:mc="http://schemas.openxmlformats.org/markup-compatibility/2006" xmlns:aink="http://schemas.microsoft.com/office/drawing/2016/ink" xmlns:am3d="http://schemas.microsoft.com/office/drawing/2017/model3d" xmlns:o="urn:schemas-microsoft-com:office:office" xmlns:oel="http://schemas.microsoft.com/office/2019/extlst" xmlns:r="http://schemas.openxmlformats.org/officeDocument/2006/relationships" xmlns:m="http://schemas.openxmlformats.org/officeDocument/2006/math" xmlns:v="urn:schemas-microsoft-com:vml" xmlns:wp14="http://schemas.microsoft.com/office/word/2010/wordprocessingDrawing" xmlns:wp="http://schemas.openxmlformats.org/drawingml/2006/wordprocessingDrawing" xmlns:w10="urn:schemas-microsoft-com:office:word" xmlns:w="http://schemas.openxmlformats.org/wordprocessingml/2006/main" xmlns:w14="http://schemas.microsoft.com/office/word/2010/wordml" xmlns:w15="http://schemas.microsoft.com/office/word/2012/wordml" xmlns:w16cex="http://schemas.microsoft.com/office/word/2018/wordml/cex" xmlns:w16cid="http://schemas.microsoft.com/office/word/2016/wordml/cid" xmlns:w16="http://schemas.microsoft.com/office/word/2018/wordml" xmlns:w16du="http://schemas.microsoft.com/office/word/2023/wordml/word16du" xmlns:w16sdtdh="http://schemas.microsoft.com/office/word/2020/wordml/sdtdatahash" xmlns:w16se="http://schemas.microsoft.com/office/word/2015/wordml/symex" xmlns:wpg="http://schemas.microsoft.com/office/word/2010/wordprocessingGroup" xmlns:wpi="http://schemas.microsoft.com/office/word/2010/wordprocessingInk" xmlns:wne="http://schemas.microsoft.com/office/word/2006/wordml" xmlns:wps="http://schemas.microsoft.com/office/word/2010/wordprocessingShape" mc:Ignorable="w14 w15 w16se w16cid w16 w16cex w16sdtdh w16du wp14">
   <w:docParts>
     <w:docPart>
       <w:docPartPr>
@@ -3890,7 +4486,7 @@
 </file>
 
 <file path=word/glossary/fontTable.xml><?xml version="1.0" encoding="utf-8"?>
-<w:fonts xmlns:mc="http://schemas.openxmlformats.org/markup-compatibility/2006" xmlns:r="http://schemas.openxmlformats.org/officeDocument/2006/relationships" xmlns:w="http://schemas.openxmlformats.org/wordprocessingml/2006/main" xmlns:w14="http://schemas.microsoft.com/office/word/2010/wordml" xmlns:w15="http://schemas.microsoft.com/office/word/2012/wordml" xmlns:w16cex="http://schemas.microsoft.com/office/word/2018/wordml/cex" xmlns:w16cid="http://schemas.microsoft.com/office/word/2016/wordml/cid" xmlns:w16="http://schemas.microsoft.com/office/word/2018/wordml" xmlns:w16sdtdh="http://schemas.microsoft.com/office/word/2020/wordml/sdtdatahash" xmlns:w16se="http://schemas.microsoft.com/office/word/2015/wordml/symex" mc:Ignorable="w14 w15 w16se w16cid w16 w16cex w16sdtdh">
+<w:fonts xmlns:mc="http://schemas.openxmlformats.org/markup-compatibility/2006" xmlns:r="http://schemas.openxmlformats.org/officeDocument/2006/relationships" xmlns:w="http://schemas.openxmlformats.org/wordprocessingml/2006/main" xmlns:w14="http://schemas.microsoft.com/office/word/2010/wordml" xmlns:w15="http://schemas.microsoft.com/office/word/2012/wordml" xmlns:w16cex="http://schemas.microsoft.com/office/word/2018/wordml/cex" xmlns:w16cid="http://schemas.microsoft.com/office/word/2016/wordml/cid" xmlns:w16="http://schemas.microsoft.com/office/word/2018/wordml" xmlns:w16du="http://schemas.microsoft.com/office/word/2023/wordml/word16du" xmlns:w16sdtdh="http://schemas.microsoft.com/office/word/2020/wordml/sdtdatahash" xmlns:w16se="http://schemas.microsoft.com/office/word/2015/wordml/symex" mc:Ignorable="w14 w15 w16se w16cid w16 w16cex w16sdtdh w16du">
   <w:font w:name="Symbol">
     <w:panose1 w:val="05050102010706020507"/>
     <w:charset w:val="02"/>
@@ -3958,7 +4554,7 @@
 </file>
 
 <file path=word/glossary/settings.xml><?xml version="1.0" encoding="utf-8"?>
-<w:settings xmlns:mc="http://schemas.openxmlformats.org/markup-compatibility/2006" xmlns:o="urn:schemas-microsoft-com:office:office" xmlns:r="http://schemas.openxmlformats.org/officeDocument/2006/relationships" xmlns:m="http://schemas.openxmlformats.org/officeDocument/2006/math" xmlns:v="urn:schemas-microsoft-com:vml" xmlns:w10="urn:schemas-microsoft-com:office:word" xmlns:w="http://schemas.openxmlformats.org/wordprocessingml/2006/main" xmlns:w14="http://schemas.microsoft.com/office/word/2010/wordml" xmlns:w15="http://schemas.microsoft.com/office/word/2012/wordml" xmlns:w16cex="http://schemas.microsoft.com/office/word/2018/wordml/cex" xmlns:w16cid="http://schemas.microsoft.com/office/word/2016/wordml/cid" xmlns:w16="http://schemas.microsoft.com/office/word/2018/wordml" xmlns:w16sdtdh="http://schemas.microsoft.com/office/word/2020/wordml/sdtdatahash" xmlns:w16se="http://schemas.microsoft.com/office/word/2015/wordml/symex" xmlns:sl="http://schemas.openxmlformats.org/schemaLibrary/2006/main" mc:Ignorable="w14 w15 w16se w16cid w16 w16cex w16sdtdh">
+<w:settings xmlns:mc="http://schemas.openxmlformats.org/markup-compatibility/2006" xmlns:o="urn:schemas-microsoft-com:office:office" xmlns:r="http://schemas.openxmlformats.org/officeDocument/2006/relationships" xmlns:m="http://schemas.openxmlformats.org/officeDocument/2006/math" xmlns:v="urn:schemas-microsoft-com:vml" xmlns:w10="urn:schemas-microsoft-com:office:word" xmlns:w="http://schemas.openxmlformats.org/wordprocessingml/2006/main" xmlns:w14="http://schemas.microsoft.com/office/word/2010/wordml" xmlns:w15="http://schemas.microsoft.com/office/word/2012/wordml" xmlns:w16cex="http://schemas.microsoft.com/office/word/2018/wordml/cex" xmlns:w16cid="http://schemas.microsoft.com/office/word/2016/wordml/cid" xmlns:w16="http://schemas.microsoft.com/office/word/2018/wordml" xmlns:w16du="http://schemas.microsoft.com/office/word/2023/wordml/word16du" xmlns:w16sdtdh="http://schemas.microsoft.com/office/word/2020/wordml/sdtdatahash" xmlns:w16se="http://schemas.microsoft.com/office/word/2015/wordml/symex" xmlns:sl="http://schemas.openxmlformats.org/schemaLibrary/2006/main" mc:Ignorable="w14 w15 w16se w16cid w16 w16cex w16sdtdh w16du">
   <w:view w:val="normal"/>
   <w:defaultTabStop w:val="720"/>
   <w:characterSpacingControl w:val="doNotCompress"/>
@@ -3978,11 +4574,13 @@
     <w:rsid w:val="001F1795"/>
     <w:rsid w:val="00293559"/>
     <w:rsid w:val="003C3C1D"/>
+    <w:rsid w:val="004C32B9"/>
     <w:rsid w:val="00585F61"/>
     <w:rsid w:val="005D2204"/>
     <w:rsid w:val="00721E18"/>
     <w:rsid w:val="007607F5"/>
     <w:rsid w:val="00896295"/>
+    <w:rsid w:val="008A780D"/>
     <w:rsid w:val="00913FCE"/>
     <w:rsid w:val="00947FFB"/>
     <w:rsid w:val="00A47230"/>
@@ -4011,7 +4609,7 @@
 </file>
 
 <file path=word/glossary/styles.xml><?xml version="1.0" encoding="utf-8"?>
-<w:styles xmlns:mc="http://schemas.openxmlformats.org/markup-compatibility/2006" xmlns:r="http://schemas.openxmlformats.org/officeDocument/2006/relationships" xmlns:w="http://schemas.openxmlformats.org/wordprocessingml/2006/main" xmlns:w14="http://schemas.microsoft.com/office/word/2010/wordml" xmlns:w15="http://schemas.microsoft.com/office/word/2012/wordml" xmlns:w16cex="http://schemas.microsoft.com/office/word/2018/wordml/cex" xmlns:w16cid="http://schemas.microsoft.com/office/word/2016/wordml/cid" xmlns:w16="http://schemas.microsoft.com/office/word/2018/wordml" xmlns:w16sdtdh="http://schemas.microsoft.com/office/word/2020/wordml/sdtdatahash" xmlns:w16se="http://schemas.microsoft.com/office/word/2015/wordml/symex" mc:Ignorable="w14 w15 w16se w16cid w16 w16cex w16sdtdh">
+<w:styles xmlns:mc="http://schemas.openxmlformats.org/markup-compatibility/2006" xmlns:r="http://schemas.openxmlformats.org/officeDocument/2006/relationships" xmlns:w="http://schemas.openxmlformats.org/wordprocessingml/2006/main" xmlns:w14="http://schemas.microsoft.com/office/word/2010/wordml" xmlns:w15="http://schemas.microsoft.com/office/word/2012/wordml" xmlns:w16cex="http://schemas.microsoft.com/office/word/2018/wordml/cex" xmlns:w16cid="http://schemas.microsoft.com/office/word/2016/wordml/cid" xmlns:w16="http://schemas.microsoft.com/office/word/2018/wordml" xmlns:w16du="http://schemas.microsoft.com/office/word/2023/wordml/word16du" xmlns:w16sdtdh="http://schemas.microsoft.com/office/word/2020/wordml/sdtdatahash" xmlns:w16se="http://schemas.microsoft.com/office/word/2015/wordml/symex" mc:Ignorable="w14 w15 w16se w16cid w16 w16cex w16sdtdh w16du">
   <w:docDefaults>
     <w:rPrDefault>
       <w:rPr>
@@ -4444,7 +5042,7 @@
 </file>
 
 <file path=word/glossary/webSettings.xml><?xml version="1.0" encoding="utf-8"?>
-<w:webSettings xmlns:mc="http://schemas.openxmlformats.org/markup-compatibility/2006" xmlns:r="http://schemas.openxmlformats.org/officeDocument/2006/relationships" xmlns:w="http://schemas.openxmlformats.org/wordprocessingml/2006/main" xmlns:w14="http://schemas.microsoft.com/office/word/2010/wordml" xmlns:w15="http://schemas.microsoft.com/office/word/2012/wordml" xmlns:w16cex="http://schemas.microsoft.com/office/word/2018/wordml/cex" xmlns:w16cid="http://schemas.microsoft.com/office/word/2016/wordml/cid" xmlns:w16="http://schemas.microsoft.com/office/word/2018/wordml" xmlns:w16sdtdh="http://schemas.microsoft.com/office/word/2020/wordml/sdtdatahash" xmlns:w16se="http://schemas.microsoft.com/office/word/2015/wordml/symex" mc:Ignorable="w14 w15 w16se w16cid w16 w16cex w16sdtdh">
+<w:webSettings xmlns:mc="http://schemas.openxmlformats.org/markup-compatibility/2006" xmlns:r="http://schemas.openxmlformats.org/officeDocument/2006/relationships" xmlns:w="http://schemas.openxmlformats.org/wordprocessingml/2006/main" xmlns:w14="http://schemas.microsoft.com/office/word/2010/wordml" xmlns:w15="http://schemas.microsoft.com/office/word/2012/wordml" xmlns:w16cex="http://schemas.microsoft.com/office/word/2018/wordml/cex" xmlns:w16cid="http://schemas.microsoft.com/office/word/2016/wordml/cid" xmlns:w16="http://schemas.microsoft.com/office/word/2018/wordml" xmlns:w16du="http://schemas.microsoft.com/office/word/2023/wordml/word16du" xmlns:w16sdtdh="http://schemas.microsoft.com/office/word/2020/wordml/sdtdatahash" xmlns:w16se="http://schemas.microsoft.com/office/word/2015/wordml/symex" mc:Ignorable="w14 w15 w16se w16cid w16 w16cex w16sdtdh w16du">
   <w:optimizeForBrowser/>
   <w:allowPNG/>
 </w:webSettings>

</xml_diff>

<commit_message>
Build V43-beta. 'Some changes' x2. Fix shader. Wildcard IP addr. Black edge on main menu fix.
</commit_message>
<xml_diff>
--- a/Support Manual.docx
+++ b/Support Manual.docx
@@ -12,23 +12,32 @@
           <w:sz w:val="48"/>
         </w:rPr>
       </w:pPr>
-      <w:proofErr w:type="spellStart"/>
       <w:r>
         <w:rPr>
           <w:rFonts w:ascii="Verdana" w:hAnsi="Verdana"/>
           <w:b/>
           <w:sz w:val="48"/>
         </w:rPr>
-        <w:t>Ermac</w:t>
-      </w:r>
-      <w:proofErr w:type="spellEnd"/>
-      <w:r>
+        <w:t xml:space="preserve">Ermac Voxel Game </w:t>
+      </w:r>
+    </w:p>
+    <w:p>
+      <w:pPr>
+        <w:pStyle w:val="NoSpacing"/>
+        <w:jc w:val="center"/>
         <w:rPr>
           <w:rFonts w:ascii="Verdana" w:hAnsi="Verdana"/>
           <w:b/>
           <w:sz w:val="48"/>
         </w:rPr>
-        <w:t xml:space="preserve"> Voxel Game </w:t>
+      </w:pPr>
+      <w:r>
+        <w:rPr>
+          <w:rFonts w:ascii="Verdana" w:hAnsi="Verdana"/>
+          <w:b/>
+          <w:sz w:val="48"/>
+        </w:rPr>
+        <w:t>“NEWGEN”</w:t>
       </w:r>
     </w:p>
     <w:p>
@@ -47,42 +56,23 @@
           <w:b/>
           <w:sz w:val="48"/>
         </w:rPr>
-        <w:t>“NEWGEN”</w:t>
+        <w:t>Game name: “Demolition Synergy”</w:t>
       </w:r>
     </w:p>
     <w:p>
       <w:pPr>
         <w:pStyle w:val="NoSpacing"/>
         <w:jc w:val="center"/>
-        <w:rPr>
-          <w:rFonts w:ascii="Verdana" w:hAnsi="Verdana"/>
-          <w:b/>
-          <w:sz w:val="48"/>
-        </w:rPr>
-      </w:pPr>
-      <w:r>
-        <w:rPr>
-          <w:rFonts w:ascii="Verdana" w:hAnsi="Verdana"/>
-          <w:b/>
-          <w:sz w:val="48"/>
-        </w:rPr>
-        <w:t>Game name: “Demolition Synergy”</w:t>
-      </w:r>
-    </w:p>
-    <w:p>
-      <w:pPr>
-        <w:pStyle w:val="NoSpacing"/>
-        <w:jc w:val="center"/>
       </w:pPr>
       <w:r>
         <w:rPr>
           <w:noProof/>
         </w:rPr>
         <w:drawing>
-          <wp:inline distT="0" distB="0" distL="0" distR="0" wp14:anchorId="03CA2730" wp14:editId="7D4E16A8">
-            <wp:extent cx="2295144" cy="1197864"/>
-            <wp:effectExtent l="0" t="0" r="0" b="2540"/>
-            <wp:docPr id="1" name="Picture 1"/>
+          <wp:inline distT="0" distB="0" distL="0" distR="0" wp14:anchorId="54505473" wp14:editId="519FE46C">
+            <wp:extent cx="6858000" cy="3857625"/>
+            <wp:effectExtent l="0" t="0" r="0" b="9525"/>
+            <wp:docPr id="1533731631" name="Picture 1"/>
             <wp:cNvGraphicFramePr>
               <a:graphicFrameLocks xmlns:a="http://schemas.openxmlformats.org/drawingml/2006/main" noChangeAspect="1"/>
             </wp:cNvGraphicFramePr>
@@ -90,17 +80,11 @@
               <a:graphicData uri="http://schemas.openxmlformats.org/drawingml/2006/picture">
                 <pic:pic xmlns:pic="http://schemas.openxmlformats.org/drawingml/2006/picture">
                   <pic:nvPicPr>
-                    <pic:cNvPr id="0" name="ds_acro.png"/>
+                    <pic:cNvPr id="1533731631" name=""/>
                     <pic:cNvPicPr/>
                   </pic:nvPicPr>
                   <pic:blipFill>
-                    <a:blip r:embed="rId7" cstate="print">
-                      <a:extLst>
-                        <a:ext uri="{28A0092B-C50C-407E-A947-70E740481C1C}">
-                          <a14:useLocalDpi xmlns:a14="http://schemas.microsoft.com/office/drawing/2010/main" val="0"/>
-                        </a:ext>
-                      </a:extLst>
-                    </a:blip>
+                    <a:blip r:embed="rId7"/>
                     <a:stretch>
                       <a:fillRect/>
                     </a:stretch>
@@ -108,7 +92,7 @@
                   <pic:spPr>
                     <a:xfrm>
                       <a:off x="0" y="0"/>
-                      <a:ext cx="2295144" cy="1197864"/>
+                      <a:ext cx="6858000" cy="3857625"/>
                     </a:xfrm>
                     <a:prstGeom prst="rect">
                       <a:avLst/>
@@ -357,6 +341,7 @@
           <w:b/>
           <w:sz w:val="48"/>
         </w:rPr>
+        <w:lastRenderedPageBreak/>
         <w:t xml:space="preserve">effects </w:t>
       </w:r>
       <w:r>
@@ -393,23 +378,13 @@
           <w:sz w:val="48"/>
         </w:rPr>
       </w:pPr>
-      <w:proofErr w:type="spellStart"/>
       <w:r>
         <w:rPr>
           <w:rFonts w:ascii="Verdana" w:hAnsi="Verdana"/>
           <w:b/>
           <w:sz w:val="48"/>
         </w:rPr>
-        <w:t>intrface</w:t>
-      </w:r>
-      <w:proofErr w:type="spellEnd"/>
-      <w:r>
-        <w:rPr>
-          <w:rFonts w:ascii="Verdana" w:hAnsi="Verdana"/>
-          <w:b/>
-          <w:sz w:val="48"/>
-        </w:rPr>
-        <w:t xml:space="preserve"> </w:t>
+        <w:t xml:space="preserve">intrface </w:t>
       </w:r>
       <w:r>
         <w:rPr>
@@ -473,23 +448,7 @@
           <w:rFonts w:ascii="Verdana" w:hAnsi="Verdana"/>
           <w:sz w:val="32"/>
         </w:rPr>
-        <w:t>models (.obj format) and textures (.</w:t>
-      </w:r>
-      <w:proofErr w:type="spellStart"/>
-      <w:r>
-        <w:rPr>
-          <w:rFonts w:ascii="Verdana" w:hAnsi="Verdana"/>
-          <w:sz w:val="32"/>
-        </w:rPr>
-        <w:t>png</w:t>
-      </w:r>
-      <w:proofErr w:type="spellEnd"/>
-      <w:r>
-        <w:rPr>
-          <w:rFonts w:ascii="Verdana" w:hAnsi="Verdana"/>
-          <w:sz w:val="32"/>
-        </w:rPr>
-        <w:t xml:space="preserve"> format) for the player assets;</w:t>
+        <w:t>models (.obj format) and textures (.png format) for the player assets;</w:t>
       </w:r>
     </w:p>
     <w:p>
@@ -531,39 +490,7 @@
           <w:rFonts w:ascii="Verdana" w:hAnsi="Verdana"/>
           <w:sz w:val="32"/>
         </w:rPr>
-        <w:t xml:space="preserve">contains music and sound </w:t>
-      </w:r>
-      <w:proofErr w:type="spellStart"/>
-      <w:r>
-        <w:rPr>
-          <w:rFonts w:ascii="Verdana" w:hAnsi="Verdana"/>
-          <w:sz w:val="32"/>
-        </w:rPr>
-        <w:t>fx</w:t>
-      </w:r>
-      <w:proofErr w:type="spellEnd"/>
-      <w:r>
-        <w:rPr>
-          <w:rFonts w:ascii="Verdana" w:hAnsi="Verdana"/>
-          <w:sz w:val="32"/>
-        </w:rPr>
-        <w:t xml:space="preserve"> audio files (.</w:t>
-      </w:r>
-      <w:proofErr w:type="spellStart"/>
-      <w:r>
-        <w:rPr>
-          <w:rFonts w:ascii="Verdana" w:hAnsi="Verdana"/>
-          <w:sz w:val="32"/>
-        </w:rPr>
-        <w:t>ogg</w:t>
-      </w:r>
-      <w:proofErr w:type="spellEnd"/>
-      <w:r>
-        <w:rPr>
-          <w:rFonts w:ascii="Verdana" w:hAnsi="Verdana"/>
-          <w:sz w:val="32"/>
-        </w:rPr>
-        <w:t xml:space="preserve"> format);</w:t>
+        <w:t>contains music and sound fx audio files (.ogg format);</w:t>
       </w:r>
     </w:p>
     <w:p>
@@ -605,23 +532,7 @@
           <w:rFonts w:ascii="Verdana" w:hAnsi="Verdana"/>
           <w:sz w:val="32"/>
         </w:rPr>
-        <w:t>contains models (.obj format) and textures (.</w:t>
-      </w:r>
-      <w:proofErr w:type="spellStart"/>
-      <w:r>
-        <w:rPr>
-          <w:rFonts w:ascii="Verdana" w:hAnsi="Verdana"/>
-          <w:sz w:val="32"/>
-        </w:rPr>
-        <w:t>png</w:t>
-      </w:r>
-      <w:proofErr w:type="spellEnd"/>
-      <w:r>
-        <w:rPr>
-          <w:rFonts w:ascii="Verdana" w:hAnsi="Verdana"/>
-          <w:sz w:val="32"/>
-        </w:rPr>
-        <w:t xml:space="preserve"> format) for blocks which make environment as it is.</w:t>
+        <w:t>contains models (.obj format) and textures (.png format) for blocks which make environment as it is.</w:t>
       </w:r>
     </w:p>
     <w:p>
@@ -649,7 +560,6 @@
           <w:b/>
           <w:sz w:val="48"/>
         </w:rPr>
-        <w:lastRenderedPageBreak/>
         <w:t xml:space="preserve">weapons – </w:t>
       </w:r>
       <w:r>
@@ -814,7 +724,6 @@
           <w:szCs w:val="32"/>
         </w:rPr>
       </w:pPr>
-      <w:proofErr w:type="spellStart"/>
       <w:r>
         <w:rPr>
           <w:rFonts w:ascii="Verdana" w:hAnsi="Verdana"/>
@@ -825,32 +734,13 @@
         </w:rPr>
         <w:t>fps_max</w:t>
       </w:r>
-      <w:proofErr w:type="spellEnd"/>
-      <w:r>
-        <w:rPr>
-          <w:rFonts w:ascii="Verdana" w:hAnsi="Verdana"/>
-          <w:sz w:val="32"/>
-          <w:szCs w:val="32"/>
-        </w:rPr>
-        <w:t xml:space="preserve">&lt;num&gt;, </w:t>
-      </w:r>
-      <w:proofErr w:type="spellStart"/>
-      <w:r>
-        <w:rPr>
-          <w:rFonts w:ascii="Verdana" w:hAnsi="Verdana"/>
-          <w:sz w:val="32"/>
-          <w:szCs w:val="32"/>
-        </w:rPr>
-        <w:t>fpsMax</w:t>
-      </w:r>
-      <w:proofErr w:type="spellEnd"/>
-      <w:r>
-        <w:rPr>
-          <w:rFonts w:ascii="Verdana" w:hAnsi="Verdana"/>
-          <w:sz w:val="32"/>
-          <w:szCs w:val="32"/>
-        </w:rPr>
-        <w:t>&lt;num&gt;: allowing to change max fps (it must be positive number)</w:t>
+      <w:r>
+        <w:rPr>
+          <w:rFonts w:ascii="Verdana" w:hAnsi="Verdana"/>
+          <w:sz w:val="32"/>
+          <w:szCs w:val="32"/>
+        </w:rPr>
+        <w:t>&lt;num&gt;, fpsMax&lt;num&gt;: allowing to change max fps (it must be positive number)</w:t>
       </w:r>
       <w:r>
         <w:rPr>
@@ -916,7 +806,6 @@
           <w:szCs w:val="32"/>
         </w:rPr>
       </w:pPr>
-      <w:proofErr w:type="spellStart"/>
       <w:r>
         <w:rPr>
           <w:rFonts w:ascii="Verdana" w:hAnsi="Verdana"/>
@@ -927,7 +816,6 @@
         </w:rPr>
         <w:t>fullscreen</w:t>
       </w:r>
-      <w:proofErr w:type="spellEnd"/>
       <w:r>
         <w:rPr>
           <w:rFonts w:ascii="Verdana" w:hAnsi="Verdana"/>
@@ -960,18 +848,8 @@
           <w:sz w:val="32"/>
           <w:szCs w:val="32"/>
         </w:rPr>
-        <w:t xml:space="preserve"> makes your game run </w:t>
-      </w:r>
-      <w:proofErr w:type="spellStart"/>
-      <w:r>
-        <w:rPr>
-          <w:rFonts w:ascii="Verdana" w:hAnsi="Verdana"/>
-          <w:sz w:val="32"/>
-          <w:szCs w:val="32"/>
-        </w:rPr>
-        <w:t>fullscreen</w:t>
-      </w:r>
-      <w:proofErr w:type="spellEnd"/>
+        <w:t xml:space="preserve"> makes your game run fullscreen</w:t>
+      </w:r>
       <w:r>
         <w:rPr>
           <w:rFonts w:ascii="Verdana" w:hAnsi="Verdana"/>
@@ -1008,7 +886,6 @@
           <w:szCs w:val="32"/>
         </w:rPr>
       </w:pPr>
-      <w:proofErr w:type="spellStart"/>
       <w:r>
         <w:rPr>
           <w:rFonts w:ascii="Verdana" w:hAnsi="Verdana"/>
@@ -1019,68 +896,13 @@
         </w:rPr>
         <w:t>v_sync</w:t>
       </w:r>
-      <w:proofErr w:type="spellEnd"/>
-      <w:r>
-        <w:rPr>
-          <w:rFonts w:ascii="Verdana" w:hAnsi="Verdana"/>
-          <w:sz w:val="32"/>
-          <w:szCs w:val="32"/>
-        </w:rPr>
-        <w:t xml:space="preserve"> &lt;bool&gt;, </w:t>
-      </w:r>
-      <w:proofErr w:type="spellStart"/>
-      <w:r>
-        <w:rPr>
-          <w:rFonts w:ascii="Verdana" w:hAnsi="Verdana"/>
-          <w:sz w:val="32"/>
-          <w:szCs w:val="32"/>
-        </w:rPr>
-        <w:t>vsync</w:t>
-      </w:r>
-      <w:proofErr w:type="spellEnd"/>
-      <w:r>
-        <w:rPr>
-          <w:rFonts w:ascii="Verdana" w:hAnsi="Verdana"/>
-          <w:sz w:val="32"/>
-          <w:szCs w:val="32"/>
-        </w:rPr>
-        <w:t xml:space="preserve">&lt;bool&gt;: whether or not you </w:t>
-      </w:r>
-      <w:proofErr w:type="spellStart"/>
-      <w:r>
-        <w:rPr>
-          <w:rFonts w:ascii="Verdana" w:hAnsi="Verdana"/>
-          <w:sz w:val="32"/>
-          <w:szCs w:val="32"/>
-        </w:rPr>
-        <w:t>wanna</w:t>
-      </w:r>
-      <w:proofErr w:type="spellEnd"/>
-      <w:r>
-        <w:rPr>
-          <w:rFonts w:ascii="Verdana" w:hAnsi="Verdana"/>
-          <w:sz w:val="32"/>
-          <w:szCs w:val="32"/>
-        </w:rPr>
-        <w:t xml:space="preserve"> </w:t>
-      </w:r>
-      <w:proofErr w:type="spellStart"/>
-      <w:r>
-        <w:rPr>
-          <w:rFonts w:ascii="Verdana" w:hAnsi="Verdana"/>
-          <w:sz w:val="32"/>
-          <w:szCs w:val="32"/>
-        </w:rPr>
-        <w:t>vsync</w:t>
-      </w:r>
-      <w:proofErr w:type="spellEnd"/>
-      <w:r>
-        <w:rPr>
-          <w:rFonts w:ascii="Verdana" w:hAnsi="Verdana"/>
-          <w:sz w:val="32"/>
-          <w:szCs w:val="32"/>
-        </w:rPr>
-        <w:t xml:space="preserve"> on or off. If it’s on (you’ve set it to true) your fps is capped to your monitor refresh rate.</w:t>
+      <w:r>
+        <w:rPr>
+          <w:rFonts w:ascii="Verdana" w:hAnsi="Verdana"/>
+          <w:sz w:val="32"/>
+          <w:szCs w:val="32"/>
+        </w:rPr>
+        <w:t xml:space="preserve"> &lt;bool&gt;, vsync&lt;bool&gt;: whether or not you wanna vsync on or off. If it’s on (you’ve set it to true) your fps is capped to your monitor refresh rate.</w:t>
       </w:r>
     </w:p>
     <w:p>
@@ -1102,7 +924,6 @@
           <w:szCs w:val="32"/>
         </w:rPr>
       </w:pPr>
-      <w:proofErr w:type="spellStart"/>
       <w:r>
         <w:rPr>
           <w:rFonts w:ascii="Verdana" w:hAnsi="Verdana"/>
@@ -1133,7 +954,6 @@
         </w:rPr>
         <w:t>ects</w:t>
       </w:r>
-      <w:proofErr w:type="spellEnd"/>
       <w:r>
         <w:rPr>
           <w:rFonts w:ascii="Verdana" w:hAnsi="Verdana"/>
@@ -1142,7 +962,6 @@
         </w:rPr>
         <w:t xml:space="preserve"> &lt;</w:t>
       </w:r>
-      <w:proofErr w:type="spellStart"/>
       <w:r>
         <w:rPr>
           <w:rFonts w:ascii="Verdana" w:hAnsi="Verdana"/>
@@ -1151,7 +970,6 @@
         </w:rPr>
         <w:t>enum</w:t>
       </w:r>
-      <w:proofErr w:type="spellEnd"/>
       <w:r>
         <w:rPr>
           <w:rFonts w:ascii="Verdana" w:hAnsi="Verdana"/>
@@ -1196,7 +1014,6 @@
           <w:szCs w:val="32"/>
         </w:rPr>
       </w:pPr>
-      <w:proofErr w:type="spellStart"/>
       <w:r>
         <w:rPr>
           <w:rFonts w:ascii="Verdana" w:hAnsi="Verdana"/>
@@ -1237,7 +1054,6 @@
         </w:rPr>
         <w:t>ects</w:t>
       </w:r>
-      <w:proofErr w:type="spellEnd"/>
       <w:r>
         <w:rPr>
           <w:rFonts w:ascii="Verdana" w:hAnsi="Verdana"/>
@@ -1246,7 +1062,6 @@
         </w:rPr>
         <w:t xml:space="preserve"> &lt;</w:t>
       </w:r>
-      <w:proofErr w:type="spellStart"/>
       <w:r>
         <w:rPr>
           <w:rFonts w:ascii="Verdana" w:hAnsi="Verdana"/>
@@ -1255,7 +1070,6 @@
         </w:rPr>
         <w:t>enum</w:t>
       </w:r>
-      <w:proofErr w:type="spellEnd"/>
       <w:r>
         <w:rPr>
           <w:rFonts w:ascii="Verdana" w:hAnsi="Verdana"/>
@@ -1300,7 +1114,6 @@
           <w:szCs w:val="32"/>
         </w:rPr>
       </w:pPr>
-      <w:proofErr w:type="spellStart"/>
       <w:r>
         <w:rPr>
           <w:rFonts w:ascii="Verdana" w:hAnsi="Verdana"/>
@@ -1311,32 +1124,13 @@
         </w:rPr>
         <w:t>mouse_sensitivity</w:t>
       </w:r>
-      <w:proofErr w:type="spellEnd"/>
-      <w:r>
-        <w:rPr>
-          <w:rFonts w:ascii="Verdana" w:hAnsi="Verdana"/>
-          <w:sz w:val="32"/>
-          <w:szCs w:val="32"/>
-        </w:rPr>
-        <w:t xml:space="preserve">&lt;num&gt;, </w:t>
-      </w:r>
-      <w:proofErr w:type="spellStart"/>
-      <w:r>
-        <w:rPr>
-          <w:rFonts w:ascii="Verdana" w:hAnsi="Verdana"/>
-          <w:sz w:val="32"/>
-          <w:szCs w:val="32"/>
-        </w:rPr>
-        <w:t>msens</w:t>
-      </w:r>
-      <w:proofErr w:type="spellEnd"/>
-      <w:r>
-        <w:rPr>
-          <w:rFonts w:ascii="Verdana" w:hAnsi="Verdana"/>
-          <w:sz w:val="32"/>
-          <w:szCs w:val="32"/>
-        </w:rPr>
-        <w:t xml:space="preserve"> &lt;num&gt;: sets mouse sensitivity to this value.</w:t>
+      <w:r>
+        <w:rPr>
+          <w:rFonts w:ascii="Verdana" w:hAnsi="Verdana"/>
+          <w:sz w:val="32"/>
+          <w:szCs w:val="32"/>
+        </w:rPr>
+        <w:t>&lt;num&gt;, msens &lt;num&gt;: sets mouse sensitivity to this value.</w:t>
       </w:r>
     </w:p>
     <w:p>
@@ -1366,6 +1160,7 @@
           <w:sz w:val="32"/>
           <w:szCs w:val="32"/>
         </w:rPr>
+        <w:lastRenderedPageBreak/>
         <w:t>music</w:t>
       </w:r>
       <w:r>
@@ -1490,7 +1285,6 @@
           <w:szCs w:val="32"/>
         </w:rPr>
       </w:pPr>
-      <w:proofErr w:type="spellStart"/>
       <w:r>
         <w:rPr>
           <w:rFonts w:ascii="Verdana" w:hAnsi="Verdana"/>
@@ -1511,23 +1305,13 @@
         </w:rPr>
         <w:t>izeof</w:t>
       </w:r>
-      <w:proofErr w:type="spellEnd"/>
-      <w:r>
-        <w:rPr>
-          <w:rFonts w:ascii="Verdana" w:hAnsi="Verdana"/>
-          <w:sz w:val="32"/>
-          <w:szCs w:val="32"/>
-        </w:rPr>
-        <w:t>[&lt;</w:t>
-      </w:r>
-      <w:proofErr w:type="spellStart"/>
-      <w:r>
-        <w:rPr>
-          <w:rFonts w:ascii="Verdana" w:hAnsi="Verdana"/>
-          <w:sz w:val="32"/>
-          <w:szCs w:val="32"/>
-        </w:rPr>
-        <w:t>chunk</w:t>
+      <w:r>
+        <w:rPr>
+          <w:rFonts w:ascii="Verdana" w:hAnsi="Verdana"/>
+          <w:sz w:val="32"/>
+          <w:szCs w:val="32"/>
+        </w:rPr>
+        <w:t>[&lt;chunk</w:t>
       </w:r>
       <w:r>
         <w:rPr>
@@ -1543,52 +1327,7 @@
           <w:sz w:val="32"/>
           <w:szCs w:val="32"/>
         </w:rPr>
-        <w:t>d</w:t>
-      </w:r>
-      <w:proofErr w:type="spellEnd"/>
-      <w:r>
-        <w:rPr>
-          <w:rFonts w:ascii="Verdana" w:hAnsi="Verdana"/>
-          <w:sz w:val="32"/>
-          <w:szCs w:val="32"/>
-        </w:rPr>
-        <w:t xml:space="preserve">&gt;]: get total size without </w:t>
-      </w:r>
-      <w:proofErr w:type="spellStart"/>
-      <w:r>
-        <w:rPr>
-          <w:rFonts w:ascii="Verdana" w:hAnsi="Verdana"/>
-          <w:sz w:val="32"/>
-          <w:szCs w:val="32"/>
-        </w:rPr>
-        <w:t>args</w:t>
-      </w:r>
-      <w:proofErr w:type="spellEnd"/>
-      <w:r>
-        <w:rPr>
-          <w:rFonts w:ascii="Verdana" w:hAnsi="Verdana"/>
-          <w:sz w:val="32"/>
-          <w:szCs w:val="32"/>
-        </w:rPr>
-        <w:t xml:space="preserve">, if </w:t>
-      </w:r>
-      <w:proofErr w:type="spellStart"/>
-      <w:r>
-        <w:rPr>
-          <w:rFonts w:ascii="Verdana" w:hAnsi="Verdana"/>
-          <w:sz w:val="32"/>
-          <w:szCs w:val="32"/>
-        </w:rPr>
-        <w:t>args</w:t>
-      </w:r>
-      <w:proofErr w:type="spellEnd"/>
-      <w:r>
-        <w:rPr>
-          <w:rFonts w:ascii="Verdana" w:hAnsi="Verdana"/>
-          <w:sz w:val="32"/>
-          <w:szCs w:val="32"/>
-        </w:rPr>
-        <w:t xml:space="preserve"> provided size of blocks of that chunk.</w:t>
+        <w:t>d&gt;]: get total size without args, if args provided size of blocks of that chunk.</w:t>
       </w:r>
     </w:p>
     <w:p>
@@ -1748,7 +1487,6 @@
           <w:szCs w:val="32"/>
         </w:rPr>
       </w:pPr>
-      <w:proofErr w:type="spellStart"/>
       <w:r>
         <w:rPr>
           <w:rFonts w:ascii="Verdana" w:hAnsi="Verdana"/>
@@ -1759,7 +1497,6 @@
         </w:rPr>
         <w:t>game_ticks</w:t>
       </w:r>
-      <w:proofErr w:type="spellEnd"/>
       <w:r>
         <w:rPr>
           <w:rFonts w:ascii="Verdana" w:hAnsi="Verdana"/>
@@ -1778,7 +1515,6 @@
         </w:rPr>
         <w:t>&lt;</w:t>
       </w:r>
-      <w:proofErr w:type="spellStart"/>
       <w:r>
         <w:rPr>
           <w:rFonts w:ascii="Verdana" w:hAnsi="Verdana"/>
@@ -1801,16 +1537,7 @@
           <w:sz w:val="32"/>
           <w:szCs w:val="32"/>
         </w:rPr>
-        <w:t>num</w:t>
-      </w:r>
-      <w:proofErr w:type="spellEnd"/>
-      <w:r>
-        <w:rPr>
-          <w:rFonts w:ascii="Verdana" w:hAnsi="Verdana"/>
-          <w:sz w:val="32"/>
-          <w:szCs w:val="32"/>
-        </w:rPr>
-        <w:t>&gt;</w:t>
+        <w:t>num&gt;</w:t>
       </w:r>
       <w:r>
         <w:rPr>
@@ -2004,67 +1731,31 @@
           <w:sz w:val="32"/>
           <w:szCs w:val="32"/>
         </w:rPr>
-        <w:t xml:space="preserve">W, </w:t>
-      </w:r>
-      <w:proofErr w:type="spellStart"/>
-      <w:r>
-        <w:rPr>
-          <w:rFonts w:ascii="Verdana" w:hAnsi="Verdana"/>
-          <w:sz w:val="32"/>
-          <w:szCs w:val="32"/>
-        </w:rPr>
-        <w:t>UpArrow</w:t>
-      </w:r>
-      <w:proofErr w:type="spellEnd"/>
-      <w:r>
-        <w:rPr>
-          <w:rFonts w:ascii="Verdana" w:hAnsi="Verdana"/>
-          <w:sz w:val="32"/>
-          <w:szCs w:val="32"/>
-        </w:rPr>
-        <w:t xml:space="preserve"> = Forward</w:t>
-      </w:r>
-    </w:p>
-    <w:p>
-      <w:pPr>
-        <w:pStyle w:val="NoSpacing"/>
-        <w:pBdr>
-          <w:top w:val="single" w:sz="4" w:space="1" w:color="auto"/>
-          <w:left w:val="single" w:sz="4" w:space="4" w:color="auto"/>
-          <w:bottom w:val="single" w:sz="4" w:space="1" w:color="auto"/>
-          <w:right w:val="single" w:sz="4" w:space="4" w:color="auto"/>
-        </w:pBdr>
-        <w:rPr>
-          <w:rFonts w:ascii="Verdana" w:hAnsi="Verdana"/>
-          <w:sz w:val="32"/>
-          <w:szCs w:val="32"/>
-        </w:rPr>
-      </w:pPr>
-      <w:r>
-        <w:rPr>
-          <w:rFonts w:ascii="Verdana" w:hAnsi="Verdana"/>
-          <w:sz w:val="32"/>
-          <w:szCs w:val="32"/>
-        </w:rPr>
-        <w:t xml:space="preserve">A, </w:t>
-      </w:r>
-      <w:proofErr w:type="spellStart"/>
-      <w:r>
-        <w:rPr>
-          <w:rFonts w:ascii="Verdana" w:hAnsi="Verdana"/>
-          <w:sz w:val="32"/>
-          <w:szCs w:val="32"/>
-        </w:rPr>
-        <w:t>DownArrow</w:t>
-      </w:r>
-      <w:proofErr w:type="spellEnd"/>
-      <w:r>
-        <w:rPr>
-          <w:rFonts w:ascii="Verdana" w:hAnsi="Verdana"/>
-          <w:sz w:val="32"/>
-          <w:szCs w:val="32"/>
-        </w:rPr>
-        <w:t xml:space="preserve"> = Backward</w:t>
+        <w:t>W, UpArrow = Forward</w:t>
+      </w:r>
+    </w:p>
+    <w:p>
+      <w:pPr>
+        <w:pStyle w:val="NoSpacing"/>
+        <w:pBdr>
+          <w:top w:val="single" w:sz="4" w:space="1" w:color="auto"/>
+          <w:left w:val="single" w:sz="4" w:space="4" w:color="auto"/>
+          <w:bottom w:val="single" w:sz="4" w:space="1" w:color="auto"/>
+          <w:right w:val="single" w:sz="4" w:space="4" w:color="auto"/>
+        </w:pBdr>
+        <w:rPr>
+          <w:rFonts w:ascii="Verdana" w:hAnsi="Verdana"/>
+          <w:sz w:val="32"/>
+          <w:szCs w:val="32"/>
+        </w:rPr>
+      </w:pPr>
+      <w:r>
+        <w:rPr>
+          <w:rFonts w:ascii="Verdana" w:hAnsi="Verdana"/>
+          <w:sz w:val="32"/>
+          <w:szCs w:val="32"/>
+        </w:rPr>
+        <w:t>A, DownArrow = Backward</w:t>
       </w:r>
     </w:p>
     <w:p>
@@ -2130,57 +1821,37 @@
           <w:szCs w:val="32"/>
         </w:rPr>
       </w:pPr>
-      <w:proofErr w:type="spellStart"/>
-      <w:r>
-        <w:rPr>
-          <w:rFonts w:ascii="Verdana" w:hAnsi="Verdana"/>
-          <w:sz w:val="32"/>
-          <w:szCs w:val="32"/>
-        </w:rPr>
-        <w:t>LeftArrow</w:t>
-      </w:r>
-      <w:proofErr w:type="spellEnd"/>
-      <w:r>
-        <w:rPr>
-          <w:rFonts w:ascii="Verdana" w:hAnsi="Verdana"/>
-          <w:sz w:val="32"/>
-          <w:szCs w:val="32"/>
-        </w:rPr>
-        <w:t xml:space="preserve"> = Turn Left</w:t>
-      </w:r>
-    </w:p>
-    <w:p>
-      <w:pPr>
-        <w:pStyle w:val="NoSpacing"/>
-        <w:pBdr>
-          <w:top w:val="single" w:sz="4" w:space="1" w:color="auto"/>
-          <w:left w:val="single" w:sz="4" w:space="4" w:color="auto"/>
-          <w:bottom w:val="single" w:sz="4" w:space="1" w:color="auto"/>
-          <w:right w:val="single" w:sz="4" w:space="4" w:color="auto"/>
-        </w:pBdr>
-        <w:rPr>
-          <w:rFonts w:ascii="Verdana" w:hAnsi="Verdana"/>
-          <w:sz w:val="32"/>
-          <w:szCs w:val="32"/>
-        </w:rPr>
-      </w:pPr>
-      <w:proofErr w:type="spellStart"/>
-      <w:r>
-        <w:rPr>
-          <w:rFonts w:ascii="Verdana" w:hAnsi="Verdana"/>
-          <w:sz w:val="32"/>
-          <w:szCs w:val="32"/>
-        </w:rPr>
-        <w:t>RightArrow</w:t>
-      </w:r>
-      <w:proofErr w:type="spellEnd"/>
-      <w:r>
-        <w:rPr>
-          <w:rFonts w:ascii="Verdana" w:hAnsi="Verdana"/>
-          <w:sz w:val="32"/>
-          <w:szCs w:val="32"/>
-        </w:rPr>
-        <w:t xml:space="preserve"> = Turn Right</w:t>
+      <w:r>
+        <w:rPr>
+          <w:rFonts w:ascii="Verdana" w:hAnsi="Verdana"/>
+          <w:sz w:val="32"/>
+          <w:szCs w:val="32"/>
+        </w:rPr>
+        <w:t>LeftArrow = Turn Left</w:t>
+      </w:r>
+    </w:p>
+    <w:p>
+      <w:pPr>
+        <w:pStyle w:val="NoSpacing"/>
+        <w:pBdr>
+          <w:top w:val="single" w:sz="4" w:space="1" w:color="auto"/>
+          <w:left w:val="single" w:sz="4" w:space="4" w:color="auto"/>
+          <w:bottom w:val="single" w:sz="4" w:space="1" w:color="auto"/>
+          <w:right w:val="single" w:sz="4" w:space="4" w:color="auto"/>
+        </w:pBdr>
+        <w:rPr>
+          <w:rFonts w:ascii="Verdana" w:hAnsi="Verdana"/>
+          <w:sz w:val="32"/>
+          <w:szCs w:val="32"/>
+        </w:rPr>
+      </w:pPr>
+      <w:r>
+        <w:rPr>
+          <w:rFonts w:ascii="Verdana" w:hAnsi="Verdana"/>
+          <w:sz w:val="32"/>
+          <w:szCs w:val="32"/>
+        </w:rPr>
+        <w:t>RightArrow = Turn Right</w:t>
       </w:r>
     </w:p>
     <w:p>
@@ -2242,7 +1913,6 @@
           <w:szCs w:val="32"/>
         </w:rPr>
       </w:pPr>
-      <w:proofErr w:type="spellStart"/>
       <w:r>
         <w:rPr>
           <w:rFonts w:ascii="Verdana" w:hAnsi="Verdana"/>
@@ -2251,7 +1921,6 @@
         </w:rPr>
         <w:t>PageUp</w:t>
       </w:r>
-      <w:proofErr w:type="spellEnd"/>
       <w:r>
         <w:rPr>
           <w:rFonts w:ascii="Verdana" w:hAnsi="Verdana"/>
@@ -2284,7 +1953,6 @@
           <w:szCs w:val="32"/>
         </w:rPr>
       </w:pPr>
-      <w:proofErr w:type="spellStart"/>
       <w:r>
         <w:rPr>
           <w:rFonts w:ascii="Verdana" w:hAnsi="Verdana"/>
@@ -2293,7 +1961,6 @@
         </w:rPr>
         <w:t>PageDown</w:t>
       </w:r>
-      <w:proofErr w:type="spellEnd"/>
       <w:r>
         <w:rPr>
           <w:rFonts w:ascii="Verdana" w:hAnsi="Verdana"/>
@@ -2584,6 +2251,7 @@
           <w:sz w:val="32"/>
           <w:szCs w:val="32"/>
         </w:rPr>
+        <w:lastRenderedPageBreak/>
         <w:t>Mouse1 + SHIFT = Select Fluid Block</w:t>
       </w:r>
     </w:p>
@@ -2867,7 +2535,6 @@
           <w:sz w:val="32"/>
           <w:szCs w:val="32"/>
         </w:rPr>
-        <w:lastRenderedPageBreak/>
         <w:t>F2 = Save Level</w:t>
       </w:r>
     </w:p>
@@ -3254,15 +2921,7 @@
         <w:pStyle w:val="NoSpacing"/>
       </w:pPr>
       <w:r>
-        <w:t>Author: Alexander “</w:t>
-      </w:r>
-      <w:proofErr w:type="spellStart"/>
-      <w:r>
-        <w:t>Ermac</w:t>
-      </w:r>
-      <w:proofErr w:type="spellEnd"/>
-      <w:r>
-        <w:t xml:space="preserve">” Stojanovich (email: </w:t>
+        <w:t xml:space="preserve">Author: Alexander “Ermac” Stojanovich (email: </w:t>
       </w:r>
       <w:hyperlink r:id="rId9" w:history="1">
         <w:r>
@@ -3292,15 +2951,7 @@
         <w:pStyle w:val="NoSpacing"/>
       </w:pPr>
       <w:r>
-        <w:t xml:space="preserve">Audio material was provided from freesound.org by </w:t>
-      </w:r>
-      <w:proofErr w:type="spellStart"/>
-      <w:r>
-        <w:t>Erokia</w:t>
-      </w:r>
-      <w:proofErr w:type="spellEnd"/>
-      <w:r>
-        <w:t>.</w:t>
+        <w:t>Audio material was provided from freesound.org by Erokia.</w:t>
       </w:r>
     </w:p>
     <w:sectPr>
@@ -3614,23 +3265,13 @@
             <w:szCs w:val="32"/>
           </w:rPr>
         </w:pPr>
-        <w:proofErr w:type="spellStart"/>
         <w:r>
           <w:rPr>
             <w:rFonts w:ascii="Verdana" w:hAnsi="Verdana"/>
             <w:sz w:val="24"/>
             <w:szCs w:val="32"/>
           </w:rPr>
-          <w:t>Ermac</w:t>
-        </w:r>
-        <w:proofErr w:type="spellEnd"/>
-        <w:r>
-          <w:rPr>
-            <w:rFonts w:ascii="Verdana" w:hAnsi="Verdana"/>
-            <w:sz w:val="24"/>
-            <w:szCs w:val="32"/>
-          </w:rPr>
-          <w:t xml:space="preserve"> Voxel Game - </w:t>
+          <w:t xml:space="preserve">Ermac Voxel Game - </w:t>
         </w:r>
         <w:r>
           <w:rPr>
@@ -3638,25 +3279,7 @@
             <w:sz w:val="24"/>
             <w:szCs w:val="32"/>
           </w:rPr>
-          <w:t>Alexander “</w:t>
-        </w:r>
-        <w:proofErr w:type="spellStart"/>
-        <w:r>
-          <w:rPr>
-            <w:rFonts w:ascii="Verdana" w:hAnsi="Verdana"/>
-            <w:sz w:val="24"/>
-            <w:szCs w:val="32"/>
-          </w:rPr>
-          <w:t>Ermac</w:t>
-        </w:r>
-        <w:proofErr w:type="spellEnd"/>
-        <w:r>
-          <w:rPr>
-            <w:rFonts w:ascii="Verdana" w:hAnsi="Verdana"/>
-            <w:sz w:val="24"/>
-            <w:szCs w:val="32"/>
-          </w:rPr>
-          <w:t>” Stojanovich</w:t>
+          <w:t>Alexander “Ermac” Stojanovich</w:t>
         </w:r>
         <w:r>
           <w:rPr>
@@ -4570,6 +4193,7 @@
     <w:rsidRoot w:val="00913FCE"/>
     <w:rsid w:val="000F4CBE"/>
     <w:rsid w:val="000F63D0"/>
+    <w:rsid w:val="00110A0E"/>
     <w:rsid w:val="00133C44"/>
     <w:rsid w:val="001F1795"/>
     <w:rsid w:val="00293559"/>
@@ -4577,8 +4201,11 @@
     <w:rsid w:val="004C32B9"/>
     <w:rsid w:val="00585F61"/>
     <w:rsid w:val="005D2204"/>
+    <w:rsid w:val="006B7125"/>
+    <w:rsid w:val="00704102"/>
     <w:rsid w:val="00721E18"/>
     <w:rsid w:val="007607F5"/>
+    <w:rsid w:val="00840D29"/>
     <w:rsid w:val="00896295"/>
     <w:rsid w:val="008A780D"/>
     <w:rsid w:val="00913FCE"/>

</xml_diff>